<commit_message>
Refine BIOSZEN analysis and reporting workflows
</commit_message>
<xml_diff>
--- a/inst/app/www/MANUAL_EN.docx
+++ b/inst/app/www/MANUAL_EN.docx
@@ -2,7 +2,15 @@
 <file path=word/document.xml><?xml version="1.0" encoding="utf-8"?>
 <w:document xmlns:w="http://schemas.openxmlformats.org/wordprocessingml/2006/main" xmlns:m="http://schemas.openxmlformats.org/officeDocument/2006/math" xmlns:r="http://schemas.openxmlformats.org/officeDocument/2006/relationships" xmlns:o="urn:schemas-microsoft-com:office:office" xmlns:v="urn:schemas-microsoft-com:vml" xmlns:w10="urn:schemas-microsoft-com:office:word" xmlns:a="http://schemas.openxmlformats.org/drawingml/2006/main" xmlns:pic="http://schemas.openxmlformats.org/drawingml/2006/picture" xmlns:wp="http://schemas.openxmlformats.org/drawingml/2006/wordprocessingDrawing">
   <w:body>
-    <w:bookmarkStart w:id="70" w:name="bioszen-user-manual-english"/>
+    <w:p>
+      <w:pPr>
+        <w:pStyle w:val="Title"/>
+      </w:pPr>
+      <w:r>
+        <w:t xml:space="preserve">BIOSZEN User Manual (English)</w:t>
+      </w:r>
+    </w:p>
+    <w:bookmarkStart w:id="74" w:name="bioszen-user-manual-english"/>
     <w:p>
       <w:pPr>
         <w:pStyle w:val="Heading1"/>
@@ -3056,7 +3064,7 @@
       </w:r>
     </w:p>
     <w:bookmarkEnd w:id="38"/>
-    <w:bookmarkStart w:id="51" w:name="X0cb250eb1df454c6760228a2c04c93ed8beae8a"/>
+    <w:bookmarkStart w:id="55" w:name="X0cb250eb1df454c6760228a2c04c93ed8beae8a"/>
     <w:p>
       <w:pPr>
         <w:pStyle w:val="Heading2"/>
@@ -3526,21 +3534,13 @@
       </w:r>
     </w:p>
     <w:bookmarkEnd w:id="46"/>
-    <w:bookmarkStart w:id="50" w:name="composition-panel"/>
+    <w:bookmarkStart w:id="50" w:name="shared-plot-appearance-controls"/>
     <w:p>
       <w:pPr>
         <w:pStyle w:val="Heading3"/>
       </w:pPr>
       <w:r>
-        <w:t xml:space="preserve">Composition Panel</w:t>
-      </w:r>
-    </w:p>
-    <w:p>
-      <w:pPr>
-        <w:pStyle w:val="FirstParagraph"/>
-      </w:pPr>
-      <w:r>
-        <w:t xml:space="preserve">Recommended steps:</w:t>
+        <w:t xml:space="preserve">Shared plot appearance controls</w:t>
       </w:r>
     </w:p>
     <w:p>
@@ -3552,7 +3552,7 @@
         </w:numPr>
       </w:pPr>
       <w:r>
-        <w:t xml:space="preserve">Click</w:t>
+        <w:t xml:space="preserve">The</w:t>
       </w:r>
       <w:r>
         <w:t xml:space="preserve"> </w:t>
@@ -3562,13 +3562,67 @@
           <w:b/>
           <w:bCs/>
         </w:rPr>
-        <w:t xml:space="preserve">Add to panel</w:t>
-      </w:r>
-      <w:r>
-        <w:t xml:space="preserve"> </w:t>
-      </w:r>
-      <w:r>
-        <w:t xml:space="preserve">from individual plots.</w:t>
+        <w:t xml:space="preserve">Error bar statistic</w:t>
+      </w:r>
+      <w:r>
+        <w:t xml:space="preserve"> </w:t>
+      </w:r>
+      <w:r>
+        <w:t xml:space="preserve">selector controls deviation bars where available:</w:t>
+      </w:r>
+    </w:p>
+    <w:p>
+      <w:pPr>
+        <w:pStyle w:val="Compact"/>
+        <w:numPr>
+          <w:ilvl w:val="1"/>
+          <w:numId w:val="1031"/>
+        </w:numPr>
+      </w:pPr>
+      <w:r>
+        <w:rPr>
+          <w:rStyle w:val="VerbatimChar"/>
+        </w:rPr>
+        <w:t xml:space="preserve">SD</w:t>
+      </w:r>
+      <w:r>
+        <w:t xml:space="preserve">: mean +/- standard deviation.</w:t>
+      </w:r>
+    </w:p>
+    <w:p>
+      <w:pPr>
+        <w:pStyle w:val="Compact"/>
+        <w:numPr>
+          <w:ilvl w:val="1"/>
+          <w:numId w:val="1031"/>
+        </w:numPr>
+      </w:pPr>
+      <w:r>
+        <w:rPr>
+          <w:rStyle w:val="VerbatimChar"/>
+        </w:rPr>
+        <w:t xml:space="preserve">SEM</w:t>
+      </w:r>
+      <w:r>
+        <w:t xml:space="preserve">: mean +/- standard error.</w:t>
+      </w:r>
+    </w:p>
+    <w:p>
+      <w:pPr>
+        <w:pStyle w:val="Compact"/>
+        <w:numPr>
+          <w:ilvl w:val="1"/>
+          <w:numId w:val="1031"/>
+        </w:numPr>
+      </w:pPr>
+      <w:r>
+        <w:rPr>
+          <w:rStyle w:val="VerbatimChar"/>
+        </w:rPr>
+        <w:t xml:space="preserve">Min-Max</w:t>
+      </w:r>
+      <w:r>
+        <w:t xml:space="preserve">: observed minimum to maximum; available only for Boxplot.</w:t>
       </w:r>
     </w:p>
     <w:p>
@@ -3580,7 +3634,7 @@
         </w:numPr>
       </w:pPr>
       <w:r>
-        <w:t xml:space="preserve">Open</w:t>
+        <w:t xml:space="preserve">The collapsible</w:t>
       </w:r>
       <w:r>
         <w:t xml:space="preserve"> </w:t>
@@ -3590,13 +3644,13 @@
           <w:b/>
           <w:bCs/>
         </w:rPr>
-        <w:t xml:space="preserve">Composition Panel</w:t>
-      </w:r>
-      <w:r>
-        <w:t xml:space="preserve"> </w:t>
-      </w:r>
-      <w:r>
-        <w:t xml:space="preserve">tab.</w:t>
+        <w:t xml:space="preserve">Text styling</w:t>
+      </w:r>
+      <w:r>
+        <w:t xml:space="preserve"> </w:t>
+      </w:r>
+      <w:r>
+        <w:t xml:space="preserve">section is available for individual plots.</w:t>
       </w:r>
     </w:p>
     <w:p>
@@ -3608,7 +3662,17 @@
         </w:numPr>
       </w:pPr>
       <w:r>
-        <w:t xml:space="preserve">Select and order plots.</w:t>
+        <w:rPr>
+          <w:b/>
+          <w:bCs/>
+        </w:rPr>
+        <w:t xml:space="preserve">Font family</w:t>
+      </w:r>
+      <w:r>
+        <w:t xml:space="preserve"> </w:t>
+      </w:r>
+      <w:r>
+        <w:t xml:space="preserve">applies to all text in the current graph. Available choices include common publication and system fonts such as Helvetica, Arial, Calibri, Cambria, Segoe UI, Times New Roman, Georgia, Verdana, and related variants.</w:t>
       </w:r>
     </w:p>
     <w:p>
@@ -3620,7 +3684,7 @@
         </w:numPr>
       </w:pPr>
       <w:r>
-        <w:t xml:space="preserve">Configure layout (rows/columns, grid, output size).</w:t>
+        <w:t xml:space="preserve">Bold, italic, and underline are applied independently by text part: plot title, axis titles, axis numbers, legend, data labels, and significance text.</w:t>
       </w:r>
     </w:p>
     <w:p>
@@ -3632,7 +3696,7 @@
         </w:numPr>
       </w:pPr>
       <w:r>
-        <w:t xml:space="preserve">Configure style (legend, fonts, text sizes, palette).</w:t>
+        <w:t xml:space="preserve">Each text part can use its own combination of styles; selecting underline for significance text, for example, does not force underline on the title or legend.</w:t>
       </w:r>
     </w:p>
     <w:p>
@@ -3644,19 +3708,7 @@
         </w:numPr>
       </w:pPr>
       <w:r>
-        <w:t xml:space="preserve">Optionally add rich text and per-plot overrides.</w:t>
-      </w:r>
-    </w:p>
-    <w:p>
-      <w:pPr>
-        <w:pStyle w:val="Compact"/>
-        <w:numPr>
-          <w:ilvl w:val="0"/>
-          <w:numId w:val="1030"/>
-        </w:numPr>
-      </w:pPr>
-      <w:r>
-        <w:t xml:space="preserve">Export to</w:t>
+        <w:t xml:space="preserve">These choices are applied to the plot preview and included in exported</w:t>
       </w:r>
       <w:r>
         <w:t xml:space="preserve"> </w:t>
@@ -3668,19 +3720,10 @@
         <w:t xml:space="preserve">PNG</w:t>
       </w:r>
       <w:r>
-        <w:t xml:space="preserve">,</w:t>
-      </w:r>
-      <w:r>
-        <w:t xml:space="preserve"> </w:t>
-      </w:r>
-      <w:r>
-        <w:rPr>
-          <w:rStyle w:val="VerbatimChar"/>
-        </w:rPr>
-        <w:t xml:space="preserve">PPTX</w:t>
-      </w:r>
-      <w:r>
-        <w:t xml:space="preserve">,</w:t>
+        <w:t xml:space="preserve"> </w:t>
+      </w:r>
+      <w:r>
+        <w:t xml:space="preserve">and</w:t>
       </w:r>
       <w:r>
         <w:t xml:space="preserve"> </w:t>
@@ -3692,7 +3735,10 @@
         <w:t xml:space="preserve">PDF</w:t>
       </w:r>
       <w:r>
-        <w:t xml:space="preserve">.</w:t>
+        <w:t xml:space="preserve"> </w:t>
+      </w:r>
+      <w:r>
+        <w:t xml:space="preserve">files.</w:t>
       </w:r>
     </w:p>
     <w:p>
@@ -3702,20 +3748,297 @@
       <w:r>
         <w:drawing>
           <wp:inline>
-            <wp:extent cx="5334000" cy="2115879"/>
+            <wp:extent cx="3185962" cy="5014762"/>
             <wp:effectExtent b="0" l="0" r="0" t="0"/>
-            <wp:docPr descr="Significance and annotation setup" title="" id="48" name="Picture"/>
+            <wp:docPr descr="Text styling controls" title="" id="48" name="Picture"/>
             <a:graphic>
               <a:graphicData uri="http://schemas.openxmlformats.org/drawingml/2006/picture">
                 <pic:pic>
                   <pic:nvPicPr>
-                    <pic:cNvPr descr="manual_images/10_significance_annotations.png" id="49" name="Picture"/>
+                    <pic:cNvPr descr="manual_images/11_text_styling_controls.png" id="49" name="Picture"/>
                     <pic:cNvPicPr>
                       <a:picLocks noChangeArrowheads="1" noChangeAspect="1"/>
                     </pic:cNvPicPr>
                   </pic:nvPicPr>
                   <pic:blipFill>
                     <a:blip r:embed="rId47"/>
+                    <a:stretch>
+                      <a:fillRect/>
+                    </a:stretch>
+                  </pic:blipFill>
+                  <pic:spPr bwMode="auto">
+                    <a:xfrm>
+                      <a:off x="0" y="0"/>
+                      <a:ext cx="3185962" cy="5014762"/>
+                    </a:xfrm>
+                    <a:prstGeom prst="rect">
+                      <a:avLst/>
+                    </a:prstGeom>
+                    <a:noFill/>
+                    <a:ln w="9525">
+                      <a:noFill/>
+                      <a:headEnd/>
+                      <a:tailEnd/>
+                    </a:ln>
+                  </pic:spPr>
+                </pic:pic>
+              </a:graphicData>
+            </a:graphic>
+          </wp:inline>
+        </w:drawing>
+      </w:r>
+    </w:p>
+    <w:bookmarkEnd w:id="50"/>
+    <w:bookmarkStart w:id="54" w:name="composition-panel"/>
+    <w:p>
+      <w:pPr>
+        <w:pStyle w:val="Heading3"/>
+      </w:pPr>
+      <w:r>
+        <w:t xml:space="preserve">Composition Panel</w:t>
+      </w:r>
+    </w:p>
+    <w:p>
+      <w:pPr>
+        <w:pStyle w:val="FirstParagraph"/>
+      </w:pPr>
+      <w:r>
+        <w:t xml:space="preserve">Recommended steps:</w:t>
+      </w:r>
+    </w:p>
+    <w:p>
+      <w:pPr>
+        <w:pStyle w:val="Compact"/>
+        <w:numPr>
+          <w:ilvl w:val="0"/>
+          <w:numId w:val="1032"/>
+        </w:numPr>
+      </w:pPr>
+      <w:r>
+        <w:t xml:space="preserve">Click</w:t>
+      </w:r>
+      <w:r>
+        <w:t xml:space="preserve"> </w:t>
+      </w:r>
+      <w:r>
+        <w:rPr>
+          <w:b/>
+          <w:bCs/>
+        </w:rPr>
+        <w:t xml:space="preserve">Add to panel</w:t>
+      </w:r>
+      <w:r>
+        <w:t xml:space="preserve"> </w:t>
+      </w:r>
+      <w:r>
+        <w:t xml:space="preserve">from individual plots.</w:t>
+      </w:r>
+    </w:p>
+    <w:p>
+      <w:pPr>
+        <w:pStyle w:val="Compact"/>
+        <w:numPr>
+          <w:ilvl w:val="0"/>
+          <w:numId w:val="1032"/>
+        </w:numPr>
+      </w:pPr>
+      <w:r>
+        <w:t xml:space="preserve">Open</w:t>
+      </w:r>
+      <w:r>
+        <w:t xml:space="preserve"> </w:t>
+      </w:r>
+      <w:r>
+        <w:rPr>
+          <w:b/>
+          <w:bCs/>
+        </w:rPr>
+        <w:t xml:space="preserve">Composition Panel</w:t>
+      </w:r>
+      <w:r>
+        <w:t xml:space="preserve"> </w:t>
+      </w:r>
+      <w:r>
+        <w:t xml:space="preserve">tab.</w:t>
+      </w:r>
+    </w:p>
+    <w:p>
+      <w:pPr>
+        <w:pStyle w:val="Compact"/>
+        <w:numPr>
+          <w:ilvl w:val="0"/>
+          <w:numId w:val="1032"/>
+        </w:numPr>
+      </w:pPr>
+      <w:r>
+        <w:t xml:space="preserve">Select and order plots.</w:t>
+      </w:r>
+    </w:p>
+    <w:p>
+      <w:pPr>
+        <w:pStyle w:val="Compact"/>
+        <w:numPr>
+          <w:ilvl w:val="0"/>
+          <w:numId w:val="1032"/>
+        </w:numPr>
+      </w:pPr>
+      <w:r>
+        <w:t xml:space="preserve">Configure layout (rows/columns, grid, output size).</w:t>
+      </w:r>
+    </w:p>
+    <w:p>
+      <w:pPr>
+        <w:pStyle w:val="Compact"/>
+        <w:numPr>
+          <w:ilvl w:val="0"/>
+          <w:numId w:val="1032"/>
+        </w:numPr>
+      </w:pPr>
+      <w:r>
+        <w:t xml:space="preserve">Configure style (legend mode, legend side, fonts, text sizes, palette).</w:t>
+      </w:r>
+    </w:p>
+    <w:p>
+      <w:pPr>
+        <w:pStyle w:val="Compact"/>
+        <w:numPr>
+          <w:ilvl w:val="0"/>
+          <w:numId w:val="1032"/>
+        </w:numPr>
+      </w:pPr>
+      <w:r>
+        <w:t xml:space="preserve">Optionally add rich text and per-plot overrides.</w:t>
+      </w:r>
+    </w:p>
+    <w:p>
+      <w:pPr>
+        <w:pStyle w:val="Compact"/>
+        <w:numPr>
+          <w:ilvl w:val="0"/>
+          <w:numId w:val="1032"/>
+        </w:numPr>
+      </w:pPr>
+      <w:r>
+        <w:t xml:space="preserve">Export to</w:t>
+      </w:r>
+      <w:r>
+        <w:t xml:space="preserve"> </w:t>
+      </w:r>
+      <w:r>
+        <w:rPr>
+          <w:rStyle w:val="VerbatimChar"/>
+        </w:rPr>
+        <w:t xml:space="preserve">PNG</w:t>
+      </w:r>
+      <w:r>
+        <w:t xml:space="preserve">,</w:t>
+      </w:r>
+      <w:r>
+        <w:t xml:space="preserve"> </w:t>
+      </w:r>
+      <w:r>
+        <w:rPr>
+          <w:rStyle w:val="VerbatimChar"/>
+        </w:rPr>
+        <w:t xml:space="preserve">PPTX</w:t>
+      </w:r>
+      <w:r>
+        <w:t xml:space="preserve">,</w:t>
+      </w:r>
+      <w:r>
+        <w:t xml:space="preserve"> </w:t>
+      </w:r>
+      <w:r>
+        <w:rPr>
+          <w:rStyle w:val="VerbatimChar"/>
+        </w:rPr>
+        <w:t xml:space="preserve">PDF</w:t>
+      </w:r>
+      <w:r>
+        <w:t xml:space="preserve">.</w:t>
+      </w:r>
+    </w:p>
+    <w:p>
+      <w:pPr>
+        <w:pStyle w:val="FirstParagraph"/>
+      </w:pPr>
+      <w:r>
+        <w:t xml:space="preserve">Composition style controls apply in parallel to all selected plots. The composition</w:t>
+      </w:r>
+      <w:r>
+        <w:t xml:space="preserve"> </w:t>
+      </w:r>
+      <w:r>
+        <w:rPr>
+          <w:b/>
+          <w:bCs/>
+        </w:rPr>
+        <w:t xml:space="preserve">Text styling</w:t>
+      </w:r>
+      <w:r>
+        <w:t xml:space="preserve"> </w:t>
+      </w:r>
+      <w:r>
+        <w:t xml:space="preserve">section mirrors the individual plot controls: the font family is applied across all plot text, while bold/italic/underline can be selected separately for titles, axes, legends, data labels, and significance text. Composition exports preserve these settings in</w:t>
+      </w:r>
+      <w:r>
+        <w:t xml:space="preserve"> </w:t>
+      </w:r>
+      <w:r>
+        <w:rPr>
+          <w:rStyle w:val="VerbatimChar"/>
+        </w:rPr>
+        <w:t xml:space="preserve">PNG</w:t>
+      </w:r>
+      <w:r>
+        <w:t xml:space="preserve">,</w:t>
+      </w:r>
+      <w:r>
+        <w:t xml:space="preserve"> </w:t>
+      </w:r>
+      <w:r>
+        <w:rPr>
+          <w:rStyle w:val="VerbatimChar"/>
+        </w:rPr>
+        <w:t xml:space="preserve">PDF</w:t>
+      </w:r>
+      <w:r>
+        <w:t xml:space="preserve">, and</w:t>
+      </w:r>
+      <w:r>
+        <w:t xml:space="preserve"> </w:t>
+      </w:r>
+      <w:r>
+        <w:rPr>
+          <w:rStyle w:val="VerbatimChar"/>
+        </w:rPr>
+        <w:t xml:space="preserve">PPTX</w:t>
+      </w:r>
+      <w:r>
+        <w:t xml:space="preserve">.</w:t>
+      </w:r>
+    </w:p>
+    <w:p>
+      <w:pPr>
+        <w:pStyle w:val="BodyText"/>
+      </w:pPr>
+      <w:r>
+        <w:drawing>
+          <wp:inline>
+            <wp:extent cx="5334000" cy="2115879"/>
+            <wp:effectExtent b="0" l="0" r="0" t="0"/>
+            <wp:docPr descr="Significance and annotation setup" title="" id="52" name="Picture"/>
+            <a:graphic>
+              <a:graphicData uri="http://schemas.openxmlformats.org/drawingml/2006/picture">
+                <pic:pic>
+                  <pic:nvPicPr>
+                    <pic:cNvPr descr="manual_images/10_significance_annotations.png" id="53" name="Picture"/>
+                    <pic:cNvPicPr>
+                      <a:picLocks noChangeArrowheads="1" noChangeAspect="1"/>
+                    </pic:cNvPicPr>
+                  </pic:nvPicPr>
+                  <pic:blipFill>
+                    <a:blip r:embed="rId51"/>
                     <a:stretch>
                       <a:fillRect/>
                     </a:stretch>
@@ -3742,9 +4065,9 @@
         </w:drawing>
       </w:r>
     </w:p>
-    <w:bookmarkEnd w:id="50"/>
-    <w:bookmarkEnd w:id="51"/>
-    <w:bookmarkStart w:id="52" w:name="X115a55130e2baabc52a19ceae26040e6a759372"/>
+    <w:bookmarkEnd w:id="54"/>
+    <w:bookmarkEnd w:id="55"/>
+    <w:bookmarkStart w:id="56" w:name="X115a55130e2baabc52a19ceae26040e6a759372"/>
     <w:p>
       <w:pPr>
         <w:pStyle w:val="Heading2"/>
@@ -3782,7 +4105,7 @@
         <w:pStyle w:val="Compact"/>
         <w:numPr>
           <w:ilvl w:val="0"/>
-          <w:numId w:val="1031"/>
+          <w:numId w:val="1033"/>
         </w:numPr>
       </w:pPr>
       <w:r>
@@ -3809,7 +4132,7 @@
         <w:pStyle w:val="Compact"/>
         <w:numPr>
           <w:ilvl w:val="0"/>
-          <w:numId w:val="1031"/>
+          <w:numId w:val="1033"/>
         </w:numPr>
       </w:pPr>
       <w:r>
@@ -3854,15 +4177,15 @@
         <w:pStyle w:val="Compact"/>
         <w:numPr>
           <w:ilvl w:val="0"/>
-          <w:numId w:val="1031"/>
+          <w:numId w:val="1033"/>
         </w:numPr>
       </w:pPr>
       <w:r>
         <w:t xml:space="preserve">Fallback logic is applied when strict control pairing is not available.</w:t>
       </w:r>
     </w:p>
-    <w:bookmarkEnd w:id="52"/>
-    <w:bookmarkStart w:id="54" w:name="X00c7035554882fbb638d8b5cc72953fcde99525"/>
+    <w:bookmarkEnd w:id="56"/>
+    <w:bookmarkStart w:id="58" w:name="X00c7035554882fbb638d8b5cc72953fcde99525"/>
     <w:p>
       <w:pPr>
         <w:pStyle w:val="Heading2"/>
@@ -3871,7 +4194,7 @@
         <w:t xml:space="preserve">8. Statistics</w:t>
       </w:r>
     </w:p>
-    <w:bookmarkStart w:id="53" w:name="main-statistical-tools"/>
+    <w:bookmarkStart w:id="57" w:name="main-statistical-tools"/>
     <w:p>
       <w:pPr>
         <w:pStyle w:val="Heading3"/>
@@ -3885,7 +4208,7 @@
         <w:pStyle w:val="Compact"/>
         <w:numPr>
           <w:ilvl w:val="0"/>
-          <w:numId w:val="1032"/>
+          <w:numId w:val="1034"/>
         </w:numPr>
       </w:pPr>
       <w:r>
@@ -3906,7 +4229,7 @@
         <w:pStyle w:val="Compact"/>
         <w:numPr>
           <w:ilvl w:val="0"/>
-          <w:numId w:val="1032"/>
+          <w:numId w:val="1034"/>
         </w:numPr>
       </w:pPr>
       <w:r>
@@ -3927,7 +4250,7 @@
         <w:pStyle w:val="Compact"/>
         <w:numPr>
           <w:ilvl w:val="0"/>
-          <w:numId w:val="1032"/>
+          <w:numId w:val="1034"/>
         </w:numPr>
       </w:pPr>
       <w:r>
@@ -3948,7 +4271,7 @@
         <w:pStyle w:val="Compact"/>
         <w:numPr>
           <w:ilvl w:val="0"/>
-          <w:numId w:val="1032"/>
+          <w:numId w:val="1034"/>
         </w:numPr>
       </w:pPr>
       <w:r>
@@ -3969,7 +4292,7 @@
         <w:pStyle w:val="Compact"/>
         <w:numPr>
           <w:ilvl w:val="0"/>
-          <w:numId w:val="1032"/>
+          <w:numId w:val="1034"/>
         </w:numPr>
       </w:pPr>
       <w:r>
@@ -3990,7 +4313,7 @@
         <w:pStyle w:val="Compact"/>
         <w:numPr>
           <w:ilvl w:val="0"/>
-          <w:numId w:val="1032"/>
+          <w:numId w:val="1034"/>
         </w:numPr>
       </w:pPr>
       <w:r>
@@ -4023,7 +4346,7 @@
         <w:pStyle w:val="Compact"/>
         <w:numPr>
           <w:ilvl w:val="0"/>
-          <w:numId w:val="1032"/>
+          <w:numId w:val="1034"/>
         </w:numPr>
       </w:pPr>
       <w:r>
@@ -4044,7 +4367,7 @@
         <w:pStyle w:val="Compact"/>
         <w:numPr>
           <w:ilvl w:val="0"/>
-          <w:numId w:val="1032"/>
+          <w:numId w:val="1034"/>
         </w:numPr>
       </w:pPr>
       <w:r>
@@ -4073,7 +4396,7 @@
         <w:pStyle w:val="Compact"/>
         <w:numPr>
           <w:ilvl w:val="0"/>
-          <w:numId w:val="1033"/>
+          <w:numId w:val="1035"/>
         </w:numPr>
       </w:pPr>
       <w:r>
@@ -4094,7 +4417,7 @@
         <w:pStyle w:val="Compact"/>
         <w:numPr>
           <w:ilvl w:val="0"/>
-          <w:numId w:val="1033"/>
+          <w:numId w:val="1035"/>
         </w:numPr>
       </w:pPr>
       <w:r>
@@ -4115,7 +4438,7 @@
         <w:pStyle w:val="Compact"/>
         <w:numPr>
           <w:ilvl w:val="0"/>
-          <w:numId w:val="1033"/>
+          <w:numId w:val="1035"/>
         </w:numPr>
       </w:pPr>
       <w:r>
@@ -4136,7 +4459,7 @@
         <w:pStyle w:val="Compact"/>
         <w:numPr>
           <w:ilvl w:val="0"/>
-          <w:numId w:val="1033"/>
+          <w:numId w:val="1035"/>
         </w:numPr>
       </w:pPr>
       <w:r>
@@ -4180,317 +4503,357 @@
     </w:p>
     <w:p>
       <w:pPr>
-        <w:pStyle w:val="Compact"/>
-        <w:numPr>
-          <w:ilvl w:val="0"/>
-          <w:numId w:val="1034"/>
-        </w:numPr>
-      </w:pPr>
-      <w:r>
-        <w:rPr>
-          <w:rStyle w:val="VerbatimChar"/>
-        </w:rPr>
-        <w:t xml:space="preserve">S1</w:t>
-      </w:r>
-      <w:r>
-        <w:t xml:space="preserve">:</w:t>
-      </w:r>
-      <w:r>
-        <w:t xml:space="preserve"> </w:t>
-      </w:r>
-      <w:r>
-        <w:rPr>
-          <w:rStyle w:val="VerbatimChar"/>
-        </w:rPr>
-        <w:t xml:space="preserve">stats::lm</w:t>
-      </w:r>
-      <w:r>
-        <w:t xml:space="preserve"> </w:t>
-      </w:r>
-      <w:r>
-        <w:t xml:space="preserve">+</w:t>
-      </w:r>
-      <w:r>
-        <w:t xml:space="preserve"> </w:t>
-      </w:r>
-      <w:r>
-        <w:rPr>
-          <w:rStyle w:val="VerbatimChar"/>
-        </w:rPr>
-        <w:t xml:space="preserve">splines::ns</w:t>
-      </w:r>
-      <w:r>
-        <w:t xml:space="preserve"> </w:t>
-      </w:r>
-      <w:r>
-        <w:t xml:space="preserve">+</w:t>
-      </w:r>
-      <w:r>
-        <w:t xml:space="preserve"> </w:t>
-      </w:r>
-      <w:r>
-        <w:rPr>
-          <w:rStyle w:val="VerbatimChar"/>
-        </w:rPr>
-        <w:t xml:space="preserve">stats::anova</w:t>
-      </w:r>
-    </w:p>
-    <w:p>
-      <w:pPr>
-        <w:pStyle w:val="Compact"/>
-        <w:numPr>
-          <w:ilvl w:val="0"/>
-          <w:numId w:val="1034"/>
-        </w:numPr>
-      </w:pPr>
-      <w:r>
-        <w:rPr>
-          <w:rStyle w:val="VerbatimChar"/>
-        </w:rPr>
-        <w:t xml:space="preserve">S2</w:t>
-      </w:r>
-      <w:r>
-        <w:t xml:space="preserve">:</w:t>
-      </w:r>
-      <w:r>
-        <w:t xml:space="preserve"> </w:t>
-      </w:r>
-      <w:r>
-        <w:rPr>
-          <w:rStyle w:val="VerbatimChar"/>
-        </w:rPr>
-        <w:t xml:space="preserve">stats::pnorm</w:t>
-      </w:r>
-      <w:r>
-        <w:t xml:space="preserve"> </w:t>
-      </w:r>
-      <w:r>
-        <w:t xml:space="preserve">+</w:t>
-      </w:r>
-      <w:r>
-        <w:t xml:space="preserve"> </w:t>
-      </w:r>
-      <w:r>
-        <w:rPr>
-          <w:rStyle w:val="VerbatimChar"/>
-        </w:rPr>
-        <w:t xml:space="preserve">stats::pchisq</w:t>
-      </w:r>
-    </w:p>
-    <w:p>
-      <w:pPr>
-        <w:pStyle w:val="Compact"/>
-        <w:numPr>
-          <w:ilvl w:val="0"/>
-          <w:numId w:val="1034"/>
-        </w:numPr>
-      </w:pPr>
-      <w:r>
-        <w:rPr>
-          <w:rStyle w:val="VerbatimChar"/>
-        </w:rPr>
-        <w:t xml:space="preserve">S3</w:t>
-      </w:r>
-      <w:r>
-        <w:t xml:space="preserve">:</w:t>
-      </w:r>
-      <w:r>
-        <w:t xml:space="preserve"> </w:t>
-      </w:r>
-      <w:r>
-        <w:rPr>
-          <w:rStyle w:val="VerbatimChar"/>
-        </w:rPr>
-        <w:t xml:space="preserve">stats::pnorm</w:t>
-      </w:r>
-    </w:p>
-    <w:p>
-      <w:pPr>
-        <w:pStyle w:val="Compact"/>
-        <w:numPr>
-          <w:ilvl w:val="0"/>
-          <w:numId w:val="1034"/>
-        </w:numPr>
-      </w:pPr>
-      <w:r>
-        <w:rPr>
-          <w:rStyle w:val="VerbatimChar"/>
-        </w:rPr>
-        <w:t xml:space="preserve">S4</w:t>
-      </w:r>
-      <w:r>
-        <w:t xml:space="preserve">:</w:t>
-      </w:r>
-      <w:r>
-        <w:t xml:space="preserve"> </w:t>
-      </w:r>
-      <w:r>
-        <w:rPr>
-          <w:rStyle w:val="VerbatimChar"/>
-        </w:rPr>
-        <w:t xml:space="preserve">gcplyr::auc</w:t>
-      </w:r>
-      <w:r>
-        <w:t xml:space="preserve"> </w:t>
-      </w:r>
-      <w:r>
-        <w:t xml:space="preserve">+ normality-driven comparisons (</w:t>
-      </w:r>
-      <w:r>
-        <w:rPr>
-          <w:rStyle w:val="VerbatimChar"/>
-        </w:rPr>
-        <w:t xml:space="preserve">stats::t.test</w:t>
-      </w:r>
-      <w:r>
-        <w:t xml:space="preserve">,</w:t>
-      </w:r>
-      <w:r>
-        <w:t xml:space="preserve"> </w:t>
-      </w:r>
-      <w:r>
-        <w:rPr>
-          <w:rStyle w:val="VerbatimChar"/>
-        </w:rPr>
-        <w:t xml:space="preserve">stats::wilcox.test</w:t>
-      </w:r>
-      <w:r>
-        <w:t xml:space="preserve">,</w:t>
-      </w:r>
-      <w:r>
-        <w:t xml:space="preserve"> </w:t>
-      </w:r>
-      <w:r>
-        <w:rPr>
-          <w:rStyle w:val="VerbatimChar"/>
-        </w:rPr>
-        <w:t xml:space="preserve">stats::aov</w:t>
-      </w:r>
-      <w:r>
-        <w:t xml:space="preserve">,</w:t>
-      </w:r>
-      <w:r>
-        <w:t xml:space="preserve"> </w:t>
-      </w:r>
-      <w:r>
-        <w:rPr>
-          <w:rStyle w:val="VerbatimChar"/>
-        </w:rPr>
-        <w:t xml:space="preserve">stats::kruskal.test</w:t>
-      </w:r>
-      <w:r>
-        <w:t xml:space="preserve">)</w:t>
-      </w:r>
-    </w:p>
-    <w:p>
-      <w:pPr>
-        <w:pStyle w:val="FirstParagraph"/>
-      </w:pPr>
-      <w:r>
-        <w:t xml:space="preserve">Comparison modes:</w:t>
-      </w:r>
-    </w:p>
-    <w:p>
-      <w:pPr>
-        <w:pStyle w:val="Compact"/>
-        <w:numPr>
-          <w:ilvl w:val="0"/>
-          <w:numId w:val="1035"/>
-        </w:numPr>
-      </w:pPr>
-      <w:r>
-        <w:t xml:space="preserve">All vs all</w:t>
-      </w:r>
-    </w:p>
-    <w:p>
-      <w:pPr>
-        <w:pStyle w:val="Compact"/>
-        <w:numPr>
-          <w:ilvl w:val="0"/>
-          <w:numId w:val="1035"/>
-        </w:numPr>
-      </w:pPr>
-      <w:r>
-        <w:t xml:space="preserve">Control vs all</w:t>
-      </w:r>
-    </w:p>
-    <w:p>
-      <w:pPr>
-        <w:pStyle w:val="Compact"/>
-        <w:numPr>
-          <w:ilvl w:val="0"/>
-          <w:numId w:val="1035"/>
-        </w:numPr>
-      </w:pPr>
-      <w:r>
-        <w:t xml:space="preserve">Pair</w:t>
-      </w:r>
-    </w:p>
-    <w:p>
-      <w:pPr>
-        <w:pStyle w:val="FirstParagraph"/>
-      </w:pPr>
-      <w:r>
-        <w:t xml:space="preserve">P-value correction options:</w:t>
-      </w:r>
-    </w:p>
-    <w:p>
-      <w:pPr>
-        <w:pStyle w:val="Compact"/>
-        <w:numPr>
-          <w:ilvl w:val="0"/>
-          <w:numId w:val="1036"/>
-        </w:numPr>
-      </w:pPr>
-      <w:r>
-        <w:t xml:space="preserve">Holm</w:t>
-      </w:r>
-    </w:p>
-    <w:p>
-      <w:pPr>
-        <w:pStyle w:val="Compact"/>
-        <w:numPr>
-          <w:ilvl w:val="0"/>
-          <w:numId w:val="1036"/>
-        </w:numPr>
-      </w:pPr>
-      <w:r>
-        <w:t xml:space="preserve">FDR</w:t>
-      </w:r>
-    </w:p>
-    <w:p>
-      <w:pPr>
-        <w:pStyle w:val="Compact"/>
-        <w:numPr>
-          <w:ilvl w:val="0"/>
-          <w:numId w:val="1036"/>
-        </w:numPr>
-      </w:pPr>
-      <w:r>
-        <w:t xml:space="preserve">Bonferroni</w:t>
-      </w:r>
-    </w:p>
-    <w:p>
-      <w:pPr>
-        <w:pStyle w:val="Compact"/>
-        <w:numPr>
-          <w:ilvl w:val="0"/>
-          <w:numId w:val="1036"/>
-        </w:numPr>
-      </w:pPr>
-      <w:r>
-        <w:t xml:space="preserve">None</w:t>
-      </w:r>
-    </w:p>
-    <w:p>
-      <w:pPr>
-        <w:pStyle w:val="BlockText"/>
-      </w:pPr>
+        <w:pStyle w:val="BodyText"/>
+      </w:pPr>
+      <w:r>
+        <w:t xml:space="preserve">The</w:t>
+      </w:r>
+      <w:r>
+        <w:t xml:space="preserve"> </w:t>
+      </w:r>
       <w:r>
         <w:rPr>
           <w:b/>
           <w:bCs/>
         </w:rPr>
+        <w:t xml:space="preserve">Curve Statistics</w:t>
+      </w:r>
+      <w:r>
+        <w:t xml:space="preserve"> </w:t>
+      </w:r>
+      <w:r>
+        <w:t xml:space="preserve">accordion appears for Curves plots. Select one or more methods, then click</w:t>
+      </w:r>
+      <w:r>
+        <w:t xml:space="preserve"> </w:t>
+      </w:r>
+      <w:r>
+        <w:rPr>
+          <w:b/>
+          <w:bCs/>
+        </w:rPr>
+        <w:t xml:space="preserve">Run curve statistics</w:t>
+      </w:r>
+      <w:r>
+        <w:t xml:space="preserve"> </w:t>
+      </w:r>
+      <w:r>
+        <w:t xml:space="preserve">to generate the results table.</w:t>
+      </w:r>
+    </w:p>
+    <w:p>
+      <w:pPr>
+        <w:pStyle w:val="Compact"/>
+        <w:numPr>
+          <w:ilvl w:val="0"/>
+          <w:numId w:val="1036"/>
+        </w:numPr>
+      </w:pPr>
+      <w:r>
+        <w:rPr>
+          <w:rStyle w:val="VerbatimChar"/>
+        </w:rPr>
+        <w:t xml:space="preserve">S1</w:t>
+      </w:r>
+      <w:r>
+        <w:t xml:space="preserve">:</w:t>
+      </w:r>
+      <w:r>
+        <w:t xml:space="preserve"> </w:t>
+      </w:r>
+      <w:r>
+        <w:rPr>
+          <w:rStyle w:val="VerbatimChar"/>
+        </w:rPr>
+        <w:t xml:space="preserve">stats::lm</w:t>
+      </w:r>
+      <w:r>
+        <w:t xml:space="preserve"> </w:t>
+      </w:r>
+      <w:r>
+        <w:t xml:space="preserve">+</w:t>
+      </w:r>
+      <w:r>
+        <w:t xml:space="preserve"> </w:t>
+      </w:r>
+      <w:r>
+        <w:rPr>
+          <w:rStyle w:val="VerbatimChar"/>
+        </w:rPr>
+        <w:t xml:space="preserve">splines::ns</w:t>
+      </w:r>
+      <w:r>
+        <w:t xml:space="preserve"> </w:t>
+      </w:r>
+      <w:r>
+        <w:t xml:space="preserve">+</w:t>
+      </w:r>
+      <w:r>
+        <w:t xml:space="preserve"> </w:t>
+      </w:r>
+      <w:r>
+        <w:rPr>
+          <w:rStyle w:val="VerbatimChar"/>
+        </w:rPr>
+        <w:t xml:space="preserve">stats::anova</w:t>
+      </w:r>
+    </w:p>
+    <w:p>
+      <w:pPr>
+        <w:pStyle w:val="Compact"/>
+        <w:numPr>
+          <w:ilvl w:val="0"/>
+          <w:numId w:val="1036"/>
+        </w:numPr>
+      </w:pPr>
+      <w:r>
+        <w:rPr>
+          <w:rStyle w:val="VerbatimChar"/>
+        </w:rPr>
+        <w:t xml:space="preserve">S2</w:t>
+      </w:r>
+      <w:r>
+        <w:t xml:space="preserve">:</w:t>
+      </w:r>
+      <w:r>
+        <w:t xml:space="preserve"> </w:t>
+      </w:r>
+      <w:r>
+        <w:rPr>
+          <w:rStyle w:val="VerbatimChar"/>
+        </w:rPr>
+        <w:t xml:space="preserve">stats::pnorm</w:t>
+      </w:r>
+      <w:r>
+        <w:t xml:space="preserve"> </w:t>
+      </w:r>
+      <w:r>
+        <w:t xml:space="preserve">+</w:t>
+      </w:r>
+      <w:r>
+        <w:t xml:space="preserve"> </w:t>
+      </w:r>
+      <w:r>
+        <w:rPr>
+          <w:rStyle w:val="VerbatimChar"/>
+        </w:rPr>
+        <w:t xml:space="preserve">stats::pchisq</w:t>
+      </w:r>
+    </w:p>
+    <w:p>
+      <w:pPr>
+        <w:pStyle w:val="Compact"/>
+        <w:numPr>
+          <w:ilvl w:val="0"/>
+          <w:numId w:val="1036"/>
+        </w:numPr>
+      </w:pPr>
+      <w:r>
+        <w:rPr>
+          <w:rStyle w:val="VerbatimChar"/>
+        </w:rPr>
+        <w:t xml:space="preserve">S3</w:t>
+      </w:r>
+      <w:r>
+        <w:t xml:space="preserve">:</w:t>
+      </w:r>
+      <w:r>
+        <w:t xml:space="preserve"> </w:t>
+      </w:r>
+      <w:r>
+        <w:rPr>
+          <w:rStyle w:val="VerbatimChar"/>
+        </w:rPr>
+        <w:t xml:space="preserve">stats::pnorm</w:t>
+      </w:r>
+    </w:p>
+    <w:p>
+      <w:pPr>
+        <w:pStyle w:val="Compact"/>
+        <w:numPr>
+          <w:ilvl w:val="0"/>
+          <w:numId w:val="1036"/>
+        </w:numPr>
+      </w:pPr>
+      <w:r>
+        <w:rPr>
+          <w:rStyle w:val="VerbatimChar"/>
+        </w:rPr>
+        <w:t xml:space="preserve">S4</w:t>
+      </w:r>
+      <w:r>
+        <w:t xml:space="preserve">:</w:t>
+      </w:r>
+      <w:r>
+        <w:t xml:space="preserve"> </w:t>
+      </w:r>
+      <w:r>
+        <w:rPr>
+          <w:rStyle w:val="VerbatimChar"/>
+        </w:rPr>
+        <w:t xml:space="preserve">gcplyr::auc</w:t>
+      </w:r>
+      <w:r>
+        <w:t xml:space="preserve"> </w:t>
+      </w:r>
+      <w:r>
+        <w:t xml:space="preserve">+ normality-driven comparisons (</w:t>
+      </w:r>
+      <w:r>
+        <w:rPr>
+          <w:rStyle w:val="VerbatimChar"/>
+        </w:rPr>
+        <w:t xml:space="preserve">stats::t.test</w:t>
+      </w:r>
+      <w:r>
+        <w:t xml:space="preserve">,</w:t>
+      </w:r>
+      <w:r>
+        <w:t xml:space="preserve"> </w:t>
+      </w:r>
+      <w:r>
+        <w:rPr>
+          <w:rStyle w:val="VerbatimChar"/>
+        </w:rPr>
+        <w:t xml:space="preserve">stats::wilcox.test</w:t>
+      </w:r>
+      <w:r>
+        <w:t xml:space="preserve">,</w:t>
+      </w:r>
+      <w:r>
+        <w:t xml:space="preserve"> </w:t>
+      </w:r>
+      <w:r>
+        <w:rPr>
+          <w:rStyle w:val="VerbatimChar"/>
+        </w:rPr>
+        <w:t xml:space="preserve">stats::aov</w:t>
+      </w:r>
+      <w:r>
+        <w:t xml:space="preserve">,</w:t>
+      </w:r>
+      <w:r>
+        <w:t xml:space="preserve"> </w:t>
+      </w:r>
+      <w:r>
+        <w:rPr>
+          <w:rStyle w:val="VerbatimChar"/>
+        </w:rPr>
+        <w:t xml:space="preserve">stats::kruskal.test</w:t>
+      </w:r>
+      <w:r>
+        <w:t xml:space="preserve">)</w:t>
+      </w:r>
+    </w:p>
+    <w:p>
+      <w:pPr>
+        <w:pStyle w:val="FirstParagraph"/>
+      </w:pPr>
+      <w:r>
+        <w:t xml:space="preserve">Comparison modes:</w:t>
+      </w:r>
+    </w:p>
+    <w:p>
+      <w:pPr>
+        <w:pStyle w:val="Compact"/>
+        <w:numPr>
+          <w:ilvl w:val="0"/>
+          <w:numId w:val="1037"/>
+        </w:numPr>
+      </w:pPr>
+      <w:r>
+        <w:t xml:space="preserve">All vs all</w:t>
+      </w:r>
+    </w:p>
+    <w:p>
+      <w:pPr>
+        <w:pStyle w:val="Compact"/>
+        <w:numPr>
+          <w:ilvl w:val="0"/>
+          <w:numId w:val="1037"/>
+        </w:numPr>
+      </w:pPr>
+      <w:r>
+        <w:t xml:space="preserve">Control vs all</w:t>
+      </w:r>
+    </w:p>
+    <w:p>
+      <w:pPr>
+        <w:pStyle w:val="Compact"/>
+        <w:numPr>
+          <w:ilvl w:val="0"/>
+          <w:numId w:val="1037"/>
+        </w:numPr>
+      </w:pPr>
+      <w:r>
+        <w:t xml:space="preserve">Pair</w:t>
+      </w:r>
+    </w:p>
+    <w:p>
+      <w:pPr>
+        <w:pStyle w:val="FirstParagraph"/>
+      </w:pPr>
+      <w:r>
+        <w:t xml:space="preserve">P-value correction options:</w:t>
+      </w:r>
+    </w:p>
+    <w:p>
+      <w:pPr>
+        <w:pStyle w:val="Compact"/>
+        <w:numPr>
+          <w:ilvl w:val="0"/>
+          <w:numId w:val="1038"/>
+        </w:numPr>
+      </w:pPr>
+      <w:r>
+        <w:t xml:space="preserve">Holm</w:t>
+      </w:r>
+    </w:p>
+    <w:p>
+      <w:pPr>
+        <w:pStyle w:val="Compact"/>
+        <w:numPr>
+          <w:ilvl w:val="0"/>
+          <w:numId w:val="1038"/>
+        </w:numPr>
+      </w:pPr>
+      <w:r>
+        <w:t xml:space="preserve">FDR</w:t>
+      </w:r>
+    </w:p>
+    <w:p>
+      <w:pPr>
+        <w:pStyle w:val="Compact"/>
+        <w:numPr>
+          <w:ilvl w:val="0"/>
+          <w:numId w:val="1038"/>
+        </w:numPr>
+      </w:pPr>
+      <w:r>
+        <w:t xml:space="preserve">Bonferroni</w:t>
+      </w:r>
+    </w:p>
+    <w:p>
+      <w:pPr>
+        <w:pStyle w:val="Compact"/>
+        <w:numPr>
+          <w:ilvl w:val="0"/>
+          <w:numId w:val="1038"/>
+        </w:numPr>
+      </w:pPr>
+      <w:r>
+        <w:t xml:space="preserve">None</w:t>
+      </w:r>
+    </w:p>
+    <w:p>
+      <w:pPr>
+        <w:pStyle w:val="BlockText"/>
+      </w:pPr>
+      <w:r>
+        <w:rPr>
+          <w:b/>
+          <w:bCs/>
+        </w:rPr>
         <w:t xml:space="preserve">CAUTION:</w:t>
       </w:r>
       <w:r>
@@ -4515,9 +4878,9 @@
         <w:t xml:space="preserve">and some non-parametric paths that require raw observations are disabled.</w:t>
       </w:r>
     </w:p>
-    <w:bookmarkEnd w:id="53"/>
-    <w:bookmarkEnd w:id="54"/>
-    <w:bookmarkStart w:id="55" w:name="X226b9a1a8acbb38ca74b8f37dcf5f8aa29b93b6"/>
+    <w:bookmarkEnd w:id="57"/>
+    <w:bookmarkEnd w:id="58"/>
+    <w:bookmarkStart w:id="59" w:name="X226b9a1a8acbb38ca74b8f37dcf5f8aa29b93b6"/>
     <w:p>
       <w:pPr>
         <w:pStyle w:val="Heading2"/>
@@ -4539,7 +4902,7 @@
         <w:pStyle w:val="Compact"/>
         <w:numPr>
           <w:ilvl w:val="0"/>
-          <w:numId w:val="1037"/>
+          <w:numId w:val="1039"/>
         </w:numPr>
       </w:pPr>
       <w:r>
@@ -4551,7 +4914,7 @@
         <w:pStyle w:val="Compact"/>
         <w:numPr>
           <w:ilvl w:val="0"/>
-          <w:numId w:val="1037"/>
+          <w:numId w:val="1039"/>
         </w:numPr>
       </w:pPr>
       <w:r>
@@ -4608,7 +4971,7 @@
         <w:pStyle w:val="Compact"/>
         <w:numPr>
           <w:ilvl w:val="0"/>
-          <w:numId w:val="1037"/>
+          <w:numId w:val="1039"/>
         </w:numPr>
       </w:pPr>
       <w:r>
@@ -4628,7 +4991,7 @@
         <w:pStyle w:val="Compact"/>
         <w:numPr>
           <w:ilvl w:val="0"/>
-          <w:numId w:val="1038"/>
+          <w:numId w:val="1040"/>
         </w:numPr>
       </w:pPr>
       <w:r>
@@ -4640,7 +5003,7 @@
         <w:pStyle w:val="Compact"/>
         <w:numPr>
           <w:ilvl w:val="0"/>
-          <w:numId w:val="1038"/>
+          <w:numId w:val="1040"/>
         </w:numPr>
       </w:pPr>
       <w:r>
@@ -4652,7 +5015,7 @@
         <w:pStyle w:val="Compact"/>
         <w:numPr>
           <w:ilvl w:val="0"/>
-          <w:numId w:val="1038"/>
+          <w:numId w:val="1040"/>
         </w:numPr>
       </w:pPr>
       <w:r>
@@ -4688,7 +5051,7 @@
         <w:pStyle w:val="Compact"/>
         <w:numPr>
           <w:ilvl w:val="0"/>
-          <w:numId w:val="1038"/>
+          <w:numId w:val="1040"/>
         </w:numPr>
       </w:pPr>
       <w:r>
@@ -4724,15 +5087,15 @@
         <w:pStyle w:val="Compact"/>
         <w:numPr>
           <w:ilvl w:val="0"/>
-          <w:numId w:val="1038"/>
+          <w:numId w:val="1040"/>
         </w:numPr>
       </w:pPr>
       <w:r>
         <w:t xml:space="preserve">Replace or append annotations.</w:t>
       </w:r>
     </w:p>
-    <w:bookmarkEnd w:id="55"/>
-    <w:bookmarkStart w:id="61" w:name="X74088aaef10aeab96f289eb9220b0777e0698d0"/>
+    <w:bookmarkEnd w:id="59"/>
+    <w:bookmarkStart w:id="65" w:name="X74088aaef10aeab96f289eb9220b0777e0698d0"/>
     <w:p>
       <w:pPr>
         <w:pStyle w:val="Heading2"/>
@@ -4754,7 +5117,7 @@
         <w:pStyle w:val="Compact"/>
         <w:numPr>
           <w:ilvl w:val="0"/>
-          <w:numId w:val="1039"/>
+          <w:numId w:val="1041"/>
         </w:numPr>
       </w:pPr>
       <w:r>
@@ -4766,7 +5129,7 @@
         <w:pStyle w:val="Compact"/>
         <w:numPr>
           <w:ilvl w:val="0"/>
-          <w:numId w:val="1039"/>
+          <w:numId w:val="1041"/>
         </w:numPr>
       </w:pPr>
       <w:r>
@@ -4778,14 +5141,14 @@
         <w:pStyle w:val="Compact"/>
         <w:numPr>
           <w:ilvl w:val="0"/>
-          <w:numId w:val="1039"/>
+          <w:numId w:val="1041"/>
         </w:numPr>
       </w:pPr>
       <w:r>
         <w:t xml:space="preserve">Sample size and replicate coverage.</w:t>
       </w:r>
     </w:p>
-    <w:bookmarkStart w:id="56" w:name="biological-replicates"/>
+    <w:bookmarkStart w:id="60" w:name="biological-replicates"/>
     <w:p>
       <w:pPr>
         <w:pStyle w:val="Heading3"/>
@@ -4799,7 +5162,7 @@
         <w:pStyle w:val="Compact"/>
         <w:numPr>
           <w:ilvl w:val="0"/>
-          <w:numId w:val="1040"/>
+          <w:numId w:val="1042"/>
         </w:numPr>
       </w:pPr>
       <w:r>
@@ -4811,7 +5174,7 @@
         <w:pStyle w:val="Compact"/>
         <w:numPr>
           <w:ilvl w:val="0"/>
-          <w:numId w:val="1040"/>
+          <w:numId w:val="1042"/>
         </w:numPr>
       </w:pPr>
       <w:r>
@@ -4823,7 +5186,7 @@
         <w:pStyle w:val="Compact"/>
         <w:numPr>
           <w:ilvl w:val="0"/>
-          <w:numId w:val="1040"/>
+          <w:numId w:val="1042"/>
         </w:numPr>
       </w:pPr>
       <w:r>
@@ -4843,7 +5206,7 @@
         <w:pStyle w:val="Compact"/>
         <w:numPr>
           <w:ilvl w:val="0"/>
-          <w:numId w:val="1041"/>
+          <w:numId w:val="1043"/>
         </w:numPr>
       </w:pPr>
       <w:r>
@@ -4855,15 +5218,15 @@
         <w:pStyle w:val="Compact"/>
         <w:numPr>
           <w:ilvl w:val="0"/>
-          <w:numId w:val="1041"/>
+          <w:numId w:val="1043"/>
         </w:numPr>
       </w:pPr>
       <w:r>
         <w:t xml:space="preserve">Keeps lowest-score (most reproducible) replicates.</w:t>
       </w:r>
     </w:p>
-    <w:bookmarkEnd w:id="56"/>
-    <w:bookmarkStart w:id="60" w:name="technical-replicates"/>
+    <w:bookmarkEnd w:id="60"/>
+    <w:bookmarkStart w:id="64" w:name="technical-replicates"/>
     <w:p>
       <w:pPr>
         <w:pStyle w:val="Heading3"/>
@@ -4885,7 +5248,7 @@
         <w:pStyle w:val="Compact"/>
         <w:numPr>
           <w:ilvl w:val="0"/>
-          <w:numId w:val="1042"/>
+          <w:numId w:val="1044"/>
         </w:numPr>
       </w:pPr>
       <w:r>
@@ -4897,7 +5260,7 @@
         <w:pStyle w:val="Compact"/>
         <w:numPr>
           <w:ilvl w:val="0"/>
-          <w:numId w:val="1042"/>
+          <w:numId w:val="1044"/>
         </w:numPr>
       </w:pPr>
       <w:r>
@@ -4909,7 +5272,7 @@
         <w:pStyle w:val="Compact"/>
         <w:numPr>
           <w:ilvl w:val="0"/>
-          <w:numId w:val="1042"/>
+          <w:numId w:val="1044"/>
         </w:numPr>
       </w:pPr>
       <w:r>
@@ -4921,7 +5284,7 @@
         <w:pStyle w:val="Compact"/>
         <w:numPr>
           <w:ilvl w:val="0"/>
-          <w:numId w:val="1042"/>
+          <w:numId w:val="1044"/>
         </w:numPr>
       </w:pPr>
       <w:r>
@@ -4933,7 +5296,7 @@
         <w:pStyle w:val="Compact"/>
         <w:numPr>
           <w:ilvl w:val="0"/>
-          <w:numId w:val="1042"/>
+          <w:numId w:val="1044"/>
         </w:numPr>
       </w:pPr>
       <w:r>
@@ -4949,18 +5312,18 @@
           <wp:inline>
             <wp:extent cx="5334000" cy="2228174"/>
             <wp:effectExtent b="0" l="0" r="0" t="0"/>
-            <wp:docPr descr="Biological replicate filtering" title="" id="58" name="Picture"/>
+            <wp:docPr descr="Biological replicate filtering" title="" id="62" name="Picture"/>
             <a:graphic>
               <a:graphicData uri="http://schemas.openxmlformats.org/drawingml/2006/picture">
                 <pic:pic>
                   <pic:nvPicPr>
-                    <pic:cNvPr descr="manual_images/04_filter_biological_replicates.png" id="59" name="Picture"/>
+                    <pic:cNvPr descr="manual_images/04_filter_biological_replicates.png" id="63" name="Picture"/>
                     <pic:cNvPicPr>
                       <a:picLocks noChangeArrowheads="1" noChangeAspect="1"/>
                     </pic:cNvPicPr>
                   </pic:nvPicPr>
                   <pic:blipFill>
-                    <a:blip r:embed="rId57"/>
+                    <a:blip r:embed="rId61"/>
                     <a:stretch>
                       <a:fillRect/>
                     </a:stretch>
@@ -4987,9 +5350,9 @@
         </w:drawing>
       </w:r>
     </w:p>
-    <w:bookmarkEnd w:id="60"/>
-    <w:bookmarkEnd w:id="61"/>
-    <w:bookmarkStart w:id="62" w:name="X027b5303909c1c711c784491c3eab67dd715d28"/>
+    <w:bookmarkEnd w:id="64"/>
+    <w:bookmarkEnd w:id="65"/>
+    <w:bookmarkStart w:id="66" w:name="X027b5303909c1c711c784491c3eab67dd715d28"/>
     <w:p>
       <w:pPr>
         <w:pStyle w:val="Heading2"/>
@@ -5011,7 +5374,7 @@
         <w:pStyle w:val="Compact"/>
         <w:numPr>
           <w:ilvl w:val="0"/>
-          <w:numId w:val="1043"/>
+          <w:numId w:val="1045"/>
         </w:numPr>
       </w:pPr>
       <w:r>
@@ -5033,7 +5396,7 @@
         <w:pStyle w:val="Compact"/>
         <w:numPr>
           <w:ilvl w:val="0"/>
-          <w:numId w:val="1043"/>
+          <w:numId w:val="1045"/>
         </w:numPr>
       </w:pPr>
       <w:r>
@@ -5045,7 +5408,7 @@
         <w:pStyle w:val="Compact"/>
         <w:numPr>
           <w:ilvl w:val="0"/>
-          <w:numId w:val="1043"/>
+          <w:numId w:val="1045"/>
         </w:numPr>
       </w:pPr>
       <w:r>
@@ -5054,6 +5417,18 @@
     </w:p>
     <w:p>
       <w:pPr>
+        <w:pStyle w:val="Compact"/>
+        <w:numPr>
+          <w:ilvl w:val="0"/>
+          <w:numId w:val="1045"/>
+        </w:numPr>
+      </w:pPr>
+      <w:r>
+        <w:t xml:space="preserve">Plot typography choices, error-bar statistic, and curve-statistics method selection persist across metadata roundtrip.</w:t>
+      </w:r>
+    </w:p>
+    <w:p>
+      <w:pPr>
         <w:pStyle w:val="FirstParagraph"/>
       </w:pPr>
       <w:r>
@@ -5065,7 +5440,7 @@
         <w:pStyle w:val="Compact"/>
         <w:numPr>
           <w:ilvl w:val="0"/>
-          <w:numId w:val="1044"/>
+          <w:numId w:val="1046"/>
         </w:numPr>
       </w:pPr>
       <w:r>
@@ -5077,7 +5452,7 @@
         <w:pStyle w:val="Compact"/>
         <w:numPr>
           <w:ilvl w:val="0"/>
-          <w:numId w:val="1044"/>
+          <w:numId w:val="1046"/>
         </w:numPr>
       </w:pPr>
       <w:r>
@@ -5089,7 +5464,7 @@
         <w:pStyle w:val="Compact"/>
         <w:numPr>
           <w:ilvl w:val="0"/>
-          <w:numId w:val="1044"/>
+          <w:numId w:val="1046"/>
         </w:numPr>
       </w:pPr>
       <w:r>
@@ -5109,7 +5484,7 @@
         <w:pStyle w:val="Compact"/>
         <w:numPr>
           <w:ilvl w:val="0"/>
-          <w:numId w:val="1045"/>
+          <w:numId w:val="1047"/>
         </w:numPr>
       </w:pPr>
       <w:r>
@@ -5121,7 +5496,7 @@
         <w:pStyle w:val="Compact"/>
         <w:numPr>
           <w:ilvl w:val="0"/>
-          <w:numId w:val="1045"/>
+          <w:numId w:val="1047"/>
         </w:numPr>
       </w:pPr>
       <w:r>
@@ -5133,15 +5508,15 @@
         <w:pStyle w:val="Compact"/>
         <w:numPr>
           <w:ilvl w:val="0"/>
-          <w:numId w:val="1045"/>
+          <w:numId w:val="1047"/>
         </w:numPr>
       </w:pPr>
       <w:r>
         <w:t xml:space="preserve">Final builder orientation checks.</w:t>
       </w:r>
     </w:p>
-    <w:bookmarkEnd w:id="62"/>
-    <w:bookmarkStart w:id="63" w:name="Xdaccffce00e124c4dc2e12129d423a1de5e7d51"/>
+    <w:bookmarkEnd w:id="66"/>
+    <w:bookmarkStart w:id="67" w:name="Xdaccffce00e124c4dc2e12129d423a1de5e7d51"/>
     <w:p>
       <w:pPr>
         <w:pStyle w:val="Heading2"/>
@@ -5163,7 +5538,7 @@
         <w:pStyle w:val="Compact"/>
         <w:numPr>
           <w:ilvl w:val="0"/>
-          <w:numId w:val="1046"/>
+          <w:numId w:val="1048"/>
         </w:numPr>
       </w:pPr>
       <w:r>
@@ -5196,7 +5571,7 @@
         <w:pStyle w:val="Compact"/>
         <w:numPr>
           <w:ilvl w:val="0"/>
-          <w:numId w:val="1046"/>
+          <w:numId w:val="1048"/>
         </w:numPr>
       </w:pPr>
       <w:r>
@@ -5208,7 +5583,7 @@
         <w:pStyle w:val="Compact"/>
         <w:numPr>
           <w:ilvl w:val="0"/>
-          <w:numId w:val="1046"/>
+          <w:numId w:val="1048"/>
         </w:numPr>
       </w:pPr>
       <w:r>
@@ -5220,7 +5595,7 @@
         <w:pStyle w:val="Compact"/>
         <w:numPr>
           <w:ilvl w:val="0"/>
-          <w:numId w:val="1046"/>
+          <w:numId w:val="1048"/>
         </w:numPr>
       </w:pPr>
       <w:r>
@@ -5232,7 +5607,7 @@
         <w:pStyle w:val="Compact"/>
         <w:numPr>
           <w:ilvl w:val="0"/>
-          <w:numId w:val="1046"/>
+          <w:numId w:val="1048"/>
         </w:numPr>
       </w:pPr>
       <w:r>
@@ -5244,7 +5619,7 @@
         <w:pStyle w:val="Compact"/>
         <w:numPr>
           <w:ilvl w:val="0"/>
-          <w:numId w:val="1046"/>
+          <w:numId w:val="1048"/>
         </w:numPr>
       </w:pPr>
       <w:r>
@@ -5256,15 +5631,23 @@
         <w:pStyle w:val="Compact"/>
         <w:numPr>
           <w:ilvl w:val="0"/>
-          <w:numId w:val="1046"/>
+          <w:numId w:val="1048"/>
         </w:numPr>
       </w:pPr>
       <w:r>
         <w:t xml:space="preserve">Merged platemap/curves exports (if merge tools were used).</w:t>
       </w:r>
     </w:p>
-    <w:bookmarkEnd w:id="63"/>
-    <w:bookmarkStart w:id="67" w:name="Xe593582c9f00b53676a004fd4095b4d203d92ef"/>
+    <w:p>
+      <w:pPr>
+        <w:pStyle w:val="FirstParagraph"/>
+      </w:pPr>
+      <w:r>
+        <w:t xml:space="preserve">Plot exports preserve the active visual configuration, including font family, per-text-part bold/italic/underline choices, selected error-bar statistic, significance labels, and axis/legend settings. Composition exports preserve the same typography controls across all plots in the layout.</w:t>
+      </w:r>
+    </w:p>
+    <w:bookmarkEnd w:id="67"/>
+    <w:bookmarkStart w:id="71" w:name="Xe593582c9f00b53676a004fd4095b4d203d92ef"/>
     <w:p>
       <w:pPr>
         <w:pStyle w:val="Heading2"/>
@@ -5286,7 +5669,7 @@
         <w:pStyle w:val="Compact"/>
         <w:numPr>
           <w:ilvl w:val="0"/>
-          <w:numId w:val="1047"/>
+          <w:numId w:val="1049"/>
         </w:numPr>
       </w:pPr>
       <w:r>
@@ -5322,7 +5705,7 @@
         <w:pStyle w:val="Compact"/>
         <w:numPr>
           <w:ilvl w:val="0"/>
-          <w:numId w:val="1047"/>
+          <w:numId w:val="1049"/>
         </w:numPr>
       </w:pPr>
       <w:r>
@@ -5334,7 +5717,7 @@
         <w:pStyle w:val="Compact"/>
         <w:numPr>
           <w:ilvl w:val="1"/>
-          <w:numId w:val="1048"/>
+          <w:numId w:val="1050"/>
         </w:numPr>
       </w:pPr>
       <w:r>
@@ -5358,7 +5741,7 @@
         <w:pStyle w:val="Compact"/>
         <w:numPr>
           <w:ilvl w:val="1"/>
-          <w:numId w:val="1048"/>
+          <w:numId w:val="1050"/>
         </w:numPr>
       </w:pPr>
       <w:r>
@@ -5393,7 +5776,7 @@
         <w:pStyle w:val="Compact"/>
         <w:numPr>
           <w:ilvl w:val="0"/>
-          <w:numId w:val="1049"/>
+          <w:numId w:val="1051"/>
         </w:numPr>
       </w:pPr>
       <w:r>
@@ -5411,7 +5794,7 @@
         <w:pStyle w:val="Compact"/>
         <w:numPr>
           <w:ilvl w:val="0"/>
-          <w:numId w:val="1049"/>
+          <w:numId w:val="1051"/>
         </w:numPr>
       </w:pPr>
       <w:r>
@@ -5429,7 +5812,7 @@
         <w:pStyle w:val="Compact"/>
         <w:numPr>
           <w:ilvl w:val="0"/>
-          <w:numId w:val="1049"/>
+          <w:numId w:val="1051"/>
         </w:numPr>
       </w:pPr>
       <w:r>
@@ -5456,7 +5839,7 @@
         <w:pStyle w:val="Compact"/>
         <w:numPr>
           <w:ilvl w:val="0"/>
-          <w:numId w:val="1049"/>
+          <w:numId w:val="1051"/>
         </w:numPr>
       </w:pPr>
       <w:r>
@@ -5474,7 +5857,7 @@
         <w:pStyle w:val="Compact"/>
         <w:numPr>
           <w:ilvl w:val="0"/>
-          <w:numId w:val="1049"/>
+          <w:numId w:val="1051"/>
         </w:numPr>
       </w:pPr>
       <w:r>
@@ -5492,7 +5875,7 @@
         <w:pStyle w:val="Compact"/>
         <w:numPr>
           <w:ilvl w:val="0"/>
-          <w:numId w:val="1049"/>
+          <w:numId w:val="1051"/>
         </w:numPr>
       </w:pPr>
       <w:r>
@@ -5522,7 +5905,7 @@
         <w:pStyle w:val="Compact"/>
         <w:numPr>
           <w:ilvl w:val="0"/>
-          <w:numId w:val="1049"/>
+          <w:numId w:val="1051"/>
         </w:numPr>
       </w:pPr>
       <w:r>
@@ -5548,7 +5931,7 @@
         <w:pStyle w:val="Compact"/>
         <w:numPr>
           <w:ilvl w:val="0"/>
-          <w:numId w:val="1050"/>
+          <w:numId w:val="1052"/>
         </w:numPr>
       </w:pPr>
       <w:r>
@@ -5560,7 +5943,7 @@
         <w:pStyle w:val="Compact"/>
         <w:numPr>
           <w:ilvl w:val="0"/>
-          <w:numId w:val="1050"/>
+          <w:numId w:val="1052"/>
         </w:numPr>
       </w:pPr>
       <w:r>
@@ -5572,7 +5955,7 @@
         <w:pStyle w:val="Compact"/>
         <w:numPr>
           <w:ilvl w:val="0"/>
-          <w:numId w:val="1050"/>
+          <w:numId w:val="1052"/>
         </w:numPr>
       </w:pPr>
       <w:r>
@@ -5584,7 +5967,7 @@
         <w:pStyle w:val="Compact"/>
         <w:numPr>
           <w:ilvl w:val="0"/>
-          <w:numId w:val="1050"/>
+          <w:numId w:val="1052"/>
         </w:numPr>
       </w:pPr>
       <w:r>
@@ -5596,7 +5979,7 @@
         <w:pStyle w:val="Compact"/>
         <w:numPr>
           <w:ilvl w:val="0"/>
-          <w:numId w:val="1050"/>
+          <w:numId w:val="1052"/>
         </w:numPr>
       </w:pPr>
       <w:r>
@@ -5612,18 +5995,18 @@
           <wp:inline>
             <wp:extent cx="5334000" cy="2011947"/>
             <wp:effectExtent b="0" l="0" r="0" t="0"/>
-            <wp:docPr descr="Growth workflow" title="" id="65" name="Picture"/>
+            <wp:docPr descr="Growth workflow" title="" id="69" name="Picture"/>
             <a:graphic>
               <a:graphicData uri="http://schemas.openxmlformats.org/drawingml/2006/picture">
                 <pic:pic>
                   <pic:nvPicPr>
-                    <pic:cNvPr descr="manual_images/13_growth_parameters_workflow.png" id="66" name="Picture"/>
+                    <pic:cNvPr descr="manual_images/13_growth_parameters_workflow.png" id="70" name="Picture"/>
                     <pic:cNvPicPr>
                       <a:picLocks noChangeArrowheads="1" noChangeAspect="1"/>
                     </pic:cNvPicPr>
                   </pic:nvPicPr>
                   <pic:blipFill>
-                    <a:blip r:embed="rId64"/>
+                    <a:blip r:embed="rId68"/>
                     <a:stretch>
                       <a:fillRect/>
                     </a:stretch>
@@ -5650,8 +6033,8 @@
         </w:drawing>
       </w:r>
     </w:p>
-    <w:bookmarkEnd w:id="67"/>
-    <w:bookmarkStart w:id="68" w:name="X412317ec57e4cfdc618c120090edd958d43de49"/>
+    <w:bookmarkEnd w:id="71"/>
+    <w:bookmarkStart w:id="72" w:name="X412317ec57e4cfdc618c120090edd958d43de49"/>
     <w:p>
       <w:pPr>
         <w:pStyle w:val="Heading2"/>
@@ -5664,7 +6047,7 @@
       <w:pPr>
         <w:numPr>
           <w:ilvl w:val="0"/>
-          <w:numId w:val="1051"/>
+          <w:numId w:val="1053"/>
         </w:numPr>
       </w:pPr>
       <w:r>
@@ -5691,7 +6074,7 @@
       <w:pPr>
         <w:numPr>
           <w:ilvl w:val="0"/>
-          <w:numId w:val="1051"/>
+          <w:numId w:val="1053"/>
         </w:numPr>
       </w:pPr>
       <w:r>
@@ -5718,7 +6101,7 @@
       <w:pPr>
         <w:numPr>
           <w:ilvl w:val="0"/>
-          <w:numId w:val="1051"/>
+          <w:numId w:val="1053"/>
         </w:numPr>
       </w:pPr>
       <w:r>
@@ -5745,7 +6128,7 @@
       <w:pPr>
         <w:numPr>
           <w:ilvl w:val="0"/>
-          <w:numId w:val="1051"/>
+          <w:numId w:val="1053"/>
         </w:numPr>
       </w:pPr>
       <w:r>
@@ -5772,7 +6155,7 @@
       <w:pPr>
         <w:numPr>
           <w:ilvl w:val="0"/>
-          <w:numId w:val="1051"/>
+          <w:numId w:val="1053"/>
         </w:numPr>
       </w:pPr>
       <w:r>
@@ -5799,7 +6182,7 @@
       <w:pPr>
         <w:numPr>
           <w:ilvl w:val="0"/>
-          <w:numId w:val="1051"/>
+          <w:numId w:val="1053"/>
         </w:numPr>
       </w:pPr>
       <w:r>
@@ -5841,7 +6224,7 @@
       <w:pPr>
         <w:numPr>
           <w:ilvl w:val="0"/>
-          <w:numId w:val="1051"/>
+          <w:numId w:val="1053"/>
         </w:numPr>
       </w:pPr>
       <w:r>
@@ -5896,7 +6279,7 @@
       <w:pPr>
         <w:numPr>
           <w:ilvl w:val="0"/>
-          <w:numId w:val="1051"/>
+          <w:numId w:val="1053"/>
         </w:numPr>
       </w:pPr>
       <w:r>
@@ -5923,7 +6306,7 @@
       <w:pPr>
         <w:numPr>
           <w:ilvl w:val="0"/>
-          <w:numId w:val="1051"/>
+          <w:numId w:val="1053"/>
         </w:numPr>
       </w:pPr>
       <w:r>
@@ -5946,8 +6329,8 @@
         <w:t xml:space="preserve">What to do: Reduce active parameters and heavy layers.</w:t>
       </w:r>
     </w:p>
-    <w:bookmarkEnd w:id="68"/>
-    <w:bookmarkStart w:id="69" w:name="Xcd58510a2561031e4603a64a38bc819a9ac6e6a"/>
+    <w:bookmarkEnd w:id="72"/>
+    <w:bookmarkStart w:id="73" w:name="Xcd58510a2561031e4603a64a38bc819a9ac6e6a"/>
     <w:p>
       <w:pPr>
         <w:pStyle w:val="Heading2"/>
@@ -5973,8 +6356,8 @@
         <w:t xml:space="preserve">bioszenf@gmail.com</w:t>
       </w:r>
     </w:p>
-    <w:bookmarkEnd w:id="69"/>
-    <w:bookmarkEnd w:id="70"/>
+    <w:bookmarkEnd w:id="73"/>
+    <w:bookmarkEnd w:id="74"/>
     <w:sectPr>
       <w:footnotePr>
         <w:numRestart w:val="eachSect"/>
@@ -6472,6 +6855,12 @@
     <w:abstractNumId w:val="991"/>
   </w:num>
   <w:num w:numId="1030">
+    <w:abstractNumId w:val="991"/>
+  </w:num>
+  <w:num w:numId="1031">
+    <w:abstractNumId w:val="991"/>
+  </w:num>
+  <w:num w:numId="1032">
     <w:abstractNumId w:val="99411"/>
     <w:lvlOverride w:ilvl="0">
       <w:startOverride w:val="1"/>
@@ -6501,12 +6890,6 @@
       <w:startOverride w:val="1"/>
     </w:lvlOverride>
   </w:num>
-  <w:num w:numId="1031">
-    <w:abstractNumId w:val="991"/>
-  </w:num>
-  <w:num w:numId="1032">
-    <w:abstractNumId w:val="991"/>
-  </w:num>
   <w:num w:numId="1033">
     <w:abstractNumId w:val="991"/>
   </w:num>
@@ -6520,6 +6903,12 @@
     <w:abstractNumId w:val="991"/>
   </w:num>
   <w:num w:numId="1037">
+    <w:abstractNumId w:val="991"/>
+  </w:num>
+  <w:num w:numId="1038">
+    <w:abstractNumId w:val="991"/>
+  </w:num>
+  <w:num w:numId="1039">
     <w:abstractNumId w:val="99411"/>
     <w:lvlOverride w:ilvl="0">
       <w:startOverride w:val="1"/>
@@ -6549,7 +6938,7 @@
       <w:startOverride w:val="1"/>
     </w:lvlOverride>
   </w:num>
-  <w:num w:numId="1038">
+  <w:num w:numId="1040">
     <w:abstractNumId w:val="99411"/>
     <w:lvlOverride w:ilvl="0">
       <w:startOverride w:val="1"/>
@@ -6579,12 +6968,6 @@
       <w:startOverride w:val="1"/>
     </w:lvlOverride>
   </w:num>
-  <w:num w:numId="1039">
-    <w:abstractNumId w:val="991"/>
-  </w:num>
-  <w:num w:numId="1040">
-    <w:abstractNumId w:val="991"/>
-  </w:num>
   <w:num w:numId="1041">
     <w:abstractNumId w:val="991"/>
   </w:num>
@@ -6613,6 +6996,12 @@
     <w:abstractNumId w:val="991"/>
   </w:num>
   <w:num w:numId="1050">
+    <w:abstractNumId w:val="991"/>
+  </w:num>
+  <w:num w:numId="1051">
+    <w:abstractNumId w:val="991"/>
+  </w:num>
+  <w:num w:numId="1052">
     <w:abstractNumId w:val="99411"/>
     <w:lvlOverride w:ilvl="0">
       <w:startOverride w:val="1"/>
@@ -6642,7 +7031,7 @@
       <w:startOverride w:val="1"/>
     </w:lvlOverride>
   </w:num>
-  <w:num w:numId="1051">
+  <w:num w:numId="1053">
     <w:abstractNumId w:val="991"/>
   </w:num>
 </w:numbering>

</xml_diff>

<commit_message>
Prepare BIOSZEN 2.0.3 release
</commit_message>
<xml_diff>
--- a/inst/app/www/MANUAL_EN.docx
+++ b/inst/app/www/MANUAL_EN.docx
@@ -2,23 +2,15 @@
 <file path=word/document.xml><?xml version="1.0" encoding="utf-8"?>
 <w:document xmlns:w="http://schemas.openxmlformats.org/wordprocessingml/2006/main" xmlns:m="http://schemas.openxmlformats.org/officeDocument/2006/math" xmlns:r="http://schemas.openxmlformats.org/officeDocument/2006/relationships" xmlns:o="urn:schemas-microsoft-com:office:office" xmlns:v="urn:schemas-microsoft-com:vml" xmlns:w10="urn:schemas-microsoft-com:office:word" xmlns:a="http://schemas.openxmlformats.org/drawingml/2006/main" xmlns:pic="http://schemas.openxmlformats.org/drawingml/2006/picture" xmlns:wp="http://schemas.openxmlformats.org/drawingml/2006/wordprocessingDrawing">
   <w:body>
-    <w:p>
-      <w:pPr>
-        <w:pStyle w:val="Title"/>
+    <w:bookmarkStart w:id="74" w:name="bioszen-user-manual-english"/>
+    <w:p>
+      <w:pPr>
+        <w:pStyle w:val="Heading1"/>
       </w:pPr>
       <w:r>
         <w:t xml:space="preserve">BIOSZEN User Manual (English)</w:t>
       </w:r>
     </w:p>
-    <w:bookmarkStart w:id="74" w:name="bioszen-user-manual-english"/>
-    <w:p>
-      <w:pPr>
-        <w:pStyle w:val="Heading1"/>
-      </w:pPr>
-      <w:r>
-        <w:t xml:space="preserve">BIOSZEN User Manual (English)</w:t>
-      </w:r>
-    </w:p>
     <w:p>
       <w:pPr>
         <w:pStyle w:val="FirstParagraph"/>
@@ -29,7 +21,7 @@
     </w:p>
     <w:p>
       <w:pPr>
-        <w:pStyle w:val="BodyText"/>
+        <w:pStyle w:val="CaptionedFigure"/>
       </w:pPr>
       <w:r>
         <w:drawing>
@@ -76,6 +68,14 @@
     </w:p>
     <w:p>
       <w:pPr>
+        <w:pStyle w:val="ImageCaption"/>
+      </w:pPr>
+      <w:r>
+        <w:t xml:space="preserve">BIOSZEN app overview</w:t>
+      </w:r>
+    </w:p>
+    <w:p>
+      <w:pPr>
         <w:pStyle w:val="BlockText"/>
       </w:pPr>
       <w:r>
@@ -391,7 +391,7 @@
       </w:hyperlink>
     </w:p>
     <w:bookmarkEnd w:id="12"/>
-    <w:bookmarkStart w:id="17" w:name="Xcc802c028399c90ef506226ebaf5d25e7c22381"/>
+    <w:bookmarkStart w:id="17" w:name="before-you-start"/>
     <w:p>
       <w:pPr>
         <w:pStyle w:val="Heading2"/>
@@ -775,7 +775,7 @@
       </w:r>
     </w:p>
     <w:bookmarkEnd w:id="17"/>
-    <w:bookmarkStart w:id="24" w:name="X717faac405ee7bcb1499a96623efaf8a5d1ee47"/>
+    <w:bookmarkStart w:id="24" w:name="fast-start-by-scenario"/>
     <w:p>
       <w:pPr>
         <w:pStyle w:val="Heading2"/>
@@ -1038,7 +1038,7 @@
     </w:p>
     <w:p>
       <w:pPr>
-        <w:pStyle w:val="FirstParagraph"/>
+        <w:pStyle w:val="CaptionedFigure"/>
       </w:pPr>
       <w:r>
         <w:drawing>
@@ -1083,9 +1083,17 @@
         </w:drawing>
       </w:r>
     </w:p>
+    <w:p>
+      <w:pPr>
+        <w:pStyle w:val="ImageCaption"/>
+      </w:pPr>
+      <w:r>
+        <w:t xml:space="preserve">Plot setup and layers</w:t>
+      </w:r>
+    </w:p>
     <w:bookmarkEnd w:id="23"/>
     <w:bookmarkEnd w:id="24"/>
-    <w:bookmarkStart w:id="25" w:name="X128ed19147767cebcf7cb23c4bcc70881f470f9"/>
+    <w:bookmarkStart w:id="25" w:name="choose-an-input-mode"/>
     <w:p>
       <w:pPr>
         <w:pStyle w:val="Heading2"/>
@@ -1240,7 +1248,7 @@
       </w:r>
     </w:p>
     <w:bookmarkEnd w:id="25"/>
-    <w:bookmarkStart w:id="34" w:name="X6b8972cbac599c5fedbf83a48be69951ca6b7c8"/>
+    <w:bookmarkStart w:id="34" w:name="input-specifications"/>
     <w:p>
       <w:pPr>
         <w:pStyle w:val="Heading2"/>
@@ -1249,7 +1257,7 @@
         <w:t xml:space="preserve">4. Input Specifications</w:t>
       </w:r>
     </w:p>
-    <w:bookmarkStart w:id="26" w:name="X0605fe61617601d5dc607a15bb9e5babb26d0bd"/>
+    <w:bookmarkStart w:id="26" w:name="platemap-workbook"/>
     <w:p>
       <w:pPr>
         <w:pStyle w:val="Heading3"/>
@@ -1463,7 +1471,7 @@
         <w:t xml:space="preserve">3</w:t>
       </w:r>
       <w:r>
-        <w:t xml:space="preserve">, ...).</w:t>
+        <w:t xml:space="preserve">, …).</w:t>
       </w:r>
     </w:p>
     <w:p>
@@ -1759,7 +1767,7 @@
       </w:r>
     </w:p>
     <w:bookmarkEnd w:id="26"/>
-    <w:bookmarkStart w:id="27" w:name="Xe43541bf07e4c62d7d45bf62912f7f89f9c08e5"/>
+    <w:bookmarkStart w:id="27" w:name="curves-file"/>
     <w:p>
       <w:pPr>
         <w:pStyle w:val="Heading3"/>
@@ -1845,7 +1853,7 @@
         <w:t xml:space="preserve">A2</w:t>
       </w:r>
       <w:r>
-        <w:t xml:space="preserve">, ...).</w:t>
+        <w:t xml:space="preserve">, …).</w:t>
       </w:r>
     </w:p>
     <w:p>
@@ -1997,7 +2005,7 @@
         <w:t xml:space="preserve">A2</w:t>
       </w:r>
       <w:r>
-        <w:t xml:space="preserve">, ...).</w:t>
+        <w:t xml:space="preserve">, …).</w:t>
       </w:r>
     </w:p>
     <w:p>
@@ -2154,7 +2162,7 @@
       </w:r>
     </w:p>
     <w:bookmarkEnd w:id="27"/>
-    <w:bookmarkStart w:id="28" w:name="X239cbd4a8b7be852666d20878604d0d97369a89"/>
+    <w:bookmarkStart w:id="28" w:name="grouped-parameters-mode"/>
     <w:p>
       <w:pPr>
         <w:pStyle w:val="Heading3"/>
@@ -2221,7 +2229,7 @@
         <w:t xml:space="preserve">Parametro_2</w:t>
       </w:r>
       <w:r>
-        <w:t xml:space="preserve">, ...).</w:t>
+        <w:t xml:space="preserve">, …).</w:t>
       </w:r>
     </w:p>
     <w:p>
@@ -2278,7 +2286,7 @@
       </w:r>
     </w:p>
     <w:bookmarkEnd w:id="28"/>
-    <w:bookmarkStart w:id="29" w:name="Xcbadc8a632b74252ecce5f0e02c8d2548229bde"/>
+    <w:bookmarkStart w:id="29" w:name="summary-mode"/>
     <w:p>
       <w:pPr>
         <w:pStyle w:val="Heading3"/>
@@ -2497,7 +2505,7 @@
       </w:r>
     </w:p>
     <w:bookmarkEnd w:id="29"/>
-    <w:bookmarkStart w:id="30" w:name="X9b6d5804ff663a0063e2ffa1f700ec485883876"/>
+    <w:bookmarkStart w:id="30" w:name="csv-mode"/>
     <w:p>
       <w:pPr>
         <w:pStyle w:val="Heading3"/>
@@ -2638,7 +2646,7 @@
       </w:r>
     </w:p>
     <w:bookmarkEnd w:id="30"/>
-    <w:bookmarkStart w:id="33" w:name="X2bee644eb2d3a5adf897f34f1e02f1d8c3b4b94"/>
+    <w:bookmarkStart w:id="33" w:name="optional-ai-skill-for-input-preparation"/>
     <w:p>
       <w:pPr>
         <w:pStyle w:val="Heading3"/>
@@ -2728,7 +2736,7 @@
         <w:t xml:space="preserve"> </w:t>
       </w:r>
       <w:r>
-        <w:t xml:space="preserve">folder into your agent's skill system.</w:t>
+        <w:t xml:space="preserve">folder into your agent’s skill system.</w:t>
       </w:r>
     </w:p>
     <w:p>
@@ -2863,7 +2871,7 @@
     </w:p>
     <w:bookmarkEnd w:id="33"/>
     <w:bookmarkEnd w:id="34"/>
-    <w:bookmarkStart w:id="38" w:name="X2e7b1a4065091c3158d5038f5bc7571dc49a75d"/>
+    <w:bookmarkStart w:id="38" w:name="standard-workflow"/>
     <w:p>
       <w:pPr>
         <w:pStyle w:val="Heading2"/>
@@ -3018,7 +3026,7 @@
     </w:p>
     <w:p>
       <w:pPr>
-        <w:pStyle w:val="FirstParagraph"/>
+        <w:pStyle w:val="CaptionedFigure"/>
       </w:pPr>
       <w:r>
         <w:drawing>
@@ -3063,8 +3071,16 @@
         </w:drawing>
       </w:r>
     </w:p>
+    <w:p>
+      <w:pPr>
+        <w:pStyle w:val="ImageCaption"/>
+      </w:pPr>
+      <w:r>
+        <w:t xml:space="preserve">Filtering by media/conditions</w:t>
+      </w:r>
+    </w:p>
     <w:bookmarkEnd w:id="38"/>
-    <w:bookmarkStart w:id="55" w:name="X0cb250eb1df454c6760228a2c04c93ed8beae8a"/>
+    <w:bookmarkStart w:id="55" w:name="plot-types-and-controls"/>
     <w:p>
       <w:pPr>
         <w:pStyle w:val="Heading2"/>
@@ -3684,7 +3700,7 @@
         </w:numPr>
       </w:pPr>
       <w:r>
-        <w:t xml:space="preserve">Bold, italic, and underline are applied independently by text part: plot title, axis titles, axis numbers, legend, data labels, and significance text.</w:t>
+        <w:t xml:space="preserve">Bold, italic, and underline are applied independently by text part: plot title, axis titles, axis tick labels, legend, data labels, and significance text.</w:t>
       </w:r>
     </w:p>
     <w:p>
@@ -3696,6 +3712,30 @@
         </w:numPr>
       </w:pPr>
       <w:r>
+        <w:t xml:space="preserve">Axis-title styling is applied to both X and Y axis titles when those titles are visible. Axis tick-label styling applies to the labels shown along the axes, whether they are numeric ticks or category labels.</w:t>
+      </w:r>
+    </w:p>
+    <w:p>
+      <w:pPr>
+        <w:pStyle w:val="Compact"/>
+        <w:numPr>
+          <w:ilvl w:val="0"/>
+          <w:numId w:val="1030"/>
+        </w:numPr>
+      </w:pPr>
+      <w:r>
+        <w:t xml:space="preserve">Legend controls include whether the legend is shown on the right when applicable, plus legend text size and bold/italic/underline styling.</w:t>
+      </w:r>
+    </w:p>
+    <w:p>
+      <w:pPr>
+        <w:pStyle w:val="Compact"/>
+        <w:numPr>
+          <w:ilvl w:val="0"/>
+          <w:numId w:val="1030"/>
+        </w:numPr>
+      </w:pPr>
+      <w:r>
         <w:t xml:space="preserve">Each text part can use its own combination of styles; selecting underline for significance text, for example, does not force underline on the title or legend.</w:t>
       </w:r>
     </w:p>
@@ -3743,7 +3783,7 @@
     </w:p>
     <w:p>
       <w:pPr>
-        <w:pStyle w:val="FirstParagraph"/>
+        <w:pStyle w:val="CaptionedFigure"/>
       </w:pPr>
       <w:r>
         <w:drawing>
@@ -3788,6 +3828,14 @@
         </w:drawing>
       </w:r>
     </w:p>
+    <w:p>
+      <w:pPr>
+        <w:pStyle w:val="ImageCaption"/>
+      </w:pPr>
+      <w:r>
+        <w:t xml:space="preserve">Text styling controls</w:t>
+      </w:r>
+    </w:p>
     <w:bookmarkEnd w:id="50"/>
     <w:bookmarkStart w:id="54" w:name="composition-panel"/>
     <w:p>
@@ -4020,7 +4068,7 @@
     </w:p>
     <w:p>
       <w:pPr>
-        <w:pStyle w:val="BodyText"/>
+        <w:pStyle w:val="CaptionedFigure"/>
       </w:pPr>
       <w:r>
         <w:drawing>
@@ -4065,9 +4113,17 @@
         </w:drawing>
       </w:r>
     </w:p>
+    <w:p>
+      <w:pPr>
+        <w:pStyle w:val="ImageCaption"/>
+      </w:pPr>
+      <w:r>
+        <w:t xml:space="preserve">Significance and annotation setup</w:t>
+      </w:r>
+    </w:p>
     <w:bookmarkEnd w:id="54"/>
     <w:bookmarkEnd w:id="55"/>
-    <w:bookmarkStart w:id="56" w:name="X115a55130e2baabc52a19ceae26040e6a759372"/>
+    <w:bookmarkStart w:id="56" w:name="normalization"/>
     <w:p>
       <w:pPr>
         <w:pStyle w:val="Heading2"/>
@@ -4185,7 +4241,7 @@
       </w:r>
     </w:p>
     <w:bookmarkEnd w:id="56"/>
-    <w:bookmarkStart w:id="58" w:name="X00c7035554882fbb638d8b5cc72953fcde99525"/>
+    <w:bookmarkStart w:id="58" w:name="statistics"/>
     <w:p>
       <w:pPr>
         <w:pStyle w:val="Heading2"/>
@@ -4880,7 +4936,7 @@
     </w:p>
     <w:bookmarkEnd w:id="57"/>
     <w:bookmarkEnd w:id="58"/>
-    <w:bookmarkStart w:id="59" w:name="X226b9a1a8acbb38ca74b8f37dcf5f8aa29b93b6"/>
+    <w:bookmarkStart w:id="59" w:name="significance-annotations"/>
     <w:p>
       <w:pPr>
         <w:pStyle w:val="Heading2"/>
@@ -5095,7 +5151,7 @@
       </w:r>
     </w:p>
     <w:bookmarkEnd w:id="59"/>
-    <w:bookmarkStart w:id="65" w:name="X74088aaef10aeab96f289eb9220b0777e0698d0"/>
+    <w:bookmarkStart w:id="65" w:name="qc-and-replicate-management"/>
     <w:p>
       <w:pPr>
         <w:pStyle w:val="Heading2"/>
@@ -5305,7 +5361,7 @@
     </w:p>
     <w:p>
       <w:pPr>
-        <w:pStyle w:val="FirstParagraph"/>
+        <w:pStyle w:val="CaptionedFigure"/>
       </w:pPr>
       <w:r>
         <w:drawing>
@@ -5350,9 +5406,17 @@
         </w:drawing>
       </w:r>
     </w:p>
+    <w:p>
+      <w:pPr>
+        <w:pStyle w:val="ImageCaption"/>
+      </w:pPr>
+      <w:r>
+        <w:t xml:space="preserve">Biological replicate filtering</w:t>
+      </w:r>
+    </w:p>
     <w:bookmarkEnd w:id="64"/>
     <w:bookmarkEnd w:id="65"/>
-    <w:bookmarkStart w:id="66" w:name="X027b5303909c1c711c784491c3eab67dd715d28"/>
+    <w:bookmarkStart w:id="66" w:name="metadata-and-reproducibility"/>
     <w:p>
       <w:pPr>
         <w:pStyle w:val="Heading2"/>
@@ -5424,7 +5488,31 @@
         </w:numPr>
       </w:pPr>
       <w:r>
-        <w:t xml:space="preserve">Plot typography choices, error-bar statistic, and curve-statistics method selection persist across metadata roundtrip.</w:t>
+        <w:t xml:space="preserve">Plot typography choices persist across metadata roundtrip, including font family, text sizes, and normal/bold/italic/underline state for plot titles, X/Y axis titles, axis tick labels, legend text, data labels, and significance text.</w:t>
+      </w:r>
+    </w:p>
+    <w:p>
+      <w:pPr>
+        <w:pStyle w:val="Compact"/>
+        <w:numPr>
+          <w:ilvl w:val="0"/>
+          <w:numId w:val="1045"/>
+        </w:numPr>
+      </w:pPr>
+      <w:r>
+        <w:t xml:space="preserve">Legend visibility/placement, including right-side legend selection where applicable, is stored in metadata and reapplied when metadata are loaded.</w:t>
+      </w:r>
+    </w:p>
+    <w:p>
+      <w:pPr>
+        <w:pStyle w:val="Compact"/>
+        <w:numPr>
+          <w:ilvl w:val="0"/>
+          <w:numId w:val="1045"/>
+        </w:numPr>
+      </w:pPr>
+      <w:r>
+        <w:t xml:space="preserve">Error-bar statistic and curve-statistics method selection persist across metadata roundtrip.</w:t>
       </w:r>
     </w:p>
     <w:p>
@@ -5516,7 +5604,7 @@
       </w:r>
     </w:p>
     <w:bookmarkEnd w:id="66"/>
-    <w:bookmarkStart w:id="67" w:name="Xdaccffce00e124c4dc2e12129d423a1de5e7d51"/>
+    <w:bookmarkStart w:id="67" w:name="downloads"/>
     <w:p>
       <w:pPr>
         <w:pStyle w:val="Heading2"/>
@@ -5647,7 +5735,7 @@
       </w:r>
     </w:p>
     <w:bookmarkEnd w:id="67"/>
-    <w:bookmarkStart w:id="71" w:name="Xe593582c9f00b53676a004fd4095b4d203d92ef"/>
+    <w:bookmarkStart w:id="71" w:name="growth-module"/>
     <w:p>
       <w:pPr>
         <w:pStyle w:val="Heading2"/>
@@ -5989,6 +6077,174 @@
     <w:p>
       <w:pPr>
         <w:pStyle w:val="FirstParagraph"/>
+      </w:pPr>
+      <w:r>
+        <w:t xml:space="preserve">Autosave and interruption handling:</w:t>
+      </w:r>
+    </w:p>
+    <w:p>
+      <w:pPr>
+        <w:pStyle w:val="Compact"/>
+        <w:numPr>
+          <w:ilvl w:val="0"/>
+          <w:numId w:val="1053"/>
+        </w:numPr>
+      </w:pPr>
+      <w:r>
+        <w:t xml:space="preserve">The optional</w:t>
+      </w:r>
+      <w:r>
+        <w:t xml:space="preserve"> </w:t>
+      </w:r>
+      <w:r>
+        <w:rPr>
+          <w:b/>
+          <w:bCs/>
+        </w:rPr>
+        <w:t xml:space="preserve">Autosave output folder</w:t>
+      </w:r>
+      <w:r>
+        <w:t xml:space="preserve"> </w:t>
+      </w:r>
+      <w:r>
+        <w:t xml:space="preserve">can be typed manually or selected with</w:t>
+      </w:r>
+      <w:r>
+        <w:t xml:space="preserve"> </w:t>
+      </w:r>
+      <w:r>
+        <w:rPr>
+          <w:b/>
+          <w:bCs/>
+        </w:rPr>
+        <w:t xml:space="preserve">Browse…</w:t>
+      </w:r>
+      <w:r>
+        <w:t xml:space="preserve">.</w:t>
+      </w:r>
+    </w:p>
+    <w:p>
+      <w:pPr>
+        <w:pStyle w:val="Compact"/>
+        <w:numPr>
+          <w:ilvl w:val="0"/>
+          <w:numId w:val="1053"/>
+        </w:numPr>
+      </w:pPr>
+      <w:r>
+        <w:t xml:space="preserve">When an autosave folder is set, final</w:t>
+      </w:r>
+      <w:r>
+        <w:t xml:space="preserve"> </w:t>
+      </w:r>
+      <w:r>
+        <w:rPr>
+          <w:rStyle w:val="VerbatimChar"/>
+        </w:rPr>
+        <w:t xml:space="preserve">Curves_*.xlsx</w:t>
+      </w:r>
+      <w:r>
+        <w:t xml:space="preserve"> </w:t>
+      </w:r>
+      <w:r>
+        <w:t xml:space="preserve">/</w:t>
+      </w:r>
+      <w:r>
+        <w:t xml:space="preserve"> </w:t>
+      </w:r>
+      <w:r>
+        <w:rPr>
+          <w:rStyle w:val="VerbatimChar"/>
+        </w:rPr>
+        <w:t xml:space="preserve">Parameters_*.xlsx</w:t>
+      </w:r>
+      <w:r>
+        <w:t xml:space="preserve"> </w:t>
+      </w:r>
+      <w:r>
+        <w:t xml:space="preserve">files are copied there automatically while the regular</w:t>
+      </w:r>
+      <w:r>
+        <w:t xml:space="preserve"> </w:t>
+      </w:r>
+      <w:r>
+        <w:rPr>
+          <w:b/>
+          <w:bCs/>
+        </w:rPr>
+        <w:t xml:space="preserve">Download results</w:t>
+      </w:r>
+      <w:r>
+        <w:t xml:space="preserve"> </w:t>
+      </w:r>
+      <w:r>
+        <w:t xml:space="preserve">ZIP remains available.</w:t>
+      </w:r>
+    </w:p>
+    <w:p>
+      <w:pPr>
+        <w:pStyle w:val="Compact"/>
+        <w:numPr>
+          <w:ilvl w:val="0"/>
+          <w:numId w:val="1053"/>
+        </w:numPr>
+      </w:pPr>
+      <w:r>
+        <w:t xml:space="preserve">During long runs, BIOSZEN writes per-well checkpoints under a temporary</w:t>
+      </w:r>
+      <w:r>
+        <w:t xml:space="preserve"> </w:t>
+      </w:r>
+      <w:r>
+        <w:rPr>
+          <w:rStyle w:val="VerbatimChar"/>
+        </w:rPr>
+        <w:t xml:space="preserve">BIOSZEN_growth_checkpoints</w:t>
+      </w:r>
+      <w:r>
+        <w:t xml:space="preserve"> </w:t>
+      </w:r>
+      <w:r>
+        <w:t xml:space="preserve">folder inside the selected autosave folder. These checkpoints allow an interrupted run to resume from completed wells instead of starting from zero.</w:t>
+      </w:r>
+    </w:p>
+    <w:p>
+      <w:pPr>
+        <w:pStyle w:val="Compact"/>
+        <w:numPr>
+          <w:ilvl w:val="0"/>
+          <w:numId w:val="1053"/>
+        </w:numPr>
+      </w:pPr>
+      <w:r>
+        <w:t xml:space="preserve">Checkpoints are deleted automatically after a successful completion or successful resume. They are kept only when processing is interrupted before completion.</w:t>
+      </w:r>
+    </w:p>
+    <w:p>
+      <w:pPr>
+        <w:pStyle w:val="Compact"/>
+        <w:numPr>
+          <w:ilvl w:val="0"/>
+          <w:numId w:val="1053"/>
+        </w:numPr>
+      </w:pPr>
+      <w:r>
+        <w:rPr>
+          <w:b/>
+          <w:bCs/>
+        </w:rPr>
+        <w:t xml:space="preserve">Stop process</w:t>
+      </w:r>
+      <w:r>
+        <w:t xml:space="preserve"> </w:t>
+      </w:r>
+      <w:r>
+        <w:t xml:space="preserve">requests a safe cancellation. The app may finish the current well/checkpoint before releasing the run so partial files stay usable and the growth-parameter calculations are not changed.</w:t>
+      </w:r>
+    </w:p>
+    <w:p>
+      <w:pPr>
+        <w:pStyle w:val="CaptionedFigure"/>
       </w:pPr>
       <w:r>
         <w:drawing>
@@ -6033,8 +6289,16 @@
         </w:drawing>
       </w:r>
     </w:p>
+    <w:p>
+      <w:pPr>
+        <w:pStyle w:val="ImageCaption"/>
+      </w:pPr>
+      <w:r>
+        <w:t xml:space="preserve">Growth workflow</w:t>
+      </w:r>
+    </w:p>
     <w:bookmarkEnd w:id="71"/>
-    <w:bookmarkStart w:id="72" w:name="X412317ec57e4cfdc618c120090edd958d43de49"/>
+    <w:bookmarkStart w:id="72" w:name="troubleshooting-playbook"/>
     <w:p>
       <w:pPr>
         <w:pStyle w:val="Heading2"/>
@@ -6047,7 +6311,7 @@
       <w:pPr>
         <w:numPr>
           <w:ilvl w:val="0"/>
-          <w:numId w:val="1053"/>
+          <w:numId w:val="1054"/>
         </w:numPr>
       </w:pPr>
       <w:r>
@@ -6074,7 +6338,7 @@
       <w:pPr>
         <w:numPr>
           <w:ilvl w:val="0"/>
-          <w:numId w:val="1053"/>
+          <w:numId w:val="1054"/>
         </w:numPr>
       </w:pPr>
       <w:r>
@@ -6101,7 +6365,7 @@
       <w:pPr>
         <w:numPr>
           <w:ilvl w:val="0"/>
-          <w:numId w:val="1053"/>
+          <w:numId w:val="1054"/>
         </w:numPr>
       </w:pPr>
       <w:r>
@@ -6128,7 +6392,7 @@
       <w:pPr>
         <w:numPr>
           <w:ilvl w:val="0"/>
-          <w:numId w:val="1053"/>
+          <w:numId w:val="1054"/>
         </w:numPr>
       </w:pPr>
       <w:r>
@@ -6155,7 +6419,7 @@
       <w:pPr>
         <w:numPr>
           <w:ilvl w:val="0"/>
-          <w:numId w:val="1053"/>
+          <w:numId w:val="1054"/>
         </w:numPr>
       </w:pPr>
       <w:r>
@@ -6182,7 +6446,7 @@
       <w:pPr>
         <w:numPr>
           <w:ilvl w:val="0"/>
-          <w:numId w:val="1053"/>
+          <w:numId w:val="1054"/>
         </w:numPr>
       </w:pPr>
       <w:r>
@@ -6224,7 +6488,7 @@
       <w:pPr>
         <w:numPr>
           <w:ilvl w:val="0"/>
-          <w:numId w:val="1053"/>
+          <w:numId w:val="1054"/>
         </w:numPr>
       </w:pPr>
       <w:r>
@@ -6279,7 +6543,7 @@
       <w:pPr>
         <w:numPr>
           <w:ilvl w:val="0"/>
-          <w:numId w:val="1053"/>
+          <w:numId w:val="1054"/>
         </w:numPr>
       </w:pPr>
       <w:r>
@@ -6306,7 +6570,7 @@
       <w:pPr>
         <w:numPr>
           <w:ilvl w:val="0"/>
-          <w:numId w:val="1053"/>
+          <w:numId w:val="1054"/>
         </w:numPr>
       </w:pPr>
       <w:r>
@@ -6330,7 +6594,7 @@
       </w:r>
     </w:p>
     <w:bookmarkEnd w:id="72"/>
-    <w:bookmarkStart w:id="73" w:name="Xcd58510a2561031e4603a64a38bc819a9ac6e6a"/>
+    <w:bookmarkStart w:id="73" w:name="support"/>
     <w:p>
       <w:pPr>
         <w:pStyle w:val="Heading2"/>
@@ -7032,6 +7296,9 @@
     </w:lvlOverride>
   </w:num>
   <w:num w:numId="1053">
+    <w:abstractNumId w:val="991"/>
+  </w:num>
+  <w:num w:numId="1054">
     <w:abstractNumId w:val="991"/>
   </w:num>
 </w:numbering>

</xml_diff>

<commit_message>
Prepare stacked stats and plot flip release updates
</commit_message>
<xml_diff>
--- a/inst/app/www/MANUAL_EN.docx
+++ b/inst/app/www/MANUAL_EN.docx
@@ -3290,7 +3290,34 @@
         </w:numPr>
       </w:pPr>
       <w:r>
-        <w:t xml:space="preserve">Annotation labels/brackets available.</w:t>
+        <w:t xml:space="preserve">Statistics and auto-generated significance are available per included parameter. Comparisons are made within each parameter, so</w:t>
+      </w:r>
+      <w:r>
+        <w:t xml:space="preserve"> </w:t>
+      </w:r>
+      <w:r>
+        <w:rPr>
+          <w:rStyle w:val="VerbatimChar"/>
+        </w:rPr>
+        <w:t xml:space="preserve">Parameter A - Group 1</w:t>
+      </w:r>
+      <w:r>
+        <w:t xml:space="preserve"> </w:t>
+      </w:r>
+      <w:r>
+        <w:t xml:space="preserve">is compared with</w:t>
+      </w:r>
+      <w:r>
+        <w:t xml:space="preserve"> </w:t>
+      </w:r>
+      <w:r>
+        <w:rPr>
+          <w:rStyle w:val="VerbatimChar"/>
+        </w:rPr>
+        <w:t xml:space="preserve">Parameter A - Group 2</w:t>
+      </w:r>
+      <w:r>
+        <w:t xml:space="preserve">, not with another stacked segment.</w:t>
       </w:r>
     </w:p>
     <w:p>
@@ -3302,7 +3329,46 @@
         </w:numPr>
       </w:pPr>
       <w:r>
-        <w:t xml:space="preserve">Horizontal orientation available.</w:t>
+        <w:t xml:space="preserve">Significance labels can be added over the selected target group for the selected parameter; the results table includes a</w:t>
+      </w:r>
+      <w:r>
+        <w:t xml:space="preserve"> </w:t>
+      </w:r>
+      <w:r>
+        <w:rPr>
+          <w:rStyle w:val="VerbatimChar"/>
+        </w:rPr>
+        <w:t xml:space="preserve">Parameter</w:t>
+      </w:r>
+      <w:r>
+        <w:t xml:space="preserve"> </w:t>
+      </w:r>
+      <w:r>
+        <w:t xml:space="preserve">column.</w:t>
+      </w:r>
+    </w:p>
+    <w:p>
+      <w:pPr>
+        <w:pStyle w:val="Compact"/>
+        <w:numPr>
+          <w:ilvl w:val="0"/>
+          <w:numId w:val="1025"/>
+        </w:numPr>
+      </w:pPr>
+      <w:r>
+        <w:t xml:space="preserve">Annotation labels are recommended for stacked plots.</w:t>
+      </w:r>
+    </w:p>
+    <w:p>
+      <w:pPr>
+        <w:pStyle w:val="Compact"/>
+        <w:numPr>
+          <w:ilvl w:val="0"/>
+          <w:numId w:val="1025"/>
+        </w:numPr>
+      </w:pPr>
+      <w:r>
+        <w:t xml:space="preserve">Horizontal orientation available; legends, text styles, error bars, and significance labels are preserved when the plot is flipped.</w:t>
       </w:r>
     </w:p>
     <w:bookmarkEnd w:id="42"/>
@@ -3737,6 +3803,24 @@
       </w:pPr>
       <w:r>
         <w:t xml:space="preserve">Each text part can use its own combination of styles; selecting underline for significance text, for example, does not force underline on the title or legend.</w:t>
+      </w:r>
+    </w:p>
+    <w:p>
+      <w:pPr>
+        <w:pStyle w:val="Compact"/>
+        <w:numPr>
+          <w:ilvl w:val="0"/>
+          <w:numId w:val="1030"/>
+        </w:numPr>
+      </w:pPr>
+      <w:r>
+        <w:rPr>
+          <w:rStyle w:val="VerbatimChar"/>
+        </w:rPr>
+        <w:t xml:space="preserve">Flip orientation (horizontal)</w:t>
+      </w:r>
+      <w:r>
+        <w:t xml:space="preserve">, when available, is a visual orientation change only. It preserves the same plotted values, legends, font family, bold/italic/underline settings, error bars, and significance annotations.</w:t>
       </w:r>
     </w:p>
     <w:p>
@@ -4903,6 +4987,42 @@
     </w:p>
     <w:p>
       <w:pPr>
+        <w:pStyle w:val="FirstParagraph"/>
+      </w:pPr>
+      <w:r>
+        <w:t xml:space="preserve">For</w:t>
+      </w:r>
+      <w:r>
+        <w:t xml:space="preserve"> </w:t>
+      </w:r>
+      <w:r>
+        <w:rPr>
+          <w:b/>
+          <w:bCs/>
+        </w:rPr>
+        <w:t xml:space="preserve">Stacked</w:t>
+      </w:r>
+      <w:r>
+        <w:t xml:space="preserve"> </w:t>
+      </w:r>
+      <w:r>
+        <w:t xml:space="preserve">plots, normality and significance are calculated separately for each included parameter. The output table includes</w:t>
+      </w:r>
+      <w:r>
+        <w:t xml:space="preserve"> </w:t>
+      </w:r>
+      <w:r>
+        <w:rPr>
+          <w:rStyle w:val="VerbatimChar"/>
+        </w:rPr>
+        <w:t xml:space="preserve">Parameter</w:t>
+      </w:r>
+      <w:r>
+        <w:t xml:space="preserve">, and each parameter-level comparison should match the same comparison run from the corresponding single-parameter plot.</w:t>
+      </w:r>
+    </w:p>
+    <w:p>
+      <w:pPr>
         <w:pStyle w:val="BlockText"/>
       </w:pPr>
       <w:r>
@@ -5148,6 +5268,30 @@
       </w:pPr>
       <w:r>
         <w:t xml:space="preserve">Replace or append annotations.</w:t>
+      </w:r>
+    </w:p>
+    <w:p>
+      <w:pPr>
+        <w:pStyle w:val="FirstParagraph"/>
+      </w:pPr>
+      <w:r>
+        <w:t xml:space="preserve">For</w:t>
+      </w:r>
+      <w:r>
+        <w:t xml:space="preserve"> </w:t>
+      </w:r>
+      <w:r>
+        <w:rPr>
+          <w:b/>
+          <w:bCs/>
+        </w:rPr>
+        <w:t xml:space="preserve">Stacked</w:t>
+      </w:r>
+      <w:r>
+        <w:t xml:space="preserve"> </w:t>
+      </w:r>
+      <w:r>
+        <w:t xml:space="preserve">plots, choose the parameter before adding a label. Automatic labels keep the parameter identity and place the annotation over the selected target group for that parameter.</w:t>
       </w:r>
     </w:p>
     <w:bookmarkEnd w:id="59"/>

</xml_diff>

<commit_message>
Prepare BIOSZEN 2.0.4 release candidate
</commit_message>
<xml_diff>
--- a/inst/app/www/MANUAL_EN.docx
+++ b/inst/app/www/MANUAL_EN.docx
@@ -2,7 +2,7 @@
 <file path=word/document.xml><?xml version="1.0" encoding="utf-8"?>
 <w:document xmlns:w="http://schemas.openxmlformats.org/wordprocessingml/2006/main" xmlns:m="http://schemas.openxmlformats.org/officeDocument/2006/math" xmlns:r="http://schemas.openxmlformats.org/officeDocument/2006/relationships" xmlns:o="urn:schemas-microsoft-com:office:office" xmlns:v="urn:schemas-microsoft-com:vml" xmlns:w10="urn:schemas-microsoft-com:office:word" xmlns:a="http://schemas.openxmlformats.org/drawingml/2006/main" xmlns:pic="http://schemas.openxmlformats.org/drawingml/2006/picture" xmlns:wp="http://schemas.openxmlformats.org/drawingml/2006/wordprocessingDrawing">
   <w:body>
-    <w:bookmarkStart w:id="74" w:name="bioszen-user-manual-english"/>
+    <w:bookmarkStart w:id="143" w:name="bioszen-user-manual-english"/>
     <w:p>
       <w:pPr>
         <w:pStyle w:val="Heading1"/>
@@ -21,25 +21,25 @@
     </w:p>
     <w:p>
       <w:pPr>
-        <w:pStyle w:val="CaptionedFigure"/>
+        <w:pStyle w:val="BodyText"/>
       </w:pPr>
       <w:r>
         <w:drawing>
           <wp:inline>
             <wp:extent cx="5334000" cy="2341239"/>
             <wp:effectExtent b="0" l="0" r="0" t="0"/>
-            <wp:docPr descr="BIOSZEN app overview" title="" id="10" name="Picture"/>
+            <wp:docPr descr="BIOSZEN app overview" title="" id="78" name="Picture"/>
             <a:graphic>
               <a:graphicData uri="http://schemas.openxmlformats.org/drawingml/2006/picture">
                 <pic:pic>
                   <pic:nvPicPr>
-                    <pic:cNvPr descr="manual_images/01_app_home_overview.png" id="11" name="Picture"/>
+                    <pic:cNvPr descr="manual_images/01_app_home_overview.png" id="79" name="Picture"/>
                     <pic:cNvPicPr>
                       <a:picLocks noChangeArrowheads="1" noChangeAspect="1"/>
                     </pic:cNvPicPr>
                   </pic:nvPicPr>
                   <pic:blipFill>
-                    <a:blip r:embed="rId9"/>
+                    <a:blip r:embed="rId77"/>
                     <a:stretch>
                       <a:fillRect/>
                     </a:stretch>
@@ -68,14 +68,6 @@
     </w:p>
     <w:p>
       <w:pPr>
-        <w:pStyle w:val="ImageCaption"/>
-      </w:pPr>
-      <w:r>
-        <w:t xml:space="preserve">BIOSZEN app overview</w:t>
-      </w:r>
-    </w:p>
-    <w:p>
-      <w:pPr>
         <w:pStyle w:val="BlockText"/>
       </w:pPr>
       <w:r>
@@ -126,7 +118,7 @@
         <w:t xml:space="preserve">Keep this manual open while working. Each section includes both quick actions and deeper technical reference.</w:t>
       </w:r>
     </w:p>
-    <w:bookmarkStart w:id="12" w:name="manual-map"/>
+    <w:bookmarkStart w:id="80" w:name="manual-map"/>
     <w:p>
       <w:pPr>
         <w:pStyle w:val="Heading2"/>
@@ -390,8 +382,8 @@
         </w:r>
       </w:hyperlink>
     </w:p>
-    <w:bookmarkEnd w:id="12"/>
-    <w:bookmarkStart w:id="17" w:name="before-you-start"/>
+    <w:bookmarkEnd w:id="80"/>
+    <w:bookmarkStart w:id="85" w:name="Xcc802c028399c90ef506226ebaf5d25e7c22381"/>
     <w:p>
       <w:pPr>
         <w:pStyle w:val="Heading2"/>
@@ -684,7 +676,7 @@
           <w:numId w:val="1004"/>
         </w:numPr>
       </w:pPr>
-      <w:hyperlink r:id="rId13">
+      <w:hyperlink r:id="rId81">
         <w:r>
           <w:rPr>
             <w:rStyle w:val="Hyperlink"/>
@@ -701,7 +693,7 @@
           <w:numId w:val="1004"/>
         </w:numPr>
       </w:pPr>
-      <w:hyperlink r:id="rId14">
+      <w:hyperlink r:id="rId82">
         <w:r>
           <w:rPr>
             <w:rStyle w:val="Hyperlink"/>
@@ -718,7 +710,7 @@
           <w:numId w:val="1004"/>
         </w:numPr>
       </w:pPr>
-      <w:hyperlink r:id="rId15">
+      <w:hyperlink r:id="rId83">
         <w:r>
           <w:rPr>
             <w:rStyle w:val="Hyperlink"/>
@@ -735,7 +727,7 @@
           <w:numId w:val="1004"/>
         </w:numPr>
       </w:pPr>
-      <w:hyperlink r:id="rId16">
+      <w:hyperlink r:id="rId84">
         <w:r>
           <w:rPr>
             <w:rStyle w:val="Hyperlink"/>
@@ -774,8 +766,8 @@
         <w:t xml:space="preserve">. Keep that folder to avoid reinstalling dependencies.</w:t>
       </w:r>
     </w:p>
-    <w:bookmarkEnd w:id="17"/>
-    <w:bookmarkStart w:id="24" w:name="fast-start-by-scenario"/>
+    <w:bookmarkEnd w:id="85"/>
+    <w:bookmarkStart w:id="92" w:name="X717faac405ee7bcb1499a96623efaf8a5d1ee47"/>
     <w:p>
       <w:pPr>
         <w:pStyle w:val="Heading2"/>
@@ -784,7 +776,7 @@
         <w:t xml:space="preserve">2. Fast Start by Scenario</w:t>
       </w:r>
     </w:p>
-    <w:bookmarkStart w:id="18" w:name="Xa7fd6d851aa97e621ff7d312d1eecc596d93a28"/>
+    <w:bookmarkStart w:id="86" w:name="Xa7fd6d851aa97e621ff7d312d1eecc596d93a28"/>
     <w:p>
       <w:pPr>
         <w:pStyle w:val="Heading3"/>
@@ -891,8 +883,8 @@
         <w:t xml:space="preserve">Export plot, tables, metadata, and ZIP bundle.</w:t>
       </w:r>
     </w:p>
-    <w:bookmarkEnd w:id="18"/>
-    <w:bookmarkStart w:id="19" w:name="Xfb5a9e6fb4846348544dde5a71c800812e0227b"/>
+    <w:bookmarkEnd w:id="86"/>
+    <w:bookmarkStart w:id="87" w:name="Xfb5a9e6fb4846348544dde5a71c800812e0227b"/>
     <w:p>
       <w:pPr>
         <w:pStyle w:val="Heading3"/>
@@ -962,8 +954,8 @@
         <w:t xml:space="preserve">Export plots and metadata.</w:t>
       </w:r>
     </w:p>
-    <w:bookmarkEnd w:id="19"/>
-    <w:bookmarkStart w:id="23" w:name="X98e459497506ff727301c25765f2a946169182f"/>
+    <w:bookmarkEnd w:id="87"/>
+    <w:bookmarkStart w:id="91" w:name="X98e459497506ff727301c25765f2a946169182f"/>
     <w:p>
       <w:pPr>
         <w:pStyle w:val="Heading3"/>
@@ -1038,25 +1030,25 @@
     </w:p>
     <w:p>
       <w:pPr>
-        <w:pStyle w:val="CaptionedFigure"/>
+        <w:pStyle w:val="FirstParagraph"/>
       </w:pPr>
       <w:r>
         <w:drawing>
           <wp:inline>
             <wp:extent cx="5334000" cy="2133600"/>
             <wp:effectExtent b="0" l="0" r="0" t="0"/>
-            <wp:docPr descr="Plot setup and layers" title="" id="21" name="Picture"/>
+            <wp:docPr descr="Plot setup and layers" title="" id="89" name="Picture"/>
             <a:graphic>
               <a:graphicData uri="http://schemas.openxmlformats.org/drawingml/2006/picture">
                 <pic:pic>
                   <pic:nvPicPr>
-                    <pic:cNvPr descr="manual_images/02_plot_setup_layers.png" id="22" name="Picture"/>
+                    <pic:cNvPr descr="manual_images/02_plot_setup_layers.png" id="90" name="Picture"/>
                     <pic:cNvPicPr>
                       <a:picLocks noChangeArrowheads="1" noChangeAspect="1"/>
                     </pic:cNvPicPr>
                   </pic:nvPicPr>
                   <pic:blipFill>
-                    <a:blip r:embed="rId20"/>
+                    <a:blip r:embed="rId88"/>
                     <a:stretch>
                       <a:fillRect/>
                     </a:stretch>
@@ -1083,17 +1075,9 @@
         </w:drawing>
       </w:r>
     </w:p>
-    <w:p>
-      <w:pPr>
-        <w:pStyle w:val="ImageCaption"/>
-      </w:pPr>
-      <w:r>
-        <w:t xml:space="preserve">Plot setup and layers</w:t>
-      </w:r>
-    </w:p>
-    <w:bookmarkEnd w:id="23"/>
-    <w:bookmarkEnd w:id="24"/>
-    <w:bookmarkStart w:id="25" w:name="choose-an-input-mode"/>
+    <w:bookmarkEnd w:id="91"/>
+    <w:bookmarkEnd w:id="92"/>
+    <w:bookmarkStart w:id="93" w:name="X128ed19147767cebcf7cb23c4bcc70881f470f9"/>
     <w:p>
       <w:pPr>
         <w:pStyle w:val="Heading2"/>
@@ -1247,8 +1231,8 @@
         <w:t xml:space="preserve">.</w:t>
       </w:r>
     </w:p>
-    <w:bookmarkEnd w:id="25"/>
-    <w:bookmarkStart w:id="34" w:name="input-specifications"/>
+    <w:bookmarkEnd w:id="93"/>
+    <w:bookmarkStart w:id="102" w:name="X6b8972cbac599c5fedbf83a48be69951ca6b7c8"/>
     <w:p>
       <w:pPr>
         <w:pStyle w:val="Heading2"/>
@@ -1257,7 +1241,7 @@
         <w:t xml:space="preserve">4. Input Specifications</w:t>
       </w:r>
     </w:p>
-    <w:bookmarkStart w:id="26" w:name="platemap-workbook"/>
+    <w:bookmarkStart w:id="94" w:name="X0605fe61617601d5dc607a15bb9e5babb26d0bd"/>
     <w:p>
       <w:pPr>
         <w:pStyle w:val="Heading3"/>
@@ -1471,7 +1455,7 @@
         <w:t xml:space="preserve">3</w:t>
       </w:r>
       <w:r>
-        <w:t xml:space="preserve">, …).</w:t>
+        <w:t xml:space="preserve">, ...).</w:t>
       </w:r>
     </w:p>
     <w:p>
@@ -1766,8 +1750,8 @@
         <w:t xml:space="preserve">Y_Title</w:t>
       </w:r>
     </w:p>
-    <w:bookmarkEnd w:id="26"/>
-    <w:bookmarkStart w:id="27" w:name="curves-file"/>
+    <w:bookmarkEnd w:id="94"/>
+    <w:bookmarkStart w:id="95" w:name="Xe43541bf07e4c62d7d45bf62912f7f89f9c08e5"/>
     <w:p>
       <w:pPr>
         <w:pStyle w:val="Heading3"/>
@@ -1853,7 +1837,7 @@
         <w:t xml:space="preserve">A2</w:t>
       </w:r>
       <w:r>
-        <w:t xml:space="preserve">, …).</w:t>
+        <w:t xml:space="preserve">, ...).</w:t>
       </w:r>
     </w:p>
     <w:p>
@@ -2005,7 +1989,7 @@
         <w:t xml:space="preserve">A2</w:t>
       </w:r>
       <w:r>
-        <w:t xml:space="preserve">, …).</w:t>
+        <w:t xml:space="preserve">, ...).</w:t>
       </w:r>
     </w:p>
     <w:p>
@@ -2161,8 +2145,8 @@
         <w:t xml:space="preserve">vs curve headers).</w:t>
       </w:r>
     </w:p>
-    <w:bookmarkEnd w:id="27"/>
-    <w:bookmarkStart w:id="28" w:name="grouped-parameters-mode"/>
+    <w:bookmarkEnd w:id="95"/>
+    <w:bookmarkStart w:id="96" w:name="X239cbd4a8b7be852666d20878604d0d97369a89"/>
     <w:p>
       <w:pPr>
         <w:pStyle w:val="Heading3"/>
@@ -2229,7 +2213,7 @@
         <w:t xml:space="preserve">Parametro_2</w:t>
       </w:r>
       <w:r>
-        <w:t xml:space="preserve">, …).</w:t>
+        <w:t xml:space="preserve">, ...).</w:t>
       </w:r>
     </w:p>
     <w:p>
@@ -2285,8 +2269,8 @@
         <w:t xml:space="preserve">).</w:t>
       </w:r>
     </w:p>
-    <w:bookmarkEnd w:id="28"/>
-    <w:bookmarkStart w:id="29" w:name="summary-mode"/>
+    <w:bookmarkEnd w:id="96"/>
+    <w:bookmarkStart w:id="97" w:name="Xcbadc8a632b74252ecce5f0e02c8d2548229bde"/>
     <w:p>
       <w:pPr>
         <w:pStyle w:val="Heading3"/>
@@ -2504,8 +2488,8 @@
         <w:t xml:space="preserve">file or an embedded curve-summary sheet.</w:t>
       </w:r>
     </w:p>
-    <w:bookmarkEnd w:id="29"/>
-    <w:bookmarkStart w:id="30" w:name="csv-mode"/>
+    <w:bookmarkEnd w:id="97"/>
+    <w:bookmarkStart w:id="98" w:name="X9b6d5804ff663a0063e2ffa1f700ec485883876"/>
     <w:p>
       <w:pPr>
         <w:pStyle w:val="Heading3"/>
@@ -2645,8 +2629,8 @@
         <w:t xml:space="preserve">+ wells).</w:t>
       </w:r>
     </w:p>
-    <w:bookmarkEnd w:id="30"/>
-    <w:bookmarkStart w:id="33" w:name="optional-ai-skill-for-input-preparation"/>
+    <w:bookmarkEnd w:id="98"/>
+    <w:bookmarkStart w:id="101" w:name="X2bee644eb2d3a5adf897f34f1e02f1d8c3b4b94"/>
     <w:p>
       <w:pPr>
         <w:pStyle w:val="Heading3"/>
@@ -2665,7 +2649,7 @@
       <w:r>
         <w:t xml:space="preserve"> </w:t>
       </w:r>
-      <w:hyperlink r:id="rId31">
+      <w:hyperlink r:id="rId99">
         <w:r>
           <w:rPr>
             <w:rStyle w:val="VerbatimChar"/>
@@ -2709,7 +2693,7 @@
       <w:r>
         <w:t xml:space="preserve"> </w:t>
       </w:r>
-      <w:hyperlink r:id="rId32">
+      <w:hyperlink r:id="rId100">
         <w:r>
           <w:rPr>
             <w:rStyle w:val="Hyperlink"/>
@@ -2736,7 +2720,7 @@
         <w:t xml:space="preserve"> </w:t>
       </w:r>
       <w:r>
-        <w:t xml:space="preserve">folder into your agent’s skill system.</w:t>
+        <w:t xml:space="preserve">folder into your agent's skill system.</w:t>
       </w:r>
     </w:p>
     <w:p>
@@ -2869,9 +2853,9 @@
         <w:t xml:space="preserve">specific measurement type.</w:t>
       </w:r>
     </w:p>
-    <w:bookmarkEnd w:id="33"/>
-    <w:bookmarkEnd w:id="34"/>
-    <w:bookmarkStart w:id="38" w:name="standard-workflow"/>
+    <w:bookmarkEnd w:id="101"/>
+    <w:bookmarkEnd w:id="102"/>
+    <w:bookmarkStart w:id="106" w:name="X2e7b1a4065091c3158d5038f5bc7571dc49a75d"/>
     <w:p>
       <w:pPr>
         <w:pStyle w:val="Heading2"/>
@@ -3026,25 +3010,25 @@
     </w:p>
     <w:p>
       <w:pPr>
-        <w:pStyle w:val="CaptionedFigure"/>
+        <w:pStyle w:val="FirstParagraph"/>
       </w:pPr>
       <w:r>
         <w:drawing>
           <wp:inline>
             <wp:extent cx="5334000" cy="1320297"/>
             <wp:effectExtent b="0" l="0" r="0" t="0"/>
-            <wp:docPr descr="Filtering by media/conditions" title="" id="36" name="Picture"/>
+            <wp:docPr descr="Filtering by media/conditions" title="" id="104" name="Picture"/>
             <a:graphic>
               <a:graphicData uri="http://schemas.openxmlformats.org/drawingml/2006/picture">
                 <pic:pic>
                   <pic:nvPicPr>
-                    <pic:cNvPr descr="manual_images/03_filter_media_conditions.png" id="37" name="Picture"/>
+                    <pic:cNvPr descr="manual_images/03_filter_media_conditions.png" id="105" name="Picture"/>
                     <pic:cNvPicPr>
                       <a:picLocks noChangeArrowheads="1" noChangeAspect="1"/>
                     </pic:cNvPicPr>
                   </pic:nvPicPr>
                   <pic:blipFill>
-                    <a:blip r:embed="rId35"/>
+                    <a:blip r:embed="rId103"/>
                     <a:stretch>
                       <a:fillRect/>
                     </a:stretch>
@@ -3071,16 +3055,8 @@
         </w:drawing>
       </w:r>
     </w:p>
-    <w:p>
-      <w:pPr>
-        <w:pStyle w:val="ImageCaption"/>
-      </w:pPr>
-      <w:r>
-        <w:t xml:space="preserve">Filtering by media/conditions</w:t>
-      </w:r>
-    </w:p>
-    <w:bookmarkEnd w:id="38"/>
-    <w:bookmarkStart w:id="55" w:name="plot-types-and-controls"/>
+    <w:bookmarkEnd w:id="106"/>
+    <w:bookmarkStart w:id="124" w:name="X0cb250eb1df454c6760228a2c04c93ed8beae8a"/>
     <w:p>
       <w:pPr>
         <w:pStyle w:val="Heading2"/>
@@ -3089,7 +3065,7 @@
         <w:t xml:space="preserve">6. Plot Types and Controls</w:t>
       </w:r>
     </w:p>
-    <w:bookmarkStart w:id="39" w:name="boxplot"/>
+    <w:bookmarkStart w:id="107" w:name="boxplot"/>
     <w:p>
       <w:pPr>
         <w:pStyle w:val="Heading3"/>
@@ -3155,8 +3131,8 @@
         <w:t xml:space="preserve">improves readability for long group labels.</w:t>
       </w:r>
     </w:p>
-    <w:bookmarkEnd w:id="39"/>
-    <w:bookmarkStart w:id="40" w:name="barplot"/>
+    <w:bookmarkEnd w:id="107"/>
+    <w:bookmarkStart w:id="108" w:name="barplot"/>
     <w:p>
       <w:pPr>
         <w:pStyle w:val="Heading3"/>
@@ -3201,8 +3177,8 @@
         <w:t xml:space="preserve">Horizontal orientation available.</w:t>
       </w:r>
     </w:p>
-    <w:bookmarkEnd w:id="40"/>
-    <w:bookmarkStart w:id="41" w:name="violin"/>
+    <w:bookmarkEnd w:id="108"/>
+    <w:bookmarkStart w:id="109" w:name="violin"/>
     <w:p>
       <w:pPr>
         <w:pStyle w:val="Heading3"/>
@@ -3247,8 +3223,8 @@
         <w:t xml:space="preserve">Horizontal orientation available.</w:t>
       </w:r>
     </w:p>
-    <w:bookmarkEnd w:id="41"/>
-    <w:bookmarkStart w:id="42" w:name="stacked"/>
+    <w:bookmarkEnd w:id="109"/>
+    <w:bookmarkStart w:id="110" w:name="stacked"/>
     <w:p>
       <w:pPr>
         <w:pStyle w:val="Heading3"/>
@@ -3371,8 +3347,8 @@
         <w:t xml:space="preserve">Horizontal orientation available; legends, text styles, error bars, and significance labels are preserved when the plot is flipped.</w:t>
       </w:r>
     </w:p>
-    <w:bookmarkEnd w:id="42"/>
-    <w:bookmarkStart w:id="43" w:name="correlation"/>
+    <w:bookmarkEnd w:id="110"/>
+    <w:bookmarkStart w:id="111" w:name="correlation"/>
     <w:p>
       <w:pPr>
         <w:pStyle w:val="Heading3"/>
@@ -3465,8 +3441,8 @@
         <w:t xml:space="preserve">Advanced panel supports one-vs-all style screening and Excel export.</w:t>
       </w:r>
     </w:p>
-    <w:bookmarkEnd w:id="43"/>
-    <w:bookmarkStart w:id="44" w:name="heatmap"/>
+    <w:bookmarkEnd w:id="111"/>
+    <w:bookmarkStart w:id="112" w:name="heatmap"/>
     <w:p>
       <w:pPr>
         <w:pStyle w:val="Heading3"/>
@@ -3523,8 +3499,8 @@
         <w:t xml:space="preserve">Optional in-cell value labels.</w:t>
       </w:r>
     </w:p>
-    <w:bookmarkEnd w:id="44"/>
-    <w:bookmarkStart w:id="45" w:name="correlation-matrix"/>
+    <w:bookmarkEnd w:id="112"/>
+    <w:bookmarkStart w:id="113" w:name="correlation-matrix"/>
     <w:p>
       <w:pPr>
         <w:pStyle w:val="Heading3"/>
@@ -3569,8 +3545,8 @@
         <w:t xml:space="preserve">Optional significant labels only.</w:t>
       </w:r>
     </w:p>
-    <w:bookmarkEnd w:id="45"/>
-    <w:bookmarkStart w:id="46" w:name="curves"/>
+    <w:bookmarkEnd w:id="113"/>
+    <w:bookmarkStart w:id="114" w:name="curves"/>
     <w:p>
       <w:pPr>
         <w:pStyle w:val="Heading3"/>
@@ -3615,8 +3591,8 @@
         <w:t xml:space="preserve">Optional raw replicate trajectories.</w:t>
       </w:r>
     </w:p>
-    <w:bookmarkEnd w:id="46"/>
-    <w:bookmarkStart w:id="50" w:name="shared-plot-appearance-controls"/>
+    <w:bookmarkEnd w:id="114"/>
+    <w:bookmarkStart w:id="118" w:name="shared-plot-appearance-controls"/>
     <w:p>
       <w:pPr>
         <w:pStyle w:val="Heading3"/>
@@ -3867,25 +3843,25 @@
     </w:p>
     <w:p>
       <w:pPr>
-        <w:pStyle w:val="CaptionedFigure"/>
+        <w:pStyle w:val="FirstParagraph"/>
       </w:pPr>
       <w:r>
         <w:drawing>
           <wp:inline>
             <wp:extent cx="3185962" cy="5014762"/>
             <wp:effectExtent b="0" l="0" r="0" t="0"/>
-            <wp:docPr descr="Text styling controls" title="" id="48" name="Picture"/>
+            <wp:docPr descr="Text styling controls" title="" id="116" name="Picture"/>
             <a:graphic>
               <a:graphicData uri="http://schemas.openxmlformats.org/drawingml/2006/picture">
                 <pic:pic>
                   <pic:nvPicPr>
-                    <pic:cNvPr descr="manual_images/11_text_styling_controls.png" id="49" name="Picture"/>
+                    <pic:cNvPr descr="manual_images/11_text_styling_controls.png" id="117" name="Picture"/>
                     <pic:cNvPicPr>
                       <a:picLocks noChangeArrowheads="1" noChangeAspect="1"/>
                     </pic:cNvPicPr>
                   </pic:nvPicPr>
                   <pic:blipFill>
-                    <a:blip r:embed="rId47"/>
+                    <a:blip r:embed="rId115"/>
                     <a:stretch>
                       <a:fillRect/>
                     </a:stretch>
@@ -3912,16 +3888,8 @@
         </w:drawing>
       </w:r>
     </w:p>
-    <w:p>
-      <w:pPr>
-        <w:pStyle w:val="ImageCaption"/>
-      </w:pPr>
-      <w:r>
-        <w:t xml:space="preserve">Text styling controls</w:t>
-      </w:r>
-    </w:p>
-    <w:bookmarkEnd w:id="50"/>
-    <w:bookmarkStart w:id="54" w:name="composition-panel"/>
+    <w:bookmarkEnd w:id="118"/>
+    <w:bookmarkStart w:id="123" w:name="composition-panel"/>
     <w:p>
       <w:pPr>
         <w:pStyle w:val="Heading3"/>
@@ -3935,7 +3903,7 @@
         <w:pStyle w:val="FirstParagraph"/>
       </w:pPr>
       <w:r>
-        <w:t xml:space="preserve">Recommended steps:</w:t>
+        <w:t xml:space="preserve">Recommended workflow:</w:t>
       </w:r>
     </w:p>
     <w:p>
@@ -3947,7 +3915,7 @@
         </w:numPr>
       </w:pPr>
       <w:r>
-        <w:t xml:space="preserve">Click</w:t>
+        <w:t xml:space="preserve">Build and edit each source graph, then click</w:t>
       </w:r>
       <w:r>
         <w:t xml:space="preserve"> </w:t>
@@ -3960,10 +3928,7 @@
         <w:t xml:space="preserve">Add to panel</w:t>
       </w:r>
       <w:r>
-        <w:t xml:space="preserve"> </w:t>
-      </w:r>
-      <w:r>
-        <w:t xml:space="preserve">from individual plots.</w:t>
+        <w:t xml:space="preserve">.</w:t>
       </w:r>
     </w:p>
     <w:p>
@@ -3991,7 +3956,7 @@
         <w:t xml:space="preserve"> </w:t>
       </w:r>
       <w:r>
-        <w:t xml:space="preserve">tab.</w:t>
+        <w:t xml:space="preserve">and use the plot picker to include, exclude, and order plots. Deselecting a plot removes it from the active composition without deleting the source graph.</w:t>
       </w:r>
     </w:p>
     <w:p>
@@ -4003,7 +3968,7 @@
         </w:numPr>
       </w:pPr>
       <w:r>
-        <w:t xml:space="preserve">Select and order plots.</w:t>
+        <w:t xml:space="preserve">Set rows and columns. For non-rectangular or repeated-cell layouts, enter the layout grid; column widths and row heights control relative sizing and positioning.</w:t>
       </w:r>
     </w:p>
     <w:p>
@@ -4015,7 +3980,7 @@
         </w:numPr>
       </w:pPr>
       <w:r>
-        <w:t xml:space="preserve">Configure layout (rows/columns, grid, output size).</w:t>
+        <w:t xml:space="preserve">Set composition width and height in pixels. These values define the preview canvas and the composition aspect ratio; they are independent of export DPI and PowerPoint slide size.</w:t>
       </w:r>
     </w:p>
     <w:p>
@@ -4027,75 +3992,7 @@
         </w:numPr>
       </w:pPr>
       <w:r>
-        <w:t xml:space="preserve">Configure style (legend mode, legend side, fonts, text sizes, palette).</w:t>
-      </w:r>
-    </w:p>
-    <w:p>
-      <w:pPr>
-        <w:pStyle w:val="Compact"/>
-        <w:numPr>
-          <w:ilvl w:val="0"/>
-          <w:numId w:val="1032"/>
-        </w:numPr>
-      </w:pPr>
-      <w:r>
-        <w:t xml:space="preserve">Optionally add rich text and per-plot overrides.</w:t>
-      </w:r>
-    </w:p>
-    <w:p>
-      <w:pPr>
-        <w:pStyle w:val="Compact"/>
-        <w:numPr>
-          <w:ilvl w:val="0"/>
-          <w:numId w:val="1032"/>
-        </w:numPr>
-      </w:pPr>
-      <w:r>
-        <w:t xml:space="preserve">Export to</w:t>
-      </w:r>
-      <w:r>
-        <w:t xml:space="preserve"> </w:t>
-      </w:r>
-      <w:r>
-        <w:rPr>
-          <w:rStyle w:val="VerbatimChar"/>
-        </w:rPr>
-        <w:t xml:space="preserve">PNG</w:t>
-      </w:r>
-      <w:r>
-        <w:t xml:space="preserve">,</w:t>
-      </w:r>
-      <w:r>
-        <w:t xml:space="preserve"> </w:t>
-      </w:r>
-      <w:r>
-        <w:rPr>
-          <w:rStyle w:val="VerbatimChar"/>
-        </w:rPr>
-        <w:t xml:space="preserve">PPTX</w:t>
-      </w:r>
-      <w:r>
-        <w:t xml:space="preserve">,</w:t>
-      </w:r>
-      <w:r>
-        <w:t xml:space="preserve"> </w:t>
-      </w:r>
-      <w:r>
-        <w:rPr>
-          <w:rStyle w:val="VerbatimChar"/>
-        </w:rPr>
-        <w:t xml:space="preserve">PDF</w:t>
-      </w:r>
-      <w:r>
-        <w:t xml:space="preserve">.</w:t>
-      </w:r>
-    </w:p>
-    <w:p>
-      <w:pPr>
-        <w:pStyle w:val="FirstParagraph"/>
-      </w:pPr>
-      <w:r>
-        <w:t xml:space="preserve">Composition style controls apply in parallel to all selected plots. The composition</w:t>
+        <w:t xml:space="preserve">Configure style, shared legends, typography, palette, rich text, and optional per-plot overrides.</w:t>
       </w:r>
       <w:r>
         <w:t xml:space="preserve"> </w:t>
@@ -4105,72 +4002,304 @@
           <w:b/>
           <w:bCs/>
         </w:rPr>
+        <w:t xml:space="preserve">Apply composition typography to every plot</w:t>
+      </w:r>
+      <w:r>
+        <w:t xml:space="preserve"> </w:t>
+      </w:r>
+      <w:r>
+        <w:t xml:space="preserve">changes tick-label sizes, X/Y angles and alignment, font family, and text styles across every included graph while preserving its data geometry.</w:t>
+      </w:r>
+    </w:p>
+    <w:p>
+      <w:pPr>
+        <w:pStyle w:val="Compact"/>
+        <w:numPr>
+          <w:ilvl w:val="0"/>
+          <w:numId w:val="1032"/>
+        </w:numPr>
+      </w:pPr>
+      <w:r>
+        <w:t xml:space="preserve">Configure the PowerPoint slide preset (</w:t>
+      </w:r>
+      <w:r>
+        <w:rPr>
+          <w:rStyle w:val="VerbatimChar"/>
+        </w:rPr>
+        <w:t xml:space="preserve">4:3</w:t>
+      </w:r>
+      <w:r>
+        <w:t xml:space="preserve">,</w:t>
+      </w:r>
+      <w:r>
+        <w:t xml:space="preserve"> </w:t>
+      </w:r>
+      <w:r>
+        <w:rPr>
+          <w:rStyle w:val="VerbatimChar"/>
+        </w:rPr>
+        <w:t xml:space="preserve">16:9</w:t>
+      </w:r>
+      <w:r>
+        <w:t xml:space="preserve">, or custom), width, height, orientation, and edge margin.</w:t>
+      </w:r>
+    </w:p>
+    <w:p>
+      <w:pPr>
+        <w:pStyle w:val="Compact"/>
+        <w:numPr>
+          <w:ilvl w:val="0"/>
+          <w:numId w:val="1032"/>
+        </w:numPr>
+      </w:pPr>
+      <w:r>
+        <w:t xml:space="preserve">Review the preview and export</w:t>
+      </w:r>
+      <w:r>
+        <w:t xml:space="preserve"> </w:t>
+      </w:r>
+      <w:r>
+        <w:rPr>
+          <w:rStyle w:val="VerbatimChar"/>
+        </w:rPr>
+        <w:t xml:space="preserve">PNG</w:t>
+      </w:r>
+      <w:r>
+        <w:t xml:space="preserve">,</w:t>
+      </w:r>
+      <w:r>
+        <w:t xml:space="preserve"> </w:t>
+      </w:r>
+      <w:r>
+        <w:rPr>
+          <w:rStyle w:val="VerbatimChar"/>
+        </w:rPr>
+        <w:t xml:space="preserve">PPTX</w:t>
+      </w:r>
+      <w:r>
+        <w:t xml:space="preserve">,</w:t>
+      </w:r>
+      <w:r>
+        <w:t xml:space="preserve"> </w:t>
+      </w:r>
+      <w:r>
+        <w:rPr>
+          <w:rStyle w:val="VerbatimChar"/>
+        </w:rPr>
+        <w:t xml:space="preserve">PDF</w:t>
+      </w:r>
+      <w:r>
+        <w:t xml:space="preserve">, or composition metadata.</w:t>
+      </w:r>
+    </w:p>
+    <w:bookmarkStart w:id="122" w:name="dpi-and-physical-dimensions"/>
+    <w:p>
+      <w:pPr>
+        <w:pStyle w:val="Heading4"/>
+      </w:pPr>
+      <w:r>
+        <w:t xml:space="preserve">DPI and physical dimensions</w:t>
+      </w:r>
+    </w:p>
+    <w:p>
+      <w:pPr>
+        <w:pStyle w:val="Compact"/>
+        <w:numPr>
+          <w:ilvl w:val="0"/>
+          <w:numId w:val="1033"/>
+        </w:numPr>
+      </w:pPr>
+      <w:r>
+        <w:t xml:space="preserve">The default export resolution is</w:t>
+      </w:r>
+      <w:r>
+        <w:t xml:space="preserve"> </w:t>
+      </w:r>
+      <w:r>
+        <w:rPr>
+          <w:b/>
+          <w:bCs/>
+        </w:rPr>
+        <w:t xml:space="preserve">300 DPI</w:t>
+      </w:r>
+      <w:r>
+        <w:t xml:space="preserve">. The supported range is</w:t>
+      </w:r>
+      <w:r>
+        <w:t xml:space="preserve"> </w:t>
+      </w:r>
+      <w:r>
+        <w:rPr>
+          <w:b/>
+          <w:bCs/>
+        </w:rPr>
+        <w:t xml:space="preserve">72 to 600 DPI</w:t>
+      </w:r>
+      <w:r>
+        <w:t xml:space="preserve">, and the value remains editable.</w:t>
+      </w:r>
+    </w:p>
+    <w:p>
+      <w:pPr>
+        <w:pStyle w:val="Compact"/>
+        <w:numPr>
+          <w:ilvl w:val="0"/>
+          <w:numId w:val="1033"/>
+        </w:numPr>
+      </w:pPr>
+      <w:r>
+        <w:t xml:space="preserve">DPI applies to raster output, including</w:t>
+      </w:r>
+      <w:r>
+        <w:t xml:space="preserve"> </w:t>
+      </w:r>
+      <w:r>
+        <w:rPr>
+          <w:rStyle w:val="VerbatimChar"/>
+        </w:rPr>
+        <w:t xml:space="preserve">PNG</w:t>
+      </w:r>
+      <w:r>
+        <w:t xml:space="preserve">, raster clipboard output, and the raster fallback used only when editable PowerPoint vector rendering is unavailable.</w:t>
+      </w:r>
+    </w:p>
+    <w:p>
+      <w:pPr>
+        <w:pStyle w:val="Compact"/>
+        <w:numPr>
+          <w:ilvl w:val="0"/>
+          <w:numId w:val="1033"/>
+        </w:numPr>
+      </w:pPr>
+      <w:r>
+        <w:rPr>
+          <w:rStyle w:val="VerbatimChar"/>
+        </w:rPr>
+        <w:t xml:space="preserve">PDF</w:t>
+      </w:r>
+      <w:r>
+        <w:t xml:space="preserve"> </w:t>
+      </w:r>
+      <w:r>
+        <w:t xml:space="preserve">and the normal editable</w:t>
+      </w:r>
+      <w:r>
+        <w:t xml:space="preserve"> </w:t>
+      </w:r>
+      <w:r>
+        <w:rPr>
+          <w:rStyle w:val="VerbatimChar"/>
+        </w:rPr>
+        <w:t xml:space="preserve">PPTX</w:t>
+      </w:r>
+      <w:r>
+        <w:t xml:space="preserve"> </w:t>
+      </w:r>
+      <w:r>
+        <w:t xml:space="preserve">path are vector-based, so DPI does not alter their vector elements. A selected DPI is still stored in metadata for reproducibility and for any raster fallback.</w:t>
+      </w:r>
+    </w:p>
+    <w:p>
+      <w:pPr>
+        <w:pStyle w:val="Compact"/>
+        <w:numPr>
+          <w:ilvl w:val="0"/>
+          <w:numId w:val="1033"/>
+        </w:numPr>
+      </w:pPr>
+      <w:r>
+        <w:t xml:space="preserve">The browser preview uses screen/CSS pixel density. Changing export DPI does not resize or reposition the preview.</w:t>
+      </w:r>
+    </w:p>
+    <w:p>
+      <w:pPr>
+        <w:pStyle w:val="Compact"/>
+        <w:numPr>
+          <w:ilvl w:val="0"/>
+          <w:numId w:val="1033"/>
+        </w:numPr>
+      </w:pPr>
+      <w:r>
+        <w:t xml:space="preserve">Increasing DPI increases raster pixel count, rendering time, memory use, and file size. It does not change composition width/height, graph proportions, layout positions, or PowerPoint slide dimensions.</w:t>
+      </w:r>
+    </w:p>
+    <w:p>
+      <w:pPr>
+        <w:pStyle w:val="Compact"/>
+        <w:numPr>
+          <w:ilvl w:val="0"/>
+          <w:numId w:val="1033"/>
+        </w:numPr>
+      </w:pPr>
+      <w:r>
+        <w:t xml:space="preserve">Composition width/height control the logical canvas. PowerPoint width/height control the physical slide. DPI controls raster sampling quality. These are separate settings.</w:t>
+      </w:r>
+    </w:p>
+    <w:p>
+      <w:pPr>
+        <w:pStyle w:val="Compact"/>
+        <w:numPr>
+          <w:ilvl w:val="0"/>
+          <w:numId w:val="1033"/>
+        </w:numPr>
+      </w:pPr>
+      <w:r>
+        <w:t xml:space="preserve">Metadata stores the effective DPI and restores it when loaded. Legacy metadata without a DPI field uses 300 DPI. Missing, non-numeric, zero, negative, or out-of-range DPI values safely fall back to 300 DPI; other valid metadata fields are still restored.</w:t>
+      </w:r>
+    </w:p>
+    <w:p>
+      <w:pPr>
+        <w:pStyle w:val="FirstParagraph"/>
+      </w:pPr>
+      <w:r>
+        <w:t xml:space="preserve">Composition style controls apply in parallel to all selected plots. The composition</w:t>
+      </w:r>
+      <w:r>
+        <w:t xml:space="preserve"> </w:t>
+      </w:r>
+      <w:r>
+        <w:rPr>
+          <w:b/>
+          <w:bCs/>
+        </w:rPr>
         <w:t xml:space="preserve">Text styling</w:t>
       </w:r>
       <w:r>
         <w:t xml:space="preserve"> </w:t>
       </w:r>
       <w:r>
-        <w:t xml:space="preserve">section mirrors the individual plot controls: the font family is applied across all plot text, while bold/italic/underline can be selected separately for titles, axes, legends, data labels, and significance text. Composition exports preserve these settings in</w:t>
-      </w:r>
-      <w:r>
-        <w:t xml:space="preserve"> </w:t>
-      </w:r>
-      <w:r>
-        <w:rPr>
-          <w:rStyle w:val="VerbatimChar"/>
-        </w:rPr>
-        <w:t xml:space="preserve">PNG</w:t>
-      </w:r>
-      <w:r>
-        <w:t xml:space="preserve">,</w:t>
-      </w:r>
-      <w:r>
-        <w:t xml:space="preserve"> </w:t>
-      </w:r>
-      <w:r>
-        <w:rPr>
-          <w:rStyle w:val="VerbatimChar"/>
-        </w:rPr>
-        <w:t xml:space="preserve">PDF</w:t>
-      </w:r>
-      <w:r>
-        <w:t xml:space="preserve">, and</w:t>
-      </w:r>
-      <w:r>
-        <w:t xml:space="preserve"> </w:t>
-      </w:r>
-      <w:r>
-        <w:rPr>
-          <w:rStyle w:val="VerbatimChar"/>
-        </w:rPr>
-        <w:t xml:space="preserve">PPTX</w:t>
-      </w:r>
-      <w:r>
-        <w:t xml:space="preserve">.</w:t>
-      </w:r>
-    </w:p>
-    <w:p>
-      <w:pPr>
-        <w:pStyle w:val="CaptionedFigure"/>
+        <w:t xml:space="preserve">section mirrors the individual plot controls: the font family is applied across all plot text, while bold/italic/underline can be selected separately for titles, axes, legends, data labels, and significance text. Composition metadata also preserves layout, dimensions, slide settings, DPI, typography, legend configuration, palette, rich text, and per-plot overrides.</w:t>
+      </w:r>
+    </w:p>
+    <w:p>
+      <w:pPr>
+        <w:pStyle w:val="BodyText"/>
+      </w:pPr>
+      <w:r>
+        <w:t xml:space="preserve">The PowerPoint export always creates one slide and proportionally fits the preview layout within the selected margins. If a slide is too small, BIOSZEN scales the composition down and warns the user rather than overlapping or clipping plots. Very dense layouts, long labels, large fonts, and small portrait slides may require a larger slide, fewer plots, shorter labels, or wider margins. Preview and PowerPoint text can differ slightly because browser and PowerPoint font metrics are not identical; BIOSZEN applies a proportional safety adjustment when shrinking the layout.</w:t>
+      </w:r>
+    </w:p>
+    <w:p>
+      <w:pPr>
+        <w:pStyle w:val="BodyText"/>
       </w:pPr>
       <w:r>
         <w:drawing>
           <wp:inline>
             <wp:extent cx="5334000" cy="2115879"/>
             <wp:effectExtent b="0" l="0" r="0" t="0"/>
-            <wp:docPr descr="Significance and annotation setup" title="" id="52" name="Picture"/>
+            <wp:docPr descr="Significance and annotation setup" title="" id="120" name="Picture"/>
             <a:graphic>
               <a:graphicData uri="http://schemas.openxmlformats.org/drawingml/2006/picture">
                 <pic:pic>
                   <pic:nvPicPr>
-                    <pic:cNvPr descr="manual_images/10_significance_annotations.png" id="53" name="Picture"/>
+                    <pic:cNvPr descr="manual_images/10_significance_annotations.png" id="121" name="Picture"/>
                     <pic:cNvPicPr>
                       <a:picLocks noChangeArrowheads="1" noChangeAspect="1"/>
                     </pic:cNvPicPr>
                   </pic:nvPicPr>
                   <pic:blipFill>
-                    <a:blip r:embed="rId51"/>
+                    <a:blip r:embed="rId119"/>
                     <a:stretch>
                       <a:fillRect/>
                     </a:stretch>
@@ -4197,17 +4326,10 @@
         </w:drawing>
       </w:r>
     </w:p>
-    <w:p>
-      <w:pPr>
-        <w:pStyle w:val="ImageCaption"/>
-      </w:pPr>
-      <w:r>
-        <w:t xml:space="preserve">Significance and annotation setup</w:t>
-      </w:r>
-    </w:p>
-    <w:bookmarkEnd w:id="54"/>
-    <w:bookmarkEnd w:id="55"/>
-    <w:bookmarkStart w:id="56" w:name="normalization"/>
+    <w:bookmarkEnd w:id="122"/>
+    <w:bookmarkEnd w:id="123"/>
+    <w:bookmarkEnd w:id="124"/>
+    <w:bookmarkStart w:id="125" w:name="X115a55130e2baabc52a19ceae26040e6a759372"/>
     <w:p>
       <w:pPr>
         <w:pStyle w:val="Heading2"/>
@@ -4245,7 +4367,7 @@
         <w:pStyle w:val="Compact"/>
         <w:numPr>
           <w:ilvl w:val="0"/>
-          <w:numId w:val="1033"/>
+          <w:numId w:val="1034"/>
         </w:numPr>
       </w:pPr>
       <w:r>
@@ -4272,7 +4394,7 @@
         <w:pStyle w:val="Compact"/>
         <w:numPr>
           <w:ilvl w:val="0"/>
-          <w:numId w:val="1033"/>
+          <w:numId w:val="1034"/>
         </w:numPr>
       </w:pPr>
       <w:r>
@@ -4317,15 +4439,15 @@
         <w:pStyle w:val="Compact"/>
         <w:numPr>
           <w:ilvl w:val="0"/>
-          <w:numId w:val="1033"/>
+          <w:numId w:val="1034"/>
         </w:numPr>
       </w:pPr>
       <w:r>
         <w:t xml:space="preserve">Fallback logic is applied when strict control pairing is not available.</w:t>
       </w:r>
     </w:p>
-    <w:bookmarkEnd w:id="56"/>
-    <w:bookmarkStart w:id="58" w:name="statistics"/>
+    <w:bookmarkEnd w:id="125"/>
+    <w:bookmarkStart w:id="127" w:name="X00c7035554882fbb638d8b5cc72953fcde99525"/>
     <w:p>
       <w:pPr>
         <w:pStyle w:val="Heading2"/>
@@ -4334,7 +4456,7 @@
         <w:t xml:space="preserve">8. Statistics</w:t>
       </w:r>
     </w:p>
-    <w:bookmarkStart w:id="57" w:name="main-statistical-tools"/>
+    <w:bookmarkStart w:id="126" w:name="main-statistical-tools"/>
     <w:p>
       <w:pPr>
         <w:pStyle w:val="Heading3"/>
@@ -4348,7 +4470,7 @@
         <w:pStyle w:val="Compact"/>
         <w:numPr>
           <w:ilvl w:val="0"/>
-          <w:numId w:val="1034"/>
+          <w:numId w:val="1035"/>
         </w:numPr>
       </w:pPr>
       <w:r>
@@ -4369,7 +4491,7 @@
         <w:pStyle w:val="Compact"/>
         <w:numPr>
           <w:ilvl w:val="0"/>
-          <w:numId w:val="1034"/>
+          <w:numId w:val="1035"/>
         </w:numPr>
       </w:pPr>
       <w:r>
@@ -4390,7 +4512,7 @@
         <w:pStyle w:val="Compact"/>
         <w:numPr>
           <w:ilvl w:val="0"/>
-          <w:numId w:val="1034"/>
+          <w:numId w:val="1035"/>
         </w:numPr>
       </w:pPr>
       <w:r>
@@ -4411,7 +4533,7 @@
         <w:pStyle w:val="Compact"/>
         <w:numPr>
           <w:ilvl w:val="0"/>
-          <w:numId w:val="1034"/>
+          <w:numId w:val="1035"/>
         </w:numPr>
       </w:pPr>
       <w:r>
@@ -4432,7 +4554,7 @@
         <w:pStyle w:val="Compact"/>
         <w:numPr>
           <w:ilvl w:val="0"/>
-          <w:numId w:val="1034"/>
+          <w:numId w:val="1035"/>
         </w:numPr>
       </w:pPr>
       <w:r>
@@ -4453,7 +4575,7 @@
         <w:pStyle w:val="Compact"/>
         <w:numPr>
           <w:ilvl w:val="0"/>
-          <w:numId w:val="1034"/>
+          <w:numId w:val="1035"/>
         </w:numPr>
       </w:pPr>
       <w:r>
@@ -4486,7 +4608,7 @@
         <w:pStyle w:val="Compact"/>
         <w:numPr>
           <w:ilvl w:val="0"/>
-          <w:numId w:val="1034"/>
+          <w:numId w:val="1035"/>
         </w:numPr>
       </w:pPr>
       <w:r>
@@ -4507,7 +4629,7 @@
         <w:pStyle w:val="Compact"/>
         <w:numPr>
           <w:ilvl w:val="0"/>
-          <w:numId w:val="1034"/>
+          <w:numId w:val="1035"/>
         </w:numPr>
       </w:pPr>
       <w:r>
@@ -4536,7 +4658,7 @@
         <w:pStyle w:val="Compact"/>
         <w:numPr>
           <w:ilvl w:val="0"/>
-          <w:numId w:val="1035"/>
+          <w:numId w:val="1036"/>
         </w:numPr>
       </w:pPr>
       <w:r>
@@ -4557,7 +4679,7 @@
         <w:pStyle w:val="Compact"/>
         <w:numPr>
           <w:ilvl w:val="0"/>
-          <w:numId w:val="1035"/>
+          <w:numId w:val="1036"/>
         </w:numPr>
       </w:pPr>
       <w:r>
@@ -4578,7 +4700,7 @@
         <w:pStyle w:val="Compact"/>
         <w:numPr>
           <w:ilvl w:val="0"/>
-          <w:numId w:val="1035"/>
+          <w:numId w:val="1036"/>
         </w:numPr>
       </w:pPr>
       <w:r>
@@ -4599,7 +4721,7 @@
         <w:pStyle w:val="Compact"/>
         <w:numPr>
           <w:ilvl w:val="0"/>
-          <w:numId w:val="1035"/>
+          <w:numId w:val="1036"/>
         </w:numPr>
       </w:pPr>
       <w:r>
@@ -4686,7 +4808,7 @@
         <w:pStyle w:val="Compact"/>
         <w:numPr>
           <w:ilvl w:val="0"/>
-          <w:numId w:val="1036"/>
+          <w:numId w:val="1037"/>
         </w:numPr>
       </w:pPr>
       <w:r>
@@ -4743,7 +4865,7 @@
         <w:pStyle w:val="Compact"/>
         <w:numPr>
           <w:ilvl w:val="0"/>
-          <w:numId w:val="1036"/>
+          <w:numId w:val="1037"/>
         </w:numPr>
       </w:pPr>
       <w:r>
@@ -4785,7 +4907,7 @@
         <w:pStyle w:val="Compact"/>
         <w:numPr>
           <w:ilvl w:val="0"/>
-          <w:numId w:val="1036"/>
+          <w:numId w:val="1037"/>
         </w:numPr>
       </w:pPr>
       <w:r>
@@ -4812,7 +4934,7 @@
         <w:pStyle w:val="Compact"/>
         <w:numPr>
           <w:ilvl w:val="0"/>
-          <w:numId w:val="1036"/>
+          <w:numId w:val="1037"/>
         </w:numPr>
       </w:pPr>
       <w:r>
@@ -4898,7 +5020,7 @@
         <w:pStyle w:val="Compact"/>
         <w:numPr>
           <w:ilvl w:val="0"/>
-          <w:numId w:val="1037"/>
+          <w:numId w:val="1038"/>
         </w:numPr>
       </w:pPr>
       <w:r>
@@ -4910,7 +5032,7 @@
         <w:pStyle w:val="Compact"/>
         <w:numPr>
           <w:ilvl w:val="0"/>
-          <w:numId w:val="1037"/>
+          <w:numId w:val="1038"/>
         </w:numPr>
       </w:pPr>
       <w:r>
@@ -4922,7 +5044,7 @@
         <w:pStyle w:val="Compact"/>
         <w:numPr>
           <w:ilvl w:val="0"/>
-          <w:numId w:val="1037"/>
+          <w:numId w:val="1038"/>
         </w:numPr>
       </w:pPr>
       <w:r>
@@ -4942,7 +5064,7 @@
         <w:pStyle w:val="Compact"/>
         <w:numPr>
           <w:ilvl w:val="0"/>
-          <w:numId w:val="1038"/>
+          <w:numId w:val="1039"/>
         </w:numPr>
       </w:pPr>
       <w:r>
@@ -4954,7 +5076,7 @@
         <w:pStyle w:val="Compact"/>
         <w:numPr>
           <w:ilvl w:val="0"/>
-          <w:numId w:val="1038"/>
+          <w:numId w:val="1039"/>
         </w:numPr>
       </w:pPr>
       <w:r>
@@ -4966,7 +5088,7 @@
         <w:pStyle w:val="Compact"/>
         <w:numPr>
           <w:ilvl w:val="0"/>
-          <w:numId w:val="1038"/>
+          <w:numId w:val="1039"/>
         </w:numPr>
       </w:pPr>
       <w:r>
@@ -4978,7 +5100,7 @@
         <w:pStyle w:val="Compact"/>
         <w:numPr>
           <w:ilvl w:val="0"/>
-          <w:numId w:val="1038"/>
+          <w:numId w:val="1039"/>
         </w:numPr>
       </w:pPr>
       <w:r>
@@ -5054,9 +5176,9 @@
         <w:t xml:space="preserve">and some non-parametric paths that require raw observations are disabled.</w:t>
       </w:r>
     </w:p>
-    <w:bookmarkEnd w:id="57"/>
-    <w:bookmarkEnd w:id="58"/>
-    <w:bookmarkStart w:id="59" w:name="significance-annotations"/>
+    <w:bookmarkEnd w:id="126"/>
+    <w:bookmarkEnd w:id="127"/>
+    <w:bookmarkStart w:id="128" w:name="X226b9a1a8acbb38ca74b8f37dcf5f8aa29b93b6"/>
     <w:p>
       <w:pPr>
         <w:pStyle w:val="Heading2"/>
@@ -5078,7 +5200,7 @@
         <w:pStyle w:val="Compact"/>
         <w:numPr>
           <w:ilvl w:val="0"/>
-          <w:numId w:val="1039"/>
+          <w:numId w:val="1040"/>
         </w:numPr>
       </w:pPr>
       <w:r>
@@ -5090,7 +5212,7 @@
         <w:pStyle w:val="Compact"/>
         <w:numPr>
           <w:ilvl w:val="0"/>
-          <w:numId w:val="1039"/>
+          <w:numId w:val="1040"/>
         </w:numPr>
       </w:pPr>
       <w:r>
@@ -5147,7 +5269,7 @@
         <w:pStyle w:val="Compact"/>
         <w:numPr>
           <w:ilvl w:val="0"/>
-          <w:numId w:val="1039"/>
+          <w:numId w:val="1040"/>
         </w:numPr>
       </w:pPr>
       <w:r>
@@ -5167,7 +5289,7 @@
         <w:pStyle w:val="Compact"/>
         <w:numPr>
           <w:ilvl w:val="0"/>
-          <w:numId w:val="1040"/>
+          <w:numId w:val="1041"/>
         </w:numPr>
       </w:pPr>
       <w:r>
@@ -5179,7 +5301,7 @@
         <w:pStyle w:val="Compact"/>
         <w:numPr>
           <w:ilvl w:val="0"/>
-          <w:numId w:val="1040"/>
+          <w:numId w:val="1041"/>
         </w:numPr>
       </w:pPr>
       <w:r>
@@ -5191,7 +5313,7 @@
         <w:pStyle w:val="Compact"/>
         <w:numPr>
           <w:ilvl w:val="0"/>
-          <w:numId w:val="1040"/>
+          <w:numId w:val="1041"/>
         </w:numPr>
       </w:pPr>
       <w:r>
@@ -5227,7 +5349,7 @@
         <w:pStyle w:val="Compact"/>
         <w:numPr>
           <w:ilvl w:val="0"/>
-          <w:numId w:val="1040"/>
+          <w:numId w:val="1041"/>
         </w:numPr>
       </w:pPr>
       <w:r>
@@ -5263,7 +5385,7 @@
         <w:pStyle w:val="Compact"/>
         <w:numPr>
           <w:ilvl w:val="0"/>
-          <w:numId w:val="1040"/>
+          <w:numId w:val="1041"/>
         </w:numPr>
       </w:pPr>
       <w:r>
@@ -5294,8 +5416,8 @@
         <w:t xml:space="preserve">plots, choose the parameter before adding a label. Automatic labels keep the parameter identity and place the annotation over the selected target group for that parameter.</w:t>
       </w:r>
     </w:p>
-    <w:bookmarkEnd w:id="59"/>
-    <w:bookmarkStart w:id="65" w:name="qc-and-replicate-management"/>
+    <w:bookmarkEnd w:id="128"/>
+    <w:bookmarkStart w:id="134" w:name="X74088aaef10aeab96f289eb9220b0777e0698d0"/>
     <w:p>
       <w:pPr>
         <w:pStyle w:val="Heading2"/>
@@ -5317,7 +5439,7 @@
         <w:pStyle w:val="Compact"/>
         <w:numPr>
           <w:ilvl w:val="0"/>
-          <w:numId w:val="1041"/>
+          <w:numId w:val="1042"/>
         </w:numPr>
       </w:pPr>
       <w:r>
@@ -5329,7 +5451,7 @@
         <w:pStyle w:val="Compact"/>
         <w:numPr>
           <w:ilvl w:val="0"/>
-          <w:numId w:val="1041"/>
+          <w:numId w:val="1042"/>
         </w:numPr>
       </w:pPr>
       <w:r>
@@ -5341,14 +5463,14 @@
         <w:pStyle w:val="Compact"/>
         <w:numPr>
           <w:ilvl w:val="0"/>
-          <w:numId w:val="1041"/>
+          <w:numId w:val="1042"/>
         </w:numPr>
       </w:pPr>
       <w:r>
         <w:t xml:space="preserve">Sample size and replicate coverage.</w:t>
       </w:r>
     </w:p>
-    <w:bookmarkStart w:id="60" w:name="biological-replicates"/>
+    <w:bookmarkStart w:id="129" w:name="biological-replicates"/>
     <w:p>
       <w:pPr>
         <w:pStyle w:val="Heading3"/>
@@ -5362,7 +5484,7 @@
         <w:pStyle w:val="Compact"/>
         <w:numPr>
           <w:ilvl w:val="0"/>
-          <w:numId w:val="1042"/>
+          <w:numId w:val="1043"/>
         </w:numPr>
       </w:pPr>
       <w:r>
@@ -5374,7 +5496,7 @@
         <w:pStyle w:val="Compact"/>
         <w:numPr>
           <w:ilvl w:val="0"/>
-          <w:numId w:val="1042"/>
+          <w:numId w:val="1043"/>
         </w:numPr>
       </w:pPr>
       <w:r>
@@ -5386,7 +5508,7 @@
         <w:pStyle w:val="Compact"/>
         <w:numPr>
           <w:ilvl w:val="0"/>
-          <w:numId w:val="1042"/>
+          <w:numId w:val="1043"/>
         </w:numPr>
       </w:pPr>
       <w:r>
@@ -5406,7 +5528,7 @@
         <w:pStyle w:val="Compact"/>
         <w:numPr>
           <w:ilvl w:val="0"/>
-          <w:numId w:val="1043"/>
+          <w:numId w:val="1044"/>
         </w:numPr>
       </w:pPr>
       <w:r>
@@ -5418,15 +5540,15 @@
         <w:pStyle w:val="Compact"/>
         <w:numPr>
           <w:ilvl w:val="0"/>
-          <w:numId w:val="1043"/>
+          <w:numId w:val="1044"/>
         </w:numPr>
       </w:pPr>
       <w:r>
         <w:t xml:space="preserve">Keeps lowest-score (most reproducible) replicates.</w:t>
       </w:r>
     </w:p>
-    <w:bookmarkEnd w:id="60"/>
-    <w:bookmarkStart w:id="64" w:name="technical-replicates"/>
+    <w:bookmarkEnd w:id="129"/>
+    <w:bookmarkStart w:id="133" w:name="technical-replicates"/>
     <w:p>
       <w:pPr>
         <w:pStyle w:val="Heading3"/>
@@ -5448,7 +5570,7 @@
         <w:pStyle w:val="Compact"/>
         <w:numPr>
           <w:ilvl w:val="0"/>
-          <w:numId w:val="1044"/>
+          <w:numId w:val="1045"/>
         </w:numPr>
       </w:pPr>
       <w:r>
@@ -5460,7 +5582,7 @@
         <w:pStyle w:val="Compact"/>
         <w:numPr>
           <w:ilvl w:val="0"/>
-          <w:numId w:val="1044"/>
+          <w:numId w:val="1045"/>
         </w:numPr>
       </w:pPr>
       <w:r>
@@ -5472,7 +5594,7 @@
         <w:pStyle w:val="Compact"/>
         <w:numPr>
           <w:ilvl w:val="0"/>
-          <w:numId w:val="1044"/>
+          <w:numId w:val="1045"/>
         </w:numPr>
       </w:pPr>
       <w:r>
@@ -5484,7 +5606,7 @@
         <w:pStyle w:val="Compact"/>
         <w:numPr>
           <w:ilvl w:val="0"/>
-          <w:numId w:val="1044"/>
+          <w:numId w:val="1045"/>
         </w:numPr>
       </w:pPr>
       <w:r>
@@ -5496,7 +5618,7 @@
         <w:pStyle w:val="Compact"/>
         <w:numPr>
           <w:ilvl w:val="0"/>
-          <w:numId w:val="1044"/>
+          <w:numId w:val="1045"/>
         </w:numPr>
       </w:pPr>
       <w:r>
@@ -5505,25 +5627,25 @@
     </w:p>
     <w:p>
       <w:pPr>
-        <w:pStyle w:val="CaptionedFigure"/>
+        <w:pStyle w:val="FirstParagraph"/>
       </w:pPr>
       <w:r>
         <w:drawing>
           <wp:inline>
             <wp:extent cx="5334000" cy="2228174"/>
             <wp:effectExtent b="0" l="0" r="0" t="0"/>
-            <wp:docPr descr="Biological replicate filtering" title="" id="62" name="Picture"/>
+            <wp:docPr descr="Biological replicate filtering" title="" id="131" name="Picture"/>
             <a:graphic>
               <a:graphicData uri="http://schemas.openxmlformats.org/drawingml/2006/picture">
                 <pic:pic>
                   <pic:nvPicPr>
-                    <pic:cNvPr descr="manual_images/04_filter_biological_replicates.png" id="63" name="Picture"/>
+                    <pic:cNvPr descr="manual_images/04_filter_biological_replicates.png" id="132" name="Picture"/>
                     <pic:cNvPicPr>
                       <a:picLocks noChangeArrowheads="1" noChangeAspect="1"/>
                     </pic:cNvPicPr>
                   </pic:nvPicPr>
                   <pic:blipFill>
-                    <a:blip r:embed="rId61"/>
+                    <a:blip r:embed="rId130"/>
                     <a:stretch>
                       <a:fillRect/>
                     </a:stretch>
@@ -5550,17 +5672,9 @@
         </w:drawing>
       </w:r>
     </w:p>
-    <w:p>
-      <w:pPr>
-        <w:pStyle w:val="ImageCaption"/>
-      </w:pPr>
-      <w:r>
-        <w:t xml:space="preserve">Biological replicate filtering</w:t>
-      </w:r>
-    </w:p>
-    <w:bookmarkEnd w:id="64"/>
-    <w:bookmarkEnd w:id="65"/>
-    <w:bookmarkStart w:id="66" w:name="metadata-and-reproducibility"/>
+    <w:bookmarkEnd w:id="133"/>
+    <w:bookmarkEnd w:id="134"/>
+    <w:bookmarkStart w:id="135" w:name="X027b5303909c1c711c784491c3eab67dd715d28"/>
     <w:p>
       <w:pPr>
         <w:pStyle w:val="Heading2"/>
@@ -5582,7 +5696,7 @@
         <w:pStyle w:val="Compact"/>
         <w:numPr>
           <w:ilvl w:val="0"/>
-          <w:numId w:val="1045"/>
+          <w:numId w:val="1046"/>
         </w:numPr>
       </w:pPr>
       <w:r>
@@ -5604,7 +5718,7 @@
         <w:pStyle w:val="Compact"/>
         <w:numPr>
           <w:ilvl w:val="0"/>
-          <w:numId w:val="1045"/>
+          <w:numId w:val="1046"/>
         </w:numPr>
       </w:pPr>
       <w:r>
@@ -5616,7 +5730,7 @@
         <w:pStyle w:val="Compact"/>
         <w:numPr>
           <w:ilvl w:val="0"/>
-          <w:numId w:val="1045"/>
+          <w:numId w:val="1046"/>
         </w:numPr>
       </w:pPr>
       <w:r>
@@ -5628,7 +5742,7 @@
         <w:pStyle w:val="Compact"/>
         <w:numPr>
           <w:ilvl w:val="0"/>
-          <w:numId w:val="1045"/>
+          <w:numId w:val="1046"/>
         </w:numPr>
       </w:pPr>
       <w:r>
@@ -5640,7 +5754,7 @@
         <w:pStyle w:val="Compact"/>
         <w:numPr>
           <w:ilvl w:val="0"/>
-          <w:numId w:val="1045"/>
+          <w:numId w:val="1046"/>
         </w:numPr>
       </w:pPr>
       <w:r>
@@ -5652,7 +5766,7 @@
         <w:pStyle w:val="Compact"/>
         <w:numPr>
           <w:ilvl w:val="0"/>
-          <w:numId w:val="1045"/>
+          <w:numId w:val="1046"/>
         </w:numPr>
       </w:pPr>
       <w:r>
@@ -5672,7 +5786,7 @@
         <w:pStyle w:val="Compact"/>
         <w:numPr>
           <w:ilvl w:val="0"/>
-          <w:numId w:val="1046"/>
+          <w:numId w:val="1047"/>
         </w:numPr>
       </w:pPr>
       <w:r>
@@ -5684,7 +5798,7 @@
         <w:pStyle w:val="Compact"/>
         <w:numPr>
           <w:ilvl w:val="0"/>
-          <w:numId w:val="1046"/>
+          <w:numId w:val="1047"/>
         </w:numPr>
       </w:pPr>
       <w:r>
@@ -5696,7 +5810,7 @@
         <w:pStyle w:val="Compact"/>
         <w:numPr>
           <w:ilvl w:val="0"/>
-          <w:numId w:val="1046"/>
+          <w:numId w:val="1047"/>
         </w:numPr>
       </w:pPr>
       <w:r>
@@ -5716,7 +5830,7 @@
         <w:pStyle w:val="Compact"/>
         <w:numPr>
           <w:ilvl w:val="0"/>
-          <w:numId w:val="1047"/>
+          <w:numId w:val="1048"/>
         </w:numPr>
       </w:pPr>
       <w:r>
@@ -5728,7 +5842,7 @@
         <w:pStyle w:val="Compact"/>
         <w:numPr>
           <w:ilvl w:val="0"/>
-          <w:numId w:val="1047"/>
+          <w:numId w:val="1048"/>
         </w:numPr>
       </w:pPr>
       <w:r>
@@ -5740,15 +5854,15 @@
         <w:pStyle w:val="Compact"/>
         <w:numPr>
           <w:ilvl w:val="0"/>
-          <w:numId w:val="1047"/>
+          <w:numId w:val="1048"/>
         </w:numPr>
       </w:pPr>
       <w:r>
         <w:t xml:space="preserve">Final builder orientation checks.</w:t>
       </w:r>
     </w:p>
-    <w:bookmarkEnd w:id="66"/>
-    <w:bookmarkStart w:id="67" w:name="downloads"/>
+    <w:bookmarkEnd w:id="135"/>
+    <w:bookmarkStart w:id="136" w:name="Xdaccffce00e124c4dc2e12129d423a1de5e7d51"/>
     <w:p>
       <w:pPr>
         <w:pStyle w:val="Heading2"/>
@@ -5770,7 +5884,7 @@
         <w:pStyle w:val="Compact"/>
         <w:numPr>
           <w:ilvl w:val="0"/>
-          <w:numId w:val="1048"/>
+          <w:numId w:val="1049"/>
         </w:numPr>
       </w:pPr>
       <w:r>
@@ -5803,7 +5917,7 @@
         <w:pStyle w:val="Compact"/>
         <w:numPr>
           <w:ilvl w:val="0"/>
-          <w:numId w:val="1048"/>
+          <w:numId w:val="1049"/>
         </w:numPr>
       </w:pPr>
       <w:r>
@@ -5815,7 +5929,7 @@
         <w:pStyle w:val="Compact"/>
         <w:numPr>
           <w:ilvl w:val="0"/>
-          <w:numId w:val="1048"/>
+          <w:numId w:val="1049"/>
         </w:numPr>
       </w:pPr>
       <w:r>
@@ -5827,7 +5941,7 @@
         <w:pStyle w:val="Compact"/>
         <w:numPr>
           <w:ilvl w:val="0"/>
-          <w:numId w:val="1048"/>
+          <w:numId w:val="1049"/>
         </w:numPr>
       </w:pPr>
       <w:r>
@@ -5839,7 +5953,7 @@
         <w:pStyle w:val="Compact"/>
         <w:numPr>
           <w:ilvl w:val="0"/>
-          <w:numId w:val="1048"/>
+          <w:numId w:val="1049"/>
         </w:numPr>
       </w:pPr>
       <w:r>
@@ -5851,7 +5965,7 @@
         <w:pStyle w:val="Compact"/>
         <w:numPr>
           <w:ilvl w:val="0"/>
-          <w:numId w:val="1048"/>
+          <w:numId w:val="1049"/>
         </w:numPr>
       </w:pPr>
       <w:r>
@@ -5863,7 +5977,7 @@
         <w:pStyle w:val="Compact"/>
         <w:numPr>
           <w:ilvl w:val="0"/>
-          <w:numId w:val="1048"/>
+          <w:numId w:val="1049"/>
         </w:numPr>
       </w:pPr>
       <w:r>
@@ -5878,382 +5992,12 @@
         <w:t xml:space="preserve">Plot exports preserve the active visual configuration, including font family, per-text-part bold/italic/underline choices, selected error-bar statistic, significance labels, and axis/legend settings. Composition exports preserve the same typography controls across all plots in the layout.</w:t>
       </w:r>
     </w:p>
-    <w:bookmarkEnd w:id="67"/>
-    <w:bookmarkStart w:id="71" w:name="growth-module"/>
-    <w:p>
-      <w:pPr>
-        <w:pStyle w:val="Heading2"/>
-      </w:pPr>
-      <w:r>
-        <w:t xml:space="preserve">13. Growth Module</w:t>
-      </w:r>
-    </w:p>
-    <w:p>
-      <w:pPr>
-        <w:pStyle w:val="FirstParagraph"/>
-      </w:pPr>
-      <w:r>
-        <w:t xml:space="preserve">Growth tab file support:</w:t>
-      </w:r>
-    </w:p>
-    <w:p>
-      <w:pPr>
-        <w:pStyle w:val="Compact"/>
-        <w:numPr>
-          <w:ilvl w:val="0"/>
-          <w:numId w:val="1049"/>
-        </w:numPr>
-      </w:pPr>
-      <w:r>
-        <w:t xml:space="preserve">Accepted file type:</w:t>
-      </w:r>
-      <w:r>
-        <w:t xml:space="preserve"> </w:t>
-      </w:r>
-      <w:r>
-        <w:rPr>
-          <w:rStyle w:val="VerbatimChar"/>
-        </w:rPr>
-        <w:t xml:space="preserve">Excel</w:t>
-      </w:r>
-      <w:r>
-        <w:t xml:space="preserve"> </w:t>
-      </w:r>
-      <w:r>
-        <w:t xml:space="preserve">(</w:t>
-      </w:r>
-      <w:r>
-        <w:rPr>
-          <w:rStyle w:val="VerbatimChar"/>
-        </w:rPr>
-        <w:t xml:space="preserve">.xlsx</w:t>
-      </w:r>
-      <w:r>
-        <w:t xml:space="preserve">).</w:t>
-      </w:r>
-    </w:p>
-    <w:p>
-      <w:pPr>
-        <w:pStyle w:val="Compact"/>
-        <w:numPr>
-          <w:ilvl w:val="0"/>
-          <w:numId w:val="1049"/>
-        </w:numPr>
-      </w:pPr>
-      <w:r>
-        <w:t xml:space="preserve">Auto-detected structures:</w:t>
-      </w:r>
-    </w:p>
-    <w:p>
-      <w:pPr>
-        <w:pStyle w:val="Compact"/>
-        <w:numPr>
-          <w:ilvl w:val="1"/>
-          <w:numId w:val="1050"/>
-        </w:numPr>
-      </w:pPr>
-      <w:r>
-        <w:t xml:space="preserve">Reader/Tecan-like raw layout (typically later-row data in</w:t>
-      </w:r>
-      <w:r>
-        <w:t xml:space="preserve"> </w:t>
-      </w:r>
-      <w:r>
-        <w:rPr>
-          <w:rStyle w:val="VerbatimChar"/>
-        </w:rPr>
-        <w:t xml:space="preserve">Sheet1</w:t>
-      </w:r>
-      <w:r>
-        <w:t xml:space="preserve">).</w:t>
-      </w:r>
-    </w:p>
-    <w:p>
-      <w:pPr>
-        <w:pStyle w:val="Compact"/>
-        <w:numPr>
-          <w:ilvl w:val="1"/>
-          <w:numId w:val="1050"/>
-        </w:numPr>
-      </w:pPr>
-      <w:r>
-        <w:t xml:space="preserve">Processed</w:t>
-      </w:r>
-      <w:r>
-        <w:t xml:space="preserve"> </w:t>
-      </w:r>
-      <w:r>
-        <w:rPr>
-          <w:rStyle w:val="VerbatimChar"/>
-        </w:rPr>
-        <w:t xml:space="preserve">A1</w:t>
-      </w:r>
-      <w:r>
-        <w:t xml:space="preserve"> </w:t>
-      </w:r>
-      <w:r>
-        <w:t xml:space="preserve">table layout (first column time, following columns as wells/curves).</w:t>
-      </w:r>
-    </w:p>
-    <w:p>
-      <w:pPr>
-        <w:pStyle w:val="FirstParagraph"/>
-      </w:pPr>
-      <w:r>
-        <w:t xml:space="preserve">Extracted parameters:</w:t>
-      </w:r>
-    </w:p>
-    <w:p>
-      <w:pPr>
-        <w:pStyle w:val="Compact"/>
-        <w:numPr>
-          <w:ilvl w:val="0"/>
-          <w:numId w:val="1051"/>
-        </w:numPr>
-      </w:pPr>
-      <w:r>
-        <w:rPr>
-          <w:rStyle w:val="VerbatimChar"/>
-        </w:rPr>
-        <w:t xml:space="preserve">uMax</w:t>
-      </w:r>
-      <w:r>
-        <w:t xml:space="preserve">: maximum exponential-phase slope.</w:t>
-      </w:r>
-    </w:p>
-    <w:p>
-      <w:pPr>
-        <w:pStyle w:val="Compact"/>
-        <w:numPr>
-          <w:ilvl w:val="0"/>
-          <w:numId w:val="1051"/>
-        </w:numPr>
-      </w:pPr>
-      <w:r>
-        <w:rPr>
-          <w:rStyle w:val="VerbatimChar"/>
-        </w:rPr>
-        <w:t xml:space="preserve">max_percap_time</w:t>
-      </w:r>
-      <w:r>
-        <w:t xml:space="preserve">: time window of max per-capita growth.</w:t>
-      </w:r>
-    </w:p>
-    <w:p>
-      <w:pPr>
-        <w:pStyle w:val="Compact"/>
-        <w:numPr>
-          <w:ilvl w:val="0"/>
-          <w:numId w:val="1051"/>
-        </w:numPr>
-      </w:pPr>
-      <w:r>
-        <w:rPr>
-          <w:rStyle w:val="VerbatimChar"/>
-        </w:rPr>
-        <w:t xml:space="preserve">doub_time</w:t>
-      </w:r>
-      <w:r>
-        <w:t xml:space="preserve">: doubling time (</w:t>
-      </w:r>
-      <w:r>
-        <w:rPr>
-          <w:rStyle w:val="VerbatimChar"/>
-        </w:rPr>
-        <w:t xml:space="preserve">ln(2) / uMax</w:t>
-      </w:r>
-      <w:r>
-        <w:t xml:space="preserve">).</w:t>
-      </w:r>
-    </w:p>
-    <w:p>
-      <w:pPr>
-        <w:pStyle w:val="Compact"/>
-        <w:numPr>
-          <w:ilvl w:val="0"/>
-          <w:numId w:val="1051"/>
-        </w:numPr>
-      </w:pPr>
-      <w:r>
-        <w:rPr>
-          <w:rStyle w:val="VerbatimChar"/>
-        </w:rPr>
-        <w:t xml:space="preserve">lag_time</w:t>
-      </w:r>
-      <w:r>
-        <w:t xml:space="preserve">: pre-exponential transition time.</w:t>
-      </w:r>
-    </w:p>
-    <w:p>
-      <w:pPr>
-        <w:pStyle w:val="Compact"/>
-        <w:numPr>
-          <w:ilvl w:val="0"/>
-          <w:numId w:val="1051"/>
-        </w:numPr>
-      </w:pPr>
-      <w:r>
-        <w:rPr>
-          <w:rStyle w:val="VerbatimChar"/>
-        </w:rPr>
-        <w:t xml:space="preserve">ODmax</w:t>
-      </w:r>
-      <w:r>
-        <w:t xml:space="preserve">: maximum measured OD/signal.</w:t>
-      </w:r>
-    </w:p>
-    <w:p>
-      <w:pPr>
-        <w:pStyle w:val="Compact"/>
-        <w:numPr>
-          <w:ilvl w:val="0"/>
-          <w:numId w:val="1051"/>
-        </w:numPr>
-      </w:pPr>
-      <w:r>
-        <w:rPr>
-          <w:rStyle w:val="VerbatimChar"/>
-        </w:rPr>
-        <w:t xml:space="preserve">max_time</w:t>
-      </w:r>
-      <w:r>
-        <w:t xml:space="preserve">: time at</w:t>
-      </w:r>
-      <w:r>
-        <w:t xml:space="preserve"> </w:t>
-      </w:r>
-      <w:r>
-        <w:rPr>
-          <w:rStyle w:val="VerbatimChar"/>
-        </w:rPr>
-        <w:t xml:space="preserve">ODmax</w:t>
-      </w:r>
-      <w:r>
-        <w:t xml:space="preserve">.</w:t>
-      </w:r>
-    </w:p>
-    <w:p>
-      <w:pPr>
-        <w:pStyle w:val="Compact"/>
-        <w:numPr>
-          <w:ilvl w:val="0"/>
-          <w:numId w:val="1051"/>
-        </w:numPr>
-      </w:pPr>
-      <w:r>
-        <w:rPr>
-          <w:rStyle w:val="VerbatimChar"/>
-        </w:rPr>
-        <w:t xml:space="preserve">AUC</w:t>
-      </w:r>
-      <w:r>
-        <w:t xml:space="preserve">: area under the curve.</w:t>
-      </w:r>
-    </w:p>
-    <w:p>
-      <w:pPr>
-        <w:pStyle w:val="Compact"/>
-        <w:numPr>
-          <w:ilvl w:val="0"/>
-          <w:numId w:val="1051"/>
-        </w:numPr>
-      </w:pPr>
-      <w:r>
-        <w:rPr>
-          <w:rStyle w:val="VerbatimChar"/>
-        </w:rPr>
-        <w:t xml:space="preserve">OD0</w:t>
-      </w:r>
-      <w:r>
-        <w:t xml:space="preserve">: initial OD/signal at the first measured point of each curve.</w:t>
-      </w:r>
-    </w:p>
-    <w:p>
-      <w:pPr>
-        <w:pStyle w:val="FirstParagraph"/>
-      </w:pPr>
-      <w:r>
-        <w:t xml:space="preserve">Typical flow:</w:t>
-      </w:r>
-    </w:p>
-    <w:p>
-      <w:pPr>
-        <w:pStyle w:val="Compact"/>
-        <w:numPr>
-          <w:ilvl w:val="0"/>
-          <w:numId w:val="1052"/>
-        </w:numPr>
-      </w:pPr>
-      <w:r>
-        <w:t xml:space="preserve">Upload one or more growth files.</w:t>
-      </w:r>
-    </w:p>
-    <w:p>
-      <w:pPr>
-        <w:pStyle w:val="Compact"/>
-        <w:numPr>
-          <w:ilvl w:val="0"/>
-          <w:numId w:val="1052"/>
-        </w:numPr>
-      </w:pPr>
-      <w:r>
-        <w:t xml:space="preserve">Set max time and interval.</w:t>
-      </w:r>
-    </w:p>
-    <w:p>
-      <w:pPr>
-        <w:pStyle w:val="Compact"/>
-        <w:numPr>
-          <w:ilvl w:val="0"/>
-          <w:numId w:val="1052"/>
-        </w:numPr>
-      </w:pPr>
-      <w:r>
-        <w:t xml:space="preserve">Run extraction.</w:t>
-      </w:r>
-    </w:p>
-    <w:p>
-      <w:pPr>
-        <w:pStyle w:val="Compact"/>
-        <w:numPr>
-          <w:ilvl w:val="0"/>
-          <w:numId w:val="1052"/>
-        </w:numPr>
-      </w:pPr>
-      <w:r>
-        <w:t xml:space="preserve">Download ZIP outputs.</w:t>
-      </w:r>
-    </w:p>
-    <w:p>
-      <w:pPr>
-        <w:pStyle w:val="Compact"/>
-        <w:numPr>
-          <w:ilvl w:val="0"/>
-          <w:numId w:val="1052"/>
-        </w:numPr>
-      </w:pPr>
-      <w:r>
-        <w:t xml:space="preserve">Reuse extracted outputs in main plotting workflows.</w:t>
-      </w:r>
-    </w:p>
-    <w:p>
-      <w:pPr>
-        <w:pStyle w:val="FirstParagraph"/>
-      </w:pPr>
-      <w:r>
-        <w:t xml:space="preserve">Autosave and interruption handling:</w:t>
-      </w:r>
-    </w:p>
-    <w:p>
-      <w:pPr>
-        <w:pStyle w:val="Compact"/>
-        <w:numPr>
-          <w:ilvl w:val="0"/>
-          <w:numId w:val="1053"/>
-        </w:numPr>
-      </w:pPr>
-      <w:r>
-        <w:t xml:space="preserve">The optional</w:t>
+    <w:p>
+      <w:pPr>
+        <w:pStyle w:val="BodyText"/>
+      </w:pPr>
+      <w:r>
+        <w:t xml:space="preserve">Raster exports use</w:t>
       </w:r>
       <w:r>
         <w:t xml:space="preserve"> </w:t>
@@ -6263,13 +6007,391 @@
           <w:b/>
           <w:bCs/>
         </w:rPr>
-        <w:t xml:space="preserve">Autosave output folder</w:t>
-      </w:r>
-      <w:r>
-        <w:t xml:space="preserve"> </w:t>
-      </w:r>
-      <w:r>
-        <w:t xml:space="preserve">can be typed manually or selected with</w:t>
+        <w:t xml:space="preserve">300 DPI by default</w:t>
+      </w:r>
+      <w:r>
+        <w:t xml:space="preserve"> </w:t>
+      </w:r>
+      <w:r>
+        <w:t xml:space="preserve">and accept supported user values from 72 to 600 DPI. The selected effective DPI is included in metadata and bundle versions. Vector PDF/PPTX elements do not use DPI; graph width, height, and slide dimensions are configured separately.</w:t>
+      </w:r>
+    </w:p>
+    <w:bookmarkEnd w:id="136"/>
+    <w:bookmarkStart w:id="140" w:name="Xe593582c9f00b53676a004fd4095b4d203d92ef"/>
+    <w:p>
+      <w:pPr>
+        <w:pStyle w:val="Heading2"/>
+      </w:pPr>
+      <w:r>
+        <w:t xml:space="preserve">13. Growth Module</w:t>
+      </w:r>
+    </w:p>
+    <w:p>
+      <w:pPr>
+        <w:pStyle w:val="FirstParagraph"/>
+      </w:pPr>
+      <w:r>
+        <w:t xml:space="preserve">Growth tab file support:</w:t>
+      </w:r>
+    </w:p>
+    <w:p>
+      <w:pPr>
+        <w:pStyle w:val="Compact"/>
+        <w:numPr>
+          <w:ilvl w:val="0"/>
+          <w:numId w:val="1050"/>
+        </w:numPr>
+      </w:pPr>
+      <w:r>
+        <w:t xml:space="preserve">Accepted file type:</w:t>
+      </w:r>
+      <w:r>
+        <w:t xml:space="preserve"> </w:t>
+      </w:r>
+      <w:r>
+        <w:rPr>
+          <w:rStyle w:val="VerbatimChar"/>
+        </w:rPr>
+        <w:t xml:space="preserve">Excel</w:t>
+      </w:r>
+      <w:r>
+        <w:t xml:space="preserve"> </w:t>
+      </w:r>
+      <w:r>
+        <w:t xml:space="preserve">(</w:t>
+      </w:r>
+      <w:r>
+        <w:rPr>
+          <w:rStyle w:val="VerbatimChar"/>
+        </w:rPr>
+        <w:t xml:space="preserve">.xlsx</w:t>
+      </w:r>
+      <w:r>
+        <w:t xml:space="preserve">).</w:t>
+      </w:r>
+    </w:p>
+    <w:p>
+      <w:pPr>
+        <w:pStyle w:val="Compact"/>
+        <w:numPr>
+          <w:ilvl w:val="0"/>
+          <w:numId w:val="1050"/>
+        </w:numPr>
+      </w:pPr>
+      <w:r>
+        <w:t xml:space="preserve">Auto-detected structures:</w:t>
+      </w:r>
+    </w:p>
+    <w:p>
+      <w:pPr>
+        <w:pStyle w:val="Compact"/>
+        <w:numPr>
+          <w:ilvl w:val="1"/>
+          <w:numId w:val="1051"/>
+        </w:numPr>
+      </w:pPr>
+      <w:r>
+        <w:t xml:space="preserve">Reader/Tecan-like raw layout (typically later-row data in</w:t>
+      </w:r>
+      <w:r>
+        <w:t xml:space="preserve"> </w:t>
+      </w:r>
+      <w:r>
+        <w:rPr>
+          <w:rStyle w:val="VerbatimChar"/>
+        </w:rPr>
+        <w:t xml:space="preserve">Sheet1</w:t>
+      </w:r>
+      <w:r>
+        <w:t xml:space="preserve">).</w:t>
+      </w:r>
+    </w:p>
+    <w:p>
+      <w:pPr>
+        <w:pStyle w:val="Compact"/>
+        <w:numPr>
+          <w:ilvl w:val="1"/>
+          <w:numId w:val="1051"/>
+        </w:numPr>
+      </w:pPr>
+      <w:r>
+        <w:t xml:space="preserve">Processed</w:t>
+      </w:r>
+      <w:r>
+        <w:t xml:space="preserve"> </w:t>
+      </w:r>
+      <w:r>
+        <w:rPr>
+          <w:rStyle w:val="VerbatimChar"/>
+        </w:rPr>
+        <w:t xml:space="preserve">A1</w:t>
+      </w:r>
+      <w:r>
+        <w:t xml:space="preserve"> </w:t>
+      </w:r>
+      <w:r>
+        <w:t xml:space="preserve">table layout (first column time, following columns as wells/curves).</w:t>
+      </w:r>
+    </w:p>
+    <w:p>
+      <w:pPr>
+        <w:pStyle w:val="FirstParagraph"/>
+      </w:pPr>
+      <w:r>
+        <w:t xml:space="preserve">Extracted parameters:</w:t>
+      </w:r>
+    </w:p>
+    <w:p>
+      <w:pPr>
+        <w:pStyle w:val="Compact"/>
+        <w:numPr>
+          <w:ilvl w:val="0"/>
+          <w:numId w:val="1052"/>
+        </w:numPr>
+      </w:pPr>
+      <w:r>
+        <w:rPr>
+          <w:rStyle w:val="VerbatimChar"/>
+        </w:rPr>
+        <w:t xml:space="preserve">uMax</w:t>
+      </w:r>
+      <w:r>
+        <w:t xml:space="preserve">: maximum exponential-phase slope.</w:t>
+      </w:r>
+    </w:p>
+    <w:p>
+      <w:pPr>
+        <w:pStyle w:val="Compact"/>
+        <w:numPr>
+          <w:ilvl w:val="0"/>
+          <w:numId w:val="1052"/>
+        </w:numPr>
+      </w:pPr>
+      <w:r>
+        <w:rPr>
+          <w:rStyle w:val="VerbatimChar"/>
+        </w:rPr>
+        <w:t xml:space="preserve">max_percap_time</w:t>
+      </w:r>
+      <w:r>
+        <w:t xml:space="preserve">: time window of max per-capita growth.</w:t>
+      </w:r>
+    </w:p>
+    <w:p>
+      <w:pPr>
+        <w:pStyle w:val="Compact"/>
+        <w:numPr>
+          <w:ilvl w:val="0"/>
+          <w:numId w:val="1052"/>
+        </w:numPr>
+      </w:pPr>
+      <w:r>
+        <w:rPr>
+          <w:rStyle w:val="VerbatimChar"/>
+        </w:rPr>
+        <w:t xml:space="preserve">doub_time</w:t>
+      </w:r>
+      <w:r>
+        <w:t xml:space="preserve">: doubling time (</w:t>
+      </w:r>
+      <w:r>
+        <w:rPr>
+          <w:rStyle w:val="VerbatimChar"/>
+        </w:rPr>
+        <w:t xml:space="preserve">ln(2) / uMax</w:t>
+      </w:r>
+      <w:r>
+        <w:t xml:space="preserve">).</w:t>
+      </w:r>
+    </w:p>
+    <w:p>
+      <w:pPr>
+        <w:pStyle w:val="Compact"/>
+        <w:numPr>
+          <w:ilvl w:val="0"/>
+          <w:numId w:val="1052"/>
+        </w:numPr>
+      </w:pPr>
+      <w:r>
+        <w:rPr>
+          <w:rStyle w:val="VerbatimChar"/>
+        </w:rPr>
+        <w:t xml:space="preserve">lag_time</w:t>
+      </w:r>
+      <w:r>
+        <w:t xml:space="preserve">: pre-exponential transition time.</w:t>
+      </w:r>
+    </w:p>
+    <w:p>
+      <w:pPr>
+        <w:pStyle w:val="Compact"/>
+        <w:numPr>
+          <w:ilvl w:val="0"/>
+          <w:numId w:val="1052"/>
+        </w:numPr>
+      </w:pPr>
+      <w:r>
+        <w:rPr>
+          <w:rStyle w:val="VerbatimChar"/>
+        </w:rPr>
+        <w:t xml:space="preserve">ODmax</w:t>
+      </w:r>
+      <w:r>
+        <w:t xml:space="preserve">: maximum measured OD/signal.</w:t>
+      </w:r>
+    </w:p>
+    <w:p>
+      <w:pPr>
+        <w:pStyle w:val="Compact"/>
+        <w:numPr>
+          <w:ilvl w:val="0"/>
+          <w:numId w:val="1052"/>
+        </w:numPr>
+      </w:pPr>
+      <w:r>
+        <w:rPr>
+          <w:rStyle w:val="VerbatimChar"/>
+        </w:rPr>
+        <w:t xml:space="preserve">max_time</w:t>
+      </w:r>
+      <w:r>
+        <w:t xml:space="preserve">: time at</w:t>
+      </w:r>
+      <w:r>
+        <w:t xml:space="preserve"> </w:t>
+      </w:r>
+      <w:r>
+        <w:rPr>
+          <w:rStyle w:val="VerbatimChar"/>
+        </w:rPr>
+        <w:t xml:space="preserve">ODmax</w:t>
+      </w:r>
+      <w:r>
+        <w:t xml:space="preserve">.</w:t>
+      </w:r>
+    </w:p>
+    <w:p>
+      <w:pPr>
+        <w:pStyle w:val="Compact"/>
+        <w:numPr>
+          <w:ilvl w:val="0"/>
+          <w:numId w:val="1052"/>
+        </w:numPr>
+      </w:pPr>
+      <w:r>
+        <w:rPr>
+          <w:rStyle w:val="VerbatimChar"/>
+        </w:rPr>
+        <w:t xml:space="preserve">AUC</w:t>
+      </w:r>
+      <w:r>
+        <w:t xml:space="preserve">: area under the curve.</w:t>
+      </w:r>
+    </w:p>
+    <w:p>
+      <w:pPr>
+        <w:pStyle w:val="Compact"/>
+        <w:numPr>
+          <w:ilvl w:val="0"/>
+          <w:numId w:val="1052"/>
+        </w:numPr>
+      </w:pPr>
+      <w:r>
+        <w:rPr>
+          <w:rStyle w:val="VerbatimChar"/>
+        </w:rPr>
+        <w:t xml:space="preserve">OD0</w:t>
+      </w:r>
+      <w:r>
+        <w:t xml:space="preserve">: initial OD/signal at the first measured point of each curve.</w:t>
+      </w:r>
+    </w:p>
+    <w:p>
+      <w:pPr>
+        <w:pStyle w:val="FirstParagraph"/>
+      </w:pPr>
+      <w:r>
+        <w:t xml:space="preserve">Typical flow:</w:t>
+      </w:r>
+    </w:p>
+    <w:p>
+      <w:pPr>
+        <w:pStyle w:val="Compact"/>
+        <w:numPr>
+          <w:ilvl w:val="0"/>
+          <w:numId w:val="1053"/>
+        </w:numPr>
+      </w:pPr>
+      <w:r>
+        <w:t xml:space="preserve">Upload one or more growth files.</w:t>
+      </w:r>
+    </w:p>
+    <w:p>
+      <w:pPr>
+        <w:pStyle w:val="Compact"/>
+        <w:numPr>
+          <w:ilvl w:val="0"/>
+          <w:numId w:val="1053"/>
+        </w:numPr>
+      </w:pPr>
+      <w:r>
+        <w:t xml:space="preserve">Set max time and interval.</w:t>
+      </w:r>
+    </w:p>
+    <w:p>
+      <w:pPr>
+        <w:pStyle w:val="Compact"/>
+        <w:numPr>
+          <w:ilvl w:val="0"/>
+          <w:numId w:val="1053"/>
+        </w:numPr>
+      </w:pPr>
+      <w:r>
+        <w:t xml:space="preserve">Run extraction.</w:t>
+      </w:r>
+    </w:p>
+    <w:p>
+      <w:pPr>
+        <w:pStyle w:val="Compact"/>
+        <w:numPr>
+          <w:ilvl w:val="0"/>
+          <w:numId w:val="1053"/>
+        </w:numPr>
+      </w:pPr>
+      <w:r>
+        <w:t xml:space="preserve">Download ZIP outputs.</w:t>
+      </w:r>
+    </w:p>
+    <w:p>
+      <w:pPr>
+        <w:pStyle w:val="Compact"/>
+        <w:numPr>
+          <w:ilvl w:val="0"/>
+          <w:numId w:val="1053"/>
+        </w:numPr>
+      </w:pPr>
+      <w:r>
+        <w:t xml:space="preserve">Reuse extracted outputs in main plotting workflows.</w:t>
+      </w:r>
+    </w:p>
+    <w:p>
+      <w:pPr>
+        <w:pStyle w:val="FirstParagraph"/>
+      </w:pPr>
+      <w:r>
+        <w:t xml:space="preserve">Autosave and interruption handling:</w:t>
+      </w:r>
+    </w:p>
+    <w:p>
+      <w:pPr>
+        <w:pStyle w:val="Compact"/>
+        <w:numPr>
+          <w:ilvl w:val="0"/>
+          <w:numId w:val="1054"/>
+        </w:numPr>
+      </w:pPr>
+      <w:r>
+        <w:t xml:space="preserve">The optional</w:t>
       </w:r>
       <w:r>
         <w:t xml:space="preserve"> </w:t>
@@ -6279,22 +6401,13 @@
           <w:b/>
           <w:bCs/>
         </w:rPr>
-        <w:t xml:space="preserve">Browse…</w:t>
-      </w:r>
-      <w:r>
-        <w:t xml:space="preserve">.</w:t>
-      </w:r>
-    </w:p>
-    <w:p>
-      <w:pPr>
-        <w:pStyle w:val="Compact"/>
-        <w:numPr>
-          <w:ilvl w:val="0"/>
-          <w:numId w:val="1053"/>
-        </w:numPr>
-      </w:pPr>
-      <w:r>
-        <w:t xml:space="preserve">If you do not want autosave, leave this folder blank and download the ZIP with</w:t>
+        <w:t xml:space="preserve">Autosave output folder</w:t>
+      </w:r>
+      <w:r>
+        <w:t xml:space="preserve"> </w:t>
+      </w:r>
+      <w:r>
+        <w:t xml:space="preserve">can be typed manually or selected with</w:t>
       </w:r>
       <w:r>
         <w:t xml:space="preserve"> </w:t>
@@ -6304,67 +6417,22 @@
           <w:b/>
           <w:bCs/>
         </w:rPr>
-        <w:t xml:space="preserve">Download results</w:t>
-      </w:r>
-      <w:r>
-        <w:t xml:space="preserve"> </w:t>
-      </w:r>
-      <w:r>
-        <w:t xml:space="preserve">at the end.</w:t>
-      </w:r>
-    </w:p>
-    <w:p>
-      <w:pPr>
-        <w:pStyle w:val="Compact"/>
-        <w:numPr>
-          <w:ilvl w:val="0"/>
-          <w:numId w:val="1053"/>
-        </w:numPr>
-      </w:pPr>
-      <w:r>
-        <w:t xml:space="preserve">If you type a folder, it must already exist. If the path does not exist, BIOSZEN shows a correction message and does not start that run until the path is fixed or cleared.</w:t>
-      </w:r>
-    </w:p>
-    <w:p>
-      <w:pPr>
-        <w:pStyle w:val="Compact"/>
-        <w:numPr>
-          <w:ilvl w:val="0"/>
-          <w:numId w:val="1053"/>
-        </w:numPr>
-      </w:pPr>
-      <w:r>
-        <w:t xml:space="preserve">When an autosave folder is set, final</w:t>
-      </w:r>
-      <w:r>
-        <w:t xml:space="preserve"> </w:t>
-      </w:r>
-      <w:r>
-        <w:rPr>
-          <w:rStyle w:val="VerbatimChar"/>
-        </w:rPr>
-        <w:t xml:space="preserve">Curves_*.xlsx</w:t>
-      </w:r>
-      <w:r>
-        <w:t xml:space="preserve"> </w:t>
-      </w:r>
-      <w:r>
-        <w:t xml:space="preserve">/</w:t>
-      </w:r>
-      <w:r>
-        <w:t xml:space="preserve"> </w:t>
-      </w:r>
-      <w:r>
-        <w:rPr>
-          <w:rStyle w:val="VerbatimChar"/>
-        </w:rPr>
-        <w:t xml:space="preserve">Parameters_*.xlsx</w:t>
-      </w:r>
-      <w:r>
-        <w:t xml:space="preserve"> </w:t>
-      </w:r>
-      <w:r>
-        <w:t xml:space="preserve">files are copied there automatically while the regular</w:t>
+        <w:t xml:space="preserve">Browse...</w:t>
+      </w:r>
+      <w:r>
+        <w:t xml:space="preserve">.</w:t>
+      </w:r>
+    </w:p>
+    <w:p>
+      <w:pPr>
+        <w:pStyle w:val="Compact"/>
+        <w:numPr>
+          <w:ilvl w:val="0"/>
+          <w:numId w:val="1054"/>
+        </w:numPr>
+      </w:pPr>
+      <w:r>
+        <w:t xml:space="preserve">If you do not want autosave, leave this folder blank and download the ZIP with</w:t>
       </w:r>
       <w:r>
         <w:t xml:space="preserve"> </w:t>
@@ -6380,61 +6448,131 @@
         <w:t xml:space="preserve"> </w:t>
       </w:r>
       <w:r>
-        <w:t xml:space="preserve">ZIP remains available.</w:t>
-      </w:r>
-    </w:p>
-    <w:p>
-      <w:pPr>
-        <w:pStyle w:val="Compact"/>
-        <w:numPr>
-          <w:ilvl w:val="0"/>
-          <w:numId w:val="1053"/>
-        </w:numPr>
-      </w:pPr>
-      <w:r>
-        <w:t xml:space="preserve">During long runs, BIOSZEN writes per-well checkpoints under a temporary</w:t>
-      </w:r>
-      <w:r>
-        <w:t xml:space="preserve"> </w:t>
-      </w:r>
-      <w:r>
-        <w:rPr>
-          <w:rStyle w:val="VerbatimChar"/>
-        </w:rPr>
-        <w:t xml:space="preserve">BIOSZEN_growth_checkpoints</w:t>
-      </w:r>
-      <w:r>
-        <w:t xml:space="preserve"> </w:t>
-      </w:r>
-      <w:r>
-        <w:t xml:space="preserve">folder inside the selected autosave folder. These checkpoints allow an interrupted run to resume from completed wells instead of starting from zero.</w:t>
-      </w:r>
-    </w:p>
-    <w:p>
-      <w:pPr>
-        <w:pStyle w:val="Compact"/>
-        <w:numPr>
-          <w:ilvl w:val="0"/>
-          <w:numId w:val="1053"/>
-        </w:numPr>
-      </w:pPr>
-      <w:r>
-        <w:t xml:space="preserve">Checkpoints are deleted automatically after a successful completion or successful resume. They are kept only when processing is interrupted before completion.</w:t>
-      </w:r>
-    </w:p>
-    <w:p>
-      <w:pPr>
-        <w:pStyle w:val="Compact"/>
-        <w:numPr>
-          <w:ilvl w:val="0"/>
-          <w:numId w:val="1053"/>
-        </w:numPr>
-      </w:pPr>
+        <w:t xml:space="preserve">at the end.</w:t>
+      </w:r>
+    </w:p>
+    <w:p>
+      <w:pPr>
+        <w:pStyle w:val="Compact"/>
+        <w:numPr>
+          <w:ilvl w:val="0"/>
+          <w:numId w:val="1054"/>
+        </w:numPr>
+      </w:pPr>
+      <w:r>
+        <w:t xml:space="preserve">If you type a folder, it must already exist. If the path does not exist, BIOSZEN shows a correction message and does not start that run until the path is fixed or cleared.</w:t>
+      </w:r>
+    </w:p>
+    <w:p>
+      <w:pPr>
+        <w:pStyle w:val="Compact"/>
+        <w:numPr>
+          <w:ilvl w:val="0"/>
+          <w:numId w:val="1054"/>
+        </w:numPr>
+      </w:pPr>
+      <w:r>
+        <w:t xml:space="preserve">When an autosave folder is set, final</w:t>
+      </w:r>
+      <w:r>
+        <w:t xml:space="preserve"> </w:t>
+      </w:r>
+      <w:r>
+        <w:rPr>
+          <w:rStyle w:val="VerbatimChar"/>
+        </w:rPr>
+        <w:t xml:space="preserve">Curves_*.xlsx</w:t>
+      </w:r>
+      <w:r>
+        <w:t xml:space="preserve"> </w:t>
+      </w:r>
+      <w:r>
+        <w:t xml:space="preserve">/</w:t>
+      </w:r>
+      <w:r>
+        <w:t xml:space="preserve"> </w:t>
+      </w:r>
+      <w:r>
+        <w:rPr>
+          <w:rStyle w:val="VerbatimChar"/>
+        </w:rPr>
+        <w:t xml:space="preserve">Parameters_*.xlsx</w:t>
+      </w:r>
+      <w:r>
+        <w:t xml:space="preserve"> </w:t>
+      </w:r>
+      <w:r>
+        <w:t xml:space="preserve">files are copied there automatically while the regular</w:t>
+      </w:r>
+      <w:r>
+        <w:t xml:space="preserve"> </w:t>
+      </w:r>
       <w:r>
         <w:rPr>
           <w:b/>
           <w:bCs/>
         </w:rPr>
+        <w:t xml:space="preserve">Download results</w:t>
+      </w:r>
+      <w:r>
+        <w:t xml:space="preserve"> </w:t>
+      </w:r>
+      <w:r>
+        <w:t xml:space="preserve">ZIP remains available.</w:t>
+      </w:r>
+    </w:p>
+    <w:p>
+      <w:pPr>
+        <w:pStyle w:val="Compact"/>
+        <w:numPr>
+          <w:ilvl w:val="0"/>
+          <w:numId w:val="1054"/>
+        </w:numPr>
+      </w:pPr>
+      <w:r>
+        <w:t xml:space="preserve">During long runs, BIOSZEN writes per-well checkpoints under a temporary</w:t>
+      </w:r>
+      <w:r>
+        <w:t xml:space="preserve"> </w:t>
+      </w:r>
+      <w:r>
+        <w:rPr>
+          <w:rStyle w:val="VerbatimChar"/>
+        </w:rPr>
+        <w:t xml:space="preserve">BIOSZEN_growth_checkpoints</w:t>
+      </w:r>
+      <w:r>
+        <w:t xml:space="preserve"> </w:t>
+      </w:r>
+      <w:r>
+        <w:t xml:space="preserve">folder inside the selected autosave folder. These checkpoints allow an interrupted run to resume from completed wells instead of starting from zero.</w:t>
+      </w:r>
+    </w:p>
+    <w:p>
+      <w:pPr>
+        <w:pStyle w:val="Compact"/>
+        <w:numPr>
+          <w:ilvl w:val="0"/>
+          <w:numId w:val="1054"/>
+        </w:numPr>
+      </w:pPr>
+      <w:r>
+        <w:t xml:space="preserve">Checkpoints are deleted automatically after a successful completion or successful resume. They are kept only when processing is interrupted before completion.</w:t>
+      </w:r>
+    </w:p>
+    <w:p>
+      <w:pPr>
+        <w:pStyle w:val="Compact"/>
+        <w:numPr>
+          <w:ilvl w:val="0"/>
+          <w:numId w:val="1054"/>
+        </w:numPr>
+      </w:pPr>
+      <w:r>
+        <w:rPr>
+          <w:b/>
+          <w:bCs/>
+        </w:rPr>
         <w:t xml:space="preserve">Stop process</w:t>
       </w:r>
       <w:r>
@@ -6446,25 +6584,25 @@
     </w:p>
     <w:p>
       <w:pPr>
-        <w:pStyle w:val="CaptionedFigure"/>
+        <w:pStyle w:val="FirstParagraph"/>
       </w:pPr>
       <w:r>
         <w:drawing>
           <wp:inline>
             <wp:extent cx="5334000" cy="2011947"/>
             <wp:effectExtent b="0" l="0" r="0" t="0"/>
-            <wp:docPr descr="Growth workflow" title="" id="69" name="Picture"/>
+            <wp:docPr descr="Growth workflow" title="" id="138" name="Picture"/>
             <a:graphic>
               <a:graphicData uri="http://schemas.openxmlformats.org/drawingml/2006/picture">
                 <pic:pic>
                   <pic:nvPicPr>
-                    <pic:cNvPr descr="manual_images/13_growth_parameters_workflow.png" id="70" name="Picture"/>
+                    <pic:cNvPr descr="manual_images/13_growth_parameters_workflow.png" id="139" name="Picture"/>
                     <pic:cNvPicPr>
                       <a:picLocks noChangeArrowheads="1" noChangeAspect="1"/>
                     </pic:cNvPicPr>
                   </pic:nvPicPr>
                   <pic:blipFill>
-                    <a:blip r:embed="rId68"/>
+                    <a:blip r:embed="rId137"/>
                     <a:stretch>
                       <a:fillRect/>
                     </a:stretch>
@@ -6491,16 +6629,8 @@
         </w:drawing>
       </w:r>
     </w:p>
-    <w:p>
-      <w:pPr>
-        <w:pStyle w:val="ImageCaption"/>
-      </w:pPr>
-      <w:r>
-        <w:t xml:space="preserve">Growth workflow</w:t>
-      </w:r>
-    </w:p>
-    <w:bookmarkEnd w:id="71"/>
-    <w:bookmarkStart w:id="72" w:name="troubleshooting-playbook"/>
+    <w:bookmarkEnd w:id="140"/>
+    <w:bookmarkStart w:id="141" w:name="X412317ec57e4cfdc618c120090edd958d43de49"/>
     <w:p>
       <w:pPr>
         <w:pStyle w:val="Heading2"/>
@@ -6513,7 +6643,7 @@
       <w:pPr>
         <w:numPr>
           <w:ilvl w:val="0"/>
-          <w:numId w:val="1054"/>
+          <w:numId w:val="1055"/>
         </w:numPr>
       </w:pPr>
       <w:r>
@@ -6540,7 +6670,7 @@
       <w:pPr>
         <w:numPr>
           <w:ilvl w:val="0"/>
-          <w:numId w:val="1054"/>
+          <w:numId w:val="1055"/>
         </w:numPr>
       </w:pPr>
       <w:r>
@@ -6567,7 +6697,7 @@
       <w:pPr>
         <w:numPr>
           <w:ilvl w:val="0"/>
-          <w:numId w:val="1054"/>
+          <w:numId w:val="1055"/>
         </w:numPr>
       </w:pPr>
       <w:r>
@@ -6594,7 +6724,7 @@
       <w:pPr>
         <w:numPr>
           <w:ilvl w:val="0"/>
-          <w:numId w:val="1054"/>
+          <w:numId w:val="1055"/>
         </w:numPr>
       </w:pPr>
       <w:r>
@@ -6621,7 +6751,7 @@
       <w:pPr>
         <w:numPr>
           <w:ilvl w:val="0"/>
-          <w:numId w:val="1054"/>
+          <w:numId w:val="1055"/>
         </w:numPr>
       </w:pPr>
       <w:r>
@@ -6648,7 +6778,7 @@
       <w:pPr>
         <w:numPr>
           <w:ilvl w:val="0"/>
-          <w:numId w:val="1054"/>
+          <w:numId w:val="1055"/>
         </w:numPr>
       </w:pPr>
       <w:r>
@@ -6690,7 +6820,7 @@
       <w:pPr>
         <w:numPr>
           <w:ilvl w:val="0"/>
-          <w:numId w:val="1054"/>
+          <w:numId w:val="1055"/>
         </w:numPr>
       </w:pPr>
       <w:r>
@@ -6745,7 +6875,7 @@
       <w:pPr>
         <w:numPr>
           <w:ilvl w:val="0"/>
-          <w:numId w:val="1054"/>
+          <w:numId w:val="1055"/>
         </w:numPr>
       </w:pPr>
       <w:r>
@@ -6772,7 +6902,7 @@
       <w:pPr>
         <w:numPr>
           <w:ilvl w:val="0"/>
-          <w:numId w:val="1054"/>
+          <w:numId w:val="1055"/>
         </w:numPr>
       </w:pPr>
       <w:r>
@@ -6795,8 +6925,8 @@
         <w:t xml:space="preserve">What to do: Reduce active parameters and heavy layers.</w:t>
       </w:r>
     </w:p>
-    <w:bookmarkEnd w:id="72"/>
-    <w:bookmarkStart w:id="73" w:name="support"/>
+    <w:bookmarkEnd w:id="141"/>
+    <w:bookmarkStart w:id="142" w:name="Xcd58510a2561031e4603a64a38bc819a9ac6e6a"/>
     <w:p>
       <w:pPr>
         <w:pStyle w:val="Heading2"/>
@@ -6822,8 +6952,8 @@
         <w:t xml:space="preserve">bioszenf@gmail.com</w:t>
       </w:r>
     </w:p>
-    <w:bookmarkEnd w:id="73"/>
-    <w:bookmarkEnd w:id="74"/>
+    <w:bookmarkEnd w:id="142"/>
+    <w:bookmarkEnd w:id="143"/>
     <w:sectPr>
       <w:footnotePr>
         <w:numRestart w:val="eachSect"/>
@@ -7375,34 +7505,7 @@
     <w:abstractNumId w:val="991"/>
   </w:num>
   <w:num w:numId="1039">
-    <w:abstractNumId w:val="99411"/>
-    <w:lvlOverride w:ilvl="0">
-      <w:startOverride w:val="1"/>
-    </w:lvlOverride>
-    <w:lvlOverride w:ilvl="1">
-      <w:startOverride w:val="1"/>
-    </w:lvlOverride>
-    <w:lvlOverride w:ilvl="2">
-      <w:startOverride w:val="1"/>
-    </w:lvlOverride>
-    <w:lvlOverride w:ilvl="3">
-      <w:startOverride w:val="1"/>
-    </w:lvlOverride>
-    <w:lvlOverride w:ilvl="4">
-      <w:startOverride w:val="1"/>
-    </w:lvlOverride>
-    <w:lvlOverride w:ilvl="5">
-      <w:startOverride w:val="1"/>
-    </w:lvlOverride>
-    <w:lvlOverride w:ilvl="6">
-      <w:startOverride w:val="1"/>
-    </w:lvlOverride>
-    <w:lvlOverride w:ilvl="7">
-      <w:startOverride w:val="1"/>
-    </w:lvlOverride>
-    <w:lvlOverride w:ilvl="8">
-      <w:startOverride w:val="1"/>
-    </w:lvlOverride>
+    <w:abstractNumId w:val="991"/>
   </w:num>
   <w:num w:numId="1040">
     <w:abstractNumId w:val="99411"/>
@@ -7435,7 +7538,34 @@
     </w:lvlOverride>
   </w:num>
   <w:num w:numId="1041">
-    <w:abstractNumId w:val="991"/>
+    <w:abstractNumId w:val="99411"/>
+    <w:lvlOverride w:ilvl="0">
+      <w:startOverride w:val="1"/>
+    </w:lvlOverride>
+    <w:lvlOverride w:ilvl="1">
+      <w:startOverride w:val="1"/>
+    </w:lvlOverride>
+    <w:lvlOverride w:ilvl="2">
+      <w:startOverride w:val="1"/>
+    </w:lvlOverride>
+    <w:lvlOverride w:ilvl="3">
+      <w:startOverride w:val="1"/>
+    </w:lvlOverride>
+    <w:lvlOverride w:ilvl="4">
+      <w:startOverride w:val="1"/>
+    </w:lvlOverride>
+    <w:lvlOverride w:ilvl="5">
+      <w:startOverride w:val="1"/>
+    </w:lvlOverride>
+    <w:lvlOverride w:ilvl="6">
+      <w:startOverride w:val="1"/>
+    </w:lvlOverride>
+    <w:lvlOverride w:ilvl="7">
+      <w:startOverride w:val="1"/>
+    </w:lvlOverride>
+    <w:lvlOverride w:ilvl="8">
+      <w:startOverride w:val="1"/>
+    </w:lvlOverride>
   </w:num>
   <w:num w:numId="1042">
     <w:abstractNumId w:val="991"/>
@@ -7468,6 +7598,9 @@
     <w:abstractNumId w:val="991"/>
   </w:num>
   <w:num w:numId="1052">
+    <w:abstractNumId w:val="991"/>
+  </w:num>
+  <w:num w:numId="1053">
     <w:abstractNumId w:val="99411"/>
     <w:lvlOverride w:ilvl="0">
       <w:startOverride w:val="1"/>
@@ -7497,10 +7630,10 @@
       <w:startOverride w:val="1"/>
     </w:lvlOverride>
   </w:num>
-  <w:num w:numId="1053">
+  <w:num w:numId="1054">
     <w:abstractNumId w:val="991"/>
   </w:num>
-  <w:num w:numId="1054">
+  <w:num w:numId="1055">
     <w:abstractNumId w:val="991"/>
   </w:num>
 </w:numbering>
@@ -8162,7 +8295,7 @@
       <w:color w:themeColor="accent1" w:themeShade="BF" w:val="365F91"/>
     </w:rPr>
   </w:style>
-  <w:style w:type="paragraph" w:customStyle="1" w:styleId="SourceCode">
+  <w:style w:customStyle="1" w:styleId="SourceCode" w:type="paragraph">
     <w:name w:val="Source Code"/>
     <w:basedOn w:val="Normal"/>
     <w:link w:val="VerbatimChar"/>
@@ -8170,7 +8303,7 @@
       <w:wordWrap w:val="off"/>
     </w:pPr>
   </w:style>
-  <w:style w:type="character" w:customStyle="1" w:styleId="KeywordTok">
+  <w:style w:customStyle="1" w:styleId="KeywordTok" w:type="character">
     <w:name w:val="KeywordTok"/>
     <w:basedOn w:val="VerbatimChar"/>
     <w:rPr>
@@ -8178,77 +8311,77 @@
       <w:color w:val="007020"/>
     </w:rPr>
   </w:style>
-  <w:style w:type="character" w:customStyle="1" w:styleId="DataTypeTok">
+  <w:style w:customStyle="1" w:styleId="DataTypeTok" w:type="character">
     <w:name w:val="DataTypeTok"/>
     <w:basedOn w:val="VerbatimChar"/>
     <w:rPr>
       <w:color w:val="902000"/>
     </w:rPr>
   </w:style>
-  <w:style w:type="character" w:customStyle="1" w:styleId="DecValTok">
+  <w:style w:customStyle="1" w:styleId="DecValTok" w:type="character">
     <w:name w:val="DecValTok"/>
     <w:basedOn w:val="VerbatimChar"/>
     <w:rPr>
       <w:color w:val="40a070"/>
     </w:rPr>
   </w:style>
-  <w:style w:type="character" w:customStyle="1" w:styleId="BaseNTok">
+  <w:style w:customStyle="1" w:styleId="BaseNTok" w:type="character">
     <w:name w:val="BaseNTok"/>
     <w:basedOn w:val="VerbatimChar"/>
     <w:rPr>
       <w:color w:val="40a070"/>
     </w:rPr>
   </w:style>
-  <w:style w:type="character" w:customStyle="1" w:styleId="FloatTok">
+  <w:style w:customStyle="1" w:styleId="FloatTok" w:type="character">
     <w:name w:val="FloatTok"/>
     <w:basedOn w:val="VerbatimChar"/>
     <w:rPr>
       <w:color w:val="40a070"/>
     </w:rPr>
   </w:style>
-  <w:style w:type="character" w:customStyle="1" w:styleId="ConstantTok">
+  <w:style w:customStyle="1" w:styleId="ConstantTok" w:type="character">
     <w:name w:val="ConstantTok"/>
     <w:basedOn w:val="VerbatimChar"/>
     <w:rPr>
       <w:color w:val="880000"/>
     </w:rPr>
   </w:style>
-  <w:style w:type="character" w:customStyle="1" w:styleId="CharTok">
+  <w:style w:customStyle="1" w:styleId="CharTok" w:type="character">
     <w:name w:val="CharTok"/>
     <w:basedOn w:val="VerbatimChar"/>
     <w:rPr>
       <w:color w:val="4070a0"/>
     </w:rPr>
   </w:style>
-  <w:style w:type="character" w:customStyle="1" w:styleId="SpecialCharTok">
+  <w:style w:customStyle="1" w:styleId="SpecialCharTok" w:type="character">
     <w:name w:val="SpecialCharTok"/>
     <w:basedOn w:val="VerbatimChar"/>
     <w:rPr>
       <w:color w:val="4070a0"/>
     </w:rPr>
   </w:style>
-  <w:style w:type="character" w:customStyle="1" w:styleId="StringTok">
+  <w:style w:customStyle="1" w:styleId="StringTok" w:type="character">
     <w:name w:val="StringTok"/>
     <w:basedOn w:val="VerbatimChar"/>
     <w:rPr>
       <w:color w:val="4070a0"/>
     </w:rPr>
   </w:style>
-  <w:style w:type="character" w:customStyle="1" w:styleId="VerbatimStringTok">
+  <w:style w:customStyle="1" w:styleId="VerbatimStringTok" w:type="character">
     <w:name w:val="VerbatimStringTok"/>
     <w:basedOn w:val="VerbatimChar"/>
     <w:rPr>
       <w:color w:val="4070a0"/>
     </w:rPr>
   </w:style>
-  <w:style w:type="character" w:customStyle="1" w:styleId="SpecialStringTok">
+  <w:style w:customStyle="1" w:styleId="SpecialStringTok" w:type="character">
     <w:name w:val="SpecialStringTok"/>
     <w:basedOn w:val="VerbatimChar"/>
     <w:rPr>
       <w:color w:val="bb6688"/>
     </w:rPr>
   </w:style>
-  <w:style w:type="character" w:customStyle="1" w:styleId="ImportTok">
+  <w:style w:customStyle="1" w:styleId="ImportTok" w:type="character">
     <w:name w:val="ImportTok"/>
     <w:basedOn w:val="VerbatimChar"/>
     <w:rPr>
@@ -8256,7 +8389,7 @@
       <w:color w:val="008000"/>
     </w:rPr>
   </w:style>
-  <w:style w:type="character" w:customStyle="1" w:styleId="CommentTok">
+  <w:style w:customStyle="1" w:styleId="CommentTok" w:type="character">
     <w:name w:val="CommentTok"/>
     <w:basedOn w:val="VerbatimChar"/>
     <w:rPr>
@@ -8264,7 +8397,7 @@
       <w:color w:val="60a0b0"/>
     </w:rPr>
   </w:style>
-  <w:style w:type="character" w:customStyle="1" w:styleId="DocumentationTok">
+  <w:style w:customStyle="1" w:styleId="DocumentationTok" w:type="character">
     <w:name w:val="DocumentationTok"/>
     <w:basedOn w:val="VerbatimChar"/>
     <w:rPr>
@@ -8272,7 +8405,7 @@
       <w:color w:val="ba2121"/>
     </w:rPr>
   </w:style>
-  <w:style w:type="character" w:customStyle="1" w:styleId="AnnotationTok">
+  <w:style w:customStyle="1" w:styleId="AnnotationTok" w:type="character">
     <w:name w:val="AnnotationTok"/>
     <w:basedOn w:val="VerbatimChar"/>
     <w:rPr>
@@ -8281,7 +8414,7 @@
       <w:color w:val="60a0b0"/>
     </w:rPr>
   </w:style>
-  <w:style w:type="character" w:customStyle="1" w:styleId="CommentVarTok">
+  <w:style w:customStyle="1" w:styleId="CommentVarTok" w:type="character">
     <w:name w:val="CommentVarTok"/>
     <w:basedOn w:val="VerbatimChar"/>
     <w:rPr>
@@ -8290,28 +8423,28 @@
       <w:color w:val="60a0b0"/>
     </w:rPr>
   </w:style>
-  <w:style w:type="character" w:customStyle="1" w:styleId="OtherTok">
+  <w:style w:customStyle="1" w:styleId="OtherTok" w:type="character">
     <w:name w:val="OtherTok"/>
     <w:basedOn w:val="VerbatimChar"/>
     <w:rPr>
       <w:color w:val="007020"/>
     </w:rPr>
   </w:style>
-  <w:style w:type="character" w:customStyle="1" w:styleId="FunctionTok">
+  <w:style w:customStyle="1" w:styleId="FunctionTok" w:type="character">
     <w:name w:val="FunctionTok"/>
     <w:basedOn w:val="VerbatimChar"/>
     <w:rPr>
       <w:color w:val="06287e"/>
     </w:rPr>
   </w:style>
-  <w:style w:type="character" w:customStyle="1" w:styleId="VariableTok">
+  <w:style w:customStyle="1" w:styleId="VariableTok" w:type="character">
     <w:name w:val="VariableTok"/>
     <w:basedOn w:val="VerbatimChar"/>
     <w:rPr>
       <w:color w:val="19177c"/>
     </w:rPr>
   </w:style>
-  <w:style w:type="character" w:customStyle="1" w:styleId="ControlFlowTok">
+  <w:style w:customStyle="1" w:styleId="ControlFlowTok" w:type="character">
     <w:name w:val="ControlFlowTok"/>
     <w:basedOn w:val="VerbatimChar"/>
     <w:rPr>
@@ -8319,45 +8452,45 @@
       <w:color w:val="007020"/>
     </w:rPr>
   </w:style>
-  <w:style w:type="character" w:customStyle="1" w:styleId="OperatorTok">
+  <w:style w:customStyle="1" w:styleId="OperatorTok" w:type="character">
     <w:name w:val="OperatorTok"/>
     <w:basedOn w:val="VerbatimChar"/>
     <w:rPr>
       <w:color w:val="666666"/>
     </w:rPr>
   </w:style>
-  <w:style w:type="character" w:customStyle="1" w:styleId="BuiltInTok">
+  <w:style w:customStyle="1" w:styleId="BuiltInTok" w:type="character">
     <w:name w:val="BuiltInTok"/>
     <w:basedOn w:val="VerbatimChar"/>
     <w:rPr>
       <w:color w:val="008000"/>
     </w:rPr>
   </w:style>
-  <w:style w:type="character" w:customStyle="1" w:styleId="ExtensionTok">
+  <w:style w:customStyle="1" w:styleId="ExtensionTok" w:type="character">
     <w:name w:val="ExtensionTok"/>
     <w:basedOn w:val="VerbatimChar"/>
     <w:rPr/>
   </w:style>
-  <w:style w:type="character" w:customStyle="1" w:styleId="PreprocessorTok">
+  <w:style w:customStyle="1" w:styleId="PreprocessorTok" w:type="character">
     <w:name w:val="PreprocessorTok"/>
     <w:basedOn w:val="VerbatimChar"/>
     <w:rPr>
       <w:color w:val="bc7a00"/>
     </w:rPr>
   </w:style>
-  <w:style w:type="character" w:customStyle="1" w:styleId="AttributeTok">
+  <w:style w:customStyle="1" w:styleId="AttributeTok" w:type="character">
     <w:name w:val="AttributeTok"/>
     <w:basedOn w:val="VerbatimChar"/>
     <w:rPr>
       <w:color w:val="7d9029"/>
     </w:rPr>
   </w:style>
-  <w:style w:type="character" w:customStyle="1" w:styleId="RegionMarkerTok">
+  <w:style w:customStyle="1" w:styleId="RegionMarkerTok" w:type="character">
     <w:name w:val="RegionMarkerTok"/>
     <w:basedOn w:val="VerbatimChar"/>
     <w:rPr/>
   </w:style>
-  <w:style w:type="character" w:customStyle="1" w:styleId="InformationTok">
+  <w:style w:customStyle="1" w:styleId="InformationTok" w:type="character">
     <w:name w:val="InformationTok"/>
     <w:basedOn w:val="VerbatimChar"/>
     <w:rPr>
@@ -8366,7 +8499,7 @@
       <w:color w:val="60a0b0"/>
     </w:rPr>
   </w:style>
-  <w:style w:type="character" w:customStyle="1" w:styleId="WarningTok">
+  <w:style w:customStyle="1" w:styleId="WarningTok" w:type="character">
     <w:name w:val="WarningTok"/>
     <w:basedOn w:val="VerbatimChar"/>
     <w:rPr>
@@ -8375,7 +8508,7 @@
       <w:color w:val="60a0b0"/>
     </w:rPr>
   </w:style>
-  <w:style w:type="character" w:customStyle="1" w:styleId="AlertTok">
+  <w:style w:customStyle="1" w:styleId="AlertTok" w:type="character">
     <w:name w:val="AlertTok"/>
     <w:basedOn w:val="VerbatimChar"/>
     <w:rPr>
@@ -8383,7 +8516,7 @@
       <w:color w:val="ff0000"/>
     </w:rPr>
   </w:style>
-  <w:style w:type="character" w:customStyle="1" w:styleId="ErrorTok">
+  <w:style w:customStyle="1" w:styleId="ErrorTok" w:type="character">
     <w:name w:val="ErrorTok"/>
     <w:basedOn w:val="VerbatimChar"/>
     <w:rPr>
@@ -8391,7 +8524,7 @@
       <w:color w:val="ff0000"/>
     </w:rPr>
   </w:style>
-  <w:style w:type="character" w:customStyle="1" w:styleId="NormalTok">
+  <w:style w:customStyle="1" w:styleId="NormalTok" w:type="character">
     <w:name w:val="NormalTok"/>
     <w:basedOn w:val="VerbatimChar"/>
     <w:rPr/>

</xml_diff>

<commit_message>
Prepare BIOSZEN 2.0.5 for R-universe
</commit_message>
<xml_diff>
--- a/inst/app/www/MANUAL_EN.docx
+++ b/inst/app/www/MANUAL_EN.docx
@@ -2,7 +2,7 @@
 <file path=word/document.xml><?xml version="1.0" encoding="utf-8"?>
 <w:document xmlns:w="http://schemas.openxmlformats.org/wordprocessingml/2006/main" xmlns:m="http://schemas.openxmlformats.org/officeDocument/2006/math" xmlns:r="http://schemas.openxmlformats.org/officeDocument/2006/relationships" xmlns:o="urn:schemas-microsoft-com:office:office" xmlns:v="urn:schemas-microsoft-com:vml" xmlns:w10="urn:schemas-microsoft-com:office:word" xmlns:a="http://schemas.openxmlformats.org/drawingml/2006/main" xmlns:pic="http://schemas.openxmlformats.org/drawingml/2006/picture" xmlns:wp="http://schemas.openxmlformats.org/drawingml/2006/wordprocessingDrawing">
   <w:body>
-    <w:bookmarkStart w:id="143" w:name="bioszen-user-manual-english"/>
+    <w:bookmarkStart w:id="76" w:name="bioszen-user-manual-english"/>
     <w:p>
       <w:pPr>
         <w:pStyle w:val="Heading1"/>
@@ -28,18 +28,18 @@
           <wp:inline>
             <wp:extent cx="5334000" cy="2341239"/>
             <wp:effectExtent b="0" l="0" r="0" t="0"/>
-            <wp:docPr descr="BIOSZEN app overview" title="" id="78" name="Picture"/>
+            <wp:docPr descr="BIOSZEN app overview" title="" id="10" name="Picture"/>
             <a:graphic>
               <a:graphicData uri="http://schemas.openxmlformats.org/drawingml/2006/picture">
                 <pic:pic>
                   <pic:nvPicPr>
-                    <pic:cNvPr descr="manual_images/01_app_home_overview.png" id="79" name="Picture"/>
+                    <pic:cNvPr descr="manual_images/01_app_home_overview.png" id="11" name="Picture"/>
                     <pic:cNvPicPr>
                       <a:picLocks noChangeArrowheads="1" noChangeAspect="1"/>
                     </pic:cNvPicPr>
                   </pic:nvPicPr>
                   <pic:blipFill>
-                    <a:blip r:embed="rId77"/>
+                    <a:blip r:embed="rId9"/>
                     <a:stretch>
                       <a:fillRect/>
                     </a:stretch>
@@ -118,7 +118,7 @@
         <w:t xml:space="preserve">Keep this manual open while working. Each section includes both quick actions and deeper technical reference.</w:t>
       </w:r>
     </w:p>
-    <w:bookmarkStart w:id="80" w:name="manual-map"/>
+    <w:bookmarkStart w:id="12" w:name="manual-map"/>
     <w:p>
       <w:pPr>
         <w:pStyle w:val="Heading2"/>
@@ -382,8 +382,8 @@
         </w:r>
       </w:hyperlink>
     </w:p>
-    <w:bookmarkEnd w:id="80"/>
-    <w:bookmarkStart w:id="85" w:name="Xcc802c028399c90ef506226ebaf5d25e7c22381"/>
+    <w:bookmarkEnd w:id="12"/>
+    <w:bookmarkStart w:id="17" w:name="Xcc802c028399c90ef506226ebaf5d25e7c22381"/>
     <w:p>
       <w:pPr>
         <w:pStyle w:val="Heading2"/>
@@ -433,10 +433,19 @@
         <w:t xml:space="preserve">app.R</w:t>
       </w:r>
       <w:r>
-        <w:t xml:space="preserve"> </w:t>
-      </w:r>
-      <w:r>
-        <w:t xml:space="preserve">or</w:t>
+        <w:t xml:space="preserve">,</w:t>
+      </w:r>
+      <w:r>
+        <w:t xml:space="preserve"> </w:t>
+      </w:r>
+      <w:r>
+        <w:rPr>
+          <w:rStyle w:val="VerbatimChar"/>
+        </w:rPr>
+        <w:t xml:space="preserve">BIOSZEN::BIOSZEN()</w:t>
+      </w:r>
+      <w:r>
+        <w:t xml:space="preserve">, or</w:t>
       </w:r>
       <w:r>
         <w:t xml:space="preserve"> </w:t>
@@ -632,6 +641,195 @@
         <w:pStyle w:val="FirstParagraph"/>
       </w:pPr>
       <w:r>
+        <w:t xml:space="preserve">Install the stable R package from R-universe with:</w:t>
+      </w:r>
+    </w:p>
+    <w:p>
+      <w:pPr>
+        <w:pStyle w:val="SourceCode"/>
+      </w:pPr>
+      <w:r>
+        <w:rPr>
+          <w:rStyle w:val="FunctionTok"/>
+        </w:rPr>
+        <w:t xml:space="preserve">install.packages</w:t>
+      </w:r>
+      <w:r>
+        <w:rPr>
+          <w:rStyle w:val="NormalTok"/>
+        </w:rPr>
+        <w:t xml:space="preserve">(</w:t>
+      </w:r>
+      <w:r>
+        <w:br/>
+      </w:r>
+      <w:r>
+        <w:rPr>
+          <w:rStyle w:val="NormalTok"/>
+        </w:rPr>
+        <w:t xml:space="preserve">  </w:t>
+      </w:r>
+      <w:r>
+        <w:rPr>
+          <w:rStyle w:val="StringTok"/>
+        </w:rPr>
+        <w:t xml:space="preserve">"BIOSZEN"</w:t>
+      </w:r>
+      <w:r>
+        <w:rPr>
+          <w:rStyle w:val="NormalTok"/>
+        </w:rPr>
+        <w:t xml:space="preserve">,</w:t>
+      </w:r>
+      <w:r>
+        <w:br/>
+      </w:r>
+      <w:r>
+        <w:rPr>
+          <w:rStyle w:val="NormalTok"/>
+        </w:rPr>
+        <w:t xml:space="preserve">  </w:t>
+      </w:r>
+      <w:r>
+        <w:rPr>
+          <w:rStyle w:val="AttributeTok"/>
+        </w:rPr>
+        <w:t xml:space="preserve">repos =</w:t>
+      </w:r>
+      <w:r>
+        <w:rPr>
+          <w:rStyle w:val="NormalTok"/>
+        </w:rPr>
+        <w:t xml:space="preserve"> </w:t>
+      </w:r>
+      <w:r>
+        <w:rPr>
+          <w:rStyle w:val="FunctionTok"/>
+        </w:rPr>
+        <w:t xml:space="preserve">c</w:t>
+      </w:r>
+      <w:r>
+        <w:rPr>
+          <w:rStyle w:val="NormalTok"/>
+        </w:rPr>
+        <w:t xml:space="preserve">(</w:t>
+      </w:r>
+      <w:r>
+        <w:br/>
+      </w:r>
+      <w:r>
+        <w:rPr>
+          <w:rStyle w:val="NormalTok"/>
+        </w:rPr>
+        <w:t xml:space="preserve">    </w:t>
+      </w:r>
+      <w:r>
+        <w:rPr>
+          <w:rStyle w:val="StringTok"/>
+        </w:rPr>
+        <w:t xml:space="preserve">"https://bioszen.r-universe.dev"</w:t>
+      </w:r>
+      <w:r>
+        <w:rPr>
+          <w:rStyle w:val="NormalTok"/>
+        </w:rPr>
+        <w:t xml:space="preserve">,</w:t>
+      </w:r>
+      <w:r>
+        <w:br/>
+      </w:r>
+      <w:r>
+        <w:rPr>
+          <w:rStyle w:val="NormalTok"/>
+        </w:rPr>
+        <w:t xml:space="preserve">    </w:t>
+      </w:r>
+      <w:r>
+        <w:rPr>
+          <w:rStyle w:val="StringTok"/>
+        </w:rPr>
+        <w:t xml:space="preserve">"https://cloud.r-project.org"</w:t>
+      </w:r>
+      <w:r>
+        <w:br/>
+      </w:r>
+      <w:r>
+        <w:rPr>
+          <w:rStyle w:val="NormalTok"/>
+        </w:rPr>
+        <w:t xml:space="preserve">  )</w:t>
+      </w:r>
+      <w:r>
+        <w:br/>
+      </w:r>
+      <w:r>
+        <w:rPr>
+          <w:rStyle w:val="NormalTok"/>
+        </w:rPr>
+        <w:t xml:space="preserve">)</w:t>
+      </w:r>
+      <w:r>
+        <w:br/>
+      </w:r>
+      <w:r>
+        <w:rPr>
+          <w:rStyle w:val="NormalTok"/>
+        </w:rPr>
+        <w:t xml:space="preserve">BIOSZEN</w:t>
+      </w:r>
+      <w:r>
+        <w:rPr>
+          <w:rStyle w:val="SpecialCharTok"/>
+        </w:rPr>
+        <w:t xml:space="preserve">::</w:t>
+      </w:r>
+      <w:r>
+        <w:rPr>
+          <w:rStyle w:val="FunctionTok"/>
+        </w:rPr>
+        <w:t xml:space="preserve">BIOSZEN</w:t>
+      </w:r>
+      <w:r>
+        <w:rPr>
+          <w:rStyle w:val="NormalTok"/>
+        </w:rPr>
+        <w:t xml:space="preserve">()</w:t>
+      </w:r>
+    </w:p>
+    <w:p>
+      <w:pPr>
+        <w:pStyle w:val="FirstParagraph"/>
+      </w:pPr>
+      <w:r>
+        <w:t xml:space="preserve">The standalone</w:t>
+      </w:r>
+      <w:r>
+        <w:t xml:space="preserve"> </w:t>
+      </w:r>
+      <w:r>
+        <w:rPr>
+          <w:rStyle w:val="VerbatimChar"/>
+        </w:rPr>
+        <w:t xml:space="preserve">App.R</w:t>
+      </w:r>
+      <w:r>
+        <w:t xml:space="preserve"> </w:t>
+      </w:r>
+      <w:r>
+        <w:t xml:space="preserve">and bundle launch methods remain available for users who</w:t>
+      </w:r>
+      <w:r>
+        <w:t xml:space="preserve"> </w:t>
+      </w:r>
+      <w:r>
+        <w:t xml:space="preserve">prefer not to install BIOSZEN from a package repository.</w:t>
+      </w:r>
+    </w:p>
+    <w:p>
+      <w:pPr>
+        <w:pStyle w:val="BodyText"/>
+      </w:pPr>
+      <w:r>
         <w:t xml:space="preserve">Reference templates available in-app (</w:t>
       </w:r>
       <w:r>
@@ -676,7 +874,7 @@
           <w:numId w:val="1004"/>
         </w:numPr>
       </w:pPr>
-      <w:hyperlink r:id="rId81">
+      <w:hyperlink r:id="rId13">
         <w:r>
           <w:rPr>
             <w:rStyle w:val="Hyperlink"/>
@@ -693,7 +891,7 @@
           <w:numId w:val="1004"/>
         </w:numPr>
       </w:pPr>
-      <w:hyperlink r:id="rId82">
+      <w:hyperlink r:id="rId14">
         <w:r>
           <w:rPr>
             <w:rStyle w:val="Hyperlink"/>
@@ -710,7 +908,7 @@
           <w:numId w:val="1004"/>
         </w:numPr>
       </w:pPr>
-      <w:hyperlink r:id="rId83">
+      <w:hyperlink r:id="rId15">
         <w:r>
           <w:rPr>
             <w:rStyle w:val="Hyperlink"/>
@@ -727,7 +925,7 @@
           <w:numId w:val="1004"/>
         </w:numPr>
       </w:pPr>
-      <w:hyperlink r:id="rId84">
+      <w:hyperlink r:id="rId16">
         <w:r>
           <w:rPr>
             <w:rStyle w:val="Hyperlink"/>
@@ -766,8 +964,8 @@
         <w:t xml:space="preserve">. Keep that folder to avoid reinstalling dependencies.</w:t>
       </w:r>
     </w:p>
-    <w:bookmarkEnd w:id="85"/>
-    <w:bookmarkStart w:id="92" w:name="X717faac405ee7bcb1499a96623efaf8a5d1ee47"/>
+    <w:bookmarkEnd w:id="17"/>
+    <w:bookmarkStart w:id="25" w:name="X717faac405ee7bcb1499a96623efaf8a5d1ee47"/>
     <w:p>
       <w:pPr>
         <w:pStyle w:val="Heading2"/>
@@ -776,7 +974,7 @@
         <w:t xml:space="preserve">2. Fast Start by Scenario</w:t>
       </w:r>
     </w:p>
-    <w:bookmarkStart w:id="86" w:name="Xa7fd6d851aa97e621ff7d312d1eecc596d93a28"/>
+    <w:bookmarkStart w:id="18" w:name="Xa7fd6d851aa97e621ff7d312d1eecc596d93a28"/>
     <w:p>
       <w:pPr>
         <w:pStyle w:val="Heading3"/>
@@ -883,8 +1081,8 @@
         <w:t xml:space="preserve">Export plot, tables, metadata, and ZIP bundle.</w:t>
       </w:r>
     </w:p>
-    <w:bookmarkEnd w:id="86"/>
-    <w:bookmarkStart w:id="87" w:name="Xfb5a9e6fb4846348544dde5a71c800812e0227b"/>
+    <w:bookmarkEnd w:id="18"/>
+    <w:bookmarkStart w:id="19" w:name="Xfb5a9e6fb4846348544dde5a71c800812e0227b"/>
     <w:p>
       <w:pPr>
         <w:pStyle w:val="Heading3"/>
@@ -954,8 +1152,8 @@
         <w:t xml:space="preserve">Export plots and metadata.</w:t>
       </w:r>
     </w:p>
-    <w:bookmarkEnd w:id="87"/>
-    <w:bookmarkStart w:id="91" w:name="X98e459497506ff727301c25765f2a946169182f"/>
+    <w:bookmarkEnd w:id="19"/>
+    <w:bookmarkStart w:id="20" w:name="X98e459497506ff727301c25765f2a946169182f"/>
     <w:p>
       <w:pPr>
         <w:pStyle w:val="Heading3"/>
@@ -1026,6 +1224,235 @@
       </w:pPr>
       <w:r>
         <w:t xml:space="preserve">Add overlays/advanced layers only near final export.</w:t>
+      </w:r>
+    </w:p>
+    <w:bookmarkEnd w:id="20"/>
+    <w:bookmarkStart w:id="24" w:name="X1e4e5d684586b5543e1aaf83240cb30502e5d1b"/>
+    <w:p>
+      <w:pPr>
+        <w:pStyle w:val="Heading3"/>
+      </w:pPr>
+      <w:r>
+        <w:t xml:space="preserve">Scenario D: I need a reproducible R script</w:t>
+      </w:r>
+    </w:p>
+    <w:p>
+      <w:pPr>
+        <w:pStyle w:val="Compact"/>
+        <w:numPr>
+          <w:ilvl w:val="0"/>
+          <w:numId w:val="1008"/>
+        </w:numPr>
+      </w:pPr>
+      <w:r>
+        <w:t xml:space="preserve">Launch the same app with</w:t>
+      </w:r>
+      <w:r>
+        <w:t xml:space="preserve"> </w:t>
+      </w:r>
+      <w:r>
+        <w:rPr>
+          <w:rStyle w:val="VerbatimChar"/>
+        </w:rPr>
+        <w:t xml:space="preserve">BIOSZEN::BIOSZEN()</w:t>
+      </w:r>
+      <w:r>
+        <w:t xml:space="preserve">;</w:t>
+      </w:r>
+      <w:r>
+        <w:t xml:space="preserve"> </w:t>
+      </w:r>
+      <w:r>
+        <w:rPr>
+          <w:rStyle w:val="VerbatimChar"/>
+        </w:rPr>
+        <w:t xml:space="preserve">BIOSZEN::run_app()</w:t>
+      </w:r>
+      <w:r>
+        <w:t xml:space="preserve"> </w:t>
+      </w:r>
+      <w:r>
+        <w:t xml:space="preserve">remains supported.</w:t>
+      </w:r>
+    </w:p>
+    <w:p>
+      <w:pPr>
+        <w:pStyle w:val="Compact"/>
+        <w:numPr>
+          <w:ilvl w:val="0"/>
+          <w:numId w:val="1008"/>
+        </w:numPr>
+      </w:pPr>
+      <w:r>
+        <w:t xml:space="preserve">Use</w:t>
+      </w:r>
+      <w:r>
+        <w:t xml:space="preserve"> </w:t>
+      </w:r>
+      <w:r>
+        <w:rPr>
+          <w:rStyle w:val="VerbatimChar"/>
+        </w:rPr>
+        <w:t xml:space="preserve">BIOSZEN::growth_parameters()</w:t>
+      </w:r>
+      <w:r>
+        <w:t xml:space="preserve"> </w:t>
+      </w:r>
+      <w:r>
+        <w:t xml:space="preserve">to obtain the same growth parameters as the Growth tab without opening the visual interface.</w:t>
+      </w:r>
+    </w:p>
+    <w:p>
+      <w:pPr>
+        <w:pStyle w:val="Compact"/>
+        <w:numPr>
+          <w:ilvl w:val="0"/>
+          <w:numId w:val="1008"/>
+        </w:numPr>
+      </w:pPr>
+      <w:r>
+        <w:rPr>
+          <w:rStyle w:val="VerbatimChar"/>
+        </w:rPr>
+        <w:t xml:space="preserve">growth_parameters()</w:t>
+      </w:r>
+      <w:r>
+        <w:t xml:space="preserve"> </w:t>
+      </w:r>
+      <w:r>
+        <w:t xml:space="preserve">accepts wide/tidy data frames, one or more</w:t>
+      </w:r>
+      <w:r>
+        <w:t xml:space="preserve"> </w:t>
+      </w:r>
+      <w:r>
+        <w:rPr>
+          <w:rStyle w:val="VerbatimChar"/>
+        </w:rPr>
+        <w:t xml:space="preserve">.xlsx</w:t>
+      </w:r>
+      <w:r>
+        <w:t xml:space="preserve">/</w:t>
+      </w:r>
+      <w:r>
+        <w:rPr>
+          <w:rStyle w:val="VerbatimChar"/>
+        </w:rPr>
+        <w:t xml:space="preserve">.xls</w:t>
+      </w:r>
+      <w:r>
+        <w:t xml:space="preserve">/</w:t>
+      </w:r>
+      <w:r>
+        <w:rPr>
+          <w:rStyle w:val="VerbatimChar"/>
+        </w:rPr>
+        <w:t xml:space="preserve">.csv</w:t>
+      </w:r>
+      <w:r>
+        <w:t xml:space="preserve"> </w:t>
+      </w:r>
+      <w:r>
+        <w:t xml:space="preserve">files, or a directory. It writes nothing unless</w:t>
+      </w:r>
+      <w:r>
+        <w:t xml:space="preserve"> </w:t>
+      </w:r>
+      <w:r>
+        <w:rPr>
+          <w:rStyle w:val="VerbatimChar"/>
+        </w:rPr>
+        <w:t xml:space="preserve">output_dir</w:t>
+      </w:r>
+      <w:r>
+        <w:t xml:space="preserve"> </w:t>
+      </w:r>
+      <w:r>
+        <w:t xml:space="preserve">is supplied.</w:t>
+      </w:r>
+    </w:p>
+    <w:p>
+      <w:pPr>
+        <w:pStyle w:val="Compact"/>
+        <w:numPr>
+          <w:ilvl w:val="0"/>
+          <w:numId w:val="1008"/>
+        </w:numPr>
+      </w:pPr>
+      <w:r>
+        <w:t xml:space="preserve">Use</w:t>
+      </w:r>
+      <w:r>
+        <w:t xml:space="preserve"> </w:t>
+      </w:r>
+      <w:r>
+        <w:rPr>
+          <w:rStyle w:val="VerbatimChar"/>
+        </w:rPr>
+        <w:t xml:space="preserve">BIOSZEN::bioszen_update_available()</w:t>
+      </w:r>
+      <w:r>
+        <w:t xml:space="preserve"> </w:t>
+      </w:r>
+      <w:r>
+        <w:t xml:space="preserve">to check for an update and</w:t>
+      </w:r>
+      <w:r>
+        <w:t xml:space="preserve"> </w:t>
+      </w:r>
+      <w:r>
+        <w:rPr>
+          <w:rStyle w:val="VerbatimChar"/>
+        </w:rPr>
+        <w:t xml:space="preserve">BIOSZEN::bioszen_update()</w:t>
+      </w:r>
+      <w:r>
+        <w:t xml:space="preserve"> </w:t>
+      </w:r>
+      <w:r>
+        <w:t xml:space="preserve">to install one after confirmation and after closing the app.</w:t>
+      </w:r>
+    </w:p>
+    <w:p>
+      <w:pPr>
+        <w:pStyle w:val="Compact"/>
+        <w:numPr>
+          <w:ilvl w:val="0"/>
+          <w:numId w:val="1008"/>
+        </w:numPr>
+      </w:pPr>
+      <w:r>
+        <w:t xml:space="preserve">Use</w:t>
+      </w:r>
+      <w:r>
+        <w:t xml:space="preserve"> </w:t>
+      </w:r>
+      <w:r>
+        <w:rPr>
+          <w:rStyle w:val="VerbatimChar"/>
+        </w:rPr>
+        <w:t xml:space="preserve">BIOSZEN::bioszen_citation()</w:t>
+      </w:r>
+      <w:r>
+        <w:t xml:space="preserve"> </w:t>
+      </w:r>
+      <w:r>
+        <w:t xml:space="preserve">or</w:t>
+      </w:r>
+      <w:r>
+        <w:t xml:space="preserve"> </w:t>
+      </w:r>
+      <w:r>
+        <w:rPr>
+          <w:rStyle w:val="VerbatimChar"/>
+        </w:rPr>
+        <w:t xml:space="preserve">citation("BIOSZEN")</w:t>
+      </w:r>
+      <w:r>
+        <w:t xml:space="preserve"> </w:t>
+      </w:r>
+      <w:r>
+        <w:t xml:space="preserve">for the official citation.</w:t>
       </w:r>
     </w:p>
     <w:p>
@@ -1037,18 +1464,18 @@
           <wp:inline>
             <wp:extent cx="5334000" cy="2133600"/>
             <wp:effectExtent b="0" l="0" r="0" t="0"/>
-            <wp:docPr descr="Plot setup and layers" title="" id="89" name="Picture"/>
+            <wp:docPr descr="Plot setup and layers" title="" id="22" name="Picture"/>
             <a:graphic>
               <a:graphicData uri="http://schemas.openxmlformats.org/drawingml/2006/picture">
                 <pic:pic>
                   <pic:nvPicPr>
-                    <pic:cNvPr descr="manual_images/02_plot_setup_layers.png" id="90" name="Picture"/>
+                    <pic:cNvPr descr="manual_images/02_plot_setup_layers.png" id="23" name="Picture"/>
                     <pic:cNvPicPr>
                       <a:picLocks noChangeArrowheads="1" noChangeAspect="1"/>
                     </pic:cNvPicPr>
                   </pic:nvPicPr>
                   <pic:blipFill>
-                    <a:blip r:embed="rId88"/>
+                    <a:blip r:embed="rId21"/>
                     <a:stretch>
                       <a:fillRect/>
                     </a:stretch>
@@ -1075,9 +1502,9 @@
         </w:drawing>
       </w:r>
     </w:p>
-    <w:bookmarkEnd w:id="91"/>
-    <w:bookmarkEnd w:id="92"/>
-    <w:bookmarkStart w:id="93" w:name="X128ed19147767cebcf7cb23c4bcc70881f470f9"/>
+    <w:bookmarkEnd w:id="24"/>
+    <w:bookmarkEnd w:id="25"/>
+    <w:bookmarkStart w:id="26" w:name="X128ed19147767cebcf7cb23c4bcc70881f470f9"/>
     <w:p>
       <w:pPr>
         <w:pStyle w:val="Heading2"/>
@@ -1090,7 +1517,7 @@
       <w:pPr>
         <w:numPr>
           <w:ilvl w:val="0"/>
-          <w:numId w:val="1008"/>
+          <w:numId w:val="1009"/>
         </w:numPr>
       </w:pPr>
       <w:r>
@@ -1117,7 +1544,7 @@
       <w:pPr>
         <w:numPr>
           <w:ilvl w:val="0"/>
-          <w:numId w:val="1008"/>
+          <w:numId w:val="1009"/>
         </w:numPr>
       </w:pPr>
       <w:r>
@@ -1169,7 +1596,7 @@
       <w:pPr>
         <w:numPr>
           <w:ilvl w:val="0"/>
-          <w:numId w:val="1008"/>
+          <w:numId w:val="1009"/>
         </w:numPr>
       </w:pPr>
       <w:r>
@@ -1196,7 +1623,7 @@
       <w:pPr>
         <w:numPr>
           <w:ilvl w:val="0"/>
-          <w:numId w:val="1008"/>
+          <w:numId w:val="1009"/>
         </w:numPr>
       </w:pPr>
       <w:r>
@@ -1231,8 +1658,8 @@
         <w:t xml:space="preserve">.</w:t>
       </w:r>
     </w:p>
-    <w:bookmarkEnd w:id="93"/>
-    <w:bookmarkStart w:id="102" w:name="X6b8972cbac599c5fedbf83a48be69951ca6b7c8"/>
+    <w:bookmarkEnd w:id="26"/>
+    <w:bookmarkStart w:id="35" w:name="X6b8972cbac599c5fedbf83a48be69951ca6b7c8"/>
     <w:p>
       <w:pPr>
         <w:pStyle w:val="Heading2"/>
@@ -1241,7 +1668,7 @@
         <w:t xml:space="preserve">4. Input Specifications</w:t>
       </w:r>
     </w:p>
-    <w:bookmarkStart w:id="94" w:name="X0605fe61617601d5dc607a15bb9e5babb26d0bd"/>
+    <w:bookmarkStart w:id="27" w:name="X0605fe61617601d5dc607a15bb9e5babb26d0bd"/>
     <w:p>
       <w:pPr>
         <w:pStyle w:val="Heading3"/>
@@ -1263,7 +1690,7 @@
         <w:pStyle w:val="Compact"/>
         <w:numPr>
           <w:ilvl w:val="0"/>
-          <w:numId w:val="1009"/>
+          <w:numId w:val="1010"/>
         </w:numPr>
       </w:pPr>
       <w:r>
@@ -1281,7 +1708,7 @@
         <w:pStyle w:val="Compact"/>
         <w:numPr>
           <w:ilvl w:val="0"/>
-          <w:numId w:val="1009"/>
+          <w:numId w:val="1010"/>
         </w:numPr>
       </w:pPr>
       <w:r>
@@ -1316,7 +1743,7 @@
         <w:pStyle w:val="Compact"/>
         <w:numPr>
           <w:ilvl w:val="0"/>
-          <w:numId w:val="1010"/>
+          <w:numId w:val="1011"/>
         </w:numPr>
       </w:pPr>
       <w:r>
@@ -1355,7 +1782,7 @@
         <w:pStyle w:val="Compact"/>
         <w:numPr>
           <w:ilvl w:val="0"/>
-          <w:numId w:val="1010"/>
+          <w:numId w:val="1011"/>
         </w:numPr>
       </w:pPr>
       <w:r>
@@ -1373,7 +1800,7 @@
         <w:pStyle w:val="Compact"/>
         <w:numPr>
           <w:ilvl w:val="0"/>
-          <w:numId w:val="1010"/>
+          <w:numId w:val="1011"/>
         </w:numPr>
       </w:pPr>
       <w:r>
@@ -1412,7 +1839,7 @@
         <w:pStyle w:val="Compact"/>
         <w:numPr>
           <w:ilvl w:val="0"/>
-          <w:numId w:val="1010"/>
+          <w:numId w:val="1011"/>
         </w:numPr>
       </w:pPr>
       <w:r>
@@ -1463,7 +1890,7 @@
         <w:pStyle w:val="Compact"/>
         <w:numPr>
           <w:ilvl w:val="0"/>
-          <w:numId w:val="1010"/>
+          <w:numId w:val="1011"/>
         </w:numPr>
       </w:pPr>
       <w:r>
@@ -1553,7 +1980,7 @@
         <w:pStyle w:val="Compact"/>
         <w:numPr>
           <w:ilvl w:val="0"/>
-          <w:numId w:val="1010"/>
+          <w:numId w:val="1011"/>
         </w:numPr>
       </w:pPr>
       <w:r>
@@ -1574,7 +2001,7 @@
         <w:pStyle w:val="Compact"/>
         <w:numPr>
           <w:ilvl w:val="0"/>
-          <w:numId w:val="1010"/>
+          <w:numId w:val="1011"/>
         </w:numPr>
       </w:pPr>
       <w:r>
@@ -1592,7 +2019,7 @@
         <w:pStyle w:val="Compact"/>
         <w:numPr>
           <w:ilvl w:val="0"/>
-          <w:numId w:val="1010"/>
+          <w:numId w:val="1011"/>
         </w:numPr>
       </w:pPr>
       <w:r>
@@ -1612,7 +2039,7 @@
         <w:pStyle w:val="Compact"/>
         <w:numPr>
           <w:ilvl w:val="0"/>
-          <w:numId w:val="1011"/>
+          <w:numId w:val="1012"/>
         </w:numPr>
       </w:pPr>
       <w:r>
@@ -1695,7 +2122,7 @@
         <w:pStyle w:val="Compact"/>
         <w:numPr>
           <w:ilvl w:val="0"/>
-          <w:numId w:val="1012"/>
+          <w:numId w:val="1013"/>
         </w:numPr>
       </w:pPr>
       <w:r>
@@ -1710,7 +2137,7 @@
         <w:pStyle w:val="Compact"/>
         <w:numPr>
           <w:ilvl w:val="0"/>
-          <w:numId w:val="1012"/>
+          <w:numId w:val="1013"/>
         </w:numPr>
       </w:pPr>
       <w:r>
@@ -1725,7 +2152,7 @@
         <w:pStyle w:val="Compact"/>
         <w:numPr>
           <w:ilvl w:val="0"/>
-          <w:numId w:val="1012"/>
+          <w:numId w:val="1013"/>
         </w:numPr>
       </w:pPr>
       <w:r>
@@ -1740,7 +2167,7 @@
         <w:pStyle w:val="Compact"/>
         <w:numPr>
           <w:ilvl w:val="0"/>
-          <w:numId w:val="1012"/>
+          <w:numId w:val="1013"/>
         </w:numPr>
       </w:pPr>
       <w:r>
@@ -1750,8 +2177,8 @@
         <w:t xml:space="preserve">Y_Title</w:t>
       </w:r>
     </w:p>
-    <w:bookmarkEnd w:id="94"/>
-    <w:bookmarkStart w:id="95" w:name="Xe43541bf07e4c62d7d45bf62912f7f89f9c08e5"/>
+    <w:bookmarkEnd w:id="27"/>
+    <w:bookmarkStart w:id="28" w:name="Xe43541bf07e4c62d7d45bf62912f7f89f9c08e5"/>
     <w:p>
       <w:pPr>
         <w:pStyle w:val="Heading3"/>
@@ -1794,7 +2221,7 @@
         <w:pStyle w:val="Compact"/>
         <w:numPr>
           <w:ilvl w:val="0"/>
-          <w:numId w:val="1013"/>
+          <w:numId w:val="1014"/>
         </w:numPr>
       </w:pPr>
       <w:r>
@@ -1845,7 +2272,7 @@
         <w:pStyle w:val="Compact"/>
         <w:numPr>
           <w:ilvl w:val="0"/>
-          <w:numId w:val="1013"/>
+          <w:numId w:val="1014"/>
         </w:numPr>
       </w:pPr>
       <w:r>
@@ -1952,7 +2379,7 @@
         <w:pStyle w:val="Compact"/>
         <w:numPr>
           <w:ilvl w:val="0"/>
-          <w:numId w:val="1014"/>
+          <w:numId w:val="1015"/>
         </w:numPr>
       </w:pPr>
       <w:r>
@@ -1997,7 +2424,7 @@
         <w:pStyle w:val="Compact"/>
         <w:numPr>
           <w:ilvl w:val="0"/>
-          <w:numId w:val="1014"/>
+          <w:numId w:val="1015"/>
         </w:numPr>
       </w:pPr>
       <w:r>
@@ -2009,7 +2436,7 @@
         <w:pStyle w:val="Compact"/>
         <w:numPr>
           <w:ilvl w:val="1"/>
-          <w:numId w:val="1015"/>
+          <w:numId w:val="1016"/>
         </w:numPr>
       </w:pPr>
       <w:r>
@@ -2042,7 +2469,7 @@
         <w:pStyle w:val="Compact"/>
         <w:numPr>
           <w:ilvl w:val="1"/>
-          <w:numId w:val="1015"/>
+          <w:numId w:val="1016"/>
         </w:numPr>
       </w:pPr>
       <w:r>
@@ -2087,7 +2514,7 @@
         <w:pStyle w:val="Compact"/>
         <w:numPr>
           <w:ilvl w:val="1"/>
-          <w:numId w:val="1015"/>
+          <w:numId w:val="1016"/>
         </w:numPr>
       </w:pPr>
       <w:r>
@@ -2145,8 +2572,8 @@
         <w:t xml:space="preserve">vs curve headers).</w:t>
       </w:r>
     </w:p>
-    <w:bookmarkEnd w:id="95"/>
-    <w:bookmarkStart w:id="96" w:name="X239cbd4a8b7be852666d20878604d0d97369a89"/>
+    <w:bookmarkEnd w:id="28"/>
+    <w:bookmarkStart w:id="29" w:name="X239cbd4a8b7be852666d20878604d0d97369a89"/>
     <w:p>
       <w:pPr>
         <w:pStyle w:val="Heading3"/>
@@ -2160,7 +2587,7 @@
         <w:pStyle w:val="Compact"/>
         <w:numPr>
           <w:ilvl w:val="0"/>
-          <w:numId w:val="1016"/>
+          <w:numId w:val="1017"/>
         </w:numPr>
       </w:pPr>
       <w:r>
@@ -2185,7 +2612,7 @@
         <w:pStyle w:val="Compact"/>
         <w:numPr>
           <w:ilvl w:val="0"/>
-          <w:numId w:val="1016"/>
+          <w:numId w:val="1017"/>
         </w:numPr>
       </w:pPr>
       <w:r>
@@ -2221,7 +2648,7 @@
         <w:pStyle w:val="Compact"/>
         <w:numPr>
           <w:ilvl w:val="0"/>
-          <w:numId w:val="1016"/>
+          <w:numId w:val="1017"/>
         </w:numPr>
       </w:pPr>
       <w:r>
@@ -2233,7 +2660,7 @@
         <w:pStyle w:val="Compact"/>
         <w:numPr>
           <w:ilvl w:val="0"/>
-          <w:numId w:val="1016"/>
+          <w:numId w:val="1017"/>
         </w:numPr>
       </w:pPr>
       <w:r>
@@ -2269,8 +2696,8 @@
         <w:t xml:space="preserve">).</w:t>
       </w:r>
     </w:p>
-    <w:bookmarkEnd w:id="96"/>
-    <w:bookmarkStart w:id="97" w:name="Xcbadc8a632b74252ecce5f0e02c8d2548229bde"/>
+    <w:bookmarkEnd w:id="29"/>
+    <w:bookmarkStart w:id="30" w:name="Xcbadc8a632b74252ecce5f0e02c8d2548229bde"/>
     <w:p>
       <w:pPr>
         <w:pStyle w:val="Heading3"/>
@@ -2284,7 +2711,7 @@
         <w:pStyle w:val="Compact"/>
         <w:numPr>
           <w:ilvl w:val="0"/>
-          <w:numId w:val="1017"/>
+          <w:numId w:val="1018"/>
         </w:numPr>
       </w:pPr>
       <w:r>
@@ -2309,83 +2736,11 @@
         <w:pStyle w:val="Compact"/>
         <w:numPr>
           <w:ilvl w:val="0"/>
-          <w:numId w:val="1017"/>
+          <w:numId w:val="1018"/>
         </w:numPr>
       </w:pPr>
       <w:r>
         <w:t xml:space="preserve">BIOSZEN detects parameter summaries from any of these sheet names:</w:t>
-      </w:r>
-    </w:p>
-    <w:p>
-      <w:pPr>
-        <w:pStyle w:val="Compact"/>
-        <w:numPr>
-          <w:ilvl w:val="1"/>
-          <w:numId w:val="1018"/>
-        </w:numPr>
-      </w:pPr>
-      <w:r>
-        <w:rPr>
-          <w:rStyle w:val="VerbatimChar"/>
-        </w:rPr>
-        <w:t xml:space="preserve">Parameters_Summary</w:t>
-      </w:r>
-    </w:p>
-    <w:p>
-      <w:pPr>
-        <w:pStyle w:val="Compact"/>
-        <w:numPr>
-          <w:ilvl w:val="1"/>
-          <w:numId w:val="1018"/>
-        </w:numPr>
-      </w:pPr>
-      <w:r>
-        <w:rPr>
-          <w:rStyle w:val="VerbatimChar"/>
-        </w:rPr>
-        <w:t xml:space="preserve">Parametros_Summary</w:t>
-      </w:r>
-    </w:p>
-    <w:p>
-      <w:pPr>
-        <w:pStyle w:val="Compact"/>
-        <w:numPr>
-          <w:ilvl w:val="1"/>
-          <w:numId w:val="1018"/>
-        </w:numPr>
-      </w:pPr>
-      <w:r>
-        <w:rPr>
-          <w:rStyle w:val="VerbatimChar"/>
-        </w:rPr>
-        <w:t xml:space="preserve">Summary_Parameters</w:t>
-      </w:r>
-    </w:p>
-    <w:p>
-      <w:pPr>
-        <w:pStyle w:val="Compact"/>
-        <w:numPr>
-          <w:ilvl w:val="1"/>
-          <w:numId w:val="1018"/>
-        </w:numPr>
-      </w:pPr>
-      <w:r>
-        <w:rPr>
-          <w:rStyle w:val="VerbatimChar"/>
-        </w:rPr>
-        <w:t xml:space="preserve">Resumen_Parametros</w:t>
-      </w:r>
-    </w:p>
-    <w:p>
-      <w:pPr>
-        <w:pStyle w:val="Compact"/>
-        <w:numPr>
-          <w:ilvl w:val="0"/>
-          <w:numId w:val="1017"/>
-        </w:numPr>
-      </w:pPr>
-      <w:r>
-        <w:t xml:space="preserve">BIOSZEN detects embedded curve summaries from any of these sheet names:</w:t>
       </w:r>
     </w:p>
     <w:p>
@@ -2400,7 +2755,7 @@
         <w:rPr>
           <w:rStyle w:val="VerbatimChar"/>
         </w:rPr>
-        <w:t xml:space="preserve">Curves_Summary</w:t>
+        <w:t xml:space="preserve">Parameters_Summary</w:t>
       </w:r>
     </w:p>
     <w:p>
@@ -2415,7 +2770,7 @@
         <w:rPr>
           <w:rStyle w:val="VerbatimChar"/>
         </w:rPr>
-        <w:t xml:space="preserve">Curvas_Summary</w:t>
+        <w:t xml:space="preserve">Parametros_Summary</w:t>
       </w:r>
     </w:p>
     <w:p>
@@ -2430,7 +2785,7 @@
         <w:rPr>
           <w:rStyle w:val="VerbatimChar"/>
         </w:rPr>
-        <w:t xml:space="preserve">Summary_Curves</w:t>
+        <w:t xml:space="preserve">Summary_Parameters</w:t>
       </w:r>
     </w:p>
     <w:p>
@@ -2445,6 +2800,78 @@
         <w:rPr>
           <w:rStyle w:val="VerbatimChar"/>
         </w:rPr>
+        <w:t xml:space="preserve">Resumen_Parametros</w:t>
+      </w:r>
+    </w:p>
+    <w:p>
+      <w:pPr>
+        <w:pStyle w:val="Compact"/>
+        <w:numPr>
+          <w:ilvl w:val="0"/>
+          <w:numId w:val="1018"/>
+        </w:numPr>
+      </w:pPr>
+      <w:r>
+        <w:t xml:space="preserve">BIOSZEN detects embedded curve summaries from any of these sheet names:</w:t>
+      </w:r>
+    </w:p>
+    <w:p>
+      <w:pPr>
+        <w:pStyle w:val="Compact"/>
+        <w:numPr>
+          <w:ilvl w:val="1"/>
+          <w:numId w:val="1020"/>
+        </w:numPr>
+      </w:pPr>
+      <w:r>
+        <w:rPr>
+          <w:rStyle w:val="VerbatimChar"/>
+        </w:rPr>
+        <w:t xml:space="preserve">Curves_Summary</w:t>
+      </w:r>
+    </w:p>
+    <w:p>
+      <w:pPr>
+        <w:pStyle w:val="Compact"/>
+        <w:numPr>
+          <w:ilvl w:val="1"/>
+          <w:numId w:val="1020"/>
+        </w:numPr>
+      </w:pPr>
+      <w:r>
+        <w:rPr>
+          <w:rStyle w:val="VerbatimChar"/>
+        </w:rPr>
+        <w:t xml:space="preserve">Curvas_Summary</w:t>
+      </w:r>
+    </w:p>
+    <w:p>
+      <w:pPr>
+        <w:pStyle w:val="Compact"/>
+        <w:numPr>
+          <w:ilvl w:val="1"/>
+          <w:numId w:val="1020"/>
+        </w:numPr>
+      </w:pPr>
+      <w:r>
+        <w:rPr>
+          <w:rStyle w:val="VerbatimChar"/>
+        </w:rPr>
+        <w:t xml:space="preserve">Summary_Curves</w:t>
+      </w:r>
+    </w:p>
+    <w:p>
+      <w:pPr>
+        <w:pStyle w:val="Compact"/>
+        <w:numPr>
+          <w:ilvl w:val="1"/>
+          <w:numId w:val="1020"/>
+        </w:numPr>
+      </w:pPr>
+      <w:r>
+        <w:rPr>
+          <w:rStyle w:val="VerbatimChar"/>
+        </w:rPr>
         <w:t xml:space="preserve">Resumen_Curvas</w:t>
       </w:r>
     </w:p>
@@ -2453,7 +2880,7 @@
         <w:pStyle w:val="Compact"/>
         <w:numPr>
           <w:ilvl w:val="0"/>
-          <w:numId w:val="1017"/>
+          <w:numId w:val="1018"/>
         </w:numPr>
       </w:pPr>
       <w:r>
@@ -2465,7 +2892,7 @@
         <w:pStyle w:val="Compact"/>
         <w:numPr>
           <w:ilvl w:val="0"/>
-          <w:numId w:val="1017"/>
+          <w:numId w:val="1018"/>
         </w:numPr>
       </w:pPr>
       <w:r>
@@ -2488,8 +2915,8 @@
         <w:t xml:space="preserve">file or an embedded curve-summary sheet.</w:t>
       </w:r>
     </w:p>
-    <w:bookmarkEnd w:id="97"/>
-    <w:bookmarkStart w:id="98" w:name="X9b6d5804ff663a0063e2ffa1f700ec485883876"/>
+    <w:bookmarkEnd w:id="30"/>
+    <w:bookmarkStart w:id="31" w:name="X9b6d5804ff663a0063e2ffa1f700ec485883876"/>
     <w:p>
       <w:pPr>
         <w:pStyle w:val="Heading3"/>
@@ -2503,7 +2930,7 @@
         <w:pStyle w:val="Compact"/>
         <w:numPr>
           <w:ilvl w:val="0"/>
-          <w:numId w:val="1020"/>
+          <w:numId w:val="1021"/>
         </w:numPr>
       </w:pPr>
       <w:r>
@@ -2573,7 +3000,7 @@
         <w:pStyle w:val="Compact"/>
         <w:numPr>
           <w:ilvl w:val="0"/>
-          <w:numId w:val="1020"/>
+          <w:numId w:val="1021"/>
         </w:numPr>
       </w:pPr>
       <w:r>
@@ -2585,7 +3012,7 @@
         <w:pStyle w:val="Compact"/>
         <w:numPr>
           <w:ilvl w:val="0"/>
-          <w:numId w:val="1020"/>
+          <w:numId w:val="1021"/>
         </w:numPr>
       </w:pPr>
       <w:r>
@@ -2629,8 +3056,8 @@
         <w:t xml:space="preserve">+ wells).</w:t>
       </w:r>
     </w:p>
-    <w:bookmarkEnd w:id="98"/>
-    <w:bookmarkStart w:id="101" w:name="X2bee644eb2d3a5adf897f34f1e02f1d8c3b4b94"/>
+    <w:bookmarkEnd w:id="31"/>
+    <w:bookmarkStart w:id="34" w:name="X2bee644eb2d3a5adf897f34f1e02f1d8c3b4b94"/>
     <w:p>
       <w:pPr>
         <w:pStyle w:val="Heading3"/>
@@ -2649,7 +3076,7 @@
       <w:r>
         <w:t xml:space="preserve"> </w:t>
       </w:r>
-      <w:hyperlink r:id="rId99">
+      <w:hyperlink r:id="rId32">
         <w:r>
           <w:rPr>
             <w:rStyle w:val="VerbatimChar"/>
@@ -2693,7 +3120,7 @@
       <w:r>
         <w:t xml:space="preserve"> </w:t>
       </w:r>
-      <w:hyperlink r:id="rId100">
+      <w:hyperlink r:id="rId33">
         <w:r>
           <w:rPr>
             <w:rStyle w:val="Hyperlink"/>
@@ -2853,9 +3280,9 @@
         <w:t xml:space="preserve">specific measurement type.</w:t>
       </w:r>
     </w:p>
-    <w:bookmarkEnd w:id="101"/>
-    <w:bookmarkEnd w:id="102"/>
-    <w:bookmarkStart w:id="106" w:name="X2e7b1a4065091c3158d5038f5bc7571dc49a75d"/>
+    <w:bookmarkEnd w:id="34"/>
+    <w:bookmarkEnd w:id="35"/>
+    <w:bookmarkStart w:id="39" w:name="X2e7b1a4065091c3158d5038f5bc7571dc49a75d"/>
     <w:p>
       <w:pPr>
         <w:pStyle w:val="Heading2"/>
@@ -2869,7 +3296,7 @@
         <w:pStyle w:val="Compact"/>
         <w:numPr>
           <w:ilvl w:val="0"/>
-          <w:numId w:val="1021"/>
+          <w:numId w:val="1022"/>
         </w:numPr>
       </w:pPr>
       <w:r>
@@ -2881,7 +3308,7 @@
         <w:pStyle w:val="Compact"/>
         <w:numPr>
           <w:ilvl w:val="0"/>
-          <w:numId w:val="1021"/>
+          <w:numId w:val="1022"/>
         </w:numPr>
       </w:pPr>
       <w:r>
@@ -2893,7 +3320,7 @@
         <w:pStyle w:val="Compact"/>
         <w:numPr>
           <w:ilvl w:val="0"/>
-          <w:numId w:val="1021"/>
+          <w:numId w:val="1022"/>
         </w:numPr>
       </w:pPr>
       <w:r>
@@ -2905,7 +3332,7 @@
         <w:pStyle w:val="Compact"/>
         <w:numPr>
           <w:ilvl w:val="0"/>
-          <w:numId w:val="1021"/>
+          <w:numId w:val="1022"/>
         </w:numPr>
       </w:pPr>
       <w:r>
@@ -2941,7 +3368,7 @@
         <w:pStyle w:val="Compact"/>
         <w:numPr>
           <w:ilvl w:val="0"/>
-          <w:numId w:val="1021"/>
+          <w:numId w:val="1022"/>
         </w:numPr>
       </w:pPr>
       <w:r>
@@ -2953,7 +3380,7 @@
         <w:pStyle w:val="Compact"/>
         <w:numPr>
           <w:ilvl w:val="0"/>
-          <w:numId w:val="1021"/>
+          <w:numId w:val="1022"/>
         </w:numPr>
       </w:pPr>
       <w:r>
@@ -2965,7 +3392,7 @@
         <w:pStyle w:val="Compact"/>
         <w:numPr>
           <w:ilvl w:val="0"/>
-          <w:numId w:val="1021"/>
+          <w:numId w:val="1022"/>
         </w:numPr>
       </w:pPr>
       <w:r>
@@ -2977,7 +3404,7 @@
         <w:pStyle w:val="Compact"/>
         <w:numPr>
           <w:ilvl w:val="0"/>
-          <w:numId w:val="1021"/>
+          <w:numId w:val="1022"/>
         </w:numPr>
       </w:pPr>
       <w:r>
@@ -2989,7 +3416,7 @@
         <w:pStyle w:val="Compact"/>
         <w:numPr>
           <w:ilvl w:val="0"/>
-          <w:numId w:val="1021"/>
+          <w:numId w:val="1022"/>
         </w:numPr>
       </w:pPr>
       <w:r>
@@ -3001,7 +3428,7 @@
         <w:pStyle w:val="Compact"/>
         <w:numPr>
           <w:ilvl w:val="0"/>
-          <w:numId w:val="1021"/>
+          <w:numId w:val="1022"/>
         </w:numPr>
       </w:pPr>
       <w:r>
@@ -3017,18 +3444,18 @@
           <wp:inline>
             <wp:extent cx="5334000" cy="1320297"/>
             <wp:effectExtent b="0" l="0" r="0" t="0"/>
-            <wp:docPr descr="Filtering by media/conditions" title="" id="104" name="Picture"/>
+            <wp:docPr descr="Filtering by media/conditions" title="" id="37" name="Picture"/>
             <a:graphic>
               <a:graphicData uri="http://schemas.openxmlformats.org/drawingml/2006/picture">
                 <pic:pic>
                   <pic:nvPicPr>
-                    <pic:cNvPr descr="manual_images/03_filter_media_conditions.png" id="105" name="Picture"/>
+                    <pic:cNvPr descr="manual_images/03_filter_media_conditions.png" id="38" name="Picture"/>
                     <pic:cNvPicPr>
                       <a:picLocks noChangeArrowheads="1" noChangeAspect="1"/>
                     </pic:cNvPicPr>
                   </pic:nvPicPr>
                   <pic:blipFill>
-                    <a:blip r:embed="rId103"/>
+                    <a:blip r:embed="rId36"/>
                     <a:stretch>
                       <a:fillRect/>
                     </a:stretch>
@@ -3055,8 +3482,8 @@
         </w:drawing>
       </w:r>
     </w:p>
-    <w:bookmarkEnd w:id="106"/>
-    <w:bookmarkStart w:id="124" w:name="X0cb250eb1df454c6760228a2c04c93ed8beae8a"/>
+    <w:bookmarkEnd w:id="39"/>
+    <w:bookmarkStart w:id="57" w:name="X0cb250eb1df454c6760228a2c04c93ed8beae8a"/>
     <w:p>
       <w:pPr>
         <w:pStyle w:val="Heading2"/>
@@ -3065,7 +3492,7 @@
         <w:t xml:space="preserve">6. Plot Types and Controls</w:t>
       </w:r>
     </w:p>
-    <w:bookmarkStart w:id="107" w:name="boxplot"/>
+    <w:bookmarkStart w:id="40" w:name="boxplot"/>
     <w:p>
       <w:pPr>
         <w:pStyle w:val="Heading3"/>
@@ -3079,7 +3506,7 @@
         <w:pStyle w:val="Compact"/>
         <w:numPr>
           <w:ilvl w:val="0"/>
-          <w:numId w:val="1022"/>
+          <w:numId w:val="1023"/>
         </w:numPr>
       </w:pPr>
       <w:r>
@@ -3091,7 +3518,7 @@
         <w:pStyle w:val="Compact"/>
         <w:numPr>
           <w:ilvl w:val="0"/>
-          <w:numId w:val="1022"/>
+          <w:numId w:val="1023"/>
         </w:numPr>
       </w:pPr>
       <w:r>
@@ -3103,7 +3530,7 @@
         <w:pStyle w:val="Compact"/>
         <w:numPr>
           <w:ilvl w:val="0"/>
-          <w:numId w:val="1022"/>
+          <w:numId w:val="1023"/>
         </w:numPr>
       </w:pPr>
       <w:r>
@@ -3115,7 +3542,7 @@
         <w:pStyle w:val="Compact"/>
         <w:numPr>
           <w:ilvl w:val="0"/>
-          <w:numId w:val="1022"/>
+          <w:numId w:val="1023"/>
         </w:numPr>
       </w:pPr>
       <w:r>
@@ -3131,8 +3558,8 @@
         <w:t xml:space="preserve">improves readability for long group labels.</w:t>
       </w:r>
     </w:p>
-    <w:bookmarkEnd w:id="107"/>
-    <w:bookmarkStart w:id="108" w:name="barplot"/>
+    <w:bookmarkEnd w:id="40"/>
+    <w:bookmarkStart w:id="41" w:name="barplot"/>
     <w:p>
       <w:pPr>
         <w:pStyle w:val="Heading3"/>
@@ -3146,7 +3573,7 @@
         <w:pStyle w:val="Compact"/>
         <w:numPr>
           <w:ilvl w:val="0"/>
-          <w:numId w:val="1023"/>
+          <w:numId w:val="1024"/>
         </w:numPr>
       </w:pPr>
       <w:r>
@@ -3158,7 +3585,7 @@
         <w:pStyle w:val="Compact"/>
         <w:numPr>
           <w:ilvl w:val="0"/>
-          <w:numId w:val="1023"/>
+          <w:numId w:val="1024"/>
         </w:numPr>
       </w:pPr>
       <w:r>
@@ -3170,15 +3597,15 @@
         <w:pStyle w:val="Compact"/>
         <w:numPr>
           <w:ilvl w:val="0"/>
-          <w:numId w:val="1023"/>
+          <w:numId w:val="1024"/>
         </w:numPr>
       </w:pPr>
       <w:r>
         <w:t xml:space="preserve">Horizontal orientation available.</w:t>
       </w:r>
     </w:p>
-    <w:bookmarkEnd w:id="108"/>
-    <w:bookmarkStart w:id="109" w:name="violin"/>
+    <w:bookmarkEnd w:id="41"/>
+    <w:bookmarkStart w:id="42" w:name="violin"/>
     <w:p>
       <w:pPr>
         <w:pStyle w:val="Heading3"/>
@@ -3192,7 +3619,7 @@
         <w:pStyle w:val="Compact"/>
         <w:numPr>
           <w:ilvl w:val="0"/>
-          <w:numId w:val="1024"/>
+          <w:numId w:val="1025"/>
         </w:numPr>
       </w:pPr>
       <w:r>
@@ -3204,7 +3631,7 @@
         <w:pStyle w:val="Compact"/>
         <w:numPr>
           <w:ilvl w:val="0"/>
-          <w:numId w:val="1024"/>
+          <w:numId w:val="1025"/>
         </w:numPr>
       </w:pPr>
       <w:r>
@@ -3216,15 +3643,15 @@
         <w:pStyle w:val="Compact"/>
         <w:numPr>
           <w:ilvl w:val="0"/>
-          <w:numId w:val="1024"/>
+          <w:numId w:val="1025"/>
         </w:numPr>
       </w:pPr>
       <w:r>
         <w:t xml:space="preserve">Horizontal orientation available.</w:t>
       </w:r>
     </w:p>
-    <w:bookmarkEnd w:id="109"/>
-    <w:bookmarkStart w:id="110" w:name="stacked"/>
+    <w:bookmarkEnd w:id="42"/>
+    <w:bookmarkStart w:id="43" w:name="stacked"/>
     <w:p>
       <w:pPr>
         <w:pStyle w:val="Heading3"/>
@@ -3238,7 +3665,7 @@
         <w:pStyle w:val="Compact"/>
         <w:numPr>
           <w:ilvl w:val="0"/>
-          <w:numId w:val="1025"/>
+          <w:numId w:val="1026"/>
         </w:numPr>
       </w:pPr>
       <w:r>
@@ -3250,7 +3677,7 @@
         <w:pStyle w:val="Compact"/>
         <w:numPr>
           <w:ilvl w:val="0"/>
-          <w:numId w:val="1025"/>
+          <w:numId w:val="1026"/>
         </w:numPr>
       </w:pPr>
       <w:r>
@@ -3262,7 +3689,7 @@
         <w:pStyle w:val="Compact"/>
         <w:numPr>
           <w:ilvl w:val="0"/>
-          <w:numId w:val="1025"/>
+          <w:numId w:val="1026"/>
         </w:numPr>
       </w:pPr>
       <w:r>
@@ -3301,7 +3728,7 @@
         <w:pStyle w:val="Compact"/>
         <w:numPr>
           <w:ilvl w:val="0"/>
-          <w:numId w:val="1025"/>
+          <w:numId w:val="1026"/>
         </w:numPr>
       </w:pPr>
       <w:r>
@@ -3328,7 +3755,7 @@
         <w:pStyle w:val="Compact"/>
         <w:numPr>
           <w:ilvl w:val="0"/>
-          <w:numId w:val="1025"/>
+          <w:numId w:val="1026"/>
         </w:numPr>
       </w:pPr>
       <w:r>
@@ -3340,15 +3767,15 @@
         <w:pStyle w:val="Compact"/>
         <w:numPr>
           <w:ilvl w:val="0"/>
-          <w:numId w:val="1025"/>
+          <w:numId w:val="1026"/>
         </w:numPr>
       </w:pPr>
       <w:r>
         <w:t xml:space="preserve">Horizontal orientation available; legends, text styles, error bars, and significance labels are preserved when the plot is flipped.</w:t>
       </w:r>
     </w:p>
-    <w:bookmarkEnd w:id="110"/>
-    <w:bookmarkStart w:id="111" w:name="correlation"/>
+    <w:bookmarkEnd w:id="43"/>
+    <w:bookmarkStart w:id="44" w:name="correlation"/>
     <w:p>
       <w:pPr>
         <w:pStyle w:val="Heading3"/>
@@ -3362,7 +3789,7 @@
         <w:pStyle w:val="Compact"/>
         <w:numPr>
           <w:ilvl w:val="0"/>
-          <w:numId w:val="1026"/>
+          <w:numId w:val="1027"/>
         </w:numPr>
       </w:pPr>
       <w:r>
@@ -3374,7 +3801,7 @@
         <w:pStyle w:val="Compact"/>
         <w:numPr>
           <w:ilvl w:val="0"/>
-          <w:numId w:val="1026"/>
+          <w:numId w:val="1027"/>
         </w:numPr>
       </w:pPr>
       <w:r>
@@ -3386,7 +3813,7 @@
         <w:pStyle w:val="Compact"/>
         <w:numPr>
           <w:ilvl w:val="0"/>
-          <w:numId w:val="1026"/>
+          <w:numId w:val="1027"/>
         </w:numPr>
       </w:pPr>
       <w:r>
@@ -3434,15 +3861,15 @@
         <w:pStyle w:val="Compact"/>
         <w:numPr>
           <w:ilvl w:val="0"/>
-          <w:numId w:val="1026"/>
+          <w:numId w:val="1027"/>
         </w:numPr>
       </w:pPr>
       <w:r>
         <w:t xml:space="preserve">Advanced panel supports one-vs-all style screening and Excel export.</w:t>
       </w:r>
     </w:p>
-    <w:bookmarkEnd w:id="111"/>
-    <w:bookmarkStart w:id="112" w:name="heatmap"/>
+    <w:bookmarkEnd w:id="44"/>
+    <w:bookmarkStart w:id="45" w:name="heatmap"/>
     <w:p>
       <w:pPr>
         <w:pStyle w:val="Heading3"/>
@@ -3456,7 +3883,7 @@
         <w:pStyle w:val="Compact"/>
         <w:numPr>
           <w:ilvl w:val="0"/>
-          <w:numId w:val="1027"/>
+          <w:numId w:val="1028"/>
         </w:numPr>
       </w:pPr>
       <w:r>
@@ -3468,7 +3895,7 @@
         <w:pStyle w:val="Compact"/>
         <w:numPr>
           <w:ilvl w:val="0"/>
-          <w:numId w:val="1027"/>
+          <w:numId w:val="1028"/>
         </w:numPr>
       </w:pPr>
       <w:r>
@@ -3480,7 +3907,7 @@
         <w:pStyle w:val="Compact"/>
         <w:numPr>
           <w:ilvl w:val="0"/>
-          <w:numId w:val="1027"/>
+          <w:numId w:val="1028"/>
         </w:numPr>
       </w:pPr>
       <w:r>
@@ -3492,15 +3919,15 @@
         <w:pStyle w:val="Compact"/>
         <w:numPr>
           <w:ilvl w:val="0"/>
-          <w:numId w:val="1027"/>
+          <w:numId w:val="1028"/>
         </w:numPr>
       </w:pPr>
       <w:r>
         <w:t xml:space="preserve">Optional in-cell value labels.</w:t>
       </w:r>
     </w:p>
-    <w:bookmarkEnd w:id="112"/>
-    <w:bookmarkStart w:id="113" w:name="correlation-matrix"/>
+    <w:bookmarkEnd w:id="45"/>
+    <w:bookmarkStart w:id="46" w:name="correlation-matrix"/>
     <w:p>
       <w:pPr>
         <w:pStyle w:val="Heading3"/>
@@ -3514,7 +3941,7 @@
         <w:pStyle w:val="Compact"/>
         <w:numPr>
           <w:ilvl w:val="0"/>
-          <w:numId w:val="1028"/>
+          <w:numId w:val="1029"/>
         </w:numPr>
       </w:pPr>
       <w:r>
@@ -3526,7 +3953,7 @@
         <w:pStyle w:val="Compact"/>
         <w:numPr>
           <w:ilvl w:val="0"/>
-          <w:numId w:val="1028"/>
+          <w:numId w:val="1029"/>
         </w:numPr>
       </w:pPr>
       <w:r>
@@ -3538,15 +3965,15 @@
         <w:pStyle w:val="Compact"/>
         <w:numPr>
           <w:ilvl w:val="0"/>
-          <w:numId w:val="1028"/>
+          <w:numId w:val="1029"/>
         </w:numPr>
       </w:pPr>
       <w:r>
         <w:t xml:space="preserve">Optional significant labels only.</w:t>
       </w:r>
     </w:p>
-    <w:bookmarkEnd w:id="113"/>
-    <w:bookmarkStart w:id="114" w:name="curves"/>
+    <w:bookmarkEnd w:id="46"/>
+    <w:bookmarkStart w:id="47" w:name="curves"/>
     <w:p>
       <w:pPr>
         <w:pStyle w:val="Heading3"/>
@@ -3560,19 +3987,19 @@
         <w:pStyle w:val="Compact"/>
         <w:numPr>
           <w:ilvl w:val="0"/>
-          <w:numId w:val="1029"/>
-        </w:numPr>
-      </w:pPr>
-      <w:r>
-        <w:t xml:space="preserve">Configure axes, labels, line width.</w:t>
-      </w:r>
-    </w:p>
-    <w:p>
-      <w:pPr>
-        <w:pStyle w:val="Compact"/>
-        <w:numPr>
-          <w:ilvl w:val="0"/>
-          <w:numId w:val="1029"/>
+          <w:numId w:val="1030"/>
+        </w:numPr>
+      </w:pPr>
+      <w:r>
+        <w:t xml:space="preserve">Configure axes, labels, line width, and curve point size.</w:t>
+      </w:r>
+    </w:p>
+    <w:p>
+      <w:pPr>
+        <w:pStyle w:val="Compact"/>
+        <w:numPr>
+          <w:ilvl w:val="0"/>
+          <w:numId w:val="1030"/>
         </w:numPr>
       </w:pPr>
       <w:r>
@@ -3584,23 +4011,13 @@
         <w:pStyle w:val="Compact"/>
         <w:numPr>
           <w:ilvl w:val="0"/>
-          <w:numId w:val="1029"/>
+          <w:numId w:val="1030"/>
         </w:numPr>
       </w:pPr>
       <w:r>
         <w:t xml:space="preserve">Optional raw replicate trajectories.</w:t>
       </w:r>
     </w:p>
-    <w:bookmarkEnd w:id="114"/>
-    <w:bookmarkStart w:id="118" w:name="shared-plot-appearance-controls"/>
-    <w:p>
-      <w:pPr>
-        <w:pStyle w:val="Heading3"/>
-      </w:pPr>
-      <w:r>
-        <w:t xml:space="preserve">Shared plot appearance controls</w:t>
-      </w:r>
-    </w:p>
     <w:p>
       <w:pPr>
         <w:pStyle w:val="Compact"/>
@@ -3609,90 +4026,40 @@
           <w:numId w:val="1030"/>
         </w:numPr>
       </w:pPr>
-      <w:r>
-        <w:t xml:space="preserve">The</w:t>
-      </w:r>
-      <w:r>
-        <w:t xml:space="preserve"> </w:t>
-      </w:r>
       <w:r>
         <w:rPr>
           <w:b/>
           <w:bCs/>
         </w:rPr>
-        <w:t xml:space="preserve">Error bar statistic</w:t>
-      </w:r>
-      <w:r>
-        <w:t xml:space="preserve"> </w:t>
-      </w:r>
-      <w:r>
-        <w:t xml:space="preserve">selector controls deviation bars where available:</w:t>
-      </w:r>
-    </w:p>
-    <w:p>
-      <w:pPr>
-        <w:pStyle w:val="Compact"/>
-        <w:numPr>
-          <w:ilvl w:val="1"/>
+        <w:t xml:space="preserve">Curve point size</w:t>
+      </w:r>
+      <w:r>
+        <w:t xml:space="preserve"> </w:t>
+      </w:r>
+      <w:r>
+        <w:t xml:space="preserve">controls the visible markers when the line-and-points geometry is selected. It changes marker size only; curve values, line geometry, and statistical results are not altered.</w:t>
+      </w:r>
+    </w:p>
+    <w:bookmarkEnd w:id="47"/>
+    <w:bookmarkStart w:id="51" w:name="shared-plot-appearance-controls"/>
+    <w:p>
+      <w:pPr>
+        <w:pStyle w:val="Heading3"/>
+      </w:pPr>
+      <w:r>
+        <w:t xml:space="preserve">Shared plot appearance controls</w:t>
+      </w:r>
+    </w:p>
+    <w:p>
+      <w:pPr>
+        <w:pStyle w:val="Compact"/>
+        <w:numPr>
+          <w:ilvl w:val="0"/>
           <w:numId w:val="1031"/>
         </w:numPr>
       </w:pPr>
       <w:r>
-        <w:rPr>
-          <w:rStyle w:val="VerbatimChar"/>
-        </w:rPr>
-        <w:t xml:space="preserve">SD</w:t>
-      </w:r>
-      <w:r>
-        <w:t xml:space="preserve">: mean +/- standard deviation.</w:t>
-      </w:r>
-    </w:p>
-    <w:p>
-      <w:pPr>
-        <w:pStyle w:val="Compact"/>
-        <w:numPr>
-          <w:ilvl w:val="1"/>
-          <w:numId w:val="1031"/>
-        </w:numPr>
-      </w:pPr>
-      <w:r>
-        <w:rPr>
-          <w:rStyle w:val="VerbatimChar"/>
-        </w:rPr>
-        <w:t xml:space="preserve">SEM</w:t>
-      </w:r>
-      <w:r>
-        <w:t xml:space="preserve">: mean +/- standard error.</w:t>
-      </w:r>
-    </w:p>
-    <w:p>
-      <w:pPr>
-        <w:pStyle w:val="Compact"/>
-        <w:numPr>
-          <w:ilvl w:val="1"/>
-          <w:numId w:val="1031"/>
-        </w:numPr>
-      </w:pPr>
-      <w:r>
-        <w:rPr>
-          <w:rStyle w:val="VerbatimChar"/>
-        </w:rPr>
-        <w:t xml:space="preserve">Min-Max</w:t>
-      </w:r>
-      <w:r>
-        <w:t xml:space="preserve">: observed minimum to maximum; available only for Boxplot.</w:t>
-      </w:r>
-    </w:p>
-    <w:p>
-      <w:pPr>
-        <w:pStyle w:val="Compact"/>
-        <w:numPr>
-          <w:ilvl w:val="0"/>
-          <w:numId w:val="1030"/>
-        </w:numPr>
-      </w:pPr>
-      <w:r>
-        <w:t xml:space="preserve">The collapsible</w:t>
+        <w:t xml:space="preserve">The</w:t>
       </w:r>
       <w:r>
         <w:t xml:space="preserve"> </w:t>
@@ -3702,28 +4069,110 @@
           <w:b/>
           <w:bCs/>
         </w:rPr>
-        <w:t xml:space="preserve">Text styling</w:t>
-      </w:r>
-      <w:r>
-        <w:t xml:space="preserve"> </w:t>
-      </w:r>
-      <w:r>
-        <w:t xml:space="preserve">section is available for individual plots.</w:t>
-      </w:r>
-    </w:p>
-    <w:p>
-      <w:pPr>
-        <w:pStyle w:val="Compact"/>
-        <w:numPr>
-          <w:ilvl w:val="0"/>
-          <w:numId w:val="1030"/>
-        </w:numPr>
-      </w:pPr>
+        <w:t xml:space="preserve">Error bar statistic</w:t>
+      </w:r>
+      <w:r>
+        <w:t xml:space="preserve"> </w:t>
+      </w:r>
+      <w:r>
+        <w:t xml:space="preserve">selector controls deviation bars where available:</w:t>
+      </w:r>
+    </w:p>
+    <w:p>
+      <w:pPr>
+        <w:pStyle w:val="Compact"/>
+        <w:numPr>
+          <w:ilvl w:val="1"/>
+          <w:numId w:val="1032"/>
+        </w:numPr>
+      </w:pPr>
+      <w:r>
+        <w:rPr>
+          <w:rStyle w:val="VerbatimChar"/>
+        </w:rPr>
+        <w:t xml:space="preserve">SD</w:t>
+      </w:r>
+      <w:r>
+        <w:t xml:space="preserve">: mean +/- standard deviation.</w:t>
+      </w:r>
+    </w:p>
+    <w:p>
+      <w:pPr>
+        <w:pStyle w:val="Compact"/>
+        <w:numPr>
+          <w:ilvl w:val="1"/>
+          <w:numId w:val="1032"/>
+        </w:numPr>
+      </w:pPr>
+      <w:r>
+        <w:rPr>
+          <w:rStyle w:val="VerbatimChar"/>
+        </w:rPr>
+        <w:t xml:space="preserve">SEM</w:t>
+      </w:r>
+      <w:r>
+        <w:t xml:space="preserve">: mean +/- standard error.</w:t>
+      </w:r>
+    </w:p>
+    <w:p>
+      <w:pPr>
+        <w:pStyle w:val="Compact"/>
+        <w:numPr>
+          <w:ilvl w:val="1"/>
+          <w:numId w:val="1032"/>
+        </w:numPr>
+      </w:pPr>
+      <w:r>
+        <w:rPr>
+          <w:rStyle w:val="VerbatimChar"/>
+        </w:rPr>
+        <w:t xml:space="preserve">Min-Max</w:t>
+      </w:r>
+      <w:r>
+        <w:t xml:space="preserve">: observed minimum to maximum; available only for Boxplot.</w:t>
+      </w:r>
+    </w:p>
+    <w:p>
+      <w:pPr>
+        <w:pStyle w:val="Compact"/>
+        <w:numPr>
+          <w:ilvl w:val="0"/>
+          <w:numId w:val="1031"/>
+        </w:numPr>
+      </w:pPr>
+      <w:r>
+        <w:t xml:space="preserve">The collapsible</w:t>
+      </w:r>
+      <w:r>
+        <w:t xml:space="preserve"> </w:t>
+      </w:r>
       <w:r>
         <w:rPr>
           <w:b/>
           <w:bCs/>
         </w:rPr>
+        <w:t xml:space="preserve">Text styling</w:t>
+      </w:r>
+      <w:r>
+        <w:t xml:space="preserve"> </w:t>
+      </w:r>
+      <w:r>
+        <w:t xml:space="preserve">section is available for individual plots.</w:t>
+      </w:r>
+    </w:p>
+    <w:p>
+      <w:pPr>
+        <w:pStyle w:val="Compact"/>
+        <w:numPr>
+          <w:ilvl w:val="0"/>
+          <w:numId w:val="1031"/>
+        </w:numPr>
+      </w:pPr>
+      <w:r>
+        <w:rPr>
+          <w:b/>
+          <w:bCs/>
+        </w:rPr>
         <w:t xml:space="preserve">Font family</w:t>
       </w:r>
       <w:r>
@@ -3738,7 +4187,7 @@
         <w:pStyle w:val="Compact"/>
         <w:numPr>
           <w:ilvl w:val="0"/>
-          <w:numId w:val="1030"/>
+          <w:numId w:val="1031"/>
         </w:numPr>
       </w:pPr>
       <w:r>
@@ -3750,7 +4199,7 @@
         <w:pStyle w:val="Compact"/>
         <w:numPr>
           <w:ilvl w:val="0"/>
-          <w:numId w:val="1030"/>
+          <w:numId w:val="1031"/>
         </w:numPr>
       </w:pPr>
       <w:r>
@@ -3762,7 +4211,7 @@
         <w:pStyle w:val="Compact"/>
         <w:numPr>
           <w:ilvl w:val="0"/>
-          <w:numId w:val="1030"/>
+          <w:numId w:val="1031"/>
         </w:numPr>
       </w:pPr>
       <w:r>
@@ -3774,7 +4223,7 @@
         <w:pStyle w:val="Compact"/>
         <w:numPr>
           <w:ilvl w:val="0"/>
-          <w:numId w:val="1030"/>
+          <w:numId w:val="1031"/>
         </w:numPr>
       </w:pPr>
       <w:r>
@@ -3786,7 +4235,7 @@
         <w:pStyle w:val="Compact"/>
         <w:numPr>
           <w:ilvl w:val="0"/>
-          <w:numId w:val="1030"/>
+          <w:numId w:val="1031"/>
         </w:numPr>
       </w:pPr>
       <w:r>
@@ -3804,7 +4253,7 @@
         <w:pStyle w:val="Compact"/>
         <w:numPr>
           <w:ilvl w:val="0"/>
-          <w:numId w:val="1030"/>
+          <w:numId w:val="1031"/>
         </w:numPr>
       </w:pPr>
       <w:r>
@@ -3850,18 +4299,18 @@
           <wp:inline>
             <wp:extent cx="3185962" cy="5014762"/>
             <wp:effectExtent b="0" l="0" r="0" t="0"/>
-            <wp:docPr descr="Text styling controls" title="" id="116" name="Picture"/>
+            <wp:docPr descr="Text styling controls" title="" id="49" name="Picture"/>
             <a:graphic>
               <a:graphicData uri="http://schemas.openxmlformats.org/drawingml/2006/picture">
                 <pic:pic>
                   <pic:nvPicPr>
-                    <pic:cNvPr descr="manual_images/11_text_styling_controls.png" id="117" name="Picture"/>
+                    <pic:cNvPr descr="manual_images/11_text_styling_controls.png" id="50" name="Picture"/>
                     <pic:cNvPicPr>
                       <a:picLocks noChangeArrowheads="1" noChangeAspect="1"/>
                     </pic:cNvPicPr>
                   </pic:nvPicPr>
                   <pic:blipFill>
-                    <a:blip r:embed="rId115"/>
+                    <a:blip r:embed="rId48"/>
                     <a:stretch>
                       <a:fillRect/>
                     </a:stretch>
@@ -3888,8 +4337,8 @@
         </w:drawing>
       </w:r>
     </w:p>
-    <w:bookmarkEnd w:id="118"/>
-    <w:bookmarkStart w:id="123" w:name="composition-panel"/>
+    <w:bookmarkEnd w:id="51"/>
+    <w:bookmarkStart w:id="56" w:name="composition-panel"/>
     <w:p>
       <w:pPr>
         <w:pStyle w:val="Heading3"/>
@@ -3911,7 +4360,7 @@
         <w:pStyle w:val="Compact"/>
         <w:numPr>
           <w:ilvl w:val="0"/>
-          <w:numId w:val="1032"/>
+          <w:numId w:val="1033"/>
         </w:numPr>
       </w:pPr>
       <w:r>
@@ -3936,7 +4385,7 @@
         <w:pStyle w:val="Compact"/>
         <w:numPr>
           <w:ilvl w:val="0"/>
-          <w:numId w:val="1032"/>
+          <w:numId w:val="1033"/>
         </w:numPr>
       </w:pPr>
       <w:r>
@@ -3964,7 +4413,7 @@
         <w:pStyle w:val="Compact"/>
         <w:numPr>
           <w:ilvl w:val="0"/>
-          <w:numId w:val="1032"/>
+          <w:numId w:val="1033"/>
         </w:numPr>
       </w:pPr>
       <w:r>
@@ -3976,7 +4425,7 @@
         <w:pStyle w:val="Compact"/>
         <w:numPr>
           <w:ilvl w:val="0"/>
-          <w:numId w:val="1032"/>
+          <w:numId w:val="1033"/>
         </w:numPr>
       </w:pPr>
       <w:r>
@@ -3988,7 +4437,7 @@
         <w:pStyle w:val="Compact"/>
         <w:numPr>
           <w:ilvl w:val="0"/>
-          <w:numId w:val="1032"/>
+          <w:numId w:val="1033"/>
         </w:numPr>
       </w:pPr>
       <w:r>
@@ -4016,7 +4465,7 @@
         <w:pStyle w:val="Compact"/>
         <w:numPr>
           <w:ilvl w:val="0"/>
-          <w:numId w:val="1032"/>
+          <w:numId w:val="1033"/>
         </w:numPr>
       </w:pPr>
       <w:r>
@@ -4049,7 +4498,7 @@
         <w:pStyle w:val="Compact"/>
         <w:numPr>
           <w:ilvl w:val="0"/>
-          <w:numId w:val="1032"/>
+          <w:numId w:val="1033"/>
         </w:numPr>
       </w:pPr>
       <w:r>
@@ -4092,7 +4541,7 @@
         <w:t xml:space="preserve">, or composition metadata.</w:t>
       </w:r>
     </w:p>
-    <w:bookmarkStart w:id="122" w:name="dpi-and-physical-dimensions"/>
+    <w:bookmarkStart w:id="55" w:name="dpi-and-physical-dimensions"/>
     <w:p>
       <w:pPr>
         <w:pStyle w:val="Heading4"/>
@@ -4106,7 +4555,7 @@
         <w:pStyle w:val="Compact"/>
         <w:numPr>
           <w:ilvl w:val="0"/>
-          <w:numId w:val="1033"/>
+          <w:numId w:val="1034"/>
         </w:numPr>
       </w:pPr>
       <w:r>
@@ -4144,7 +4593,7 @@
         <w:pStyle w:val="Compact"/>
         <w:numPr>
           <w:ilvl w:val="0"/>
-          <w:numId w:val="1033"/>
+          <w:numId w:val="1034"/>
         </w:numPr>
       </w:pPr>
       <w:r>
@@ -4168,7 +4617,7 @@
         <w:pStyle w:val="Compact"/>
         <w:numPr>
           <w:ilvl w:val="0"/>
-          <w:numId w:val="1033"/>
+          <w:numId w:val="1034"/>
         </w:numPr>
       </w:pPr>
       <w:r>
@@ -4204,7 +4653,7 @@
         <w:pStyle w:val="Compact"/>
         <w:numPr>
           <w:ilvl w:val="0"/>
-          <w:numId w:val="1033"/>
+          <w:numId w:val="1034"/>
         </w:numPr>
       </w:pPr>
       <w:r>
@@ -4216,7 +4665,7 @@
         <w:pStyle w:val="Compact"/>
         <w:numPr>
           <w:ilvl w:val="0"/>
-          <w:numId w:val="1033"/>
+          <w:numId w:val="1034"/>
         </w:numPr>
       </w:pPr>
       <w:r>
@@ -4228,7 +4677,7 @@
         <w:pStyle w:val="Compact"/>
         <w:numPr>
           <w:ilvl w:val="0"/>
-          <w:numId w:val="1033"/>
+          <w:numId w:val="1034"/>
         </w:numPr>
       </w:pPr>
       <w:r>
@@ -4240,7 +4689,7 @@
         <w:pStyle w:val="Compact"/>
         <w:numPr>
           <w:ilvl w:val="0"/>
-          <w:numId w:val="1033"/>
+          <w:numId w:val="1034"/>
         </w:numPr>
       </w:pPr>
       <w:r>
@@ -4288,18 +4737,18 @@
           <wp:inline>
             <wp:extent cx="5334000" cy="2115879"/>
             <wp:effectExtent b="0" l="0" r="0" t="0"/>
-            <wp:docPr descr="Significance and annotation setup" title="" id="120" name="Picture"/>
+            <wp:docPr descr="Significance and annotation setup" title="" id="53" name="Picture"/>
             <a:graphic>
               <a:graphicData uri="http://schemas.openxmlformats.org/drawingml/2006/picture">
                 <pic:pic>
                   <pic:nvPicPr>
-                    <pic:cNvPr descr="manual_images/10_significance_annotations.png" id="121" name="Picture"/>
+                    <pic:cNvPr descr="manual_images/10_significance_annotations.png" id="54" name="Picture"/>
                     <pic:cNvPicPr>
                       <a:picLocks noChangeArrowheads="1" noChangeAspect="1"/>
                     </pic:cNvPicPr>
                   </pic:nvPicPr>
                   <pic:blipFill>
-                    <a:blip r:embed="rId119"/>
+                    <a:blip r:embed="rId52"/>
                     <a:stretch>
                       <a:fillRect/>
                     </a:stretch>
@@ -4326,10 +4775,10 @@
         </w:drawing>
       </w:r>
     </w:p>
-    <w:bookmarkEnd w:id="122"/>
-    <w:bookmarkEnd w:id="123"/>
-    <w:bookmarkEnd w:id="124"/>
-    <w:bookmarkStart w:id="125" w:name="X115a55130e2baabc52a19ceae26040e6a759372"/>
+    <w:bookmarkEnd w:id="55"/>
+    <w:bookmarkEnd w:id="56"/>
+    <w:bookmarkEnd w:id="57"/>
+    <w:bookmarkStart w:id="58" w:name="X115a55130e2baabc52a19ceae26040e6a759372"/>
     <w:p>
       <w:pPr>
         <w:pStyle w:val="Heading2"/>
@@ -4367,7 +4816,7 @@
         <w:pStyle w:val="Compact"/>
         <w:numPr>
           <w:ilvl w:val="0"/>
-          <w:numId w:val="1034"/>
+          <w:numId w:val="1035"/>
         </w:numPr>
       </w:pPr>
       <w:r>
@@ -4394,7 +4843,7 @@
         <w:pStyle w:val="Compact"/>
         <w:numPr>
           <w:ilvl w:val="0"/>
-          <w:numId w:val="1034"/>
+          <w:numId w:val="1035"/>
         </w:numPr>
       </w:pPr>
       <w:r>
@@ -4439,15 +4888,15 @@
         <w:pStyle w:val="Compact"/>
         <w:numPr>
           <w:ilvl w:val="0"/>
-          <w:numId w:val="1034"/>
+          <w:numId w:val="1035"/>
         </w:numPr>
       </w:pPr>
       <w:r>
         <w:t xml:space="preserve">Fallback logic is applied when strict control pairing is not available.</w:t>
       </w:r>
     </w:p>
-    <w:bookmarkEnd w:id="125"/>
-    <w:bookmarkStart w:id="127" w:name="X00c7035554882fbb638d8b5cc72953fcde99525"/>
+    <w:bookmarkEnd w:id="58"/>
+    <w:bookmarkStart w:id="60" w:name="X00c7035554882fbb638d8b5cc72953fcde99525"/>
     <w:p>
       <w:pPr>
         <w:pStyle w:val="Heading2"/>
@@ -4456,7 +4905,7 @@
         <w:t xml:space="preserve">8. Statistics</w:t>
       </w:r>
     </w:p>
-    <w:bookmarkStart w:id="126" w:name="main-statistical-tools"/>
+    <w:bookmarkStart w:id="59" w:name="main-statistical-tools"/>
     <w:p>
       <w:pPr>
         <w:pStyle w:val="Heading3"/>
@@ -4470,7 +4919,7 @@
         <w:pStyle w:val="Compact"/>
         <w:numPr>
           <w:ilvl w:val="0"/>
-          <w:numId w:val="1035"/>
+          <w:numId w:val="1036"/>
         </w:numPr>
       </w:pPr>
       <w:r>
@@ -4491,7 +4940,7 @@
         <w:pStyle w:val="Compact"/>
         <w:numPr>
           <w:ilvl w:val="0"/>
-          <w:numId w:val="1035"/>
+          <w:numId w:val="1036"/>
         </w:numPr>
       </w:pPr>
       <w:r>
@@ -4512,7 +4961,7 @@
         <w:pStyle w:val="Compact"/>
         <w:numPr>
           <w:ilvl w:val="0"/>
-          <w:numId w:val="1035"/>
+          <w:numId w:val="1036"/>
         </w:numPr>
       </w:pPr>
       <w:r>
@@ -4533,7 +4982,7 @@
         <w:pStyle w:val="Compact"/>
         <w:numPr>
           <w:ilvl w:val="0"/>
-          <w:numId w:val="1035"/>
+          <w:numId w:val="1036"/>
         </w:numPr>
       </w:pPr>
       <w:r>
@@ -4554,7 +5003,7 @@
         <w:pStyle w:val="Compact"/>
         <w:numPr>
           <w:ilvl w:val="0"/>
-          <w:numId w:val="1035"/>
+          <w:numId w:val="1036"/>
         </w:numPr>
       </w:pPr>
       <w:r>
@@ -4575,7 +5024,7 @@
         <w:pStyle w:val="Compact"/>
         <w:numPr>
           <w:ilvl w:val="0"/>
-          <w:numId w:val="1035"/>
+          <w:numId w:val="1036"/>
         </w:numPr>
       </w:pPr>
       <w:r>
@@ -4608,7 +5057,7 @@
         <w:pStyle w:val="Compact"/>
         <w:numPr>
           <w:ilvl w:val="0"/>
-          <w:numId w:val="1035"/>
+          <w:numId w:val="1036"/>
         </w:numPr>
       </w:pPr>
       <w:r>
@@ -4629,7 +5078,7 @@
         <w:pStyle w:val="Compact"/>
         <w:numPr>
           <w:ilvl w:val="0"/>
-          <w:numId w:val="1035"/>
+          <w:numId w:val="1036"/>
         </w:numPr>
       </w:pPr>
       <w:r>
@@ -4658,7 +5107,7 @@
         <w:pStyle w:val="Compact"/>
         <w:numPr>
           <w:ilvl w:val="0"/>
-          <w:numId w:val="1036"/>
+          <w:numId w:val="1037"/>
         </w:numPr>
       </w:pPr>
       <w:r>
@@ -4679,7 +5128,7 @@
         <w:pStyle w:val="Compact"/>
         <w:numPr>
           <w:ilvl w:val="0"/>
-          <w:numId w:val="1036"/>
+          <w:numId w:val="1037"/>
         </w:numPr>
       </w:pPr>
       <w:r>
@@ -4700,7 +5149,7 @@
         <w:pStyle w:val="Compact"/>
         <w:numPr>
           <w:ilvl w:val="0"/>
-          <w:numId w:val="1036"/>
+          <w:numId w:val="1037"/>
         </w:numPr>
       </w:pPr>
       <w:r>
@@ -4721,7 +5170,7 @@
         <w:pStyle w:val="Compact"/>
         <w:numPr>
           <w:ilvl w:val="0"/>
-          <w:numId w:val="1036"/>
+          <w:numId w:val="1037"/>
         </w:numPr>
       </w:pPr>
       <w:r>
@@ -4808,7 +5257,7 @@
         <w:pStyle w:val="Compact"/>
         <w:numPr>
           <w:ilvl w:val="0"/>
-          <w:numId w:val="1037"/>
+          <w:numId w:val="1038"/>
         </w:numPr>
       </w:pPr>
       <w:r>
@@ -4865,7 +5314,7 @@
         <w:pStyle w:val="Compact"/>
         <w:numPr>
           <w:ilvl w:val="0"/>
-          <w:numId w:val="1037"/>
+          <w:numId w:val="1038"/>
         </w:numPr>
       </w:pPr>
       <w:r>
@@ -4907,7 +5356,7 @@
         <w:pStyle w:val="Compact"/>
         <w:numPr>
           <w:ilvl w:val="0"/>
-          <w:numId w:val="1037"/>
+          <w:numId w:val="1038"/>
         </w:numPr>
       </w:pPr>
       <w:r>
@@ -4934,7 +5383,7 @@
         <w:pStyle w:val="Compact"/>
         <w:numPr>
           <w:ilvl w:val="0"/>
-          <w:numId w:val="1037"/>
+          <w:numId w:val="1038"/>
         </w:numPr>
       </w:pPr>
       <w:r>
@@ -5020,7 +5469,7 @@
         <w:pStyle w:val="Compact"/>
         <w:numPr>
           <w:ilvl w:val="0"/>
-          <w:numId w:val="1038"/>
+          <w:numId w:val="1039"/>
         </w:numPr>
       </w:pPr>
       <w:r>
@@ -5032,7 +5481,7 @@
         <w:pStyle w:val="Compact"/>
         <w:numPr>
           <w:ilvl w:val="0"/>
-          <w:numId w:val="1038"/>
+          <w:numId w:val="1039"/>
         </w:numPr>
       </w:pPr>
       <w:r>
@@ -5044,7 +5493,7 @@
         <w:pStyle w:val="Compact"/>
         <w:numPr>
           <w:ilvl w:val="0"/>
-          <w:numId w:val="1038"/>
+          <w:numId w:val="1039"/>
         </w:numPr>
       </w:pPr>
       <w:r>
@@ -5064,7 +5513,7 @@
         <w:pStyle w:val="Compact"/>
         <w:numPr>
           <w:ilvl w:val="0"/>
-          <w:numId w:val="1039"/>
+          <w:numId w:val="1040"/>
         </w:numPr>
       </w:pPr>
       <w:r>
@@ -5076,7 +5525,7 @@
         <w:pStyle w:val="Compact"/>
         <w:numPr>
           <w:ilvl w:val="0"/>
-          <w:numId w:val="1039"/>
+          <w:numId w:val="1040"/>
         </w:numPr>
       </w:pPr>
       <w:r>
@@ -5088,7 +5537,7 @@
         <w:pStyle w:val="Compact"/>
         <w:numPr>
           <w:ilvl w:val="0"/>
-          <w:numId w:val="1039"/>
+          <w:numId w:val="1040"/>
         </w:numPr>
       </w:pPr>
       <w:r>
@@ -5100,7 +5549,7 @@
         <w:pStyle w:val="Compact"/>
         <w:numPr>
           <w:ilvl w:val="0"/>
-          <w:numId w:val="1039"/>
+          <w:numId w:val="1040"/>
         </w:numPr>
       </w:pPr>
       <w:r>
@@ -5176,9 +5625,9 @@
         <w:t xml:space="preserve">and some non-parametric paths that require raw observations are disabled.</w:t>
       </w:r>
     </w:p>
-    <w:bookmarkEnd w:id="126"/>
-    <w:bookmarkEnd w:id="127"/>
-    <w:bookmarkStart w:id="128" w:name="X226b9a1a8acbb38ca74b8f37dcf5f8aa29b93b6"/>
+    <w:bookmarkEnd w:id="59"/>
+    <w:bookmarkEnd w:id="60"/>
+    <w:bookmarkStart w:id="61" w:name="X226b9a1a8acbb38ca74b8f37dcf5f8aa29b93b6"/>
     <w:p>
       <w:pPr>
         <w:pStyle w:val="Heading2"/>
@@ -5200,7 +5649,7 @@
         <w:pStyle w:val="Compact"/>
         <w:numPr>
           <w:ilvl w:val="0"/>
-          <w:numId w:val="1040"/>
+          <w:numId w:val="1041"/>
         </w:numPr>
       </w:pPr>
       <w:r>
@@ -5212,7 +5661,7 @@
         <w:pStyle w:val="Compact"/>
         <w:numPr>
           <w:ilvl w:val="0"/>
-          <w:numId w:val="1040"/>
+          <w:numId w:val="1041"/>
         </w:numPr>
       </w:pPr>
       <w:r>
@@ -5269,7 +5718,7 @@
         <w:pStyle w:val="Compact"/>
         <w:numPr>
           <w:ilvl w:val="0"/>
-          <w:numId w:val="1040"/>
+          <w:numId w:val="1041"/>
         </w:numPr>
       </w:pPr>
       <w:r>
@@ -5289,7 +5738,7 @@
         <w:pStyle w:val="Compact"/>
         <w:numPr>
           <w:ilvl w:val="0"/>
-          <w:numId w:val="1041"/>
+          <w:numId w:val="1042"/>
         </w:numPr>
       </w:pPr>
       <w:r>
@@ -5301,7 +5750,7 @@
         <w:pStyle w:val="Compact"/>
         <w:numPr>
           <w:ilvl w:val="0"/>
-          <w:numId w:val="1041"/>
+          <w:numId w:val="1042"/>
         </w:numPr>
       </w:pPr>
       <w:r>
@@ -5313,7 +5762,7 @@
         <w:pStyle w:val="Compact"/>
         <w:numPr>
           <w:ilvl w:val="0"/>
-          <w:numId w:val="1041"/>
+          <w:numId w:val="1042"/>
         </w:numPr>
       </w:pPr>
       <w:r>
@@ -5349,7 +5798,7 @@
         <w:pStyle w:val="Compact"/>
         <w:numPr>
           <w:ilvl w:val="0"/>
-          <w:numId w:val="1041"/>
+          <w:numId w:val="1042"/>
         </w:numPr>
       </w:pPr>
       <w:r>
@@ -5385,7 +5834,7 @@
         <w:pStyle w:val="Compact"/>
         <w:numPr>
           <w:ilvl w:val="0"/>
-          <w:numId w:val="1041"/>
+          <w:numId w:val="1042"/>
         </w:numPr>
       </w:pPr>
       <w:r>
@@ -5416,8 +5865,8 @@
         <w:t xml:space="preserve">plots, choose the parameter before adding a label. Automatic labels keep the parameter identity and place the annotation over the selected target group for that parameter.</w:t>
       </w:r>
     </w:p>
-    <w:bookmarkEnd w:id="128"/>
-    <w:bookmarkStart w:id="134" w:name="X74088aaef10aeab96f289eb9220b0777e0698d0"/>
+    <w:bookmarkEnd w:id="61"/>
+    <w:bookmarkStart w:id="67" w:name="X74088aaef10aeab96f289eb9220b0777e0698d0"/>
     <w:p>
       <w:pPr>
         <w:pStyle w:val="Heading2"/>
@@ -5439,7 +5888,7 @@
         <w:pStyle w:val="Compact"/>
         <w:numPr>
           <w:ilvl w:val="0"/>
-          <w:numId w:val="1042"/>
+          <w:numId w:val="1043"/>
         </w:numPr>
       </w:pPr>
       <w:r>
@@ -5451,7 +5900,7 @@
         <w:pStyle w:val="Compact"/>
         <w:numPr>
           <w:ilvl w:val="0"/>
-          <w:numId w:val="1042"/>
+          <w:numId w:val="1043"/>
         </w:numPr>
       </w:pPr>
       <w:r>
@@ -5463,14 +5912,14 @@
         <w:pStyle w:val="Compact"/>
         <w:numPr>
           <w:ilvl w:val="0"/>
-          <w:numId w:val="1042"/>
+          <w:numId w:val="1043"/>
         </w:numPr>
       </w:pPr>
       <w:r>
         <w:t xml:space="preserve">Sample size and replicate coverage.</w:t>
       </w:r>
     </w:p>
-    <w:bookmarkStart w:id="129" w:name="biological-replicates"/>
+    <w:bookmarkStart w:id="62" w:name="biological-replicates"/>
     <w:p>
       <w:pPr>
         <w:pStyle w:val="Heading3"/>
@@ -5484,7 +5933,7 @@
         <w:pStyle w:val="Compact"/>
         <w:numPr>
           <w:ilvl w:val="0"/>
-          <w:numId w:val="1043"/>
+          <w:numId w:val="1044"/>
         </w:numPr>
       </w:pPr>
       <w:r>
@@ -5496,7 +5945,7 @@
         <w:pStyle w:val="Compact"/>
         <w:numPr>
           <w:ilvl w:val="0"/>
-          <w:numId w:val="1043"/>
+          <w:numId w:val="1044"/>
         </w:numPr>
       </w:pPr>
       <w:r>
@@ -5508,7 +5957,7 @@
         <w:pStyle w:val="Compact"/>
         <w:numPr>
           <w:ilvl w:val="0"/>
-          <w:numId w:val="1043"/>
+          <w:numId w:val="1044"/>
         </w:numPr>
       </w:pPr>
       <w:r>
@@ -5528,7 +5977,7 @@
         <w:pStyle w:val="Compact"/>
         <w:numPr>
           <w:ilvl w:val="0"/>
-          <w:numId w:val="1044"/>
+          <w:numId w:val="1045"/>
         </w:numPr>
       </w:pPr>
       <w:r>
@@ -5540,15 +5989,15 @@
         <w:pStyle w:val="Compact"/>
         <w:numPr>
           <w:ilvl w:val="0"/>
-          <w:numId w:val="1044"/>
+          <w:numId w:val="1045"/>
         </w:numPr>
       </w:pPr>
       <w:r>
         <w:t xml:space="preserve">Keeps lowest-score (most reproducible) replicates.</w:t>
       </w:r>
     </w:p>
-    <w:bookmarkEnd w:id="129"/>
-    <w:bookmarkStart w:id="133" w:name="technical-replicates"/>
+    <w:bookmarkEnd w:id="62"/>
+    <w:bookmarkStart w:id="66" w:name="technical-replicates"/>
     <w:p>
       <w:pPr>
         <w:pStyle w:val="Heading3"/>
@@ -5570,7 +6019,7 @@
         <w:pStyle w:val="Compact"/>
         <w:numPr>
           <w:ilvl w:val="0"/>
-          <w:numId w:val="1045"/>
+          <w:numId w:val="1046"/>
         </w:numPr>
       </w:pPr>
       <w:r>
@@ -5582,7 +6031,7 @@
         <w:pStyle w:val="Compact"/>
         <w:numPr>
           <w:ilvl w:val="0"/>
-          <w:numId w:val="1045"/>
+          <w:numId w:val="1046"/>
         </w:numPr>
       </w:pPr>
       <w:r>
@@ -5594,7 +6043,7 @@
         <w:pStyle w:val="Compact"/>
         <w:numPr>
           <w:ilvl w:val="0"/>
-          <w:numId w:val="1045"/>
+          <w:numId w:val="1046"/>
         </w:numPr>
       </w:pPr>
       <w:r>
@@ -5606,7 +6055,7 @@
         <w:pStyle w:val="Compact"/>
         <w:numPr>
           <w:ilvl w:val="0"/>
-          <w:numId w:val="1045"/>
+          <w:numId w:val="1046"/>
         </w:numPr>
       </w:pPr>
       <w:r>
@@ -5618,7 +6067,7 @@
         <w:pStyle w:val="Compact"/>
         <w:numPr>
           <w:ilvl w:val="0"/>
-          <w:numId w:val="1045"/>
+          <w:numId w:val="1046"/>
         </w:numPr>
       </w:pPr>
       <w:r>
@@ -5634,18 +6083,18 @@
           <wp:inline>
             <wp:extent cx="5334000" cy="2228174"/>
             <wp:effectExtent b="0" l="0" r="0" t="0"/>
-            <wp:docPr descr="Biological replicate filtering" title="" id="131" name="Picture"/>
+            <wp:docPr descr="Biological replicate filtering" title="" id="64" name="Picture"/>
             <a:graphic>
               <a:graphicData uri="http://schemas.openxmlformats.org/drawingml/2006/picture">
                 <pic:pic>
                   <pic:nvPicPr>
-                    <pic:cNvPr descr="manual_images/04_filter_biological_replicates.png" id="132" name="Picture"/>
+                    <pic:cNvPr descr="manual_images/04_filter_biological_replicates.png" id="65" name="Picture"/>
                     <pic:cNvPicPr>
                       <a:picLocks noChangeArrowheads="1" noChangeAspect="1"/>
                     </pic:cNvPicPr>
                   </pic:nvPicPr>
                   <pic:blipFill>
-                    <a:blip r:embed="rId130"/>
+                    <a:blip r:embed="rId63"/>
                     <a:stretch>
                       <a:fillRect/>
                     </a:stretch>
@@ -5672,9 +6121,9 @@
         </w:drawing>
       </w:r>
     </w:p>
-    <w:bookmarkEnd w:id="133"/>
-    <w:bookmarkEnd w:id="134"/>
-    <w:bookmarkStart w:id="135" w:name="X027b5303909c1c711c784491c3eab67dd715d28"/>
+    <w:bookmarkEnd w:id="66"/>
+    <w:bookmarkEnd w:id="67"/>
+    <w:bookmarkStart w:id="68" w:name="X027b5303909c1c711c784491c3eab67dd715d28"/>
     <w:p>
       <w:pPr>
         <w:pStyle w:val="Heading2"/>
@@ -5696,7 +6145,7 @@
         <w:pStyle w:val="Compact"/>
         <w:numPr>
           <w:ilvl w:val="0"/>
-          <w:numId w:val="1046"/>
+          <w:numId w:val="1047"/>
         </w:numPr>
       </w:pPr>
       <w:r>
@@ -5718,7 +6167,7 @@
         <w:pStyle w:val="Compact"/>
         <w:numPr>
           <w:ilvl w:val="0"/>
-          <w:numId w:val="1046"/>
+          <w:numId w:val="1047"/>
         </w:numPr>
       </w:pPr>
       <w:r>
@@ -5730,7 +6179,7 @@
         <w:pStyle w:val="Compact"/>
         <w:numPr>
           <w:ilvl w:val="0"/>
-          <w:numId w:val="1046"/>
+          <w:numId w:val="1047"/>
         </w:numPr>
       </w:pPr>
       <w:r>
@@ -5742,7 +6191,7 @@
         <w:pStyle w:val="Compact"/>
         <w:numPr>
           <w:ilvl w:val="0"/>
-          <w:numId w:val="1046"/>
+          <w:numId w:val="1047"/>
         </w:numPr>
       </w:pPr>
       <w:r>
@@ -5754,7 +6203,7 @@
         <w:pStyle w:val="Compact"/>
         <w:numPr>
           <w:ilvl w:val="0"/>
-          <w:numId w:val="1046"/>
+          <w:numId w:val="1047"/>
         </w:numPr>
       </w:pPr>
       <w:r>
@@ -5766,7 +6215,19 @@
         <w:pStyle w:val="Compact"/>
         <w:numPr>
           <w:ilvl w:val="0"/>
-          <w:numId w:val="1046"/>
+          <w:numId w:val="1047"/>
+        </w:numPr>
+      </w:pPr>
+      <w:r>
+        <w:t xml:space="preserve">Curve point size is stored in curve design metadata and restored when that metadata is loaded. Design metadata do not restore group/sample order, scope, or strain selection.</w:t>
+      </w:r>
+    </w:p>
+    <w:p>
+      <w:pPr>
+        <w:pStyle w:val="Compact"/>
+        <w:numPr>
+          <w:ilvl w:val="0"/>
+          <w:numId w:val="1047"/>
         </w:numPr>
       </w:pPr>
       <w:r>
@@ -5786,7 +6247,7 @@
         <w:pStyle w:val="Compact"/>
         <w:numPr>
           <w:ilvl w:val="0"/>
-          <w:numId w:val="1047"/>
+          <w:numId w:val="1048"/>
         </w:numPr>
       </w:pPr>
       <w:r>
@@ -5798,7 +6259,7 @@
         <w:pStyle w:val="Compact"/>
         <w:numPr>
           <w:ilvl w:val="0"/>
-          <w:numId w:val="1047"/>
+          <w:numId w:val="1048"/>
         </w:numPr>
       </w:pPr>
       <w:r>
@@ -5810,7 +6271,7 @@
         <w:pStyle w:val="Compact"/>
         <w:numPr>
           <w:ilvl w:val="0"/>
-          <w:numId w:val="1047"/>
+          <w:numId w:val="1048"/>
         </w:numPr>
       </w:pPr>
       <w:r>
@@ -5830,7 +6291,7 @@
         <w:pStyle w:val="Compact"/>
         <w:numPr>
           <w:ilvl w:val="0"/>
-          <w:numId w:val="1048"/>
+          <w:numId w:val="1049"/>
         </w:numPr>
       </w:pPr>
       <w:r>
@@ -5842,7 +6303,7 @@
         <w:pStyle w:val="Compact"/>
         <w:numPr>
           <w:ilvl w:val="0"/>
-          <w:numId w:val="1048"/>
+          <w:numId w:val="1049"/>
         </w:numPr>
       </w:pPr>
       <w:r>
@@ -5854,15 +6315,15 @@
         <w:pStyle w:val="Compact"/>
         <w:numPr>
           <w:ilvl w:val="0"/>
-          <w:numId w:val="1048"/>
+          <w:numId w:val="1049"/>
         </w:numPr>
       </w:pPr>
       <w:r>
         <w:t xml:space="preserve">Final builder orientation checks.</w:t>
       </w:r>
     </w:p>
-    <w:bookmarkEnd w:id="135"/>
-    <w:bookmarkStart w:id="136" w:name="Xdaccffce00e124c4dc2e12129d423a1de5e7d51"/>
+    <w:bookmarkEnd w:id="68"/>
+    <w:bookmarkStart w:id="69" w:name="Xdaccffce00e124c4dc2e12129d423a1de5e7d51"/>
     <w:p>
       <w:pPr>
         <w:pStyle w:val="Heading2"/>
@@ -5884,7 +6345,7 @@
         <w:pStyle w:val="Compact"/>
         <w:numPr>
           <w:ilvl w:val="0"/>
-          <w:numId w:val="1049"/>
+          <w:numId w:val="1050"/>
         </w:numPr>
       </w:pPr>
       <w:r>
@@ -5917,7 +6378,7 @@
         <w:pStyle w:val="Compact"/>
         <w:numPr>
           <w:ilvl w:val="0"/>
-          <w:numId w:val="1049"/>
+          <w:numId w:val="1050"/>
         </w:numPr>
       </w:pPr>
       <w:r>
@@ -5929,7 +6390,7 @@
         <w:pStyle w:val="Compact"/>
         <w:numPr>
           <w:ilvl w:val="0"/>
-          <w:numId w:val="1049"/>
+          <w:numId w:val="1050"/>
         </w:numPr>
       </w:pPr>
       <w:r>
@@ -5941,7 +6402,7 @@
         <w:pStyle w:val="Compact"/>
         <w:numPr>
           <w:ilvl w:val="0"/>
-          <w:numId w:val="1049"/>
+          <w:numId w:val="1050"/>
         </w:numPr>
       </w:pPr>
       <w:r>
@@ -5953,7 +6414,7 @@
         <w:pStyle w:val="Compact"/>
         <w:numPr>
           <w:ilvl w:val="0"/>
-          <w:numId w:val="1049"/>
+          <w:numId w:val="1050"/>
         </w:numPr>
       </w:pPr>
       <w:r>
@@ -5965,7 +6426,7 @@
         <w:pStyle w:val="Compact"/>
         <w:numPr>
           <w:ilvl w:val="0"/>
-          <w:numId w:val="1049"/>
+          <w:numId w:val="1050"/>
         </w:numPr>
       </w:pPr>
       <w:r>
@@ -5977,7 +6438,7 @@
         <w:pStyle w:val="Compact"/>
         <w:numPr>
           <w:ilvl w:val="0"/>
-          <w:numId w:val="1049"/>
+          <w:numId w:val="1050"/>
         </w:numPr>
       </w:pPr>
       <w:r>
@@ -6016,8 +6477,8 @@
         <w:t xml:space="preserve">and accept supported user values from 72 to 600 DPI. The selected effective DPI is included in metadata and bundle versions. Vector PDF/PPTX elements do not use DPI; graph width, height, and slide dimensions are configured separately.</w:t>
       </w:r>
     </w:p>
-    <w:bookmarkEnd w:id="136"/>
-    <w:bookmarkStart w:id="140" w:name="Xe593582c9f00b53676a004fd4095b4d203d92ef"/>
+    <w:bookmarkEnd w:id="69"/>
+    <w:bookmarkStart w:id="73" w:name="Xe593582c9f00b53676a004fd4095b4d203d92ef"/>
     <w:p>
       <w:pPr>
         <w:pStyle w:val="Heading2"/>
@@ -6039,7 +6500,7 @@
         <w:pStyle w:val="Compact"/>
         <w:numPr>
           <w:ilvl w:val="0"/>
-          <w:numId w:val="1050"/>
+          <w:numId w:val="1051"/>
         </w:numPr>
       </w:pPr>
       <w:r>
@@ -6075,7 +6536,7 @@
         <w:pStyle w:val="Compact"/>
         <w:numPr>
           <w:ilvl w:val="0"/>
-          <w:numId w:val="1050"/>
+          <w:numId w:val="1051"/>
         </w:numPr>
       </w:pPr>
       <w:r>
@@ -6087,7 +6548,7 @@
         <w:pStyle w:val="Compact"/>
         <w:numPr>
           <w:ilvl w:val="1"/>
-          <w:numId w:val="1051"/>
+          <w:numId w:val="1052"/>
         </w:numPr>
       </w:pPr>
       <w:r>
@@ -6111,7 +6572,7 @@
         <w:pStyle w:val="Compact"/>
         <w:numPr>
           <w:ilvl w:val="1"/>
-          <w:numId w:val="1051"/>
+          <w:numId w:val="1052"/>
         </w:numPr>
       </w:pPr>
       <w:r>
@@ -6146,7 +6607,7 @@
         <w:pStyle w:val="Compact"/>
         <w:numPr>
           <w:ilvl w:val="0"/>
-          <w:numId w:val="1052"/>
+          <w:numId w:val="1053"/>
         </w:numPr>
       </w:pPr>
       <w:r>
@@ -6164,7 +6625,7 @@
         <w:pStyle w:val="Compact"/>
         <w:numPr>
           <w:ilvl w:val="0"/>
-          <w:numId w:val="1052"/>
+          <w:numId w:val="1053"/>
         </w:numPr>
       </w:pPr>
       <w:r>
@@ -6182,7 +6643,7 @@
         <w:pStyle w:val="Compact"/>
         <w:numPr>
           <w:ilvl w:val="0"/>
-          <w:numId w:val="1052"/>
+          <w:numId w:val="1053"/>
         </w:numPr>
       </w:pPr>
       <w:r>
@@ -6209,7 +6670,7 @@
         <w:pStyle w:val="Compact"/>
         <w:numPr>
           <w:ilvl w:val="0"/>
-          <w:numId w:val="1052"/>
+          <w:numId w:val="1053"/>
         </w:numPr>
       </w:pPr>
       <w:r>
@@ -6227,7 +6688,7 @@
         <w:pStyle w:val="Compact"/>
         <w:numPr>
           <w:ilvl w:val="0"/>
-          <w:numId w:val="1052"/>
+          <w:numId w:val="1053"/>
         </w:numPr>
       </w:pPr>
       <w:r>
@@ -6245,7 +6706,7 @@
         <w:pStyle w:val="Compact"/>
         <w:numPr>
           <w:ilvl w:val="0"/>
-          <w:numId w:val="1052"/>
+          <w:numId w:val="1053"/>
         </w:numPr>
       </w:pPr>
       <w:r>
@@ -6275,7 +6736,7 @@
         <w:pStyle w:val="Compact"/>
         <w:numPr>
           <w:ilvl w:val="0"/>
-          <w:numId w:val="1052"/>
+          <w:numId w:val="1053"/>
         </w:numPr>
       </w:pPr>
       <w:r>
@@ -6293,7 +6754,7 @@
         <w:pStyle w:val="Compact"/>
         <w:numPr>
           <w:ilvl w:val="0"/>
-          <w:numId w:val="1052"/>
+          <w:numId w:val="1053"/>
         </w:numPr>
       </w:pPr>
       <w:r>
@@ -6319,7 +6780,7 @@
         <w:pStyle w:val="Compact"/>
         <w:numPr>
           <w:ilvl w:val="0"/>
-          <w:numId w:val="1053"/>
+          <w:numId w:val="1054"/>
         </w:numPr>
       </w:pPr>
       <w:r>
@@ -6331,7 +6792,7 @@
         <w:pStyle w:val="Compact"/>
         <w:numPr>
           <w:ilvl w:val="0"/>
-          <w:numId w:val="1053"/>
+          <w:numId w:val="1054"/>
         </w:numPr>
       </w:pPr>
       <w:r>
@@ -6343,7 +6804,7 @@
         <w:pStyle w:val="Compact"/>
         <w:numPr>
           <w:ilvl w:val="0"/>
-          <w:numId w:val="1053"/>
+          <w:numId w:val="1054"/>
         </w:numPr>
       </w:pPr>
       <w:r>
@@ -6355,7 +6816,7 @@
         <w:pStyle w:val="Compact"/>
         <w:numPr>
           <w:ilvl w:val="0"/>
-          <w:numId w:val="1053"/>
+          <w:numId w:val="1054"/>
         </w:numPr>
       </w:pPr>
       <w:r>
@@ -6367,7 +6828,7 @@
         <w:pStyle w:val="Compact"/>
         <w:numPr>
           <w:ilvl w:val="0"/>
-          <w:numId w:val="1053"/>
+          <w:numId w:val="1054"/>
         </w:numPr>
       </w:pPr>
       <w:r>
@@ -6387,7 +6848,7 @@
         <w:pStyle w:val="Compact"/>
         <w:numPr>
           <w:ilvl w:val="0"/>
-          <w:numId w:val="1054"/>
+          <w:numId w:val="1055"/>
         </w:numPr>
       </w:pPr>
       <w:r>
@@ -6428,7 +6889,7 @@
         <w:pStyle w:val="Compact"/>
         <w:numPr>
           <w:ilvl w:val="0"/>
-          <w:numId w:val="1054"/>
+          <w:numId w:val="1055"/>
         </w:numPr>
       </w:pPr>
       <w:r>
@@ -6456,7 +6917,7 @@
         <w:pStyle w:val="Compact"/>
         <w:numPr>
           <w:ilvl w:val="0"/>
-          <w:numId w:val="1054"/>
+          <w:numId w:val="1055"/>
         </w:numPr>
       </w:pPr>
       <w:r>
@@ -6468,7 +6929,7 @@
         <w:pStyle w:val="Compact"/>
         <w:numPr>
           <w:ilvl w:val="0"/>
-          <w:numId w:val="1054"/>
+          <w:numId w:val="1055"/>
         </w:numPr>
       </w:pPr>
       <w:r>
@@ -6526,7 +6987,7 @@
         <w:pStyle w:val="Compact"/>
         <w:numPr>
           <w:ilvl w:val="0"/>
-          <w:numId w:val="1054"/>
+          <w:numId w:val="1055"/>
         </w:numPr>
       </w:pPr>
       <w:r>
@@ -6553,7 +7014,7 @@
         <w:pStyle w:val="Compact"/>
         <w:numPr>
           <w:ilvl w:val="0"/>
-          <w:numId w:val="1054"/>
+          <w:numId w:val="1055"/>
         </w:numPr>
       </w:pPr>
       <w:r>
@@ -6565,7 +7026,7 @@
         <w:pStyle w:val="Compact"/>
         <w:numPr>
           <w:ilvl w:val="0"/>
-          <w:numId w:val="1054"/>
+          <w:numId w:val="1055"/>
         </w:numPr>
       </w:pPr>
       <w:r>
@@ -6585,24 +7046,252 @@
     <w:p>
       <w:pPr>
         <w:pStyle w:val="FirstParagraph"/>
+      </w:pPr>
+      <w:r>
+        <w:t xml:space="preserve">R command equivalent:</w:t>
+      </w:r>
+    </w:p>
+    <w:p>
+      <w:pPr>
+        <w:pStyle w:val="SourceCode"/>
+      </w:pPr>
+      <w:r>
+        <w:rPr>
+          <w:rStyle w:val="NormalTok"/>
+        </w:rPr>
+        <w:t xml:space="preserve">parameters </w:t>
+      </w:r>
+      <w:r>
+        <w:rPr>
+          <w:rStyle w:val="OtherTok"/>
+        </w:rPr>
+        <w:t xml:space="preserve">&lt;-</w:t>
+      </w:r>
+      <w:r>
+        <w:rPr>
+          <w:rStyle w:val="NormalTok"/>
+        </w:rPr>
+        <w:t xml:space="preserve"> BIOSZEN</w:t>
+      </w:r>
+      <w:r>
+        <w:rPr>
+          <w:rStyle w:val="SpecialCharTok"/>
+        </w:rPr>
+        <w:t xml:space="preserve">::</w:t>
+      </w:r>
+      <w:r>
+        <w:rPr>
+          <w:rStyle w:val="FunctionTok"/>
+        </w:rPr>
+        <w:t xml:space="preserve">growth_parameters</w:t>
+      </w:r>
+      <w:r>
+        <w:rPr>
+          <w:rStyle w:val="NormalTok"/>
+        </w:rPr>
+        <w:t xml:space="preserve">(</w:t>
+      </w:r>
+      <w:r>
+        <w:rPr>
+          <w:rStyle w:val="StringTok"/>
+        </w:rPr>
+        <w:t xml:space="preserve">"Curves.xlsx"</w:t>
+      </w:r>
+      <w:r>
+        <w:rPr>
+          <w:rStyle w:val="NormalTok"/>
+        </w:rPr>
+        <w:t xml:space="preserve">)</w:t>
+      </w:r>
+      <w:r>
+        <w:br/>
+      </w:r>
+      <w:r>
+        <w:rPr>
+          <w:rStyle w:val="NormalTok"/>
+        </w:rPr>
+        <w:t xml:space="preserve">parameters </w:t>
+      </w:r>
+      <w:r>
+        <w:rPr>
+          <w:rStyle w:val="OtherTok"/>
+        </w:rPr>
+        <w:t xml:space="preserve">&lt;-</w:t>
+      </w:r>
+      <w:r>
+        <w:rPr>
+          <w:rStyle w:val="NormalTok"/>
+        </w:rPr>
+        <w:t xml:space="preserve"> BIOSZEN</w:t>
+      </w:r>
+      <w:r>
+        <w:rPr>
+          <w:rStyle w:val="SpecialCharTok"/>
+        </w:rPr>
+        <w:t xml:space="preserve">::</w:t>
+      </w:r>
+      <w:r>
+        <w:rPr>
+          <w:rStyle w:val="FunctionTok"/>
+        </w:rPr>
+        <w:t xml:space="preserve">growth_parameters</w:t>
+      </w:r>
+      <w:r>
+        <w:rPr>
+          <w:rStyle w:val="NormalTok"/>
+        </w:rPr>
+        <w:t xml:space="preserve">(</w:t>
+      </w:r>
+      <w:r>
+        <w:br/>
+      </w:r>
+      <w:r>
+        <w:rPr>
+          <w:rStyle w:val="NormalTok"/>
+        </w:rPr>
+        <w:t xml:space="preserve">  </w:t>
+      </w:r>
+      <w:r>
+        <w:rPr>
+          <w:rStyle w:val="StringTok"/>
+        </w:rPr>
+        <w:t xml:space="preserve">"Curves.xlsx"</w:t>
+      </w:r>
+      <w:r>
+        <w:rPr>
+          <w:rStyle w:val="NormalTok"/>
+        </w:rPr>
+        <w:t xml:space="preserve">,</w:t>
+      </w:r>
+      <w:r>
+        <w:br/>
+      </w:r>
+      <w:r>
+        <w:rPr>
+          <w:rStyle w:val="NormalTok"/>
+        </w:rPr>
+        <w:t xml:space="preserve">  </w:t>
+      </w:r>
+      <w:r>
+        <w:rPr>
+          <w:rStyle w:val="AttributeTok"/>
+        </w:rPr>
+        <w:t xml:space="preserve">output_dir =</w:t>
+      </w:r>
+      <w:r>
+        <w:rPr>
+          <w:rStyle w:val="NormalTok"/>
+        </w:rPr>
+        <w:t xml:space="preserve"> </w:t>
+      </w:r>
+      <w:r>
+        <w:rPr>
+          <w:rStyle w:val="StringTok"/>
+        </w:rPr>
+        <w:t xml:space="preserve">"growth_results"</w:t>
+      </w:r>
+      <w:r>
+        <w:rPr>
+          <w:rStyle w:val="NormalTok"/>
+        </w:rPr>
+        <w:t xml:space="preserve">,</w:t>
+      </w:r>
+      <w:r>
+        <w:br/>
+      </w:r>
+      <w:r>
+        <w:rPr>
+          <w:rStyle w:val="NormalTok"/>
+        </w:rPr>
+        <w:t xml:space="preserve">  </w:t>
+      </w:r>
+      <w:r>
+        <w:rPr>
+          <w:rStyle w:val="AttributeTok"/>
+        </w:rPr>
+        <w:t xml:space="preserve">overwrite =</w:t>
+      </w:r>
+      <w:r>
+        <w:rPr>
+          <w:rStyle w:val="NormalTok"/>
+        </w:rPr>
+        <w:t xml:space="preserve"> </w:t>
+      </w:r>
+      <w:r>
+        <w:rPr>
+          <w:rStyle w:val="ConstantTok"/>
+        </w:rPr>
+        <w:t xml:space="preserve">FALSE</w:t>
+      </w:r>
+      <w:r>
+        <w:br/>
+      </w:r>
+      <w:r>
+        <w:rPr>
+          <w:rStyle w:val="NormalTok"/>
+        </w:rPr>
+        <w:t xml:space="preserve">)</w:t>
+      </w:r>
+    </w:p>
+    <w:p>
+      <w:pPr>
+        <w:pStyle w:val="FirstParagraph"/>
+      </w:pPr>
+      <w:r>
+        <w:t xml:space="preserve">The command runs the same robust detector first and uses the same permissive</w:t>
+      </w:r>
+      <w:r>
+        <w:t xml:space="preserve"> </w:t>
+      </w:r>
+      <w:r>
+        <w:t xml:space="preserve">fallback only for values the robust method could not calculate. Its returned</w:t>
+      </w:r>
+      <w:r>
+        <w:t xml:space="preserve"> </w:t>
+      </w:r>
+      <w:r>
+        <w:t xml:space="preserve">columns and numerical results match the Growth tab. Without</w:t>
+      </w:r>
+      <w:r>
+        <w:t xml:space="preserve"> </w:t>
+      </w:r>
+      <w:r>
+        <w:rPr>
+          <w:rStyle w:val="VerbatimChar"/>
+        </w:rPr>
+        <w:t xml:space="preserve">output_dir</w:t>
+      </w:r>
+      <w:r>
+        <w:t xml:space="preserve">, it</w:t>
+      </w:r>
+      <w:r>
+        <w:t xml:space="preserve"> </w:t>
+      </w:r>
+      <w:r>
+        <w:t xml:space="preserve">returns the result in R and does not create files.</w:t>
+      </w:r>
+    </w:p>
+    <w:p>
+      <w:pPr>
+        <w:pStyle w:val="BodyText"/>
       </w:pPr>
       <w:r>
         <w:drawing>
           <wp:inline>
             <wp:extent cx="5334000" cy="2011947"/>
             <wp:effectExtent b="0" l="0" r="0" t="0"/>
-            <wp:docPr descr="Growth workflow" title="" id="138" name="Picture"/>
+            <wp:docPr descr="Growth workflow" title="" id="71" name="Picture"/>
             <a:graphic>
               <a:graphicData uri="http://schemas.openxmlformats.org/drawingml/2006/picture">
                 <pic:pic>
                   <pic:nvPicPr>
-                    <pic:cNvPr descr="manual_images/13_growth_parameters_workflow.png" id="139" name="Picture"/>
+                    <pic:cNvPr descr="manual_images/13_growth_parameters_workflow.png" id="72" name="Picture"/>
                     <pic:cNvPicPr>
                       <a:picLocks noChangeArrowheads="1" noChangeAspect="1"/>
                     </pic:cNvPicPr>
                   </pic:nvPicPr>
                   <pic:blipFill>
-                    <a:blip r:embed="rId137"/>
+                    <a:blip r:embed="rId70"/>
                     <a:stretch>
                       <a:fillRect/>
                     </a:stretch>
@@ -6629,8 +7318,8 @@
         </w:drawing>
       </w:r>
     </w:p>
-    <w:bookmarkEnd w:id="140"/>
-    <w:bookmarkStart w:id="141" w:name="X412317ec57e4cfdc618c120090edd958d43de49"/>
+    <w:bookmarkEnd w:id="73"/>
+    <w:bookmarkStart w:id="74" w:name="X412317ec57e4cfdc618c120090edd958d43de49"/>
     <w:p>
       <w:pPr>
         <w:pStyle w:val="Heading2"/>
@@ -6643,7 +7332,7 @@
       <w:pPr>
         <w:numPr>
           <w:ilvl w:val="0"/>
-          <w:numId w:val="1055"/>
+          <w:numId w:val="1056"/>
         </w:numPr>
       </w:pPr>
       <w:r>
@@ -6670,7 +7359,7 @@
       <w:pPr>
         <w:numPr>
           <w:ilvl w:val="0"/>
-          <w:numId w:val="1055"/>
+          <w:numId w:val="1056"/>
         </w:numPr>
       </w:pPr>
       <w:r>
@@ -6697,7 +7386,7 @@
       <w:pPr>
         <w:numPr>
           <w:ilvl w:val="0"/>
-          <w:numId w:val="1055"/>
+          <w:numId w:val="1056"/>
         </w:numPr>
       </w:pPr>
       <w:r>
@@ -6724,7 +7413,7 @@
       <w:pPr>
         <w:numPr>
           <w:ilvl w:val="0"/>
-          <w:numId w:val="1055"/>
+          <w:numId w:val="1056"/>
         </w:numPr>
       </w:pPr>
       <w:r>
@@ -6751,7 +7440,7 @@
       <w:pPr>
         <w:numPr>
           <w:ilvl w:val="0"/>
-          <w:numId w:val="1055"/>
+          <w:numId w:val="1056"/>
         </w:numPr>
       </w:pPr>
       <w:r>
@@ -6778,7 +7467,7 @@
       <w:pPr>
         <w:numPr>
           <w:ilvl w:val="0"/>
-          <w:numId w:val="1055"/>
+          <w:numId w:val="1056"/>
         </w:numPr>
       </w:pPr>
       <w:r>
@@ -6820,7 +7509,7 @@
       <w:pPr>
         <w:numPr>
           <w:ilvl w:val="0"/>
-          <w:numId w:val="1055"/>
+          <w:numId w:val="1056"/>
         </w:numPr>
       </w:pPr>
       <w:r>
@@ -6875,7 +7564,7 @@
       <w:pPr>
         <w:numPr>
           <w:ilvl w:val="0"/>
-          <w:numId w:val="1055"/>
+          <w:numId w:val="1056"/>
         </w:numPr>
       </w:pPr>
       <w:r>
@@ -6902,7 +7591,7 @@
       <w:pPr>
         <w:numPr>
           <w:ilvl w:val="0"/>
-          <w:numId w:val="1055"/>
+          <w:numId w:val="1056"/>
         </w:numPr>
       </w:pPr>
       <w:r>
@@ -6925,8 +7614,8 @@
         <w:t xml:space="preserve">What to do: Reduce active parameters and heavy layers.</w:t>
       </w:r>
     </w:p>
-    <w:bookmarkEnd w:id="141"/>
-    <w:bookmarkStart w:id="142" w:name="Xcd58510a2561031e4603a64a38bc819a9ac6e6a"/>
+    <w:bookmarkEnd w:id="74"/>
+    <w:bookmarkStart w:id="75" w:name="Xcd58510a2561031e4603a64a38bc819a9ac6e6a"/>
     <w:p>
       <w:pPr>
         <w:pStyle w:val="Heading2"/>
@@ -6952,8 +7641,8 @@
         <w:t xml:space="preserve">bioszenf@gmail.com</w:t>
       </w:r>
     </w:p>
-    <w:bookmarkEnd w:id="142"/>
-    <w:bookmarkEnd w:id="143"/>
+    <w:bookmarkEnd w:id="75"/>
+    <w:bookmarkEnd w:id="76"/>
     <w:sectPr>
       <w:footnotePr>
         <w:numRestart w:val="eachSect"/>
@@ -7397,6 +8086,9 @@
     <w:abstractNumId w:val="991"/>
   </w:num>
   <w:num w:numId="1021">
+    <w:abstractNumId w:val="991"/>
+  </w:num>
+  <w:num w:numId="1022">
     <w:abstractNumId w:val="99411"/>
     <w:lvlOverride w:ilvl="0">
       <w:startOverride w:val="1"/>
@@ -7426,9 +8118,6 @@
       <w:startOverride w:val="1"/>
     </w:lvlOverride>
   </w:num>
-  <w:num w:numId="1022">
-    <w:abstractNumId w:val="991"/>
-  </w:num>
   <w:num w:numId="1023">
     <w:abstractNumId w:val="991"/>
   </w:num>
@@ -7457,6 +8146,9 @@
     <w:abstractNumId w:val="991"/>
   </w:num>
   <w:num w:numId="1032">
+    <w:abstractNumId w:val="991"/>
+  </w:num>
+  <w:num w:numId="1033">
     <w:abstractNumId w:val="99411"/>
     <w:lvlOverride w:ilvl="0">
       <w:startOverride w:val="1"/>
@@ -7486,9 +8178,6 @@
       <w:startOverride w:val="1"/>
     </w:lvlOverride>
   </w:num>
-  <w:num w:numId="1033">
-    <w:abstractNumId w:val="991"/>
-  </w:num>
   <w:num w:numId="1034">
     <w:abstractNumId w:val="991"/>
   </w:num>
@@ -7508,34 +8197,7 @@
     <w:abstractNumId w:val="991"/>
   </w:num>
   <w:num w:numId="1040">
-    <w:abstractNumId w:val="99411"/>
-    <w:lvlOverride w:ilvl="0">
-      <w:startOverride w:val="1"/>
-    </w:lvlOverride>
-    <w:lvlOverride w:ilvl="1">
-      <w:startOverride w:val="1"/>
-    </w:lvlOverride>
-    <w:lvlOverride w:ilvl="2">
-      <w:startOverride w:val="1"/>
-    </w:lvlOverride>
-    <w:lvlOverride w:ilvl="3">
-      <w:startOverride w:val="1"/>
-    </w:lvlOverride>
-    <w:lvlOverride w:ilvl="4">
-      <w:startOverride w:val="1"/>
-    </w:lvlOverride>
-    <w:lvlOverride w:ilvl="5">
-      <w:startOverride w:val="1"/>
-    </w:lvlOverride>
-    <w:lvlOverride w:ilvl="6">
-      <w:startOverride w:val="1"/>
-    </w:lvlOverride>
-    <w:lvlOverride w:ilvl="7">
-      <w:startOverride w:val="1"/>
-    </w:lvlOverride>
-    <w:lvlOverride w:ilvl="8">
-      <w:startOverride w:val="1"/>
-    </w:lvlOverride>
+    <w:abstractNumId w:val="991"/>
   </w:num>
   <w:num w:numId="1041">
     <w:abstractNumId w:val="99411"/>
@@ -7568,7 +8230,34 @@
     </w:lvlOverride>
   </w:num>
   <w:num w:numId="1042">
-    <w:abstractNumId w:val="991"/>
+    <w:abstractNumId w:val="99411"/>
+    <w:lvlOverride w:ilvl="0">
+      <w:startOverride w:val="1"/>
+    </w:lvlOverride>
+    <w:lvlOverride w:ilvl="1">
+      <w:startOverride w:val="1"/>
+    </w:lvlOverride>
+    <w:lvlOverride w:ilvl="2">
+      <w:startOverride w:val="1"/>
+    </w:lvlOverride>
+    <w:lvlOverride w:ilvl="3">
+      <w:startOverride w:val="1"/>
+    </w:lvlOverride>
+    <w:lvlOverride w:ilvl="4">
+      <w:startOverride w:val="1"/>
+    </w:lvlOverride>
+    <w:lvlOverride w:ilvl="5">
+      <w:startOverride w:val="1"/>
+    </w:lvlOverride>
+    <w:lvlOverride w:ilvl="6">
+      <w:startOverride w:val="1"/>
+    </w:lvlOverride>
+    <w:lvlOverride w:ilvl="7">
+      <w:startOverride w:val="1"/>
+    </w:lvlOverride>
+    <w:lvlOverride w:ilvl="8">
+      <w:startOverride w:val="1"/>
+    </w:lvlOverride>
   </w:num>
   <w:num w:numId="1043">
     <w:abstractNumId w:val="991"/>
@@ -7601,6 +8290,9 @@
     <w:abstractNumId w:val="991"/>
   </w:num>
   <w:num w:numId="1053">
+    <w:abstractNumId w:val="991"/>
+  </w:num>
+  <w:num w:numId="1054">
     <w:abstractNumId w:val="99411"/>
     <w:lvlOverride w:ilvl="0">
       <w:startOverride w:val="1"/>
@@ -7630,10 +8322,10 @@
       <w:startOverride w:val="1"/>
     </w:lvlOverride>
   </w:num>
-  <w:num w:numId="1054">
+  <w:num w:numId="1055">
     <w:abstractNumId w:val="991"/>
   </w:num>
-  <w:num w:numId="1055">
+  <w:num w:numId="1056">
     <w:abstractNumId w:val="991"/>
   </w:num>
 </w:numbering>
@@ -8295,7 +8987,7 @@
       <w:color w:themeColor="accent1" w:themeShade="BF" w:val="365F91"/>
     </w:rPr>
   </w:style>
-  <w:style w:customStyle="1" w:styleId="SourceCode" w:type="paragraph">
+  <w:style w:type="paragraph" w:customStyle="1" w:styleId="SourceCode">
     <w:name w:val="Source Code"/>
     <w:basedOn w:val="Normal"/>
     <w:link w:val="VerbatimChar"/>
@@ -8303,7 +8995,7 @@
       <w:wordWrap w:val="off"/>
     </w:pPr>
   </w:style>
-  <w:style w:customStyle="1" w:styleId="KeywordTok" w:type="character">
+  <w:style w:type="character" w:customStyle="1" w:styleId="KeywordTok">
     <w:name w:val="KeywordTok"/>
     <w:basedOn w:val="VerbatimChar"/>
     <w:rPr>
@@ -8311,77 +9003,77 @@
       <w:color w:val="007020"/>
     </w:rPr>
   </w:style>
-  <w:style w:customStyle="1" w:styleId="DataTypeTok" w:type="character">
+  <w:style w:type="character" w:customStyle="1" w:styleId="DataTypeTok">
     <w:name w:val="DataTypeTok"/>
     <w:basedOn w:val="VerbatimChar"/>
     <w:rPr>
       <w:color w:val="902000"/>
     </w:rPr>
   </w:style>
-  <w:style w:customStyle="1" w:styleId="DecValTok" w:type="character">
+  <w:style w:type="character" w:customStyle="1" w:styleId="DecValTok">
     <w:name w:val="DecValTok"/>
     <w:basedOn w:val="VerbatimChar"/>
     <w:rPr>
       <w:color w:val="40a070"/>
     </w:rPr>
   </w:style>
-  <w:style w:customStyle="1" w:styleId="BaseNTok" w:type="character">
+  <w:style w:type="character" w:customStyle="1" w:styleId="BaseNTok">
     <w:name w:val="BaseNTok"/>
     <w:basedOn w:val="VerbatimChar"/>
     <w:rPr>
       <w:color w:val="40a070"/>
     </w:rPr>
   </w:style>
-  <w:style w:customStyle="1" w:styleId="FloatTok" w:type="character">
+  <w:style w:type="character" w:customStyle="1" w:styleId="FloatTok">
     <w:name w:val="FloatTok"/>
     <w:basedOn w:val="VerbatimChar"/>
     <w:rPr>
       <w:color w:val="40a070"/>
     </w:rPr>
   </w:style>
-  <w:style w:customStyle="1" w:styleId="ConstantTok" w:type="character">
+  <w:style w:type="character" w:customStyle="1" w:styleId="ConstantTok">
     <w:name w:val="ConstantTok"/>
     <w:basedOn w:val="VerbatimChar"/>
     <w:rPr>
       <w:color w:val="880000"/>
     </w:rPr>
   </w:style>
-  <w:style w:customStyle="1" w:styleId="CharTok" w:type="character">
+  <w:style w:type="character" w:customStyle="1" w:styleId="CharTok">
     <w:name w:val="CharTok"/>
     <w:basedOn w:val="VerbatimChar"/>
     <w:rPr>
       <w:color w:val="4070a0"/>
     </w:rPr>
   </w:style>
-  <w:style w:customStyle="1" w:styleId="SpecialCharTok" w:type="character">
+  <w:style w:type="character" w:customStyle="1" w:styleId="SpecialCharTok">
     <w:name w:val="SpecialCharTok"/>
     <w:basedOn w:val="VerbatimChar"/>
     <w:rPr>
       <w:color w:val="4070a0"/>
     </w:rPr>
   </w:style>
-  <w:style w:customStyle="1" w:styleId="StringTok" w:type="character">
+  <w:style w:type="character" w:customStyle="1" w:styleId="StringTok">
     <w:name w:val="StringTok"/>
     <w:basedOn w:val="VerbatimChar"/>
     <w:rPr>
       <w:color w:val="4070a0"/>
     </w:rPr>
   </w:style>
-  <w:style w:customStyle="1" w:styleId="VerbatimStringTok" w:type="character">
+  <w:style w:type="character" w:customStyle="1" w:styleId="VerbatimStringTok">
     <w:name w:val="VerbatimStringTok"/>
     <w:basedOn w:val="VerbatimChar"/>
     <w:rPr>
       <w:color w:val="4070a0"/>
     </w:rPr>
   </w:style>
-  <w:style w:customStyle="1" w:styleId="SpecialStringTok" w:type="character">
+  <w:style w:type="character" w:customStyle="1" w:styleId="SpecialStringTok">
     <w:name w:val="SpecialStringTok"/>
     <w:basedOn w:val="VerbatimChar"/>
     <w:rPr>
       <w:color w:val="bb6688"/>
     </w:rPr>
   </w:style>
-  <w:style w:customStyle="1" w:styleId="ImportTok" w:type="character">
+  <w:style w:type="character" w:customStyle="1" w:styleId="ImportTok">
     <w:name w:val="ImportTok"/>
     <w:basedOn w:val="VerbatimChar"/>
     <w:rPr>
@@ -8389,7 +9081,7 @@
       <w:color w:val="008000"/>
     </w:rPr>
   </w:style>
-  <w:style w:customStyle="1" w:styleId="CommentTok" w:type="character">
+  <w:style w:type="character" w:customStyle="1" w:styleId="CommentTok">
     <w:name w:val="CommentTok"/>
     <w:basedOn w:val="VerbatimChar"/>
     <w:rPr>
@@ -8397,7 +9089,7 @@
       <w:color w:val="60a0b0"/>
     </w:rPr>
   </w:style>
-  <w:style w:customStyle="1" w:styleId="DocumentationTok" w:type="character">
+  <w:style w:type="character" w:customStyle="1" w:styleId="DocumentationTok">
     <w:name w:val="DocumentationTok"/>
     <w:basedOn w:val="VerbatimChar"/>
     <w:rPr>
@@ -8405,7 +9097,7 @@
       <w:color w:val="ba2121"/>
     </w:rPr>
   </w:style>
-  <w:style w:customStyle="1" w:styleId="AnnotationTok" w:type="character">
+  <w:style w:type="character" w:customStyle="1" w:styleId="AnnotationTok">
     <w:name w:val="AnnotationTok"/>
     <w:basedOn w:val="VerbatimChar"/>
     <w:rPr>
@@ -8414,7 +9106,7 @@
       <w:color w:val="60a0b0"/>
     </w:rPr>
   </w:style>
-  <w:style w:customStyle="1" w:styleId="CommentVarTok" w:type="character">
+  <w:style w:type="character" w:customStyle="1" w:styleId="CommentVarTok">
     <w:name w:val="CommentVarTok"/>
     <w:basedOn w:val="VerbatimChar"/>
     <w:rPr>
@@ -8423,28 +9115,28 @@
       <w:color w:val="60a0b0"/>
     </w:rPr>
   </w:style>
-  <w:style w:customStyle="1" w:styleId="OtherTok" w:type="character">
+  <w:style w:type="character" w:customStyle="1" w:styleId="OtherTok">
     <w:name w:val="OtherTok"/>
     <w:basedOn w:val="VerbatimChar"/>
     <w:rPr>
       <w:color w:val="007020"/>
     </w:rPr>
   </w:style>
-  <w:style w:customStyle="1" w:styleId="FunctionTok" w:type="character">
+  <w:style w:type="character" w:customStyle="1" w:styleId="FunctionTok">
     <w:name w:val="FunctionTok"/>
     <w:basedOn w:val="VerbatimChar"/>
     <w:rPr>
       <w:color w:val="06287e"/>
     </w:rPr>
   </w:style>
-  <w:style w:customStyle="1" w:styleId="VariableTok" w:type="character">
+  <w:style w:type="character" w:customStyle="1" w:styleId="VariableTok">
     <w:name w:val="VariableTok"/>
     <w:basedOn w:val="VerbatimChar"/>
     <w:rPr>
       <w:color w:val="19177c"/>
     </w:rPr>
   </w:style>
-  <w:style w:customStyle="1" w:styleId="ControlFlowTok" w:type="character">
+  <w:style w:type="character" w:customStyle="1" w:styleId="ControlFlowTok">
     <w:name w:val="ControlFlowTok"/>
     <w:basedOn w:val="VerbatimChar"/>
     <w:rPr>
@@ -8452,45 +9144,45 @@
       <w:color w:val="007020"/>
     </w:rPr>
   </w:style>
-  <w:style w:customStyle="1" w:styleId="OperatorTok" w:type="character">
+  <w:style w:type="character" w:customStyle="1" w:styleId="OperatorTok">
     <w:name w:val="OperatorTok"/>
     <w:basedOn w:val="VerbatimChar"/>
     <w:rPr>
       <w:color w:val="666666"/>
     </w:rPr>
   </w:style>
-  <w:style w:customStyle="1" w:styleId="BuiltInTok" w:type="character">
+  <w:style w:type="character" w:customStyle="1" w:styleId="BuiltInTok">
     <w:name w:val="BuiltInTok"/>
     <w:basedOn w:val="VerbatimChar"/>
     <w:rPr>
       <w:color w:val="008000"/>
     </w:rPr>
   </w:style>
-  <w:style w:customStyle="1" w:styleId="ExtensionTok" w:type="character">
+  <w:style w:type="character" w:customStyle="1" w:styleId="ExtensionTok">
     <w:name w:val="ExtensionTok"/>
     <w:basedOn w:val="VerbatimChar"/>
     <w:rPr/>
   </w:style>
-  <w:style w:customStyle="1" w:styleId="PreprocessorTok" w:type="character">
+  <w:style w:type="character" w:customStyle="1" w:styleId="PreprocessorTok">
     <w:name w:val="PreprocessorTok"/>
     <w:basedOn w:val="VerbatimChar"/>
     <w:rPr>
       <w:color w:val="bc7a00"/>
     </w:rPr>
   </w:style>
-  <w:style w:customStyle="1" w:styleId="AttributeTok" w:type="character">
+  <w:style w:type="character" w:customStyle="1" w:styleId="AttributeTok">
     <w:name w:val="AttributeTok"/>
     <w:basedOn w:val="VerbatimChar"/>
     <w:rPr>
       <w:color w:val="7d9029"/>
     </w:rPr>
   </w:style>
-  <w:style w:customStyle="1" w:styleId="RegionMarkerTok" w:type="character">
+  <w:style w:type="character" w:customStyle="1" w:styleId="RegionMarkerTok">
     <w:name w:val="RegionMarkerTok"/>
     <w:basedOn w:val="VerbatimChar"/>
     <w:rPr/>
   </w:style>
-  <w:style w:customStyle="1" w:styleId="InformationTok" w:type="character">
+  <w:style w:type="character" w:customStyle="1" w:styleId="InformationTok">
     <w:name w:val="InformationTok"/>
     <w:basedOn w:val="VerbatimChar"/>
     <w:rPr>
@@ -8499,7 +9191,7 @@
       <w:color w:val="60a0b0"/>
     </w:rPr>
   </w:style>
-  <w:style w:customStyle="1" w:styleId="WarningTok" w:type="character">
+  <w:style w:type="character" w:customStyle="1" w:styleId="WarningTok">
     <w:name w:val="WarningTok"/>
     <w:basedOn w:val="VerbatimChar"/>
     <w:rPr>
@@ -8508,7 +9200,7 @@
       <w:color w:val="60a0b0"/>
     </w:rPr>
   </w:style>
-  <w:style w:customStyle="1" w:styleId="AlertTok" w:type="character">
+  <w:style w:type="character" w:customStyle="1" w:styleId="AlertTok">
     <w:name w:val="AlertTok"/>
     <w:basedOn w:val="VerbatimChar"/>
     <w:rPr>
@@ -8516,7 +9208,7 @@
       <w:color w:val="ff0000"/>
     </w:rPr>
   </w:style>
-  <w:style w:customStyle="1" w:styleId="ErrorTok" w:type="character">
+  <w:style w:type="character" w:customStyle="1" w:styleId="ErrorTok">
     <w:name w:val="ErrorTok"/>
     <w:basedOn w:val="VerbatimChar"/>
     <w:rPr>
@@ -8524,7 +9216,7 @@
       <w:color w:val="ff0000"/>
     </w:rPr>
   </w:style>
-  <w:style w:customStyle="1" w:styleId="NormalTok" w:type="character">
+  <w:style w:type="character" w:customStyle="1" w:styleId="NormalTok">
     <w:name w:val="NormalTok"/>
     <w:basedOn w:val="VerbatimChar"/>
     <w:rPr/>

</xml_diff>

<commit_message>
Release BIOSZEN 2.1.2 with dose-response analysis
</commit_message>
<xml_diff>
--- a/inst/app/www/MANUAL_EN.docx
+++ b/inst/app/www/MANUAL_EN.docx
@@ -2,7 +2,7 @@
 <file path=word/document.xml><?xml version="1.0" encoding="utf-8"?>
 <w:document xmlns:w="http://schemas.openxmlformats.org/wordprocessingml/2006/main" xmlns:m="http://schemas.openxmlformats.org/officeDocument/2006/math" xmlns:r="http://schemas.openxmlformats.org/officeDocument/2006/relationships" xmlns:o="urn:schemas-microsoft-com:office:office" xmlns:v="urn:schemas-microsoft-com:vml" xmlns:w10="urn:schemas-microsoft-com:office:word" xmlns:a="http://schemas.openxmlformats.org/drawingml/2006/main" xmlns:pic="http://schemas.openxmlformats.org/drawingml/2006/picture" xmlns:wp="http://schemas.openxmlformats.org/drawingml/2006/wordprocessingDrawing">
   <w:body>
-    <w:bookmarkStart w:id="76" w:name="bioszen-user-manual-english"/>
+    <w:bookmarkStart w:id="149" w:name="bioszen-user-manual-english"/>
     <w:p>
       <w:pPr>
         <w:pStyle w:val="Heading1"/>
@@ -28,18 +28,18 @@
           <wp:inline>
             <wp:extent cx="5334000" cy="2341239"/>
             <wp:effectExtent b="0" l="0" r="0" t="0"/>
-            <wp:docPr descr="BIOSZEN app overview" title="" id="10" name="Picture"/>
+            <wp:docPr descr="BIOSZEN app overview" title="" id="80" name="Picture"/>
             <a:graphic>
               <a:graphicData uri="http://schemas.openxmlformats.org/drawingml/2006/picture">
                 <pic:pic>
                   <pic:nvPicPr>
-                    <pic:cNvPr descr="manual_images/01_app_home_overview.png" id="11" name="Picture"/>
+                    <pic:cNvPr descr="manual_images/01_app_home_overview.png" id="81" name="Picture"/>
                     <pic:cNvPicPr>
                       <a:picLocks noChangeArrowheads="1" noChangeAspect="1"/>
                     </pic:cNvPicPr>
                   </pic:nvPicPr>
                   <pic:blipFill>
-                    <a:blip r:embed="rId9"/>
+                    <a:blip r:embed="rId79"/>
                     <a:stretch>
                       <a:fillRect/>
                     </a:stretch>
@@ -118,7 +118,7 @@
         <w:t xml:space="preserve">Keep this manual open while working. Each section includes both quick actions and deeper technical reference.</w:t>
       </w:r>
     </w:p>
-    <w:bookmarkStart w:id="12" w:name="manual-map"/>
+    <w:bookmarkStart w:id="82" w:name="manual-map"/>
     <w:p>
       <w:pPr>
         <w:pStyle w:val="Heading2"/>
@@ -382,8 +382,8 @@
         </w:r>
       </w:hyperlink>
     </w:p>
-    <w:bookmarkEnd w:id="12"/>
-    <w:bookmarkStart w:id="17" w:name="Xcc802c028399c90ef506226ebaf5d25e7c22381"/>
+    <w:bookmarkEnd w:id="82"/>
+    <w:bookmarkStart w:id="87" w:name="Xcc802c028399c90ef506226ebaf5d25e7c22381"/>
     <w:p>
       <w:pPr>
         <w:pStyle w:val="Heading2"/>
@@ -801,42 +801,133 @@
         <w:pStyle w:val="FirstParagraph"/>
       </w:pPr>
       <w:r>
-        <w:t xml:space="preserve">The standalone</w:t>
-      </w:r>
-      <w:r>
-        <w:t xml:space="preserve"> </w:t>
-      </w:r>
-      <w:r>
-        <w:rPr>
-          <w:rStyle w:val="VerbatimChar"/>
-        </w:rPr>
-        <w:t xml:space="preserve">App.R</w:t>
-      </w:r>
-      <w:r>
-        <w:t xml:space="preserve"> </w:t>
-      </w:r>
-      <w:r>
-        <w:t xml:space="preserve">and bundle launch methods remain available for users who</w:t>
-      </w:r>
-      <w:r>
-        <w:t xml:space="preserve"> </w:t>
-      </w:r>
-      <w:r>
-        <w:t xml:space="preserve">prefer not to install BIOSZEN from a package repository.</w:t>
-      </w:r>
-    </w:p>
-    <w:p>
-      <w:pPr>
-        <w:pStyle w:val="BodyText"/>
-      </w:pPr>
-      <w:r>
-        <w:t xml:space="preserve">Reference templates available in-app (</w:t>
+        <w:t xml:space="preserve">The package launcher opens the operating system's configured default browser.</w:t>
+      </w:r>
+      <w:r>
+        <w:t xml:space="preserve"> </w:t>
+      </w:r>
+      <w:r>
+        <w:t xml:space="preserve">Use</w:t>
+      </w:r>
+      <w:r>
+        <w:t xml:space="preserve"> </w:t>
+      </w:r>
+      <w:r>
+        <w:rPr>
+          <w:rStyle w:val="VerbatimChar"/>
+        </w:rPr>
+        <w:t xml:space="preserve">BIOSZEN::BIOSZEN(app_window = TRUE)</w:t>
+      </w:r>
+      <w:r>
+        <w:t xml:space="preserve"> </w:t>
+      </w:r>
+      <w:r>
+        <w:t xml:space="preserve">to request a dedicated app-style</w:t>
+      </w:r>
+      <w:r>
+        <w:t xml:space="preserve"> </w:t>
+      </w:r>
+      <w:r>
+        <w:t xml:space="preserve">Chromium window. The RStudio Addin is installed and registered automatically</w:t>
+      </w:r>
+      <w:r>
+        <w:t xml:space="preserve"> </w:t>
+      </w:r>
+      <w:r>
+        <w:t xml:space="preserve">with BIOSZEN; no Addin files need to be copied manually. Restart RStudio after</w:t>
+      </w:r>
+      <w:r>
+        <w:t xml:space="preserve"> </w:t>
+      </w:r>
+      <w:r>
+        <w:t xml:space="preserve">installing or updating BIOSZEN, then use</w:t>
+      </w:r>
+      <w:r>
+        <w:t xml:space="preserve"> </w:t>
       </w:r>
       <w:r>
         <w:rPr>
           <w:b/>
           <w:bCs/>
         </w:rPr>
+        <w:t xml:space="preserve">Addins &gt; Launch BIOSZEN in Browser</w:t>
+      </w:r>
+      <w:r>
+        <w:t xml:space="preserve"> </w:t>
+      </w:r>
+      <w:r>
+        <w:t xml:space="preserve">to start it without typing a command. An optional shortcut can be assigned from</w:t>
+      </w:r>
+      <w:r>
+        <w:t xml:space="preserve"> </w:t>
+      </w:r>
+      <w:r>
+        <w:rPr>
+          <w:b/>
+          <w:bCs/>
+        </w:rPr>
+        <w:t xml:space="preserve">Addins &gt; Browse Addins &gt; Keyboard Shortcuts</w:t>
+      </w:r>
+      <w:r>
+        <w:t xml:space="preserve">. Pass</w:t>
+      </w:r>
+      <w:r>
+        <w:t xml:space="preserve"> </w:t>
+      </w:r>
+      <w:r>
+        <w:rPr>
+          <w:rStyle w:val="VerbatimChar"/>
+        </w:rPr>
+        <w:t xml:space="preserve">launch.browser = FALSE</w:t>
+      </w:r>
+      <w:r>
+        <w:t xml:space="preserve"> </w:t>
+      </w:r>
+      <w:r>
+        <w:t xml:space="preserve">only when automatic browser opening is not desired.</w:t>
+      </w:r>
+    </w:p>
+    <w:p>
+      <w:pPr>
+        <w:pStyle w:val="BodyText"/>
+      </w:pPr>
+      <w:r>
+        <w:t xml:space="preserve">The standalone</w:t>
+      </w:r>
+      <w:r>
+        <w:t xml:space="preserve"> </w:t>
+      </w:r>
+      <w:r>
+        <w:rPr>
+          <w:rStyle w:val="VerbatimChar"/>
+        </w:rPr>
+        <w:t xml:space="preserve">App.R</w:t>
+      </w:r>
+      <w:r>
+        <w:t xml:space="preserve"> </w:t>
+      </w:r>
+      <w:r>
+        <w:t xml:space="preserve">and bundle launch methods remain available for users who</w:t>
+      </w:r>
+      <w:r>
+        <w:t xml:space="preserve"> </w:t>
+      </w:r>
+      <w:r>
+        <w:t xml:space="preserve">prefer not to install BIOSZEN from a package repository.</w:t>
+      </w:r>
+    </w:p>
+    <w:p>
+      <w:pPr>
+        <w:pStyle w:val="BodyText"/>
+      </w:pPr>
+      <w:r>
+        <w:t xml:space="preserve">Reference templates available in-app (</w:t>
+      </w:r>
+      <w:r>
+        <w:rPr>
+          <w:b/>
+          <w:bCs/>
+        </w:rPr>
         <w:t xml:space="preserve">Reference input files (download)</w:t>
       </w:r>
       <w:r>
@@ -874,7 +965,7 @@
           <w:numId w:val="1004"/>
         </w:numPr>
       </w:pPr>
-      <w:hyperlink r:id="rId13">
+      <w:hyperlink r:id="rId83">
         <w:r>
           <w:rPr>
             <w:rStyle w:val="Hyperlink"/>
@@ -891,7 +982,7 @@
           <w:numId w:val="1004"/>
         </w:numPr>
       </w:pPr>
-      <w:hyperlink r:id="rId14">
+      <w:hyperlink r:id="rId84">
         <w:r>
           <w:rPr>
             <w:rStyle w:val="Hyperlink"/>
@@ -908,7 +999,7 @@
           <w:numId w:val="1004"/>
         </w:numPr>
       </w:pPr>
-      <w:hyperlink r:id="rId15">
+      <w:hyperlink r:id="rId85">
         <w:r>
           <w:rPr>
             <w:rStyle w:val="Hyperlink"/>
@@ -925,7 +1016,7 @@
           <w:numId w:val="1004"/>
         </w:numPr>
       </w:pPr>
-      <w:hyperlink r:id="rId16">
+      <w:hyperlink r:id="rId86">
         <w:r>
           <w:rPr>
             <w:rStyle w:val="Hyperlink"/>
@@ -964,8 +1055,8 @@
         <w:t xml:space="preserve">. Keep that folder to avoid reinstalling dependencies.</w:t>
       </w:r>
     </w:p>
-    <w:bookmarkEnd w:id="17"/>
-    <w:bookmarkStart w:id="25" w:name="X717faac405ee7bcb1499a96623efaf8a5d1ee47"/>
+    <w:bookmarkEnd w:id="87"/>
+    <w:bookmarkStart w:id="95" w:name="X717faac405ee7bcb1499a96623efaf8a5d1ee47"/>
     <w:p>
       <w:pPr>
         <w:pStyle w:val="Heading2"/>
@@ -974,7 +1065,7 @@
         <w:t xml:space="preserve">2. Fast Start by Scenario</w:t>
       </w:r>
     </w:p>
-    <w:bookmarkStart w:id="18" w:name="Xa7fd6d851aa97e621ff7d312d1eecc596d93a28"/>
+    <w:bookmarkStart w:id="88" w:name="Xa7fd6d851aa97e621ff7d312d1eecc596d93a28"/>
     <w:p>
       <w:pPr>
         <w:pStyle w:val="Heading3"/>
@@ -1081,8 +1172,8 @@
         <w:t xml:space="preserve">Export plot, tables, metadata, and ZIP bundle.</w:t>
       </w:r>
     </w:p>
-    <w:bookmarkEnd w:id="18"/>
-    <w:bookmarkStart w:id="19" w:name="Xfb5a9e6fb4846348544dde5a71c800812e0227b"/>
+    <w:bookmarkEnd w:id="88"/>
+    <w:bookmarkStart w:id="89" w:name="Xfb5a9e6fb4846348544dde5a71c800812e0227b"/>
     <w:p>
       <w:pPr>
         <w:pStyle w:val="Heading3"/>
@@ -1152,8 +1243,8 @@
         <w:t xml:space="preserve">Export plots and metadata.</w:t>
       </w:r>
     </w:p>
-    <w:bookmarkEnd w:id="19"/>
-    <w:bookmarkStart w:id="20" w:name="X98e459497506ff727301c25765f2a946169182f"/>
+    <w:bookmarkEnd w:id="89"/>
+    <w:bookmarkStart w:id="90" w:name="X98e459497506ff727301c25765f2a946169182f"/>
     <w:p>
       <w:pPr>
         <w:pStyle w:val="Heading3"/>
@@ -1226,8 +1317,8 @@
         <w:t xml:space="preserve">Add overlays/advanced layers only near final export.</w:t>
       </w:r>
     </w:p>
-    <w:bookmarkEnd w:id="20"/>
-    <w:bookmarkStart w:id="24" w:name="X1e4e5d684586b5543e1aaf83240cb30502e5d1b"/>
+    <w:bookmarkEnd w:id="90"/>
+    <w:bookmarkStart w:id="94" w:name="X1e4e5d684586b5543e1aaf83240cb30502e5d1b"/>
     <w:p>
       <w:pPr>
         <w:pStyle w:val="Heading3"/>
@@ -1284,6 +1375,34 @@
         </w:numPr>
       </w:pPr>
       <w:r>
+        <w:t xml:space="preserve">In RStudio, the automatically installed</w:t>
+      </w:r>
+      <w:r>
+        <w:t xml:space="preserve"> </w:t>
+      </w:r>
+      <w:r>
+        <w:rPr>
+          <w:b/>
+          <w:bCs/>
+        </w:rPr>
+        <w:t xml:space="preserve">Addins &gt; Launch BIOSZEN in Browser</w:t>
+      </w:r>
+      <w:r>
+        <w:t xml:space="preserve"> </w:t>
+      </w:r>
+      <w:r>
+        <w:t xml:space="preserve">command provides a one-click equivalent and opens the operating system's configured default browser.</w:t>
+      </w:r>
+    </w:p>
+    <w:p>
+      <w:pPr>
+        <w:pStyle w:val="Compact"/>
+        <w:numPr>
+          <w:ilvl w:val="0"/>
+          <w:numId w:val="1008"/>
+        </w:numPr>
+      </w:pPr>
+      <w:r>
         <w:t xml:space="preserve">Use</w:t>
       </w:r>
       <w:r>
@@ -1411,6 +1530,108 @@
       </w:r>
       <w:r>
         <w:t xml:space="preserve">to install one after confirmation and after closing the app.</w:t>
+      </w:r>
+    </w:p>
+    <w:p>
+      <w:pPr>
+        <w:pStyle w:val="Compact"/>
+        <w:numPr>
+          <w:ilvl w:val="0"/>
+          <w:numId w:val="1008"/>
+        </w:numPr>
+      </w:pPr>
+      <w:r>
+        <w:t xml:space="preserve">When BIOSZEN is launched as an installed R package, the blue</w:t>
+      </w:r>
+      <w:r>
+        <w:t xml:space="preserve"> </w:t>
+      </w:r>
+      <w:r>
+        <w:rPr>
+          <w:b/>
+          <w:bCs/>
+        </w:rPr>
+        <w:t xml:space="preserve">Update</w:t>
+      </w:r>
+      <w:r>
+        <w:t xml:space="preserve"> </w:t>
+      </w:r>
+      <w:r>
+        <w:t xml:space="preserve">button keeps the same update workflow: it reports when no newer stable release exists and otherwise shows both versions before requesting confirmation.</w:t>
+      </w:r>
+    </w:p>
+    <w:p>
+      <w:pPr>
+        <w:pStyle w:val="Compact"/>
+        <w:numPr>
+          <w:ilvl w:val="0"/>
+          <w:numId w:val="1008"/>
+        </w:numPr>
+      </w:pPr>
+      <w:r>
+        <w:t xml:space="preserve">When BIOSZEN is launched from the local standalone bundle, the button changes to</w:t>
+      </w:r>
+      <w:r>
+        <w:t xml:space="preserve"> </w:t>
+      </w:r>
+      <w:r>
+        <w:rPr>
+          <w:b/>
+          <w:bCs/>
+        </w:rPr>
+        <w:t xml:space="preserve">Install package</w:t>
+      </w:r>
+      <w:r>
+        <w:t xml:space="preserve">. After confirmation, BIOSZEN closes and installs the stable R-universe package in the personal R library. Restart R and then use</w:t>
+      </w:r>
+      <w:r>
+        <w:t xml:space="preserve"> </w:t>
+      </w:r>
+      <w:r>
+        <w:rPr>
+          <w:rStyle w:val="VerbatimChar"/>
+        </w:rPr>
+        <w:t xml:space="preserve">BIOSZEN::BIOSZEN()</w:t>
+      </w:r>
+      <w:r>
+        <w:t xml:space="preserve">. If a normal package installation already exists, BIOSZEN reports it instead of installing again.</w:t>
+      </w:r>
+    </w:p>
+    <w:p>
+      <w:pPr>
+        <w:pStyle w:val="Compact"/>
+        <w:numPr>
+          <w:ilvl w:val="0"/>
+          <w:numId w:val="1008"/>
+        </w:numPr>
+      </w:pPr>
+      <w:r>
+        <w:rPr>
+          <w:b/>
+          <w:bCs/>
+        </w:rPr>
+        <w:t xml:space="preserve">Installation and update safety:</w:t>
+      </w:r>
+      <w:r>
+        <w:t xml:space="preserve"> </w:t>
+      </w:r>
+      <w:r>
+        <w:t xml:space="preserve">neither action installs silently. Save or download unsaved work before confirming. BIOSZEN closes Shiny before modifying package files, and the checks do not send uploaded experimental data, personal information, or credentials. If a download is interrupted or the R library is locked, the standalone launcher remains usable; restart R and retry or run</w:t>
+      </w:r>
+      <w:r>
+        <w:t xml:space="preserve"> </w:t>
+      </w:r>
+      <w:r>
+        <w:rPr>
+          <w:rStyle w:val="VerbatimChar"/>
+        </w:rPr>
+        <w:t xml:space="preserve">BIOSZEN::bioszen_update()</w:t>
+      </w:r>
+      <w:r>
+        <w:t xml:space="preserve"> </w:t>
+      </w:r>
+      <w:r>
+        <w:t xml:space="preserve">for an existing package installation.</w:t>
       </w:r>
     </w:p>
     <w:p>
@@ -1464,18 +1685,18 @@
           <wp:inline>
             <wp:extent cx="5334000" cy="2133600"/>
             <wp:effectExtent b="0" l="0" r="0" t="0"/>
-            <wp:docPr descr="Plot setup and layers" title="" id="22" name="Picture"/>
+            <wp:docPr descr="Plot setup and layers" title="" id="92" name="Picture"/>
             <a:graphic>
               <a:graphicData uri="http://schemas.openxmlformats.org/drawingml/2006/picture">
                 <pic:pic>
                   <pic:nvPicPr>
-                    <pic:cNvPr descr="manual_images/02_plot_setup_layers.png" id="23" name="Picture"/>
+                    <pic:cNvPr descr="manual_images/02_plot_setup_layers.png" id="93" name="Picture"/>
                     <pic:cNvPicPr>
                       <a:picLocks noChangeArrowheads="1" noChangeAspect="1"/>
                     </pic:cNvPicPr>
                   </pic:nvPicPr>
                   <pic:blipFill>
-                    <a:blip r:embed="rId21"/>
+                    <a:blip r:embed="rId91"/>
                     <a:stretch>
                       <a:fillRect/>
                     </a:stretch>
@@ -1502,9 +1723,9 @@
         </w:drawing>
       </w:r>
     </w:p>
-    <w:bookmarkEnd w:id="24"/>
-    <w:bookmarkEnd w:id="25"/>
-    <w:bookmarkStart w:id="26" w:name="X128ed19147767cebcf7cb23c4bcc70881f470f9"/>
+    <w:bookmarkEnd w:id="94"/>
+    <w:bookmarkEnd w:id="95"/>
+    <w:bookmarkStart w:id="96" w:name="X128ed19147767cebcf7cb23c4bcc70881f470f9"/>
     <w:p>
       <w:pPr>
         <w:pStyle w:val="Heading2"/>
@@ -1658,8 +1879,8 @@
         <w:t xml:space="preserve">.</w:t>
       </w:r>
     </w:p>
-    <w:bookmarkEnd w:id="26"/>
-    <w:bookmarkStart w:id="35" w:name="X6b8972cbac599c5fedbf83a48be69951ca6b7c8"/>
+    <w:bookmarkEnd w:id="96"/>
+    <w:bookmarkStart w:id="105" w:name="X6b8972cbac599c5fedbf83a48be69951ca6b7c8"/>
     <w:p>
       <w:pPr>
         <w:pStyle w:val="Heading2"/>
@@ -1668,7 +1889,7 @@
         <w:t xml:space="preserve">4. Input Specifications</w:t>
       </w:r>
     </w:p>
-    <w:bookmarkStart w:id="27" w:name="X0605fe61617601d5dc607a15bb9e5babb26d0bd"/>
+    <w:bookmarkStart w:id="97" w:name="X0605fe61617601d5dc607a15bb9e5babb26d0bd"/>
     <w:p>
       <w:pPr>
         <w:pStyle w:val="Heading3"/>
@@ -2177,8 +2398,8 @@
         <w:t xml:space="preserve">Y_Title</w:t>
       </w:r>
     </w:p>
-    <w:bookmarkEnd w:id="27"/>
-    <w:bookmarkStart w:id="28" w:name="Xe43541bf07e4c62d7d45bf62912f7f89f9c08e5"/>
+    <w:bookmarkEnd w:id="97"/>
+    <w:bookmarkStart w:id="98" w:name="Xe43541bf07e4c62d7d45bf62912f7f89f9c08e5"/>
     <w:p>
       <w:pPr>
         <w:pStyle w:val="Heading3"/>
@@ -2572,8 +2793,8 @@
         <w:t xml:space="preserve">vs curve headers).</w:t>
       </w:r>
     </w:p>
-    <w:bookmarkEnd w:id="28"/>
-    <w:bookmarkStart w:id="29" w:name="X239cbd4a8b7be852666d20878604d0d97369a89"/>
+    <w:bookmarkEnd w:id="98"/>
+    <w:bookmarkStart w:id="99" w:name="X239cbd4a8b7be852666d20878604d0d97369a89"/>
     <w:p>
       <w:pPr>
         <w:pStyle w:val="Heading3"/>
@@ -2696,8 +2917,8 @@
         <w:t xml:space="preserve">).</w:t>
       </w:r>
     </w:p>
-    <w:bookmarkEnd w:id="29"/>
-    <w:bookmarkStart w:id="30" w:name="Xcbadc8a632b74252ecce5f0e02c8d2548229bde"/>
+    <w:bookmarkEnd w:id="99"/>
+    <w:bookmarkStart w:id="100" w:name="Xcbadc8a632b74252ecce5f0e02c8d2548229bde"/>
     <w:p>
       <w:pPr>
         <w:pStyle w:val="Heading3"/>
@@ -2915,8 +3136,8 @@
         <w:t xml:space="preserve">file or an embedded curve-summary sheet.</w:t>
       </w:r>
     </w:p>
-    <w:bookmarkEnd w:id="30"/>
-    <w:bookmarkStart w:id="31" w:name="X9b6d5804ff663a0063e2ffa1f700ec485883876"/>
+    <w:bookmarkEnd w:id="100"/>
+    <w:bookmarkStart w:id="101" w:name="X9b6d5804ff663a0063e2ffa1f700ec485883876"/>
     <w:p>
       <w:pPr>
         <w:pStyle w:val="Heading3"/>
@@ -3056,8 +3277,8 @@
         <w:t xml:space="preserve">+ wells).</w:t>
       </w:r>
     </w:p>
-    <w:bookmarkEnd w:id="31"/>
-    <w:bookmarkStart w:id="34" w:name="X2bee644eb2d3a5adf897f34f1e02f1d8c3b4b94"/>
+    <w:bookmarkEnd w:id="101"/>
+    <w:bookmarkStart w:id="104" w:name="X2bee644eb2d3a5adf897f34f1e02f1d8c3b4b94"/>
     <w:p>
       <w:pPr>
         <w:pStyle w:val="Heading3"/>
@@ -3076,7 +3297,7 @@
       <w:r>
         <w:t xml:space="preserve"> </w:t>
       </w:r>
-      <w:hyperlink r:id="rId32">
+      <w:hyperlink r:id="rId102">
         <w:r>
           <w:rPr>
             <w:rStyle w:val="VerbatimChar"/>
@@ -3120,7 +3341,7 @@
       <w:r>
         <w:t xml:space="preserve"> </w:t>
       </w:r>
-      <w:hyperlink r:id="rId33">
+      <w:hyperlink r:id="rId103">
         <w:r>
           <w:rPr>
             <w:rStyle w:val="Hyperlink"/>
@@ -3280,9 +3501,9 @@
         <w:t xml:space="preserve">specific measurement type.</w:t>
       </w:r>
     </w:p>
-    <w:bookmarkEnd w:id="34"/>
-    <w:bookmarkEnd w:id="35"/>
-    <w:bookmarkStart w:id="39" w:name="X2e7b1a4065091c3158d5038f5bc7571dc49a75d"/>
+    <w:bookmarkEnd w:id="104"/>
+    <w:bookmarkEnd w:id="105"/>
+    <w:bookmarkStart w:id="109" w:name="X2e7b1a4065091c3158d5038f5bc7571dc49a75d"/>
     <w:p>
       <w:pPr>
         <w:pStyle w:val="Heading2"/>
@@ -3444,18 +3665,18 @@
           <wp:inline>
             <wp:extent cx="5334000" cy="1320297"/>
             <wp:effectExtent b="0" l="0" r="0" t="0"/>
-            <wp:docPr descr="Filtering by media/conditions" title="" id="37" name="Picture"/>
+            <wp:docPr descr="Filtering by media/conditions" title="" id="107" name="Picture"/>
             <a:graphic>
               <a:graphicData uri="http://schemas.openxmlformats.org/drawingml/2006/picture">
                 <pic:pic>
                   <pic:nvPicPr>
-                    <pic:cNvPr descr="manual_images/03_filter_media_conditions.png" id="38" name="Picture"/>
+                    <pic:cNvPr descr="manual_images/03_filter_media_conditions.png" id="108" name="Picture"/>
                     <pic:cNvPicPr>
                       <a:picLocks noChangeArrowheads="1" noChangeAspect="1"/>
                     </pic:cNvPicPr>
                   </pic:nvPicPr>
                   <pic:blipFill>
-                    <a:blip r:embed="rId36"/>
+                    <a:blip r:embed="rId106"/>
                     <a:stretch>
                       <a:fillRect/>
                     </a:stretch>
@@ -3482,8 +3703,8 @@
         </w:drawing>
       </w:r>
     </w:p>
-    <w:bookmarkEnd w:id="39"/>
-    <w:bookmarkStart w:id="57" w:name="X0cb250eb1df454c6760228a2c04c93ed8beae8a"/>
+    <w:bookmarkEnd w:id="109"/>
+    <w:bookmarkStart w:id="130" w:name="X0cb250eb1df454c6760228a2c04c93ed8beae8a"/>
     <w:p>
       <w:pPr>
         <w:pStyle w:val="Heading2"/>
@@ -3492,7 +3713,7 @@
         <w:t xml:space="preserve">6. Plot Types and Controls</w:t>
       </w:r>
     </w:p>
-    <w:bookmarkStart w:id="40" w:name="boxplot"/>
+    <w:bookmarkStart w:id="110" w:name="boxplot"/>
     <w:p>
       <w:pPr>
         <w:pStyle w:val="Heading3"/>
@@ -3558,8 +3779,8 @@
         <w:t xml:space="preserve">improves readability for long group labels.</w:t>
       </w:r>
     </w:p>
-    <w:bookmarkEnd w:id="40"/>
-    <w:bookmarkStart w:id="41" w:name="barplot"/>
+    <w:bookmarkEnd w:id="110"/>
+    <w:bookmarkStart w:id="111" w:name="barplot"/>
     <w:p>
       <w:pPr>
         <w:pStyle w:val="Heading3"/>
@@ -3604,8 +3825,8 @@
         <w:t xml:space="preserve">Horizontal orientation available.</w:t>
       </w:r>
     </w:p>
-    <w:bookmarkEnd w:id="41"/>
-    <w:bookmarkStart w:id="42" w:name="violin"/>
+    <w:bookmarkEnd w:id="111"/>
+    <w:bookmarkStart w:id="112" w:name="violin"/>
     <w:p>
       <w:pPr>
         <w:pStyle w:val="Heading3"/>
@@ -3650,8 +3871,8 @@
         <w:t xml:space="preserve">Horizontal orientation available.</w:t>
       </w:r>
     </w:p>
-    <w:bookmarkEnd w:id="42"/>
-    <w:bookmarkStart w:id="43" w:name="stacked"/>
+    <w:bookmarkEnd w:id="112"/>
+    <w:bookmarkStart w:id="113" w:name="stacked"/>
     <w:p>
       <w:pPr>
         <w:pStyle w:val="Heading3"/>
@@ -3774,8 +3995,8 @@
         <w:t xml:space="preserve">Horizontal orientation available; legends, text styles, error bars, and significance labels are preserved when the plot is flipped.</w:t>
       </w:r>
     </w:p>
-    <w:bookmarkEnd w:id="43"/>
-    <w:bookmarkStart w:id="44" w:name="correlation"/>
+    <w:bookmarkEnd w:id="113"/>
+    <w:bookmarkStart w:id="114" w:name="correlation"/>
     <w:p>
       <w:pPr>
         <w:pStyle w:val="Heading3"/>
@@ -3868,13 +4089,1784 @@
         <w:t xml:space="preserve">Advanced panel supports one-vs-all style screening and Excel export.</w:t>
       </w:r>
     </w:p>
-    <w:bookmarkEnd w:id="44"/>
-    <w:bookmarkStart w:id="45" w:name="heatmap"/>
+    <w:bookmarkEnd w:id="114"/>
+    <w:bookmarkStart w:id="117" w:name="concentration-response--dose-response"/>
     <w:p>
       <w:pPr>
         <w:pStyle w:val="Heading3"/>
       </w:pPr>
       <w:r>
+        <w:t xml:space="preserve">Concentration-response / dose-response</w:t>
+      </w:r>
+    </w:p>
+    <w:p>
+      <w:pPr>
+        <w:pStyle w:val="Compact"/>
+        <w:numPr>
+          <w:ilvl w:val="0"/>
+          <w:numId w:val="1028"/>
+        </w:numPr>
+      </w:pPr>
+      <w:r>
+        <w:t xml:space="preserve">Select the response parameter, compound series, strains, biological replicates, and displayed conditions to include. The same group and replicate filters used by the other plots remain active.</w:t>
+      </w:r>
+    </w:p>
+    <w:p>
+      <w:pPr>
+        <w:pStyle w:val="Compact"/>
+        <w:numPr>
+          <w:ilvl w:val="0"/>
+          <w:numId w:val="1028"/>
+        </w:numPr>
+      </w:pPr>
+      <w:r>
+        <w:t xml:space="preserve">BIOSZEN reads recognized concentrations from condition names and lets you correct every concentration and unit manually. All included rows must use one displayed unit before fitting.</w:t>
+      </w:r>
+    </w:p>
+    <w:p>
+      <w:pPr>
+        <w:pStyle w:val="Compact"/>
+        <w:numPr>
+          <w:ilvl w:val="0"/>
+          <w:numId w:val="1028"/>
+        </w:numPr>
+      </w:pPr>
+      <w:r>
+        <w:t xml:space="preserve">Each strain is fitted independently with a four-parameter log-logistic inhibitory model (</w:t>
+      </w:r>
+      <w:r>
+        <w:rPr>
+          <w:rStyle w:val="VerbatimChar"/>
+        </w:rPr>
+        <w:t xml:space="preserve">LL.4</w:t>
+      </w:r>
+      <w:r>
+        <w:t xml:space="preserve">). Individual biological-replicate points are shown by default; mean with SD or SEM is optional.</w:t>
+      </w:r>
+    </w:p>
+    <w:p>
+      <w:pPr>
+        <w:pStyle w:val="Compact"/>
+        <w:numPr>
+          <w:ilvl w:val="0"/>
+          <w:numId w:val="1028"/>
+        </w:numPr>
+      </w:pPr>
+      <w:r>
+        <w:t xml:space="preserve">The raw parameter or its control-normalized value can be used as the response. Normalized responses are fitted as percent of control.</w:t>
+      </w:r>
+    </w:p>
+    <w:p>
+      <w:pPr>
+        <w:pStyle w:val="Compact"/>
+        <w:numPr>
+          <w:ilvl w:val="0"/>
+          <w:numId w:val="1028"/>
+        </w:numPr>
+      </w:pPr>
+      <w:r>
+        <w:t xml:space="preserve">A lower IC50 indicates greater susceptibility only when the fit is inhibitory, the IC50 lies within the tested concentration range, and the uncertainty is acceptable. Values reported as</w:t>
+      </w:r>
+      <w:r>
+        <w:t xml:space="preserve"> </w:t>
+      </w:r>
+      <w:r>
+        <w:rPr>
+          <w:rStyle w:val="VerbatimChar"/>
+        </w:rPr>
+        <w:t xml:space="preserve">&gt; maximum tested</w:t>
+      </w:r>
+      <w:r>
+        <w:t xml:space="preserve">,</w:t>
+      </w:r>
+      <w:r>
+        <w:t xml:space="preserve"> </w:t>
+      </w:r>
+      <w:r>
+        <w:rPr>
+          <w:rStyle w:val="VerbatimChar"/>
+        </w:rPr>
+        <w:t xml:space="preserve">&lt; minimum tested</w:t>
+      </w:r>
+      <w:r>
+        <w:t xml:space="preserve">, or not estimable are excluded from susceptibility ranking.</w:t>
+      </w:r>
+    </w:p>
+    <w:p>
+      <w:pPr>
+        <w:pStyle w:val="Compact"/>
+        <w:numPr>
+          <w:ilvl w:val="0"/>
+          <w:numId w:val="1028"/>
+        </w:numPr>
+      </w:pPr>
+      <w:r>
+        <w:t xml:space="preserve">Axis limits, intervals, titles, fitted-line width, point size, black point outline, and confidence-band opacity affect presentation only. They do not refit the curve or change any parameter. An X interval is used on the linear axis; logarithmic X axes use automatic logarithmic spacing.</w:t>
+      </w:r>
+    </w:p>
+    <w:bookmarkStart w:id="115" w:name="X5cd01610e01d8974bd69985362e9d1534a0a498"/>
+    <w:p>
+      <w:pPr>
+        <w:pStyle w:val="Heading4"/>
+      </w:pPr>
+      <w:r>
+        <w:t xml:space="preserve">Interpretation of replicate and curve parameters</w:t>
+      </w:r>
+    </w:p>
+    <w:tbl>
+      <w:tblPr>
+        <w:tblStyle w:val="Table"/>
+        <w:tblW w:type="auto" w:w="0"/>
+        <w:tblLook w:firstRow="1" w:lastRow="0" w:firstColumn="0" w:lastColumn="0" w:noHBand="0" w:noVBand="0" w:val="0020"/>
+      </w:tblPr>
+      <w:tblGrid>
+        <w:gridCol w:w="3960"/>
+        <w:gridCol w:w="3960"/>
+      </w:tblGrid>
+      <w:tr>
+        <w:trPr>
+          <w:tblHeader w:val="on"/>
+        </w:trPr>
+        <w:tc>
+          <w:tcPr/>
+          <w:p>
+            <w:pPr>
+              <w:pStyle w:val="Compact"/>
+            </w:pPr>
+            <w:r>
+              <w:t xml:space="preserve">Output</w:t>
+            </w:r>
+          </w:p>
+        </w:tc>
+        <w:tc>
+          <w:tcPr/>
+          <w:p>
+            <w:pPr>
+              <w:pStyle w:val="Compact"/>
+            </w:pPr>
+            <w:r>
+              <w:t xml:space="preserve">Interpretation</w:t>
+            </w:r>
+          </w:p>
+        </w:tc>
+      </w:tr>
+      <w:tr>
+        <w:tc>
+          <w:tcPr/>
+          <w:p>
+            <w:pPr>
+              <w:pStyle w:val="Compact"/>
+            </w:pPr>
+            <w:r>
+              <w:rPr>
+                <w:rStyle w:val="VerbatimChar"/>
+              </w:rPr>
+              <w:t xml:space="preserve">Strain</w:t>
+            </w:r>
+            <w:r>
+              <w:t xml:space="preserve">,</w:t>
+            </w:r>
+            <w:r>
+              <w:t xml:space="preserve"> </w:t>
+            </w:r>
+            <w:r>
+              <w:rPr>
+                <w:rStyle w:val="VerbatimChar"/>
+              </w:rPr>
+              <w:t xml:space="preserve">Parameter</w:t>
+            </w:r>
+            <w:r>
+              <w:t xml:space="preserve">,</w:t>
+            </w:r>
+            <w:r>
+              <w:t xml:space="preserve"> </w:t>
+            </w:r>
+            <w:r>
+              <w:rPr>
+                <w:rStyle w:val="VerbatimChar"/>
+              </w:rPr>
+              <w:t xml:space="preserve">Compound</w:t>
+            </w:r>
+            <w:r>
+              <w:t xml:space="preserve">,</w:t>
+            </w:r>
+            <w:r>
+              <w:t xml:space="preserve"> </w:t>
+            </w:r>
+            <w:r>
+              <w:rPr>
+                <w:rStyle w:val="VerbatimChar"/>
+              </w:rPr>
+              <w:t xml:space="preserve">ConcentrationUnit</w:t>
+            </w:r>
+          </w:p>
+        </w:tc>
+        <w:tc>
+          <w:tcPr/>
+          <w:p>
+            <w:pPr>
+              <w:pStyle w:val="Compact"/>
+            </w:pPr>
+            <w:r>
+              <w:t xml:space="preserve">Identify the fitted strain, selected response, treatment series, and concentration unit. Parameters from different response or concentration units should not be compared as if they were on the same scale.</w:t>
+            </w:r>
+          </w:p>
+        </w:tc>
+      </w:tr>
+      <w:tr>
+        <w:tc>
+          <w:tcPr/>
+          <w:p>
+            <w:pPr>
+              <w:pStyle w:val="Compact"/>
+            </w:pPr>
+            <w:r>
+              <w:rPr>
+                <w:rStyle w:val="VerbatimChar"/>
+              </w:rPr>
+              <w:t xml:space="preserve">Condition</w:t>
+            </w:r>
+            <w:r>
+              <w:t xml:space="preserve">,</w:t>
+            </w:r>
+            <w:r>
+              <w:t xml:space="preserve"> </w:t>
+            </w:r>
+            <w:r>
+              <w:rPr>
+                <w:rStyle w:val="VerbatimChar"/>
+              </w:rPr>
+              <w:t xml:space="preserve">Concentration</w:t>
+            </w:r>
+          </w:p>
+        </w:tc>
+        <w:tc>
+          <w:tcPr/>
+          <w:p>
+            <w:pPr>
+              <w:pStyle w:val="Compact"/>
+            </w:pPr>
+            <w:r>
+              <w:t xml:space="preserve">Original condition/group label and the corrected numeric concentration used for that row. Always verify the concentration mapping before fitting.</w:t>
+            </w:r>
+          </w:p>
+        </w:tc>
+      </w:tr>
+      <w:tr>
+        <w:tc>
+          <w:tcPr/>
+          <w:p>
+            <w:pPr>
+              <w:pStyle w:val="Compact"/>
+            </w:pPr>
+            <w:r>
+              <w:rPr>
+                <w:rStyle w:val="VerbatimChar"/>
+              </w:rPr>
+              <w:t xml:space="preserve">BiologicalReplicate</w:t>
+            </w:r>
+            <w:r>
+              <w:t xml:space="preserve">,</w:t>
+            </w:r>
+            <w:r>
+              <w:t xml:space="preserve"> </w:t>
+            </w:r>
+            <w:r>
+              <w:rPr>
+                <w:rStyle w:val="VerbatimChar"/>
+              </w:rPr>
+              <w:t xml:space="preserve">TechnicalReplicate</w:t>
+            </w:r>
+          </w:p>
+        </w:tc>
+        <w:tc>
+          <w:tcPr/>
+          <w:p>
+            <w:pPr>
+              <w:pStyle w:val="Compact"/>
+            </w:pPr>
+            <w:r>
+              <w:t xml:space="preserve">Replicate identifiers retained in the replicate-values sheet. Selected technical replicates are averaged within each biological replicate before nonlinear fitting; biological replicates are the independent model observations.</w:t>
+            </w:r>
+          </w:p>
+        </w:tc>
+      </w:tr>
+      <w:tr>
+        <w:tc>
+          <w:tcPr/>
+          <w:p>
+            <w:pPr>
+              <w:pStyle w:val="Compact"/>
+            </w:pPr>
+            <w:r>
+              <w:rPr>
+                <w:rStyle w:val="VerbatimChar"/>
+              </w:rPr>
+              <w:t xml:space="preserve">RawValue</w:t>
+            </w:r>
+          </w:p>
+        </w:tc>
+        <w:tc>
+          <w:tcPr/>
+          <w:p>
+            <w:pPr>
+              <w:pStyle w:val="Compact"/>
+            </w:pPr>
+            <w:r>
+              <w:t xml:space="preserve">Observed parameter value retained after the active group and replicate filters.</w:t>
+            </w:r>
+          </w:p>
+        </w:tc>
+      </w:tr>
+      <w:tr>
+        <w:tc>
+          <w:tcPr/>
+          <w:p>
+            <w:pPr>
+              <w:pStyle w:val="Compact"/>
+            </w:pPr>
+            <w:r>
+              <w:rPr>
+                <w:rStyle w:val="VerbatimChar"/>
+              </w:rPr>
+              <w:t xml:space="preserve">NormalizedValue</w:t>
+            </w:r>
+          </w:p>
+        </w:tc>
+        <w:tc>
+          <w:tcPr/>
+          <w:p>
+            <w:pPr>
+              <w:pStyle w:val="Compact"/>
+            </w:pPr>
+            <w:r>
+              <w:t xml:space="preserve">Observed value expressed as percent of the selected control when normalization is enabled.</w:t>
+            </w:r>
+          </w:p>
+        </w:tc>
+      </w:tr>
+      <w:tr>
+        <w:tc>
+          <w:tcPr/>
+          <w:p>
+            <w:pPr>
+              <w:pStyle w:val="Compact"/>
+            </w:pPr>
+            <w:r>
+              <w:rPr>
+                <w:rStyle w:val="VerbatimChar"/>
+              </w:rPr>
+              <w:t xml:space="preserve">ModelValue</w:t>
+            </w:r>
+          </w:p>
+        </w:tc>
+        <w:tc>
+          <w:tcPr/>
+          <w:p>
+            <w:pPr>
+              <w:pStyle w:val="Compact"/>
+            </w:pPr>
+            <w:r>
+              <w:t xml:space="preserve">Value actually supplied to the curve model: raw or normalized according to the selected mode.</w:t>
+            </w:r>
+          </w:p>
+        </w:tc>
+      </w:tr>
+      <w:tr>
+        <w:tc>
+          <w:tcPr/>
+          <w:p>
+            <w:pPr>
+              <w:pStyle w:val="Compact"/>
+            </w:pPr>
+            <w:r>
+              <w:rPr>
+                <w:rStyle w:val="VerbatimChar"/>
+              </w:rPr>
+              <w:t xml:space="preserve">ResultBasis</w:t>
+            </w:r>
+          </w:p>
+        </w:tc>
+        <w:tc>
+          <w:tcPr/>
+          <w:p>
+            <w:pPr>
+              <w:pStyle w:val="Compact"/>
+            </w:pPr>
+            <w:r>
+              <w:t xml:space="preserve">States which response parameter was used to calculate the reported IC50.</w:t>
+            </w:r>
+          </w:p>
+        </w:tc>
+      </w:tr>
+      <w:tr>
+        <w:tc>
+          <w:tcPr/>
+          <w:p>
+            <w:pPr>
+              <w:pStyle w:val="Compact"/>
+            </w:pPr>
+            <w:r>
+              <w:rPr>
+                <w:rStyle w:val="VerbatimChar"/>
+              </w:rPr>
+              <w:t xml:space="preserve">IC50</w:t>
+            </w:r>
+            <w:r>
+              <w:t xml:space="preserve"> </w:t>
+            </w:r>
+            <w:r>
+              <w:t xml:space="preserve">/</w:t>
+            </w:r>
+            <w:r>
+              <w:t xml:space="preserve"> </w:t>
+            </w:r>
+            <w:r>
+              <w:rPr>
+                <w:rStyle w:val="VerbatimChar"/>
+              </w:rPr>
+              <w:t xml:space="preserve">IC50 result</w:t>
+            </w:r>
+          </w:p>
+        </w:tc>
+        <w:tc>
+          <w:tcPr/>
+          <w:p>
+            <w:pPr>
+              <w:pStyle w:val="Compact"/>
+            </w:pPr>
+            <w:r>
+              <w:t xml:space="preserve">Concentration producing 50% of the fitted inhibitory effect relative to the upper fitted response. Lower values generally indicate greater susceptibility. Interpret only an IC50 estimable inside the tested range.</w:t>
+            </w:r>
+          </w:p>
+        </w:tc>
+      </w:tr>
+      <w:tr>
+        <w:tc>
+          <w:tcPr/>
+          <w:p>
+            <w:pPr>
+              <w:pStyle w:val="Compact"/>
+            </w:pPr>
+            <w:r>
+              <w:rPr>
+                <w:rStyle w:val="VerbatimChar"/>
+              </w:rPr>
+              <w:t xml:space="preserve">ED50</w:t>
+            </w:r>
+          </w:p>
+        </w:tc>
+        <w:tc>
+          <w:tcPr/>
+          <w:p>
+            <w:pPr>
+              <w:pStyle w:val="Compact"/>
+            </w:pPr>
+            <w:r>
+              <w:t xml:space="preserve">Relative 50% effective dose. In the current inhibitory</w:t>
+            </w:r>
+            <w:r>
+              <w:t xml:space="preserve"> </w:t>
+            </w:r>
+            <w:r>
+              <w:rPr>
+                <w:rStyle w:val="VerbatimChar"/>
+              </w:rPr>
+              <w:t xml:space="preserve">LL.4</w:t>
+            </w:r>
+            <w:r>
+              <w:t xml:space="preserve"> </w:t>
+            </w:r>
+            <w:r>
+              <w:t xml:space="preserve">implementation it is numerically the same fitted concentration as IC50.</w:t>
+            </w:r>
+          </w:p>
+        </w:tc>
+      </w:tr>
+      <w:tr>
+        <w:tc>
+          <w:tcPr/>
+          <w:p>
+            <w:pPr>
+              <w:pStyle w:val="Compact"/>
+            </w:pPr>
+            <w:r>
+              <w:rPr>
+                <w:rStyle w:val="VerbatimChar"/>
+              </w:rPr>
+              <w:t xml:space="preserve">EC50</w:t>
+            </w:r>
+          </w:p>
+        </w:tc>
+        <w:tc>
+          <w:tcPr/>
+          <w:p>
+            <w:pPr>
+              <w:pStyle w:val="Compact"/>
+            </w:pPr>
+            <w:r>
+              <w:t xml:space="preserve">Conventional half-maximal effective concentration field. It is reported as</w:t>
+            </w:r>
+            <w:r>
+              <w:t xml:space="preserve"> </w:t>
+            </w:r>
+            <w:r>
+              <w:rPr>
+                <w:rStyle w:val="VerbatimChar"/>
+              </w:rPr>
+              <w:t xml:space="preserve">NA</w:t>
+            </w:r>
+            <w:r>
+              <w:t xml:space="preserve"> </w:t>
+            </w:r>
+            <w:r>
+              <w:t xml:space="preserve">because the current BIOSZEN route fits an inhibitory IC50/ED50 model rather than a separate stimulatory EC50 model.</w:t>
+            </w:r>
+          </w:p>
+        </w:tc>
+      </w:tr>
+      <w:tr>
+        <w:tc>
+          <w:tcPr/>
+          <w:p>
+            <w:pPr>
+              <w:pStyle w:val="Compact"/>
+            </w:pPr>
+            <w:r>
+              <w:rPr>
+                <w:rStyle w:val="VerbatimChar"/>
+              </w:rPr>
+              <w:t xml:space="preserve">IC50_SE</w:t>
+            </w:r>
+          </w:p>
+        </w:tc>
+        <w:tc>
+          <w:tcPr/>
+          <w:p>
+            <w:pPr>
+              <w:pStyle w:val="Compact"/>
+            </w:pPr>
+            <w:r>
+              <w:t xml:space="preserve">Delta-method standard error of IC50. Larger values indicate less precise estimation.</w:t>
+            </w:r>
+          </w:p>
+        </w:tc>
+      </w:tr>
+      <w:tr>
+        <w:tc>
+          <w:tcPr/>
+          <w:p>
+            <w:pPr>
+              <w:pStyle w:val="Compact"/>
+            </w:pPr>
+            <w:r>
+              <w:rPr>
+                <w:rStyle w:val="VerbatimChar"/>
+              </w:rPr>
+              <w:t xml:space="preserve">CI_Lower</w:t>
+            </w:r>
+            <w:r>
+              <w:t xml:space="preserve">,</w:t>
+            </w:r>
+            <w:r>
+              <w:t xml:space="preserve"> </w:t>
+            </w:r>
+            <w:r>
+              <w:rPr>
+                <w:rStyle w:val="VerbatimChar"/>
+              </w:rPr>
+              <w:t xml:space="preserve">CI_Upper</w:t>
+            </w:r>
+            <w:r>
+              <w:t xml:space="preserve"> </w:t>
+            </w:r>
+            <w:r>
+              <w:t xml:space="preserve">(95% CI lower/upper in the app)</w:t>
+            </w:r>
+          </w:p>
+        </w:tc>
+        <w:tc>
+          <w:tcPr/>
+          <w:p>
+            <w:pPr>
+              <w:pStyle w:val="Compact"/>
+            </w:pPr>
+            <w:r>
+              <w:t xml:space="preserve">Confidence interval for IC50. Wide intervals or limits extending far beyond the tested range indicate weak precision.</w:t>
+            </w:r>
+          </w:p>
+        </w:tc>
+      </w:tr>
+      <w:tr>
+        <w:tc>
+          <w:tcPr/>
+          <w:p>
+            <w:pPr>
+              <w:pStyle w:val="Compact"/>
+            </w:pPr>
+            <w:r>
+              <w:rPr>
+                <w:rStyle w:val="VerbatimChar"/>
+              </w:rPr>
+              <w:t xml:space="preserve">HillSlope</w:t>
+            </w:r>
+          </w:p>
+        </w:tc>
+        <w:tc>
+          <w:tcPr/>
+          <w:p>
+            <w:pPr>
+              <w:pStyle w:val="Compact"/>
+            </w:pPr>
+            <w:r>
+              <w:t xml:space="preserve">Shape parameter controlling transition steepness on the log-dose scale. For the decreasing inhibitory curves accepted by BIOSZEN it is positive; a larger value gives a sharper transition but is not by itself a susceptibility measure.</w:t>
+            </w:r>
+          </w:p>
+        </w:tc>
+      </w:tr>
+      <w:tr>
+        <w:tc>
+          <w:tcPr/>
+          <w:p>
+            <w:pPr>
+              <w:pStyle w:val="Compact"/>
+            </w:pPr>
+            <w:r>
+              <w:rPr>
+                <w:rStyle w:val="VerbatimChar"/>
+              </w:rPr>
+              <w:t xml:space="preserve">LowerAsymptote</w:t>
+            </w:r>
+          </w:p>
+        </w:tc>
+        <w:tc>
+          <w:tcPr/>
+          <w:p>
+            <w:pPr>
+              <w:pStyle w:val="Compact"/>
+            </w:pPr>
+            <w:r>
+              <w:t xml:space="preserve">Fitted response approached at high concentration. It is an extrapolated model limit and may differ from the lowest observed value.</w:t>
+            </w:r>
+          </w:p>
+        </w:tc>
+      </w:tr>
+      <w:tr>
+        <w:tc>
+          <w:tcPr/>
+          <w:p>
+            <w:pPr>
+              <w:pStyle w:val="Compact"/>
+            </w:pPr>
+            <w:r>
+              <w:rPr>
+                <w:rStyle w:val="VerbatimChar"/>
+              </w:rPr>
+              <w:t xml:space="preserve">UpperAsymptote</w:t>
+            </w:r>
+          </w:p>
+        </w:tc>
+        <w:tc>
+          <w:tcPr/>
+          <w:p>
+            <w:pPr>
+              <w:pStyle w:val="Compact"/>
+            </w:pPr>
+            <w:r>
+              <w:t xml:space="preserve">Fitted response approached at zero or low concentration. It is an extrapolated model limit and may differ from the highest observed value.</w:t>
+            </w:r>
+          </w:p>
+        </w:tc>
+      </w:tr>
+      <w:tr>
+        <w:tc>
+          <w:tcPr/>
+          <w:p>
+            <w:pPr>
+              <w:pStyle w:val="Compact"/>
+            </w:pPr>
+            <w:r>
+              <w:rPr>
+                <w:rStyle w:val="VerbatimChar"/>
+              </w:rPr>
+              <w:t xml:space="preserve">ResponseRange</w:t>
+            </w:r>
+          </w:p>
+        </w:tc>
+        <w:tc>
+          <w:tcPr/>
+          <w:p>
+            <w:pPr>
+              <w:pStyle w:val="Compact"/>
+            </w:pPr>
+            <w:r>
+              <w:rPr>
+                <w:rStyle w:val="VerbatimChar"/>
+              </w:rPr>
+              <w:t xml:space="preserve">UpperAsymptote - LowerAsymptote</w:t>
+            </w:r>
+            <w:r>
+              <w:t xml:space="preserve">; the fitted response amplitude.</w:t>
+            </w:r>
+          </w:p>
+        </w:tc>
+      </w:tr>
+      <w:tr>
+        <w:tc>
+          <w:tcPr/>
+          <w:p>
+            <w:pPr>
+              <w:pStyle w:val="Compact"/>
+            </w:pPr>
+            <w:r>
+              <w:rPr>
+                <w:rStyle w:val="VerbatimChar"/>
+              </w:rPr>
+              <w:t xml:space="preserve">InflectionPoint</w:t>
+            </w:r>
+          </w:p>
+        </w:tc>
+        <w:tc>
+          <w:tcPr/>
+          <w:p>
+            <w:pPr>
+              <w:pStyle w:val="Compact"/>
+            </w:pPr>
+            <w:r>
+              <w:t xml:space="preserve">Concentration at the center of the fitted transition. For this model it normally coincides with the relative ED50/IC50.</w:t>
+            </w:r>
+          </w:p>
+        </w:tc>
+      </w:tr>
+      <w:tr>
+        <w:tc>
+          <w:tcPr/>
+          <w:p>
+            <w:pPr>
+              <w:pStyle w:val="Compact"/>
+            </w:pPr>
+            <w:r>
+              <w:rPr>
+                <w:rStyle w:val="VerbatimChar"/>
+              </w:rPr>
+              <w:t xml:space="preserve">MaximumSlope</w:t>
+            </w:r>
+          </w:p>
+        </w:tc>
+        <w:tc>
+          <w:tcPr/>
+          <w:p>
+            <w:pPr>
+              <w:pStyle w:val="Compact"/>
+            </w:pPr>
+            <w:r>
+              <w:t xml:space="preserve">Steepest fitted change on the raw concentration axis:</w:t>
+            </w:r>
+            <w:r>
+              <w:t xml:space="preserve"> </w:t>
+            </w:r>
+            <w:r>
+              <w:rPr>
+                <w:rStyle w:val="VerbatimChar"/>
+              </w:rPr>
+              <w:t xml:space="preserve">-(ResponseRange * HillSlope) / (4 * InflectionPoint)</w:t>
+            </w:r>
+            <w:r>
+              <w:t xml:space="preserve">. A more negative value means a faster local decrease but depends on both response and concentration units.</w:t>
+            </w:r>
+          </w:p>
+        </w:tc>
+      </w:tr>
+      <w:tr>
+        <w:tc>
+          <w:tcPr/>
+          <w:p>
+            <w:pPr>
+              <w:pStyle w:val="Compact"/>
+            </w:pPr>
+            <w:r>
+              <w:rPr>
+                <w:rStyle w:val="VerbatimChar"/>
+              </w:rPr>
+              <w:t xml:space="preserve">MaximumSlopeMagnitude</w:t>
+            </w:r>
+          </w:p>
+        </w:tc>
+        <w:tc>
+          <w:tcPr/>
+          <w:p>
+            <w:pPr>
+              <w:pStyle w:val="Compact"/>
+            </w:pPr>
+            <w:r>
+              <w:t xml:space="preserve">Absolute value of</w:t>
+            </w:r>
+            <w:r>
+              <w:t xml:space="preserve"> </w:t>
+            </w:r>
+            <w:r>
+              <w:rPr>
+                <w:rStyle w:val="VerbatimChar"/>
+              </w:rPr>
+              <w:t xml:space="preserve">MaximumSlope</w:t>
+            </w:r>
+            <w:r>
+              <w:t xml:space="preserve">, useful when comparing steepness without its negative inhibitory sign. Comparisons still require the same units.</w:t>
+            </w:r>
+          </w:p>
+        </w:tc>
+      </w:tr>
+      <w:tr>
+        <w:tc>
+          <w:tcPr/>
+          <w:p>
+            <w:pPr>
+              <w:pStyle w:val="Compact"/>
+            </w:pPr>
+            <w:r>
+              <w:rPr>
+                <w:rStyle w:val="VerbatimChar"/>
+              </w:rPr>
+              <w:t xml:space="preserve">MinTested</w:t>
+            </w:r>
+            <w:r>
+              <w:t xml:space="preserve">,</w:t>
+            </w:r>
+            <w:r>
+              <w:t xml:space="preserve"> </w:t>
+            </w:r>
+            <w:r>
+              <w:rPr>
+                <w:rStyle w:val="VerbatimChar"/>
+              </w:rPr>
+              <w:t xml:space="preserve">MaxTested</w:t>
+            </w:r>
+          </w:p>
+        </w:tc>
+        <w:tc>
+          <w:tcPr/>
+          <w:p>
+            <w:pPr>
+              <w:pStyle w:val="Compact"/>
+            </w:pPr>
+            <w:r>
+              <w:t xml:space="preserve">Lowest and highest positive concentrations included in the fitted series. They define whether IC50 is inside the experimental range.</w:t>
+            </w:r>
+          </w:p>
+        </w:tc>
+      </w:tr>
+      <w:tr>
+        <w:tc>
+          <w:tcPr/>
+          <w:p>
+            <w:pPr>
+              <w:pStyle w:val="Compact"/>
+            </w:pPr>
+            <w:r>
+              <w:rPr>
+                <w:rStyle w:val="VerbatimChar"/>
+              </w:rPr>
+              <w:t xml:space="preserve">DoseLevels</w:t>
+            </w:r>
+          </w:p>
+        </w:tc>
+        <w:tc>
+          <w:tcPr/>
+          <w:p>
+            <w:pPr>
+              <w:pStyle w:val="Compact"/>
+            </w:pPr>
+            <w:r>
+              <w:t xml:space="preserve">Number of distinct concentrations included, including zero when present. More well-spaced levels generally improve identifiability.</w:t>
+            </w:r>
+          </w:p>
+        </w:tc>
+      </w:tr>
+      <w:tr>
+        <w:tc>
+          <w:tcPr/>
+          <w:p>
+            <w:pPr>
+              <w:pStyle w:val="Compact"/>
+            </w:pPr>
+            <w:r>
+              <w:rPr>
+                <w:rStyle w:val="VerbatimChar"/>
+              </w:rPr>
+              <w:t xml:space="preserve">BiologicalReplicates</w:t>
+            </w:r>
+          </w:p>
+        </w:tc>
+        <w:tc>
+          <w:tcPr/>
+          <w:p>
+            <w:pPr>
+              <w:pStyle w:val="Compact"/>
+            </w:pPr>
+            <w:r>
+              <w:t xml:space="preserve">Number of distinct biological replicates contributing to the strain fit.</w:t>
+            </w:r>
+          </w:p>
+        </w:tc>
+      </w:tr>
+      <w:tr>
+        <w:tc>
+          <w:tcPr/>
+          <w:p>
+            <w:pPr>
+              <w:pStyle w:val="Compact"/>
+            </w:pPr>
+            <w:r>
+              <w:rPr>
+                <w:rStyle w:val="VerbatimChar"/>
+              </w:rPr>
+              <w:t xml:space="preserve">Comparable</w:t>
+            </w:r>
+          </w:p>
+        </w:tc>
+        <w:tc>
+          <w:tcPr/>
+          <w:p>
+            <w:pPr>
+              <w:pStyle w:val="Compact"/>
+            </w:pPr>
+            <w:r>
+              <w:rPr>
+                <w:rStyle w:val="VerbatimChar"/>
+              </w:rPr>
+              <w:t xml:space="preserve">TRUE</w:t>
+            </w:r>
+            <w:r>
+              <w:t xml:space="preserve"> </w:t>
+            </w:r>
+            <w:r>
+              <w:t xml:space="preserve">only for a decreasing inhibitory fit with a finite positive IC50 inside the tested positive range. Only these rows enter ranking and pairwise IC50 tests.</w:t>
+            </w:r>
+          </w:p>
+        </w:tc>
+      </w:tr>
+      <w:tr>
+        <w:tc>
+          <w:tcPr/>
+          <w:p>
+            <w:pPr>
+              <w:pStyle w:val="Compact"/>
+            </w:pPr>
+            <w:r>
+              <w:rPr>
+                <w:rStyle w:val="VerbatimChar"/>
+              </w:rPr>
+              <w:t xml:space="preserve">SusceptibilityRank</w:t>
+            </w:r>
+          </w:p>
+        </w:tc>
+        <w:tc>
+          <w:tcPr/>
+          <w:p>
+            <w:pPr>
+              <w:pStyle w:val="Compact"/>
+            </w:pPr>
+            <w:r>
+              <w:t xml:space="preserve">Rank among comparable strains by ascending IC50. Rank 1 is the lowest IC50; it is descriptive unless supported by the adjusted pairwise comparison.</w:t>
+            </w:r>
+          </w:p>
+        </w:tc>
+      </w:tr>
+      <w:tr>
+        <w:tc>
+          <w:tcPr/>
+          <w:p>
+            <w:pPr>
+              <w:pStyle w:val="Compact"/>
+            </w:pPr>
+            <w:r>
+              <w:rPr>
+                <w:rStyle w:val="VerbatimChar"/>
+              </w:rPr>
+              <w:t xml:space="preserve">RelativeToLowestIC50</w:t>
+            </w:r>
+          </w:p>
+        </w:tc>
+        <w:tc>
+          <w:tcPr/>
+          <w:p>
+            <w:pPr>
+              <w:pStyle w:val="Compact"/>
+            </w:pPr>
+            <w:r>
+              <w:t xml:space="preserve">Strain IC50 divided by the lowest comparable IC50. The lowest strain equals 1; a value of 2 means twice the concentration was required for the same fitted 50% effect.</w:t>
+            </w:r>
+          </w:p>
+        </w:tc>
+      </w:tr>
+      <w:tr>
+        <w:tc>
+          <w:tcPr/>
+          <w:p>
+            <w:pPr>
+              <w:pStyle w:val="Compact"/>
+            </w:pPr>
+            <w:r>
+              <w:rPr>
+                <w:rStyle w:val="VerbatimChar"/>
+              </w:rPr>
+              <w:t xml:space="preserve">Status</w:t>
+            </w:r>
+            <w:r>
+              <w:t xml:space="preserve"> </w:t>
+            </w:r>
+            <w:r>
+              <w:t xml:space="preserve">/</w:t>
+            </w:r>
+            <w:r>
+              <w:t xml:space="preserve"> </w:t>
+            </w:r>
+            <w:r>
+              <w:rPr>
+                <w:rStyle w:val="VerbatimChar"/>
+              </w:rPr>
+              <w:t xml:space="preserve">Fit status</w:t>
+            </w:r>
+          </w:p>
+        </w:tc>
+        <w:tc>
+          <w:tcPr/>
+          <w:p>
+            <w:pPr>
+              <w:pStyle w:val="Compact"/>
+            </w:pPr>
+            <w:r>
+              <w:t xml:space="preserve">Reports whether the fit is usable or why it is not: insufficient doses, flat response, failed convergence, non-inhibitory response, IC50 not estimable, above range, or below range.</w:t>
+            </w:r>
+          </w:p>
+        </w:tc>
+      </w:tr>
+    </w:tbl>
+    <w:bookmarkEnd w:id="115"/>
+    <w:bookmarkStart w:id="116" w:name="X209d8c50cca642f01605b4b789b81fbab03b26f"/>
+    <w:p>
+      <w:pPr>
+        <w:pStyle w:val="Heading4"/>
+      </w:pPr>
+      <w:r>
+        <w:t xml:space="preserve">Interpretation of model diagnostics and strain comparisons</w:t>
+      </w:r>
+    </w:p>
+    <w:tbl>
+      <w:tblPr>
+        <w:tblStyle w:val="Table"/>
+        <w:tblW w:type="auto" w:w="0"/>
+        <w:tblLook w:firstRow="1" w:lastRow="0" w:firstColumn="0" w:lastColumn="0" w:noHBand="0" w:noVBand="0" w:val="0020"/>
+      </w:tblPr>
+      <w:tblGrid>
+        <w:gridCol w:w="3960"/>
+        <w:gridCol w:w="3960"/>
+      </w:tblGrid>
+      <w:tr>
+        <w:trPr>
+          <w:tblHeader w:val="on"/>
+        </w:trPr>
+        <w:tc>
+          <w:tcPr/>
+          <w:p>
+            <w:pPr>
+              <w:pStyle w:val="Compact"/>
+            </w:pPr>
+            <w:r>
+              <w:t xml:space="preserve">Output</w:t>
+            </w:r>
+          </w:p>
+        </w:tc>
+        <w:tc>
+          <w:tcPr/>
+          <w:p>
+            <w:pPr>
+              <w:pStyle w:val="Compact"/>
+            </w:pPr>
+            <w:r>
+              <w:t xml:space="preserve">Interpretation</w:t>
+            </w:r>
+          </w:p>
+        </w:tc>
+      </w:tr>
+      <w:tr>
+        <w:tc>
+          <w:tcPr/>
+          <w:p>
+            <w:pPr>
+              <w:pStyle w:val="Compact"/>
+            </w:pPr>
+            <w:r>
+              <w:rPr>
+                <w:rStyle w:val="VerbatimChar"/>
+              </w:rPr>
+              <w:t xml:space="preserve">Model</w:t>
+            </w:r>
+          </w:p>
+        </w:tc>
+        <w:tc>
+          <w:tcPr/>
+          <w:p>
+            <w:pPr>
+              <w:pStyle w:val="Compact"/>
+            </w:pPr>
+            <w:r>
+              <w:t xml:space="preserve">Model used for the strain; currently the four-parameter log-logistic model (</w:t>
+            </w:r>
+            <w:r>
+              <w:rPr>
+                <w:rStyle w:val="VerbatimChar"/>
+              </w:rPr>
+              <w:t xml:space="preserve">LL.4</w:t>
+            </w:r>
+            <w:r>
+              <w:t xml:space="preserve">).</w:t>
+            </w:r>
+          </w:p>
+        </w:tc>
+      </w:tr>
+      <w:tr>
+        <w:tc>
+          <w:tcPr/>
+          <w:p>
+            <w:pPr>
+              <w:pStyle w:val="Compact"/>
+            </w:pPr>
+            <w:r>
+              <w:rPr>
+                <w:rStyle w:val="VerbatimChar"/>
+              </w:rPr>
+              <w:t xml:space="preserve">Observations</w:t>
+            </w:r>
+          </w:p>
+        </w:tc>
+        <w:tc>
+          <w:tcPr/>
+          <w:p>
+            <w:pPr>
+              <w:pStyle w:val="Compact"/>
+            </w:pPr>
+            <w:r>
+              <w:t xml:space="preserve">Number of biological-replicate response values used in the fit after filtering and within-dose technical averaging.</w:t>
+            </w:r>
+          </w:p>
+        </w:tc>
+      </w:tr>
+      <w:tr>
+        <w:tc>
+          <w:tcPr/>
+          <w:p>
+            <w:pPr>
+              <w:pStyle w:val="Compact"/>
+            </w:pPr>
+            <w:r>
+              <w:rPr>
+                <w:rStyle w:val="VerbatimChar"/>
+              </w:rPr>
+              <w:t xml:space="preserve">ResidualDF</w:t>
+            </w:r>
+          </w:p>
+        </w:tc>
+        <w:tc>
+          <w:tcPr/>
+          <w:p>
+            <w:pPr>
+              <w:pStyle w:val="Compact"/>
+            </w:pPr>
+            <w:r>
+              <w:t xml:space="preserve">Residual degrees of freedom: observations minus the four fitted model parameters.</w:t>
+            </w:r>
+          </w:p>
+        </w:tc>
+      </w:tr>
+      <w:tr>
+        <w:tc>
+          <w:tcPr/>
+          <w:p>
+            <w:pPr>
+              <w:pStyle w:val="Compact"/>
+            </w:pPr>
+            <w:r>
+              <w:rPr>
+                <w:rStyle w:val="VerbatimChar"/>
+              </w:rPr>
+              <w:t xml:space="preserve">RSS</w:t>
+            </w:r>
+          </w:p>
+        </w:tc>
+        <w:tc>
+          <w:tcPr/>
+          <w:p>
+            <w:pPr>
+              <w:pStyle w:val="Compact"/>
+            </w:pPr>
+            <w:r>
+              <w:t xml:space="preserve">Residual sum of squares. Lower is better only when comparing fits to the same response and observations.</w:t>
+            </w:r>
+          </w:p>
+        </w:tc>
+      </w:tr>
+      <w:tr>
+        <w:tc>
+          <w:tcPr/>
+          <w:p>
+            <w:pPr>
+              <w:pStyle w:val="Compact"/>
+            </w:pPr>
+            <w:r>
+              <w:rPr>
+                <w:rStyle w:val="VerbatimChar"/>
+              </w:rPr>
+              <w:t xml:space="preserve">RMSE</w:t>
+            </w:r>
+          </w:p>
+        </w:tc>
+        <w:tc>
+          <w:tcPr/>
+          <w:p>
+            <w:pPr>
+              <w:pStyle w:val="Compact"/>
+            </w:pPr>
+            <w:r>
+              <w:t xml:space="preserve">Typical residual error in response units. Lower values indicate predictions closer to observations.</w:t>
+            </w:r>
+          </w:p>
+        </w:tc>
+      </w:tr>
+      <w:tr>
+        <w:tc>
+          <w:tcPr/>
+          <w:p>
+            <w:pPr>
+              <w:pStyle w:val="Compact"/>
+            </w:pPr>
+            <w:r>
+              <w:rPr>
+                <w:rStyle w:val="VerbatimChar"/>
+              </w:rPr>
+              <w:t xml:space="preserve">R_Squared</w:t>
+            </w:r>
+            <w:r>
+              <w:t xml:space="preserve">,</w:t>
+            </w:r>
+            <w:r>
+              <w:t xml:space="preserve"> </w:t>
+            </w:r>
+            <w:r>
+              <w:rPr>
+                <w:rStyle w:val="VerbatimChar"/>
+              </w:rPr>
+              <w:t xml:space="preserve">Adjusted_R_Squared</w:t>
+            </w:r>
+          </w:p>
+        </w:tc>
+        <w:tc>
+          <w:tcPr/>
+          <w:p>
+            <w:pPr>
+              <w:pStyle w:val="Compact"/>
+            </w:pPr>
+            <w:r>
+              <w:t xml:space="preserve">Descriptive proportion of response variation represented by the curve; adjusted R² accounts for four fitted parameters. For nonlinear models these should not be the sole acceptance criterion.</w:t>
+            </w:r>
+          </w:p>
+        </w:tc>
+      </w:tr>
+      <w:tr>
+        <w:tc>
+          <w:tcPr/>
+          <w:p>
+            <w:pPr>
+              <w:pStyle w:val="Compact"/>
+            </w:pPr>
+            <w:r>
+              <w:rPr>
+                <w:rStyle w:val="VerbatimChar"/>
+              </w:rPr>
+              <w:t xml:space="preserve">AIC</w:t>
+            </w:r>
+            <w:r>
+              <w:t xml:space="preserve">,</w:t>
+            </w:r>
+            <w:r>
+              <w:t xml:space="preserve"> </w:t>
+            </w:r>
+            <w:r>
+              <w:rPr>
+                <w:rStyle w:val="VerbatimChar"/>
+              </w:rPr>
+              <w:t xml:space="preserve">BIC</w:t>
+            </w:r>
+          </w:p>
+        </w:tc>
+        <w:tc>
+          <w:tcPr/>
+          <w:p>
+            <w:pPr>
+              <w:pStyle w:val="Compact"/>
+            </w:pPr>
+            <w:r>
+              <w:t xml:space="preserve">Information criteria for relative model comparison on the same dataset and response. Lower values are preferred; absolute values have no standalone biological interpretation.</w:t>
+            </w:r>
+          </w:p>
+        </w:tc>
+      </w:tr>
+      <w:tr>
+        <w:tc>
+          <w:tcPr/>
+          <w:p>
+            <w:pPr>
+              <w:pStyle w:val="Compact"/>
+            </w:pPr>
+            <w:r>
+              <w:rPr>
+                <w:rStyle w:val="VerbatimChar"/>
+              </w:rPr>
+              <w:t xml:space="preserve">LogLikelihood</w:t>
+            </w:r>
+          </w:p>
+        </w:tc>
+        <w:tc>
+          <w:tcPr/>
+          <w:p>
+            <w:pPr>
+              <w:pStyle w:val="Compact"/>
+            </w:pPr>
+            <w:r>
+              <w:t xml:space="preserve">Model log likelihood. Higher values indicate better likelihood fit only for comparable models fitted to the same observations.</w:t>
+            </w:r>
+          </w:p>
+        </w:tc>
+      </w:tr>
+      <w:tr>
+        <w:tc>
+          <w:tcPr/>
+          <w:p>
+            <w:pPr>
+              <w:pStyle w:val="Compact"/>
+            </w:pPr>
+            <w:r>
+              <w:rPr>
+                <w:rStyle w:val="VerbatimChar"/>
+              </w:rPr>
+              <w:t xml:space="preserve">LinearSlope</w:t>
+            </w:r>
+            <w:r>
+              <w:t xml:space="preserve">,</w:t>
+            </w:r>
+            <w:r>
+              <w:t xml:space="preserve"> </w:t>
+            </w:r>
+            <w:r>
+              <w:rPr>
+                <w:rStyle w:val="VerbatimChar"/>
+              </w:rPr>
+              <w:t xml:space="preserve">LinearSlopeSE</w:t>
+            </w:r>
+          </w:p>
+        </w:tc>
+        <w:tc>
+          <w:tcPr/>
+          <w:p>
+            <w:pPr>
+              <w:pStyle w:val="Compact"/>
+            </w:pPr>
+            <w:r>
+              <w:t xml:space="preserve">Optional slope and standard error from</w:t>
+            </w:r>
+            <w:r>
+              <w:t xml:space="preserve"> </w:t>
+            </w:r>
+            <w:r>
+              <w:rPr>
+                <w:rStyle w:val="VerbatimChar"/>
+              </w:rPr>
+              <w:t xml:space="preserve">Response ~ Concentration</w:t>
+            </w:r>
+            <w:r>
+              <w:t xml:space="preserve">. This is a coarse whole-range trend and does not replace IC50 or the nonlinear maximum slope.</w:t>
+            </w:r>
+          </w:p>
+        </w:tc>
+      </w:tr>
+      <w:tr>
+        <w:tc>
+          <w:tcPr/>
+          <w:p>
+            <w:pPr>
+              <w:pStyle w:val="Compact"/>
+            </w:pPr>
+            <w:r>
+              <w:rPr>
+                <w:rStyle w:val="VerbatimChar"/>
+              </w:rPr>
+              <w:t xml:space="preserve">LinearSlopeCI_Lower</w:t>
+            </w:r>
+            <w:r>
+              <w:t xml:space="preserve">,</w:t>
+            </w:r>
+            <w:r>
+              <w:t xml:space="preserve"> </w:t>
+            </w:r>
+            <w:r>
+              <w:rPr>
+                <w:rStyle w:val="VerbatimChar"/>
+              </w:rPr>
+              <w:t xml:space="preserve">LinearSlopeCI_Upper</w:t>
+            </w:r>
+          </w:p>
+        </w:tc>
+        <w:tc>
+          <w:tcPr/>
+          <w:p>
+            <w:pPr>
+              <w:pStyle w:val="Compact"/>
+            </w:pPr>
+            <w:r>
+              <w:t xml:space="preserve">Optional 95% confidence interval for the linear trend slope. An interval containing zero does not support a nonzero linear trend.</w:t>
+            </w:r>
+          </w:p>
+        </w:tc>
+      </w:tr>
+      <w:tr>
+        <w:tc>
+          <w:tcPr/>
+          <w:p>
+            <w:pPr>
+              <w:pStyle w:val="Compact"/>
+            </w:pPr>
+            <w:r>
+              <w:rPr>
+                <w:rStyle w:val="VerbatimChar"/>
+              </w:rPr>
+              <w:t xml:space="preserve">LinearSlopeP_Value</w:t>
+            </w:r>
+          </w:p>
+        </w:tc>
+        <w:tc>
+          <w:tcPr/>
+          <w:p>
+            <w:pPr>
+              <w:pStyle w:val="Compact"/>
+            </w:pPr>
+            <w:r>
+              <w:t xml:space="preserve">Optional test of whether the whole-range linear slope differs from zero. It does not test equality of IC50 values.</w:t>
+            </w:r>
+          </w:p>
+        </w:tc>
+      </w:tr>
+      <w:tr>
+        <w:tc>
+          <w:tcPr/>
+          <w:p>
+            <w:pPr>
+              <w:pStyle w:val="Compact"/>
+            </w:pPr>
+            <w:r>
+              <w:rPr>
+                <w:rStyle w:val="VerbatimChar"/>
+              </w:rPr>
+              <w:t xml:space="preserve">Linear_R_Squared</w:t>
+            </w:r>
+          </w:p>
+        </w:tc>
+        <w:tc>
+          <w:tcPr/>
+          <w:p>
+            <w:pPr>
+              <w:pStyle w:val="Compact"/>
+            </w:pPr>
+            <w:r>
+              <w:t xml:space="preserve">Descriptive R² for the optional linear trend.</w:t>
+            </w:r>
+          </w:p>
+        </w:tc>
+      </w:tr>
+      <w:tr>
+        <w:tc>
+          <w:tcPr/>
+          <w:p>
+            <w:pPr>
+              <w:pStyle w:val="Compact"/>
+            </w:pPr>
+            <w:r>
+              <w:rPr>
+                <w:rStyle w:val="VerbatimChar"/>
+              </w:rPr>
+              <w:t xml:space="preserve">Converged</w:t>
+            </w:r>
+          </w:p>
+        </w:tc>
+        <w:tc>
+          <w:tcPr/>
+          <w:p>
+            <w:pPr>
+              <w:pStyle w:val="Compact"/>
+            </w:pPr>
+            <w:r>
+              <w:t xml:space="preserve">Indicates whether the nonlinear fit object was successfully obtained. Convergence is necessary but does not guarantee biological plausibility or precision.</w:t>
+            </w:r>
+          </w:p>
+        </w:tc>
+      </w:tr>
+      <w:tr>
+        <w:tc>
+          <w:tcPr/>
+          <w:p>
+            <w:pPr>
+              <w:pStyle w:val="Compact"/>
+            </w:pPr>
+            <w:r>
+              <w:rPr>
+                <w:rStyle w:val="VerbatimChar"/>
+              </w:rPr>
+              <w:t xml:space="preserve">StrainA</w:t>
+            </w:r>
+            <w:r>
+              <w:t xml:space="preserve">,</w:t>
+            </w:r>
+            <w:r>
+              <w:t xml:space="preserve"> </w:t>
+            </w:r>
+            <w:r>
+              <w:rPr>
+                <w:rStyle w:val="VerbatimChar"/>
+              </w:rPr>
+              <w:t xml:space="preserve">StrainB</w:t>
+            </w:r>
+          </w:p>
+        </w:tc>
+        <w:tc>
+          <w:tcPr/>
+          <w:p>
+            <w:pPr>
+              <w:pStyle w:val="Compact"/>
+            </w:pPr>
+            <w:r>
+              <w:t xml:space="preserve">Identify the ordered strain pair used for the ratio and Wald comparison.</w:t>
+            </w:r>
+          </w:p>
+        </w:tc>
+      </w:tr>
+      <w:tr>
+        <w:tc>
+          <w:tcPr/>
+          <w:p>
+            <w:pPr>
+              <w:pStyle w:val="Compact"/>
+            </w:pPr>
+            <w:r>
+              <w:rPr>
+                <w:rStyle w:val="VerbatimChar"/>
+              </w:rPr>
+              <w:t xml:space="preserve">IC50_Ratio_A_over_B</w:t>
+            </w:r>
+            <w:r>
+              <w:t xml:space="preserve"> </w:t>
+            </w:r>
+            <w:r>
+              <w:t xml:space="preserve">(IC50 ratio A/B in the app)</w:t>
+            </w:r>
+          </w:p>
+        </w:tc>
+        <w:tc>
+          <w:tcPr/>
+          <w:p>
+            <w:pPr>
+              <w:pStyle w:val="Compact"/>
+            </w:pPr>
+            <w:r>
+              <w:rPr>
+                <w:rStyle w:val="VerbatimChar"/>
+              </w:rPr>
+              <w:t xml:space="preserve">IC50_A / IC50_B</w:t>
+            </w:r>
+            <w:r>
+              <w:t xml:space="preserve">. A ratio above 1 means strain A required a higher concentration and is descriptively less susceptible than B.</w:t>
+            </w:r>
+          </w:p>
+        </w:tc>
+      </w:tr>
+      <w:tr>
+        <w:tc>
+          <w:tcPr/>
+          <w:p>
+            <w:pPr>
+              <w:pStyle w:val="Compact"/>
+            </w:pPr>
+            <w:r>
+              <w:rPr>
+                <w:rStyle w:val="VerbatimChar"/>
+              </w:rPr>
+              <w:t xml:space="preserve">Ratio_CI_Lower</w:t>
+            </w:r>
+            <w:r>
+              <w:t xml:space="preserve">,</w:t>
+            </w:r>
+            <w:r>
+              <w:t xml:space="preserve"> </w:t>
+            </w:r>
+            <w:r>
+              <w:rPr>
+                <w:rStyle w:val="VerbatimChar"/>
+              </w:rPr>
+              <w:t xml:space="preserve">Ratio_CI_Upper</w:t>
+            </w:r>
+          </w:p>
+        </w:tc>
+        <w:tc>
+          <w:tcPr/>
+          <w:p>
+            <w:pPr>
+              <w:pStyle w:val="Compact"/>
+            </w:pPr>
+            <w:r>
+              <w:t xml:space="preserve">Delta-method 95% confidence interval for the IC50 ratio. An interval excluding 1 supports a difference before considering the multiplicity-adjusted test.</w:t>
+            </w:r>
+          </w:p>
+        </w:tc>
+      </w:tr>
+      <w:tr>
+        <w:tc>
+          <w:tcPr/>
+          <w:p>
+            <w:pPr>
+              <w:pStyle w:val="Compact"/>
+            </w:pPr>
+            <w:r>
+              <w:rPr>
+                <w:rStyle w:val="VerbatimChar"/>
+              </w:rPr>
+              <w:t xml:space="preserve">P_Value</w:t>
+            </w:r>
+            <w:r>
+              <w:t xml:space="preserve">,</w:t>
+            </w:r>
+            <w:r>
+              <w:t xml:space="preserve"> </w:t>
+            </w:r>
+            <w:r>
+              <w:rPr>
+                <w:rStyle w:val="VerbatimChar"/>
+              </w:rPr>
+              <w:t xml:space="preserve">P_Adjusted</w:t>
+            </w:r>
+          </w:p>
+        </w:tc>
+        <w:tc>
+          <w:tcPr/>
+          <w:p>
+            <w:pPr>
+              <w:pStyle w:val="Compact"/>
+            </w:pPr>
+            <w:r>
+              <w:t xml:space="preserve">Two-sided Wald test on the log IC50 ratio and its Holm correction across strain pairs. Use the adjusted value for the reported pairwise conclusion.</w:t>
+            </w:r>
+          </w:p>
+        </w:tc>
+      </w:tr>
+      <w:tr>
+        <w:tc>
+          <w:tcPr/>
+          <w:p>
+            <w:pPr>
+              <w:pStyle w:val="Compact"/>
+            </w:pPr>
+            <w:r>
+              <w:rPr>
+                <w:rStyle w:val="VerbatimChar"/>
+              </w:rPr>
+              <w:t xml:space="preserve">LowerIC50Strain</w:t>
+            </w:r>
+          </w:p>
+        </w:tc>
+        <w:tc>
+          <w:tcPr/>
+          <w:p>
+            <w:pPr>
+              <w:pStyle w:val="Compact"/>
+            </w:pPr>
+            <w:r>
+              <w:t xml:space="preserve">Identifies which member of the pair has the lower estimable IC50; this is the descriptively more susceptible strain when the fits are comparable.</w:t>
+            </w:r>
+          </w:p>
+        </w:tc>
+      </w:tr>
+      <w:tr>
+        <w:tc>
+          <w:tcPr/>
+          <w:p>
+            <w:pPr>
+              <w:pStyle w:val="Compact"/>
+            </w:pPr>
+            <w:r>
+              <w:rPr>
+                <w:rStyle w:val="VerbatimChar"/>
+              </w:rPr>
+              <w:t xml:space="preserve">ConclusionCode</w:t>
+            </w:r>
+            <w:r>
+              <w:t xml:space="preserve"> </w:t>
+            </w:r>
+            <w:r>
+              <w:t xml:space="preserve">/</w:t>
+            </w:r>
+            <w:r>
+              <w:t xml:space="preserve"> </w:t>
+            </w:r>
+            <w:r>
+              <w:rPr>
+                <w:rStyle w:val="VerbatimChar"/>
+              </w:rPr>
+              <w:t xml:space="preserve">Interpretation</w:t>
+            </w:r>
+          </w:p>
+        </w:tc>
+        <w:tc>
+          <w:tcPr/>
+          <w:p>
+            <w:pPr>
+              <w:pStyle w:val="Compact"/>
+            </w:pPr>
+            <w:r>
+              <w:t xml:space="preserve">Machine-readable conclusion (</w:t>
+            </w:r>
+            <w:r>
+              <w:rPr>
+                <w:rStyle w:val="VerbatimChar"/>
+              </w:rPr>
+              <w:t xml:space="preserve">different</w:t>
+            </w:r>
+            <w:r>
+              <w:t xml:space="preserve"> </w:t>
+            </w:r>
+            <w:r>
+              <w:t xml:space="preserve">or</w:t>
+            </w:r>
+            <w:r>
+              <w:t xml:space="preserve"> </w:t>
+            </w:r>
+            <w:r>
+              <w:rPr>
+                <w:rStyle w:val="VerbatimChar"/>
+              </w:rPr>
+              <w:t xml:space="preserve">not_significant</w:t>
+            </w:r>
+            <w:r>
+              <w:t xml:space="preserve">) and its plain-language app translation, based on the Holm-adjusted result.</w:t>
+            </w:r>
+          </w:p>
+        </w:tc>
+      </w:tr>
+    </w:tbl>
+    <w:bookmarkEnd w:id="116"/>
+    <w:bookmarkEnd w:id="117"/>
+    <w:bookmarkStart w:id="118" w:name="heatmap"/>
+    <w:p>
+      <w:pPr>
+        <w:pStyle w:val="Heading3"/>
+      </w:pPr>
+      <w:r>
         <w:t xml:space="preserve">Heatmap</w:t>
       </w:r>
     </w:p>
@@ -3883,7 +5875,7 @@
         <w:pStyle w:val="Compact"/>
         <w:numPr>
           <w:ilvl w:val="0"/>
-          <w:numId w:val="1028"/>
+          <w:numId w:val="1029"/>
         </w:numPr>
       </w:pPr>
       <w:r>
@@ -3895,7 +5887,7 @@
         <w:pStyle w:val="Compact"/>
         <w:numPr>
           <w:ilvl w:val="0"/>
-          <w:numId w:val="1028"/>
+          <w:numId w:val="1029"/>
         </w:numPr>
       </w:pPr>
       <w:r>
@@ -3907,7 +5899,7 @@
         <w:pStyle w:val="Compact"/>
         <w:numPr>
           <w:ilvl w:val="0"/>
-          <w:numId w:val="1028"/>
+          <w:numId w:val="1029"/>
         </w:numPr>
       </w:pPr>
       <w:r>
@@ -3919,15 +5911,15 @@
         <w:pStyle w:val="Compact"/>
         <w:numPr>
           <w:ilvl w:val="0"/>
-          <w:numId w:val="1028"/>
+          <w:numId w:val="1029"/>
         </w:numPr>
       </w:pPr>
       <w:r>
         <w:t xml:space="preserve">Optional in-cell value labels.</w:t>
       </w:r>
     </w:p>
-    <w:bookmarkEnd w:id="45"/>
-    <w:bookmarkStart w:id="46" w:name="correlation-matrix"/>
+    <w:bookmarkEnd w:id="118"/>
+    <w:bookmarkStart w:id="119" w:name="correlation-matrix"/>
     <w:p>
       <w:pPr>
         <w:pStyle w:val="Heading3"/>
@@ -3941,7 +5933,7 @@
         <w:pStyle w:val="Compact"/>
         <w:numPr>
           <w:ilvl w:val="0"/>
-          <w:numId w:val="1029"/>
+          <w:numId w:val="1030"/>
         </w:numPr>
       </w:pPr>
       <w:r>
@@ -3953,7 +5945,7 @@
         <w:pStyle w:val="Compact"/>
         <w:numPr>
           <w:ilvl w:val="0"/>
-          <w:numId w:val="1029"/>
+          <w:numId w:val="1030"/>
         </w:numPr>
       </w:pPr>
       <w:r>
@@ -3965,15 +5957,15 @@
         <w:pStyle w:val="Compact"/>
         <w:numPr>
           <w:ilvl w:val="0"/>
-          <w:numId w:val="1029"/>
+          <w:numId w:val="1030"/>
         </w:numPr>
       </w:pPr>
       <w:r>
         <w:t xml:space="preserve">Optional significant labels only.</w:t>
       </w:r>
     </w:p>
-    <w:bookmarkEnd w:id="46"/>
-    <w:bookmarkStart w:id="47" w:name="curves"/>
+    <w:bookmarkEnd w:id="119"/>
+    <w:bookmarkStart w:id="120" w:name="curves"/>
     <w:p>
       <w:pPr>
         <w:pStyle w:val="Heading3"/>
@@ -3987,7 +5979,7 @@
         <w:pStyle w:val="Compact"/>
         <w:numPr>
           <w:ilvl w:val="0"/>
-          <w:numId w:val="1030"/>
+          <w:numId w:val="1031"/>
         </w:numPr>
       </w:pPr>
       <w:r>
@@ -3999,7 +5991,7 @@
         <w:pStyle w:val="Compact"/>
         <w:numPr>
           <w:ilvl w:val="0"/>
-          <w:numId w:val="1030"/>
+          <w:numId w:val="1031"/>
         </w:numPr>
       </w:pPr>
       <w:r>
@@ -4011,7 +6003,7 @@
         <w:pStyle w:val="Compact"/>
         <w:numPr>
           <w:ilvl w:val="0"/>
-          <w:numId w:val="1030"/>
+          <w:numId w:val="1031"/>
         </w:numPr>
       </w:pPr>
       <w:r>
@@ -4023,7 +6015,7 @@
         <w:pStyle w:val="Compact"/>
         <w:numPr>
           <w:ilvl w:val="0"/>
-          <w:numId w:val="1030"/>
+          <w:numId w:val="1031"/>
         </w:numPr>
       </w:pPr>
       <w:r>
@@ -4040,8 +6032,8 @@
         <w:t xml:space="preserve">controls the visible markers when the line-and-points geometry is selected. It changes marker size only; curve values, line geometry, and statistical results are not altered.</w:t>
       </w:r>
     </w:p>
-    <w:bookmarkEnd w:id="47"/>
-    <w:bookmarkStart w:id="51" w:name="shared-plot-appearance-controls"/>
+    <w:bookmarkEnd w:id="120"/>
+    <w:bookmarkStart w:id="124" w:name="shared-plot-appearance-controls"/>
     <w:p>
       <w:pPr>
         <w:pStyle w:val="Heading3"/>
@@ -4055,7 +6047,7 @@
         <w:pStyle w:val="Compact"/>
         <w:numPr>
           <w:ilvl w:val="0"/>
-          <w:numId w:val="1031"/>
+          <w:numId w:val="1032"/>
         </w:numPr>
       </w:pPr>
       <w:r>
@@ -4083,61 +6075,61 @@
         <w:pStyle w:val="Compact"/>
         <w:numPr>
           <w:ilvl w:val="1"/>
+          <w:numId w:val="1033"/>
+        </w:numPr>
+      </w:pPr>
+      <w:r>
+        <w:rPr>
+          <w:rStyle w:val="VerbatimChar"/>
+        </w:rPr>
+        <w:t xml:space="preserve">SD</w:t>
+      </w:r>
+      <w:r>
+        <w:t xml:space="preserve">: mean +/- standard deviation.</w:t>
+      </w:r>
+    </w:p>
+    <w:p>
+      <w:pPr>
+        <w:pStyle w:val="Compact"/>
+        <w:numPr>
+          <w:ilvl w:val="1"/>
+          <w:numId w:val="1033"/>
+        </w:numPr>
+      </w:pPr>
+      <w:r>
+        <w:rPr>
+          <w:rStyle w:val="VerbatimChar"/>
+        </w:rPr>
+        <w:t xml:space="preserve">SEM</w:t>
+      </w:r>
+      <w:r>
+        <w:t xml:space="preserve">: mean +/- standard error.</w:t>
+      </w:r>
+    </w:p>
+    <w:p>
+      <w:pPr>
+        <w:pStyle w:val="Compact"/>
+        <w:numPr>
+          <w:ilvl w:val="1"/>
+          <w:numId w:val="1033"/>
+        </w:numPr>
+      </w:pPr>
+      <w:r>
+        <w:rPr>
+          <w:rStyle w:val="VerbatimChar"/>
+        </w:rPr>
+        <w:t xml:space="preserve">Min-Max</w:t>
+      </w:r>
+      <w:r>
+        <w:t xml:space="preserve">: observed minimum to maximum; available only for Boxplot.</w:t>
+      </w:r>
+    </w:p>
+    <w:p>
+      <w:pPr>
+        <w:pStyle w:val="Compact"/>
+        <w:numPr>
+          <w:ilvl w:val="0"/>
           <w:numId w:val="1032"/>
-        </w:numPr>
-      </w:pPr>
-      <w:r>
-        <w:rPr>
-          <w:rStyle w:val="VerbatimChar"/>
-        </w:rPr>
-        <w:t xml:space="preserve">SD</w:t>
-      </w:r>
-      <w:r>
-        <w:t xml:space="preserve">: mean +/- standard deviation.</w:t>
-      </w:r>
-    </w:p>
-    <w:p>
-      <w:pPr>
-        <w:pStyle w:val="Compact"/>
-        <w:numPr>
-          <w:ilvl w:val="1"/>
-          <w:numId w:val="1032"/>
-        </w:numPr>
-      </w:pPr>
-      <w:r>
-        <w:rPr>
-          <w:rStyle w:val="VerbatimChar"/>
-        </w:rPr>
-        <w:t xml:space="preserve">SEM</w:t>
-      </w:r>
-      <w:r>
-        <w:t xml:space="preserve">: mean +/- standard error.</w:t>
-      </w:r>
-    </w:p>
-    <w:p>
-      <w:pPr>
-        <w:pStyle w:val="Compact"/>
-        <w:numPr>
-          <w:ilvl w:val="1"/>
-          <w:numId w:val="1032"/>
-        </w:numPr>
-      </w:pPr>
-      <w:r>
-        <w:rPr>
-          <w:rStyle w:val="VerbatimChar"/>
-        </w:rPr>
-        <w:t xml:space="preserve">Min-Max</w:t>
-      </w:r>
-      <w:r>
-        <w:t xml:space="preserve">: observed minimum to maximum; available only for Boxplot.</w:t>
-      </w:r>
-    </w:p>
-    <w:p>
-      <w:pPr>
-        <w:pStyle w:val="Compact"/>
-        <w:numPr>
-          <w:ilvl w:val="0"/>
-          <w:numId w:val="1031"/>
         </w:numPr>
       </w:pPr>
       <w:r>
@@ -4165,7 +6157,7 @@
         <w:pStyle w:val="Compact"/>
         <w:numPr>
           <w:ilvl w:val="0"/>
-          <w:numId w:val="1031"/>
+          <w:numId w:val="1032"/>
         </w:numPr>
       </w:pPr>
       <w:r>
@@ -4187,7 +6179,7 @@
         <w:pStyle w:val="Compact"/>
         <w:numPr>
           <w:ilvl w:val="0"/>
-          <w:numId w:val="1031"/>
+          <w:numId w:val="1032"/>
         </w:numPr>
       </w:pPr>
       <w:r>
@@ -4199,7 +6191,7 @@
         <w:pStyle w:val="Compact"/>
         <w:numPr>
           <w:ilvl w:val="0"/>
-          <w:numId w:val="1031"/>
+          <w:numId w:val="1032"/>
         </w:numPr>
       </w:pPr>
       <w:r>
@@ -4211,7 +6203,7 @@
         <w:pStyle w:val="Compact"/>
         <w:numPr>
           <w:ilvl w:val="0"/>
-          <w:numId w:val="1031"/>
+          <w:numId w:val="1032"/>
         </w:numPr>
       </w:pPr>
       <w:r>
@@ -4223,7 +6215,7 @@
         <w:pStyle w:val="Compact"/>
         <w:numPr>
           <w:ilvl w:val="0"/>
-          <w:numId w:val="1031"/>
+          <w:numId w:val="1032"/>
         </w:numPr>
       </w:pPr>
       <w:r>
@@ -4235,7 +6227,7 @@
         <w:pStyle w:val="Compact"/>
         <w:numPr>
           <w:ilvl w:val="0"/>
-          <w:numId w:val="1031"/>
+          <w:numId w:val="1032"/>
         </w:numPr>
       </w:pPr>
       <w:r>
@@ -4253,7 +6245,7 @@
         <w:pStyle w:val="Compact"/>
         <w:numPr>
           <w:ilvl w:val="0"/>
-          <w:numId w:val="1031"/>
+          <w:numId w:val="1032"/>
         </w:numPr>
       </w:pPr>
       <w:r>
@@ -4299,18 +6291,18 @@
           <wp:inline>
             <wp:extent cx="3185962" cy="5014762"/>
             <wp:effectExtent b="0" l="0" r="0" t="0"/>
-            <wp:docPr descr="Text styling controls" title="" id="49" name="Picture"/>
+            <wp:docPr descr="Text styling controls" title="" id="122" name="Picture"/>
             <a:graphic>
               <a:graphicData uri="http://schemas.openxmlformats.org/drawingml/2006/picture">
                 <pic:pic>
                   <pic:nvPicPr>
-                    <pic:cNvPr descr="manual_images/11_text_styling_controls.png" id="50" name="Picture"/>
+                    <pic:cNvPr descr="manual_images/11_text_styling_controls.png" id="123" name="Picture"/>
                     <pic:cNvPicPr>
                       <a:picLocks noChangeArrowheads="1" noChangeAspect="1"/>
                     </pic:cNvPicPr>
                   </pic:nvPicPr>
                   <pic:blipFill>
-                    <a:blip r:embed="rId48"/>
+                    <a:blip r:embed="rId121"/>
                     <a:stretch>
                       <a:fillRect/>
                     </a:stretch>
@@ -4337,8 +6329,8 @@
         </w:drawing>
       </w:r>
     </w:p>
-    <w:bookmarkEnd w:id="51"/>
-    <w:bookmarkStart w:id="56" w:name="composition-panel"/>
+    <w:bookmarkEnd w:id="124"/>
+    <w:bookmarkStart w:id="129" w:name="composition-panel"/>
     <w:p>
       <w:pPr>
         <w:pStyle w:val="Heading3"/>
@@ -4360,7 +6352,7 @@
         <w:pStyle w:val="Compact"/>
         <w:numPr>
           <w:ilvl w:val="0"/>
-          <w:numId w:val="1033"/>
+          <w:numId w:val="1034"/>
         </w:numPr>
       </w:pPr>
       <w:r>
@@ -4385,7 +6377,7 @@
         <w:pStyle w:val="Compact"/>
         <w:numPr>
           <w:ilvl w:val="0"/>
-          <w:numId w:val="1033"/>
+          <w:numId w:val="1034"/>
         </w:numPr>
       </w:pPr>
       <w:r>
@@ -4413,7 +6405,7 @@
         <w:pStyle w:val="Compact"/>
         <w:numPr>
           <w:ilvl w:val="0"/>
-          <w:numId w:val="1033"/>
+          <w:numId w:val="1034"/>
         </w:numPr>
       </w:pPr>
       <w:r>
@@ -4425,7 +6417,7 @@
         <w:pStyle w:val="Compact"/>
         <w:numPr>
           <w:ilvl w:val="0"/>
-          <w:numId w:val="1033"/>
+          <w:numId w:val="1034"/>
         </w:numPr>
       </w:pPr>
       <w:r>
@@ -4437,7 +6429,7 @@
         <w:pStyle w:val="Compact"/>
         <w:numPr>
           <w:ilvl w:val="0"/>
-          <w:numId w:val="1033"/>
+          <w:numId w:val="1034"/>
         </w:numPr>
       </w:pPr>
       <w:r>
@@ -4465,7 +6457,7 @@
         <w:pStyle w:val="Compact"/>
         <w:numPr>
           <w:ilvl w:val="0"/>
-          <w:numId w:val="1033"/>
+          <w:numId w:val="1034"/>
         </w:numPr>
       </w:pPr>
       <w:r>
@@ -4498,7 +6490,7 @@
         <w:pStyle w:val="Compact"/>
         <w:numPr>
           <w:ilvl w:val="0"/>
-          <w:numId w:val="1033"/>
+          <w:numId w:val="1034"/>
         </w:numPr>
       </w:pPr>
       <w:r>
@@ -4541,7 +6533,7 @@
         <w:t xml:space="preserve">, or composition metadata.</w:t>
       </w:r>
     </w:p>
-    <w:bookmarkStart w:id="55" w:name="dpi-and-physical-dimensions"/>
+    <w:bookmarkStart w:id="128" w:name="dpi-and-physical-dimensions"/>
     <w:p>
       <w:pPr>
         <w:pStyle w:val="Heading4"/>
@@ -4555,7 +6547,7 @@
         <w:pStyle w:val="Compact"/>
         <w:numPr>
           <w:ilvl w:val="0"/>
-          <w:numId w:val="1034"/>
+          <w:numId w:val="1035"/>
         </w:numPr>
       </w:pPr>
       <w:r>
@@ -4593,7 +6585,7 @@
         <w:pStyle w:val="Compact"/>
         <w:numPr>
           <w:ilvl w:val="0"/>
-          <w:numId w:val="1034"/>
+          <w:numId w:val="1035"/>
         </w:numPr>
       </w:pPr>
       <w:r>
@@ -4617,7 +6609,7 @@
         <w:pStyle w:val="Compact"/>
         <w:numPr>
           <w:ilvl w:val="0"/>
-          <w:numId w:val="1034"/>
+          <w:numId w:val="1035"/>
         </w:numPr>
       </w:pPr>
       <w:r>
@@ -4653,7 +6645,7 @@
         <w:pStyle w:val="Compact"/>
         <w:numPr>
           <w:ilvl w:val="0"/>
-          <w:numId w:val="1034"/>
+          <w:numId w:val="1035"/>
         </w:numPr>
       </w:pPr>
       <w:r>
@@ -4665,7 +6657,7 @@
         <w:pStyle w:val="Compact"/>
         <w:numPr>
           <w:ilvl w:val="0"/>
-          <w:numId w:val="1034"/>
+          <w:numId w:val="1035"/>
         </w:numPr>
       </w:pPr>
       <w:r>
@@ -4677,7 +6669,7 @@
         <w:pStyle w:val="Compact"/>
         <w:numPr>
           <w:ilvl w:val="0"/>
-          <w:numId w:val="1034"/>
+          <w:numId w:val="1035"/>
         </w:numPr>
       </w:pPr>
       <w:r>
@@ -4689,7 +6681,7 @@
         <w:pStyle w:val="Compact"/>
         <w:numPr>
           <w:ilvl w:val="0"/>
-          <w:numId w:val="1034"/>
+          <w:numId w:val="1035"/>
         </w:numPr>
       </w:pPr>
       <w:r>
@@ -4737,18 +6729,18 @@
           <wp:inline>
             <wp:extent cx="5334000" cy="2115879"/>
             <wp:effectExtent b="0" l="0" r="0" t="0"/>
-            <wp:docPr descr="Significance and annotation setup" title="" id="53" name="Picture"/>
+            <wp:docPr descr="Significance and annotation setup" title="" id="126" name="Picture"/>
             <a:graphic>
               <a:graphicData uri="http://schemas.openxmlformats.org/drawingml/2006/picture">
                 <pic:pic>
                   <pic:nvPicPr>
-                    <pic:cNvPr descr="manual_images/10_significance_annotations.png" id="54" name="Picture"/>
+                    <pic:cNvPr descr="manual_images/10_significance_annotations.png" id="127" name="Picture"/>
                     <pic:cNvPicPr>
                       <a:picLocks noChangeArrowheads="1" noChangeAspect="1"/>
                     </pic:cNvPicPr>
                   </pic:nvPicPr>
                   <pic:blipFill>
-                    <a:blip r:embed="rId52"/>
+                    <a:blip r:embed="rId125"/>
                     <a:stretch>
                       <a:fillRect/>
                     </a:stretch>
@@ -4775,10 +6767,10 @@
         </w:drawing>
       </w:r>
     </w:p>
-    <w:bookmarkEnd w:id="55"/>
-    <w:bookmarkEnd w:id="56"/>
-    <w:bookmarkEnd w:id="57"/>
-    <w:bookmarkStart w:id="58" w:name="X115a55130e2baabc52a19ceae26040e6a759372"/>
+    <w:bookmarkEnd w:id="128"/>
+    <w:bookmarkEnd w:id="129"/>
+    <w:bookmarkEnd w:id="130"/>
+    <w:bookmarkStart w:id="131" w:name="X115a55130e2baabc52a19ceae26040e6a759372"/>
     <w:p>
       <w:pPr>
         <w:pStyle w:val="Heading2"/>
@@ -4816,7 +6808,7 @@
         <w:pStyle w:val="Compact"/>
         <w:numPr>
           <w:ilvl w:val="0"/>
-          <w:numId w:val="1035"/>
+          <w:numId w:val="1036"/>
         </w:numPr>
       </w:pPr>
       <w:r>
@@ -4843,7 +6835,7 @@
         <w:pStyle w:val="Compact"/>
         <w:numPr>
           <w:ilvl w:val="0"/>
-          <w:numId w:val="1035"/>
+          <w:numId w:val="1036"/>
         </w:numPr>
       </w:pPr>
       <w:r>
@@ -4888,15 +6880,15 @@
         <w:pStyle w:val="Compact"/>
         <w:numPr>
           <w:ilvl w:val="0"/>
-          <w:numId w:val="1035"/>
+          <w:numId w:val="1036"/>
         </w:numPr>
       </w:pPr>
       <w:r>
         <w:t xml:space="preserve">Fallback logic is applied when strict control pairing is not available.</w:t>
       </w:r>
     </w:p>
-    <w:bookmarkEnd w:id="58"/>
-    <w:bookmarkStart w:id="60" w:name="X00c7035554882fbb638d8b5cc72953fcde99525"/>
+    <w:bookmarkEnd w:id="131"/>
+    <w:bookmarkStart w:id="133" w:name="X00c7035554882fbb638d8b5cc72953fcde99525"/>
     <w:p>
       <w:pPr>
         <w:pStyle w:val="Heading2"/>
@@ -4905,7 +6897,7 @@
         <w:t xml:space="preserve">8. Statistics</w:t>
       </w:r>
     </w:p>
-    <w:bookmarkStart w:id="59" w:name="main-statistical-tools"/>
+    <w:bookmarkStart w:id="132" w:name="main-statistical-tools"/>
     <w:p>
       <w:pPr>
         <w:pStyle w:val="Heading3"/>
@@ -4919,7 +6911,7 @@
         <w:pStyle w:val="Compact"/>
         <w:numPr>
           <w:ilvl w:val="0"/>
-          <w:numId w:val="1036"/>
+          <w:numId w:val="1037"/>
         </w:numPr>
       </w:pPr>
       <w:r>
@@ -4940,7 +6932,7 @@
         <w:pStyle w:val="Compact"/>
         <w:numPr>
           <w:ilvl w:val="0"/>
-          <w:numId w:val="1036"/>
+          <w:numId w:val="1037"/>
         </w:numPr>
       </w:pPr>
       <w:r>
@@ -4961,7 +6953,7 @@
         <w:pStyle w:val="Compact"/>
         <w:numPr>
           <w:ilvl w:val="0"/>
-          <w:numId w:val="1036"/>
+          <w:numId w:val="1037"/>
         </w:numPr>
       </w:pPr>
       <w:r>
@@ -4982,7 +6974,7 @@
         <w:pStyle w:val="Compact"/>
         <w:numPr>
           <w:ilvl w:val="0"/>
-          <w:numId w:val="1036"/>
+          <w:numId w:val="1037"/>
         </w:numPr>
       </w:pPr>
       <w:r>
@@ -5003,7 +6995,7 @@
         <w:pStyle w:val="Compact"/>
         <w:numPr>
           <w:ilvl w:val="0"/>
-          <w:numId w:val="1036"/>
+          <w:numId w:val="1037"/>
         </w:numPr>
       </w:pPr>
       <w:r>
@@ -5024,7 +7016,7 @@
         <w:pStyle w:val="Compact"/>
         <w:numPr>
           <w:ilvl w:val="0"/>
-          <w:numId w:val="1036"/>
+          <w:numId w:val="1037"/>
         </w:numPr>
       </w:pPr>
       <w:r>
@@ -5057,7 +7049,7 @@
         <w:pStyle w:val="Compact"/>
         <w:numPr>
           <w:ilvl w:val="0"/>
-          <w:numId w:val="1036"/>
+          <w:numId w:val="1037"/>
         </w:numPr>
       </w:pPr>
       <w:r>
@@ -5078,7 +7070,7 @@
         <w:pStyle w:val="Compact"/>
         <w:numPr>
           <w:ilvl w:val="0"/>
-          <w:numId w:val="1036"/>
+          <w:numId w:val="1037"/>
         </w:numPr>
       </w:pPr>
       <w:r>
@@ -5107,7 +7099,7 @@
         <w:pStyle w:val="Compact"/>
         <w:numPr>
           <w:ilvl w:val="0"/>
-          <w:numId w:val="1037"/>
+          <w:numId w:val="1038"/>
         </w:numPr>
       </w:pPr>
       <w:r>
@@ -5128,7 +7120,7 @@
         <w:pStyle w:val="Compact"/>
         <w:numPr>
           <w:ilvl w:val="0"/>
-          <w:numId w:val="1037"/>
+          <w:numId w:val="1038"/>
         </w:numPr>
       </w:pPr>
       <w:r>
@@ -5149,7 +7141,7 @@
         <w:pStyle w:val="Compact"/>
         <w:numPr>
           <w:ilvl w:val="0"/>
-          <w:numId w:val="1037"/>
+          <w:numId w:val="1038"/>
         </w:numPr>
       </w:pPr>
       <w:r>
@@ -5170,7 +7162,7 @@
         <w:pStyle w:val="Compact"/>
         <w:numPr>
           <w:ilvl w:val="0"/>
-          <w:numId w:val="1037"/>
+          <w:numId w:val="1038"/>
         </w:numPr>
       </w:pPr>
       <w:r>
@@ -5257,7 +7249,7 @@
         <w:pStyle w:val="Compact"/>
         <w:numPr>
           <w:ilvl w:val="0"/>
-          <w:numId w:val="1038"/>
+          <w:numId w:val="1039"/>
         </w:numPr>
       </w:pPr>
       <w:r>
@@ -5314,7 +7306,7 @@
         <w:pStyle w:val="Compact"/>
         <w:numPr>
           <w:ilvl w:val="0"/>
-          <w:numId w:val="1038"/>
+          <w:numId w:val="1039"/>
         </w:numPr>
       </w:pPr>
       <w:r>
@@ -5356,7 +7348,7 @@
         <w:pStyle w:val="Compact"/>
         <w:numPr>
           <w:ilvl w:val="0"/>
-          <w:numId w:val="1038"/>
+          <w:numId w:val="1039"/>
         </w:numPr>
       </w:pPr>
       <w:r>
@@ -5383,7 +7375,7 @@
         <w:pStyle w:val="Compact"/>
         <w:numPr>
           <w:ilvl w:val="0"/>
-          <w:numId w:val="1038"/>
+          <w:numId w:val="1039"/>
         </w:numPr>
       </w:pPr>
       <w:r>
@@ -5469,7 +7461,7 @@
         <w:pStyle w:val="Compact"/>
         <w:numPr>
           <w:ilvl w:val="0"/>
-          <w:numId w:val="1039"/>
+          <w:numId w:val="1040"/>
         </w:numPr>
       </w:pPr>
       <w:r>
@@ -5481,7 +7473,7 @@
         <w:pStyle w:val="Compact"/>
         <w:numPr>
           <w:ilvl w:val="0"/>
-          <w:numId w:val="1039"/>
+          <w:numId w:val="1040"/>
         </w:numPr>
       </w:pPr>
       <w:r>
@@ -5493,7 +7485,7 @@
         <w:pStyle w:val="Compact"/>
         <w:numPr>
           <w:ilvl w:val="0"/>
-          <w:numId w:val="1039"/>
+          <w:numId w:val="1040"/>
         </w:numPr>
       </w:pPr>
       <w:r>
@@ -5513,7 +7505,7 @@
         <w:pStyle w:val="Compact"/>
         <w:numPr>
           <w:ilvl w:val="0"/>
-          <w:numId w:val="1040"/>
+          <w:numId w:val="1041"/>
         </w:numPr>
       </w:pPr>
       <w:r>
@@ -5525,7 +7517,7 @@
         <w:pStyle w:val="Compact"/>
         <w:numPr>
           <w:ilvl w:val="0"/>
-          <w:numId w:val="1040"/>
+          <w:numId w:val="1041"/>
         </w:numPr>
       </w:pPr>
       <w:r>
@@ -5537,7 +7529,7 @@
         <w:pStyle w:val="Compact"/>
         <w:numPr>
           <w:ilvl w:val="0"/>
-          <w:numId w:val="1040"/>
+          <w:numId w:val="1041"/>
         </w:numPr>
       </w:pPr>
       <w:r>
@@ -5549,7 +7541,7 @@
         <w:pStyle w:val="Compact"/>
         <w:numPr>
           <w:ilvl w:val="0"/>
-          <w:numId w:val="1040"/>
+          <w:numId w:val="1041"/>
         </w:numPr>
       </w:pPr>
       <w:r>
@@ -5625,9 +7617,9 @@
         <w:t xml:space="preserve">and some non-parametric paths that require raw observations are disabled.</w:t>
       </w:r>
     </w:p>
-    <w:bookmarkEnd w:id="59"/>
-    <w:bookmarkEnd w:id="60"/>
-    <w:bookmarkStart w:id="61" w:name="X226b9a1a8acbb38ca74b8f37dcf5f8aa29b93b6"/>
+    <w:bookmarkEnd w:id="132"/>
+    <w:bookmarkEnd w:id="133"/>
+    <w:bookmarkStart w:id="134" w:name="X226b9a1a8acbb38ca74b8f37dcf5f8aa29b93b6"/>
     <w:p>
       <w:pPr>
         <w:pStyle w:val="Heading2"/>
@@ -5649,7 +7641,7 @@
         <w:pStyle w:val="Compact"/>
         <w:numPr>
           <w:ilvl w:val="0"/>
-          <w:numId w:val="1041"/>
+          <w:numId w:val="1042"/>
         </w:numPr>
       </w:pPr>
       <w:r>
@@ -5661,7 +7653,7 @@
         <w:pStyle w:val="Compact"/>
         <w:numPr>
           <w:ilvl w:val="0"/>
-          <w:numId w:val="1041"/>
+          <w:numId w:val="1042"/>
         </w:numPr>
       </w:pPr>
       <w:r>
@@ -5718,7 +7710,7 @@
         <w:pStyle w:val="Compact"/>
         <w:numPr>
           <w:ilvl w:val="0"/>
-          <w:numId w:val="1041"/>
+          <w:numId w:val="1042"/>
         </w:numPr>
       </w:pPr>
       <w:r>
@@ -5738,7 +7730,7 @@
         <w:pStyle w:val="Compact"/>
         <w:numPr>
           <w:ilvl w:val="0"/>
-          <w:numId w:val="1042"/>
+          <w:numId w:val="1043"/>
         </w:numPr>
       </w:pPr>
       <w:r>
@@ -5750,7 +7742,7 @@
         <w:pStyle w:val="Compact"/>
         <w:numPr>
           <w:ilvl w:val="0"/>
-          <w:numId w:val="1042"/>
+          <w:numId w:val="1043"/>
         </w:numPr>
       </w:pPr>
       <w:r>
@@ -5762,7 +7754,7 @@
         <w:pStyle w:val="Compact"/>
         <w:numPr>
           <w:ilvl w:val="0"/>
-          <w:numId w:val="1042"/>
+          <w:numId w:val="1043"/>
         </w:numPr>
       </w:pPr>
       <w:r>
@@ -5798,7 +7790,7 @@
         <w:pStyle w:val="Compact"/>
         <w:numPr>
           <w:ilvl w:val="0"/>
-          <w:numId w:val="1042"/>
+          <w:numId w:val="1043"/>
         </w:numPr>
       </w:pPr>
       <w:r>
@@ -5834,7 +7826,7 @@
         <w:pStyle w:val="Compact"/>
         <w:numPr>
           <w:ilvl w:val="0"/>
-          <w:numId w:val="1042"/>
+          <w:numId w:val="1043"/>
         </w:numPr>
       </w:pPr>
       <w:r>
@@ -5865,8 +7857,8 @@
         <w:t xml:space="preserve">plots, choose the parameter before adding a label. Automatic labels keep the parameter identity and place the annotation over the selected target group for that parameter.</w:t>
       </w:r>
     </w:p>
-    <w:bookmarkEnd w:id="61"/>
-    <w:bookmarkStart w:id="67" w:name="X74088aaef10aeab96f289eb9220b0777e0698d0"/>
+    <w:bookmarkEnd w:id="134"/>
+    <w:bookmarkStart w:id="140" w:name="X74088aaef10aeab96f289eb9220b0777e0698d0"/>
     <w:p>
       <w:pPr>
         <w:pStyle w:val="Heading2"/>
@@ -5888,7 +7880,7 @@
         <w:pStyle w:val="Compact"/>
         <w:numPr>
           <w:ilvl w:val="0"/>
-          <w:numId w:val="1043"/>
+          <w:numId w:val="1044"/>
         </w:numPr>
       </w:pPr>
       <w:r>
@@ -5900,7 +7892,7 @@
         <w:pStyle w:val="Compact"/>
         <w:numPr>
           <w:ilvl w:val="0"/>
-          <w:numId w:val="1043"/>
+          <w:numId w:val="1044"/>
         </w:numPr>
       </w:pPr>
       <w:r>
@@ -5912,14 +7904,14 @@
         <w:pStyle w:val="Compact"/>
         <w:numPr>
           <w:ilvl w:val="0"/>
-          <w:numId w:val="1043"/>
+          <w:numId w:val="1044"/>
         </w:numPr>
       </w:pPr>
       <w:r>
         <w:t xml:space="preserve">Sample size and replicate coverage.</w:t>
       </w:r>
     </w:p>
-    <w:bookmarkStart w:id="62" w:name="biological-replicates"/>
+    <w:bookmarkStart w:id="135" w:name="biological-replicates"/>
     <w:p>
       <w:pPr>
         <w:pStyle w:val="Heading3"/>
@@ -5933,7 +7925,7 @@
         <w:pStyle w:val="Compact"/>
         <w:numPr>
           <w:ilvl w:val="0"/>
-          <w:numId w:val="1044"/>
+          <w:numId w:val="1045"/>
         </w:numPr>
       </w:pPr>
       <w:r>
@@ -5945,7 +7937,7 @@
         <w:pStyle w:val="Compact"/>
         <w:numPr>
           <w:ilvl w:val="0"/>
-          <w:numId w:val="1044"/>
+          <w:numId w:val="1045"/>
         </w:numPr>
       </w:pPr>
       <w:r>
@@ -5957,7 +7949,7 @@
         <w:pStyle w:val="Compact"/>
         <w:numPr>
           <w:ilvl w:val="0"/>
-          <w:numId w:val="1044"/>
+          <w:numId w:val="1045"/>
         </w:numPr>
       </w:pPr>
       <w:r>
@@ -5977,7 +7969,7 @@
         <w:pStyle w:val="Compact"/>
         <w:numPr>
           <w:ilvl w:val="0"/>
-          <w:numId w:val="1045"/>
+          <w:numId w:val="1046"/>
         </w:numPr>
       </w:pPr>
       <w:r>
@@ -5989,15 +7981,15 @@
         <w:pStyle w:val="Compact"/>
         <w:numPr>
           <w:ilvl w:val="0"/>
-          <w:numId w:val="1045"/>
+          <w:numId w:val="1046"/>
         </w:numPr>
       </w:pPr>
       <w:r>
         <w:t xml:space="preserve">Keeps lowest-score (most reproducible) replicates.</w:t>
       </w:r>
     </w:p>
-    <w:bookmarkEnd w:id="62"/>
-    <w:bookmarkStart w:id="66" w:name="technical-replicates"/>
+    <w:bookmarkEnd w:id="135"/>
+    <w:bookmarkStart w:id="139" w:name="technical-replicates"/>
     <w:p>
       <w:pPr>
         <w:pStyle w:val="Heading3"/>
@@ -6019,7 +8011,7 @@
         <w:pStyle w:val="Compact"/>
         <w:numPr>
           <w:ilvl w:val="0"/>
-          <w:numId w:val="1046"/>
+          <w:numId w:val="1047"/>
         </w:numPr>
       </w:pPr>
       <w:r>
@@ -6031,7 +8023,7 @@
         <w:pStyle w:val="Compact"/>
         <w:numPr>
           <w:ilvl w:val="0"/>
-          <w:numId w:val="1046"/>
+          <w:numId w:val="1047"/>
         </w:numPr>
       </w:pPr>
       <w:r>
@@ -6043,7 +8035,7 @@
         <w:pStyle w:val="Compact"/>
         <w:numPr>
           <w:ilvl w:val="0"/>
-          <w:numId w:val="1046"/>
+          <w:numId w:val="1047"/>
         </w:numPr>
       </w:pPr>
       <w:r>
@@ -6055,7 +8047,7 @@
         <w:pStyle w:val="Compact"/>
         <w:numPr>
           <w:ilvl w:val="0"/>
-          <w:numId w:val="1046"/>
+          <w:numId w:val="1047"/>
         </w:numPr>
       </w:pPr>
       <w:r>
@@ -6067,7 +8059,7 @@
         <w:pStyle w:val="Compact"/>
         <w:numPr>
           <w:ilvl w:val="0"/>
-          <w:numId w:val="1046"/>
+          <w:numId w:val="1047"/>
         </w:numPr>
       </w:pPr>
       <w:r>
@@ -6083,18 +8075,18 @@
           <wp:inline>
             <wp:extent cx="5334000" cy="2228174"/>
             <wp:effectExtent b="0" l="0" r="0" t="0"/>
-            <wp:docPr descr="Biological replicate filtering" title="" id="64" name="Picture"/>
+            <wp:docPr descr="Biological replicate filtering" title="" id="137" name="Picture"/>
             <a:graphic>
               <a:graphicData uri="http://schemas.openxmlformats.org/drawingml/2006/picture">
                 <pic:pic>
                   <pic:nvPicPr>
-                    <pic:cNvPr descr="manual_images/04_filter_biological_replicates.png" id="65" name="Picture"/>
+                    <pic:cNvPr descr="manual_images/04_filter_biological_replicates.png" id="138" name="Picture"/>
                     <pic:cNvPicPr>
                       <a:picLocks noChangeArrowheads="1" noChangeAspect="1"/>
                     </pic:cNvPicPr>
                   </pic:nvPicPr>
                   <pic:blipFill>
-                    <a:blip r:embed="rId63"/>
+                    <a:blip r:embed="rId136"/>
                     <a:stretch>
                       <a:fillRect/>
                     </a:stretch>
@@ -6121,9 +8113,9 @@
         </w:drawing>
       </w:r>
     </w:p>
-    <w:bookmarkEnd w:id="66"/>
-    <w:bookmarkEnd w:id="67"/>
-    <w:bookmarkStart w:id="68" w:name="X027b5303909c1c711c784491c3eab67dd715d28"/>
+    <w:bookmarkEnd w:id="139"/>
+    <w:bookmarkEnd w:id="140"/>
+    <w:bookmarkStart w:id="141" w:name="X027b5303909c1c711c784491c3eab67dd715d28"/>
     <w:p>
       <w:pPr>
         <w:pStyle w:val="Heading2"/>
@@ -6145,7 +8137,7 @@
         <w:pStyle w:val="Compact"/>
         <w:numPr>
           <w:ilvl w:val="0"/>
-          <w:numId w:val="1047"/>
+          <w:numId w:val="1048"/>
         </w:numPr>
       </w:pPr>
       <w:r>
@@ -6167,7 +8159,7 @@
         <w:pStyle w:val="Compact"/>
         <w:numPr>
           <w:ilvl w:val="0"/>
-          <w:numId w:val="1047"/>
+          <w:numId w:val="1048"/>
         </w:numPr>
       </w:pPr>
       <w:r>
@@ -6179,7 +8171,7 @@
         <w:pStyle w:val="Compact"/>
         <w:numPr>
           <w:ilvl w:val="0"/>
-          <w:numId w:val="1047"/>
+          <w:numId w:val="1048"/>
         </w:numPr>
       </w:pPr>
       <w:r>
@@ -6191,7 +8183,7 @@
         <w:pStyle w:val="Compact"/>
         <w:numPr>
           <w:ilvl w:val="0"/>
-          <w:numId w:val="1047"/>
+          <w:numId w:val="1048"/>
         </w:numPr>
       </w:pPr>
       <w:r>
@@ -6203,7 +8195,7 @@
         <w:pStyle w:val="Compact"/>
         <w:numPr>
           <w:ilvl w:val="0"/>
-          <w:numId w:val="1047"/>
+          <w:numId w:val="1048"/>
         </w:numPr>
       </w:pPr>
       <w:r>
@@ -6215,7 +8207,7 @@
         <w:pStyle w:val="Compact"/>
         <w:numPr>
           <w:ilvl w:val="0"/>
-          <w:numId w:val="1047"/>
+          <w:numId w:val="1048"/>
         </w:numPr>
       </w:pPr>
       <w:r>
@@ -6227,7 +8219,7 @@
         <w:pStyle w:val="Compact"/>
         <w:numPr>
           <w:ilvl w:val="0"/>
-          <w:numId w:val="1047"/>
+          <w:numId w:val="1048"/>
         </w:numPr>
       </w:pPr>
       <w:r>
@@ -6236,6 +8228,18 @@
     </w:p>
     <w:p>
       <w:pPr>
+        <w:pStyle w:val="Compact"/>
+        <w:numPr>
+          <w:ilvl w:val="0"/>
+          <w:numId w:val="1048"/>
+        </w:numPr>
+      </w:pPr>
+      <w:r>
+        <w:t xml:space="preserve">Dose-response series and strain selections, corrected concentration mapping, axis limits and intervals, axis titles, line and point sizes, point outline, and confidence-band opacity persist in dose-response metadata and saved plot versions.</w:t>
+      </w:r>
+    </w:p>
+    <w:p>
+      <w:pPr>
         <w:pStyle w:val="FirstParagraph"/>
       </w:pPr>
       <w:r>
@@ -6247,7 +8251,7 @@
         <w:pStyle w:val="Compact"/>
         <w:numPr>
           <w:ilvl w:val="0"/>
-          <w:numId w:val="1048"/>
+          <w:numId w:val="1049"/>
         </w:numPr>
       </w:pPr>
       <w:r>
@@ -6259,7 +8263,7 @@
         <w:pStyle w:val="Compact"/>
         <w:numPr>
           <w:ilvl w:val="0"/>
-          <w:numId w:val="1048"/>
+          <w:numId w:val="1049"/>
         </w:numPr>
       </w:pPr>
       <w:r>
@@ -6271,7 +8275,7 @@
         <w:pStyle w:val="Compact"/>
         <w:numPr>
           <w:ilvl w:val="0"/>
-          <w:numId w:val="1048"/>
+          <w:numId w:val="1049"/>
         </w:numPr>
       </w:pPr>
       <w:r>
@@ -6291,7 +8295,7 @@
         <w:pStyle w:val="Compact"/>
         <w:numPr>
           <w:ilvl w:val="0"/>
-          <w:numId w:val="1049"/>
+          <w:numId w:val="1050"/>
         </w:numPr>
       </w:pPr>
       <w:r>
@@ -6303,7 +8307,7 @@
         <w:pStyle w:val="Compact"/>
         <w:numPr>
           <w:ilvl w:val="0"/>
-          <w:numId w:val="1049"/>
+          <w:numId w:val="1050"/>
         </w:numPr>
       </w:pPr>
       <w:r>
@@ -6315,15 +8319,15 @@
         <w:pStyle w:val="Compact"/>
         <w:numPr>
           <w:ilvl w:val="0"/>
-          <w:numId w:val="1049"/>
+          <w:numId w:val="1050"/>
         </w:numPr>
       </w:pPr>
       <w:r>
         <w:t xml:space="preserve">Final builder orientation checks.</w:t>
       </w:r>
     </w:p>
-    <w:bookmarkEnd w:id="68"/>
-    <w:bookmarkStart w:id="69" w:name="Xdaccffce00e124c4dc2e12129d423a1de5e7d51"/>
+    <w:bookmarkEnd w:id="141"/>
+    <w:bookmarkStart w:id="142" w:name="Xdaccffce00e124c4dc2e12129d423a1de5e7d51"/>
     <w:p>
       <w:pPr>
         <w:pStyle w:val="Heading2"/>
@@ -6345,7 +8349,7 @@
         <w:pStyle w:val="Compact"/>
         <w:numPr>
           <w:ilvl w:val="0"/>
-          <w:numId w:val="1050"/>
+          <w:numId w:val="1051"/>
         </w:numPr>
       </w:pPr>
       <w:r>
@@ -6378,7 +8382,7 @@
         <w:pStyle w:val="Compact"/>
         <w:numPr>
           <w:ilvl w:val="0"/>
-          <w:numId w:val="1050"/>
+          <w:numId w:val="1051"/>
         </w:numPr>
       </w:pPr>
       <w:r>
@@ -6390,7 +8394,7 @@
         <w:pStyle w:val="Compact"/>
         <w:numPr>
           <w:ilvl w:val="0"/>
-          <w:numId w:val="1050"/>
+          <w:numId w:val="1051"/>
         </w:numPr>
       </w:pPr>
       <w:r>
@@ -6402,7 +8406,7 @@
         <w:pStyle w:val="Compact"/>
         <w:numPr>
           <w:ilvl w:val="0"/>
-          <w:numId w:val="1050"/>
+          <w:numId w:val="1051"/>
         </w:numPr>
       </w:pPr>
       <w:r>
@@ -6414,7 +8418,7 @@
         <w:pStyle w:val="Compact"/>
         <w:numPr>
           <w:ilvl w:val="0"/>
-          <w:numId w:val="1050"/>
+          <w:numId w:val="1051"/>
         </w:numPr>
       </w:pPr>
       <w:r>
@@ -6426,7 +8430,7 @@
         <w:pStyle w:val="Compact"/>
         <w:numPr>
           <w:ilvl w:val="0"/>
-          <w:numId w:val="1050"/>
+          <w:numId w:val="1051"/>
         </w:numPr>
       </w:pPr>
       <w:r>
@@ -6438,7 +8442,7 @@
         <w:pStyle w:val="Compact"/>
         <w:numPr>
           <w:ilvl w:val="0"/>
-          <w:numId w:val="1050"/>
+          <w:numId w:val="1051"/>
         </w:numPr>
       </w:pPr>
       <w:r>
@@ -6477,8 +8481,8 @@
         <w:t xml:space="preserve">and accept supported user values from 72 to 600 DPI. The selected effective DPI is included in metadata and bundle versions. Vector PDF/PPTX elements do not use DPI; graph width, height, and slide dimensions are configured separately.</w:t>
       </w:r>
     </w:p>
-    <w:bookmarkEnd w:id="69"/>
-    <w:bookmarkStart w:id="73" w:name="Xe593582c9f00b53676a004fd4095b4d203d92ef"/>
+    <w:bookmarkEnd w:id="142"/>
+    <w:bookmarkStart w:id="146" w:name="Xe593582c9f00b53676a004fd4095b4d203d92ef"/>
     <w:p>
       <w:pPr>
         <w:pStyle w:val="Heading2"/>
@@ -6500,7 +8504,7 @@
         <w:pStyle w:val="Compact"/>
         <w:numPr>
           <w:ilvl w:val="0"/>
-          <w:numId w:val="1051"/>
+          <w:numId w:val="1052"/>
         </w:numPr>
       </w:pPr>
       <w:r>
@@ -6536,7 +8540,7 @@
         <w:pStyle w:val="Compact"/>
         <w:numPr>
           <w:ilvl w:val="0"/>
-          <w:numId w:val="1051"/>
+          <w:numId w:val="1052"/>
         </w:numPr>
       </w:pPr>
       <w:r>
@@ -6548,7 +8552,7 @@
         <w:pStyle w:val="Compact"/>
         <w:numPr>
           <w:ilvl w:val="1"/>
-          <w:numId w:val="1052"/>
+          <w:numId w:val="1053"/>
         </w:numPr>
       </w:pPr>
       <w:r>
@@ -6572,7 +8576,7 @@
         <w:pStyle w:val="Compact"/>
         <w:numPr>
           <w:ilvl w:val="1"/>
-          <w:numId w:val="1052"/>
+          <w:numId w:val="1053"/>
         </w:numPr>
       </w:pPr>
       <w:r>
@@ -6607,7 +8611,7 @@
         <w:pStyle w:val="Compact"/>
         <w:numPr>
           <w:ilvl w:val="0"/>
-          <w:numId w:val="1053"/>
+          <w:numId w:val="1054"/>
         </w:numPr>
       </w:pPr>
       <w:r>
@@ -6625,7 +8629,7 @@
         <w:pStyle w:val="Compact"/>
         <w:numPr>
           <w:ilvl w:val="0"/>
-          <w:numId w:val="1053"/>
+          <w:numId w:val="1054"/>
         </w:numPr>
       </w:pPr>
       <w:r>
@@ -6643,7 +8647,7 @@
         <w:pStyle w:val="Compact"/>
         <w:numPr>
           <w:ilvl w:val="0"/>
-          <w:numId w:val="1053"/>
+          <w:numId w:val="1054"/>
         </w:numPr>
       </w:pPr>
       <w:r>
@@ -6670,7 +8674,7 @@
         <w:pStyle w:val="Compact"/>
         <w:numPr>
           <w:ilvl w:val="0"/>
-          <w:numId w:val="1053"/>
+          <w:numId w:val="1054"/>
         </w:numPr>
       </w:pPr>
       <w:r>
@@ -6688,7 +8692,7 @@
         <w:pStyle w:val="Compact"/>
         <w:numPr>
           <w:ilvl w:val="0"/>
-          <w:numId w:val="1053"/>
+          <w:numId w:val="1054"/>
         </w:numPr>
       </w:pPr>
       <w:r>
@@ -6706,7 +8710,7 @@
         <w:pStyle w:val="Compact"/>
         <w:numPr>
           <w:ilvl w:val="0"/>
-          <w:numId w:val="1053"/>
+          <w:numId w:val="1054"/>
         </w:numPr>
       </w:pPr>
       <w:r>
@@ -6736,7 +8740,7 @@
         <w:pStyle w:val="Compact"/>
         <w:numPr>
           <w:ilvl w:val="0"/>
-          <w:numId w:val="1053"/>
+          <w:numId w:val="1054"/>
         </w:numPr>
       </w:pPr>
       <w:r>
@@ -6754,7 +8758,7 @@
         <w:pStyle w:val="Compact"/>
         <w:numPr>
           <w:ilvl w:val="0"/>
-          <w:numId w:val="1053"/>
+          <w:numId w:val="1054"/>
         </w:numPr>
       </w:pPr>
       <w:r>
@@ -6780,7 +8784,7 @@
         <w:pStyle w:val="Compact"/>
         <w:numPr>
           <w:ilvl w:val="0"/>
-          <w:numId w:val="1054"/>
+          <w:numId w:val="1055"/>
         </w:numPr>
       </w:pPr>
       <w:r>
@@ -6792,7 +8796,7 @@
         <w:pStyle w:val="Compact"/>
         <w:numPr>
           <w:ilvl w:val="0"/>
-          <w:numId w:val="1054"/>
+          <w:numId w:val="1055"/>
         </w:numPr>
       </w:pPr>
       <w:r>
@@ -6804,7 +8808,7 @@
         <w:pStyle w:val="Compact"/>
         <w:numPr>
           <w:ilvl w:val="0"/>
-          <w:numId w:val="1054"/>
+          <w:numId w:val="1055"/>
         </w:numPr>
       </w:pPr>
       <w:r>
@@ -6816,7 +8820,7 @@
         <w:pStyle w:val="Compact"/>
         <w:numPr>
           <w:ilvl w:val="0"/>
-          <w:numId w:val="1054"/>
+          <w:numId w:val="1055"/>
         </w:numPr>
       </w:pPr>
       <w:r>
@@ -6828,7 +8832,7 @@
         <w:pStyle w:val="Compact"/>
         <w:numPr>
           <w:ilvl w:val="0"/>
-          <w:numId w:val="1054"/>
+          <w:numId w:val="1055"/>
         </w:numPr>
       </w:pPr>
       <w:r>
@@ -6848,7 +8852,7 @@
         <w:pStyle w:val="Compact"/>
         <w:numPr>
           <w:ilvl w:val="0"/>
-          <w:numId w:val="1055"/>
+          <w:numId w:val="1056"/>
         </w:numPr>
       </w:pPr>
       <w:r>
@@ -6889,7 +8893,7 @@
         <w:pStyle w:val="Compact"/>
         <w:numPr>
           <w:ilvl w:val="0"/>
-          <w:numId w:val="1055"/>
+          <w:numId w:val="1056"/>
         </w:numPr>
       </w:pPr>
       <w:r>
@@ -6917,7 +8921,7 @@
         <w:pStyle w:val="Compact"/>
         <w:numPr>
           <w:ilvl w:val="0"/>
-          <w:numId w:val="1055"/>
+          <w:numId w:val="1056"/>
         </w:numPr>
       </w:pPr>
       <w:r>
@@ -6929,7 +8933,7 @@
         <w:pStyle w:val="Compact"/>
         <w:numPr>
           <w:ilvl w:val="0"/>
-          <w:numId w:val="1055"/>
+          <w:numId w:val="1056"/>
         </w:numPr>
       </w:pPr>
       <w:r>
@@ -6987,7 +8991,7 @@
         <w:pStyle w:val="Compact"/>
         <w:numPr>
           <w:ilvl w:val="0"/>
-          <w:numId w:val="1055"/>
+          <w:numId w:val="1056"/>
         </w:numPr>
       </w:pPr>
       <w:r>
@@ -7014,7 +9018,7 @@
         <w:pStyle w:val="Compact"/>
         <w:numPr>
           <w:ilvl w:val="0"/>
-          <w:numId w:val="1055"/>
+          <w:numId w:val="1056"/>
         </w:numPr>
       </w:pPr>
       <w:r>
@@ -7026,7 +9030,7 @@
         <w:pStyle w:val="Compact"/>
         <w:numPr>
           <w:ilvl w:val="0"/>
-          <w:numId w:val="1055"/>
+          <w:numId w:val="1056"/>
         </w:numPr>
       </w:pPr>
       <w:r>
@@ -7232,6 +9236,105 @@
         </w:rPr>
         <w:t xml:space="preserve">)</w:t>
       </w:r>
+      <w:r>
+        <w:br/>
+      </w:r>
+      <w:r>
+        <w:br/>
+      </w:r>
+      <w:r>
+        <w:rPr>
+          <w:rStyle w:val="NormalTok"/>
+        </w:rPr>
+        <w:t xml:space="preserve">irregular_parameters </w:t>
+      </w:r>
+      <w:r>
+        <w:rPr>
+          <w:rStyle w:val="OtherTok"/>
+        </w:rPr>
+        <w:t xml:space="preserve">&lt;-</w:t>
+      </w:r>
+      <w:r>
+        <w:rPr>
+          <w:rStyle w:val="NormalTok"/>
+        </w:rPr>
+        <w:t xml:space="preserve"> BIOSZEN</w:t>
+      </w:r>
+      <w:r>
+        <w:rPr>
+          <w:rStyle w:val="SpecialCharTok"/>
+        </w:rPr>
+        <w:t xml:space="preserve">::</w:t>
+      </w:r>
+      <w:r>
+        <w:rPr>
+          <w:rStyle w:val="FunctionTok"/>
+        </w:rPr>
+        <w:t xml:space="preserve">growth_parameters_irregular</w:t>
+      </w:r>
+      <w:r>
+        <w:rPr>
+          <w:rStyle w:val="NormalTok"/>
+        </w:rPr>
+        <w:t xml:space="preserve">(</w:t>
+      </w:r>
+      <w:r>
+        <w:br/>
+      </w:r>
+      <w:r>
+        <w:rPr>
+          <w:rStyle w:val="NormalTok"/>
+        </w:rPr>
+        <w:t xml:space="preserve">  </w:t>
+      </w:r>
+      <w:r>
+        <w:rPr>
+          <w:rStyle w:val="StringTok"/>
+        </w:rPr>
+        <w:t xml:space="preserve">"irregular_curve.xlsx"</w:t>
+      </w:r>
+      <w:r>
+        <w:rPr>
+          <w:rStyle w:val="NormalTok"/>
+        </w:rPr>
+        <w:t xml:space="preserve">,</w:t>
+      </w:r>
+      <w:r>
+        <w:br/>
+      </w:r>
+      <w:r>
+        <w:rPr>
+          <w:rStyle w:val="NormalTok"/>
+        </w:rPr>
+        <w:t xml:space="preserve">  </w:t>
+      </w:r>
+      <w:r>
+        <w:rPr>
+          <w:rStyle w:val="AttributeTok"/>
+        </w:rPr>
+        <w:t xml:space="preserve">time_column =</w:t>
+      </w:r>
+      <w:r>
+        <w:rPr>
+          <w:rStyle w:val="NormalTok"/>
+        </w:rPr>
+        <w:t xml:space="preserve"> </w:t>
+      </w:r>
+      <w:r>
+        <w:rPr>
+          <w:rStyle w:val="StringTok"/>
+        </w:rPr>
+        <w:t xml:space="preserve">"Time"</w:t>
+      </w:r>
+      <w:r>
+        <w:br/>
+      </w:r>
+      <w:r>
+        <w:rPr>
+          <w:rStyle w:val="NormalTok"/>
+        </w:rPr>
+        <w:t xml:space="preserve">)</w:t>
+      </w:r>
     </w:p>
     <w:p>
       <w:pPr>
@@ -7269,6 +9372,95 @@
       </w:r>
       <w:r>
         <w:t xml:space="preserve">returns the result in R and does not create files.</w:t>
+      </w:r>
+    </w:p>
+    <w:p>
+      <w:pPr>
+        <w:pStyle w:val="BodyText"/>
+      </w:pPr>
+      <w:r>
+        <w:t xml:space="preserve">For uneven or discontinuous recorded times, use</w:t>
+      </w:r>
+      <w:r>
+        <w:t xml:space="preserve"> </w:t>
+      </w:r>
+      <w:r>
+        <w:rPr>
+          <w:rStyle w:val="VerbatimChar"/>
+        </w:rPr>
+        <w:t xml:space="preserve">BIOSZEN::growth_parameters_irregular()</w:t>
+      </w:r>
+      <w:r>
+        <w:t xml:space="preserve">. It reads the numeric time values from</w:t>
+      </w:r>
+      <w:r>
+        <w:t xml:space="preserve"> </w:t>
+      </w:r>
+      <w:r>
+        <w:t xml:space="preserve">the file directly and can automatically detect common names such as</w:t>
+      </w:r>
+      <w:r>
+        <w:t xml:space="preserve"> </w:t>
+      </w:r>
+      <w:r>
+        <w:rPr>
+          <w:rStyle w:val="VerbatimChar"/>
+        </w:rPr>
+        <w:t xml:space="preserve">Time</w:t>
+      </w:r>
+      <w:r>
+        <w:t xml:space="preserve">,</w:t>
+      </w:r>
+      <w:r>
+        <w:t xml:space="preserve"> </w:t>
+      </w:r>
+      <w:r>
+        <w:rPr>
+          <w:rStyle w:val="VerbatimChar"/>
+        </w:rPr>
+        <w:t xml:space="preserve">Tiempo</w:t>
+      </w:r>
+      <w:r>
+        <w:t xml:space="preserve">,</w:t>
+      </w:r>
+      <w:r>
+        <w:t xml:space="preserve"> </w:t>
+      </w:r>
+      <w:r>
+        <w:rPr>
+          <w:rStyle w:val="VerbatimChar"/>
+        </w:rPr>
+        <w:t xml:space="preserve">Hour</w:t>
+      </w:r>
+      <w:r>
+        <w:t xml:space="preserve">, or</w:t>
+      </w:r>
+      <w:r>
+        <w:t xml:space="preserve"> </w:t>
+      </w:r>
+      <w:r>
+        <w:rPr>
+          <w:rStyle w:val="VerbatimChar"/>
+        </w:rPr>
+        <w:t xml:space="preserve">Hora</w:t>
+      </w:r>
+      <w:r>
+        <w:t xml:space="preserve">; use</w:t>
+      </w:r>
+      <w:r>
+        <w:t xml:space="preserve"> </w:t>
+      </w:r>
+      <w:r>
+        <w:rPr>
+          <w:rStyle w:val="VerbatimChar"/>
+        </w:rPr>
+        <w:t xml:space="preserve">time_column</w:t>
+      </w:r>
+      <w:r>
+        <w:t xml:space="preserve"> </w:t>
+      </w:r>
+      <w:r>
+        <w:t xml:space="preserve">to select a specific column.</w:t>
       </w:r>
     </w:p>
     <w:p>
@@ -7280,18 +9472,18 @@
           <wp:inline>
             <wp:extent cx="5334000" cy="2011947"/>
             <wp:effectExtent b="0" l="0" r="0" t="0"/>
-            <wp:docPr descr="Growth workflow" title="" id="71" name="Picture"/>
+            <wp:docPr descr="Growth workflow" title="" id="144" name="Picture"/>
             <a:graphic>
               <a:graphicData uri="http://schemas.openxmlformats.org/drawingml/2006/picture">
                 <pic:pic>
                   <pic:nvPicPr>
-                    <pic:cNvPr descr="manual_images/13_growth_parameters_workflow.png" id="72" name="Picture"/>
+                    <pic:cNvPr descr="manual_images/13_growth_parameters_workflow.png" id="145" name="Picture"/>
                     <pic:cNvPicPr>
                       <a:picLocks noChangeArrowheads="1" noChangeAspect="1"/>
                     </pic:cNvPicPr>
                   </pic:nvPicPr>
                   <pic:blipFill>
-                    <a:blip r:embed="rId70"/>
+                    <a:blip r:embed="rId143"/>
                     <a:stretch>
                       <a:fillRect/>
                     </a:stretch>
@@ -7318,8 +9510,8 @@
         </w:drawing>
       </w:r>
     </w:p>
-    <w:bookmarkEnd w:id="73"/>
-    <w:bookmarkStart w:id="74" w:name="X412317ec57e4cfdc618c120090edd958d43de49"/>
+    <w:bookmarkEnd w:id="146"/>
+    <w:bookmarkStart w:id="147" w:name="X412317ec57e4cfdc618c120090edd958d43de49"/>
     <w:p>
       <w:pPr>
         <w:pStyle w:val="Heading2"/>
@@ -7332,7 +9524,7 @@
       <w:pPr>
         <w:numPr>
           <w:ilvl w:val="0"/>
-          <w:numId w:val="1056"/>
+          <w:numId w:val="1057"/>
         </w:numPr>
       </w:pPr>
       <w:r>
@@ -7359,7 +9551,7 @@
       <w:pPr>
         <w:numPr>
           <w:ilvl w:val="0"/>
-          <w:numId w:val="1056"/>
+          <w:numId w:val="1057"/>
         </w:numPr>
       </w:pPr>
       <w:r>
@@ -7386,7 +9578,7 @@
       <w:pPr>
         <w:numPr>
           <w:ilvl w:val="0"/>
-          <w:numId w:val="1056"/>
+          <w:numId w:val="1057"/>
         </w:numPr>
       </w:pPr>
       <w:r>
@@ -7413,7 +9605,7 @@
       <w:pPr>
         <w:numPr>
           <w:ilvl w:val="0"/>
-          <w:numId w:val="1056"/>
+          <w:numId w:val="1057"/>
         </w:numPr>
       </w:pPr>
       <w:r>
@@ -7440,7 +9632,7 @@
       <w:pPr>
         <w:numPr>
           <w:ilvl w:val="0"/>
-          <w:numId w:val="1056"/>
+          <w:numId w:val="1057"/>
         </w:numPr>
       </w:pPr>
       <w:r>
@@ -7467,7 +9659,7 @@
       <w:pPr>
         <w:numPr>
           <w:ilvl w:val="0"/>
-          <w:numId w:val="1056"/>
+          <w:numId w:val="1057"/>
         </w:numPr>
       </w:pPr>
       <w:r>
@@ -7509,7 +9701,7 @@
       <w:pPr>
         <w:numPr>
           <w:ilvl w:val="0"/>
-          <w:numId w:val="1056"/>
+          <w:numId w:val="1057"/>
         </w:numPr>
       </w:pPr>
       <w:r>
@@ -7564,7 +9756,7 @@
       <w:pPr>
         <w:numPr>
           <w:ilvl w:val="0"/>
-          <w:numId w:val="1056"/>
+          <w:numId w:val="1057"/>
         </w:numPr>
       </w:pPr>
       <w:r>
@@ -7591,7 +9783,7 @@
       <w:pPr>
         <w:numPr>
           <w:ilvl w:val="0"/>
-          <w:numId w:val="1056"/>
+          <w:numId w:val="1057"/>
         </w:numPr>
       </w:pPr>
       <w:r>
@@ -7614,8 +9806,8 @@
         <w:t xml:space="preserve">What to do: Reduce active parameters and heavy layers.</w:t>
       </w:r>
     </w:p>
-    <w:bookmarkEnd w:id="74"/>
-    <w:bookmarkStart w:id="75" w:name="Xcd58510a2561031e4603a64a38bc819a9ac6e6a"/>
+    <w:bookmarkEnd w:id="147"/>
+    <w:bookmarkStart w:id="148" w:name="Xcd58510a2561031e4603a64a38bc819a9ac6e6a"/>
     <w:p>
       <w:pPr>
         <w:pStyle w:val="Heading2"/>
@@ -7641,12 +9833,13 @@
         <w:t xml:space="preserve">bioszenf@gmail.com</w:t>
       </w:r>
     </w:p>
-    <w:bookmarkEnd w:id="75"/>
-    <w:bookmarkEnd w:id="76"/>
+    <w:bookmarkEnd w:id="148"/>
+    <w:bookmarkEnd w:id="149"/>
     <w:sectPr>
       <w:footnotePr>
         <w:numRestart w:val="eachSect"/>
       </w:footnotePr>
+      <w:pgSz w:w="12240" w:h="15840"/>
     </w:sectPr>
   </w:body>
 </w:document>
@@ -8149,6 +10342,9 @@
     <w:abstractNumId w:val="991"/>
   </w:num>
   <w:num w:numId="1033">
+    <w:abstractNumId w:val="991"/>
+  </w:num>
+  <w:num w:numId="1034">
     <w:abstractNumId w:val="99411"/>
     <w:lvlOverride w:ilvl="0">
       <w:startOverride w:val="1"/>
@@ -8178,9 +10374,6 @@
       <w:startOverride w:val="1"/>
     </w:lvlOverride>
   </w:num>
-  <w:num w:numId="1034">
-    <w:abstractNumId w:val="991"/>
-  </w:num>
   <w:num w:numId="1035">
     <w:abstractNumId w:val="991"/>
   </w:num>
@@ -8200,34 +10393,7 @@
     <w:abstractNumId w:val="991"/>
   </w:num>
   <w:num w:numId="1041">
-    <w:abstractNumId w:val="99411"/>
-    <w:lvlOverride w:ilvl="0">
-      <w:startOverride w:val="1"/>
-    </w:lvlOverride>
-    <w:lvlOverride w:ilvl="1">
-      <w:startOverride w:val="1"/>
-    </w:lvlOverride>
-    <w:lvlOverride w:ilvl="2">
-      <w:startOverride w:val="1"/>
-    </w:lvlOverride>
-    <w:lvlOverride w:ilvl="3">
-      <w:startOverride w:val="1"/>
-    </w:lvlOverride>
-    <w:lvlOverride w:ilvl="4">
-      <w:startOverride w:val="1"/>
-    </w:lvlOverride>
-    <w:lvlOverride w:ilvl="5">
-      <w:startOverride w:val="1"/>
-    </w:lvlOverride>
-    <w:lvlOverride w:ilvl="6">
-      <w:startOverride w:val="1"/>
-    </w:lvlOverride>
-    <w:lvlOverride w:ilvl="7">
-      <w:startOverride w:val="1"/>
-    </w:lvlOverride>
-    <w:lvlOverride w:ilvl="8">
-      <w:startOverride w:val="1"/>
-    </w:lvlOverride>
+    <w:abstractNumId w:val="991"/>
   </w:num>
   <w:num w:numId="1042">
     <w:abstractNumId w:val="99411"/>
@@ -8260,7 +10426,34 @@
     </w:lvlOverride>
   </w:num>
   <w:num w:numId="1043">
-    <w:abstractNumId w:val="991"/>
+    <w:abstractNumId w:val="99411"/>
+    <w:lvlOverride w:ilvl="0">
+      <w:startOverride w:val="1"/>
+    </w:lvlOverride>
+    <w:lvlOverride w:ilvl="1">
+      <w:startOverride w:val="1"/>
+    </w:lvlOverride>
+    <w:lvlOverride w:ilvl="2">
+      <w:startOverride w:val="1"/>
+    </w:lvlOverride>
+    <w:lvlOverride w:ilvl="3">
+      <w:startOverride w:val="1"/>
+    </w:lvlOverride>
+    <w:lvlOverride w:ilvl="4">
+      <w:startOverride w:val="1"/>
+    </w:lvlOverride>
+    <w:lvlOverride w:ilvl="5">
+      <w:startOverride w:val="1"/>
+    </w:lvlOverride>
+    <w:lvlOverride w:ilvl="6">
+      <w:startOverride w:val="1"/>
+    </w:lvlOverride>
+    <w:lvlOverride w:ilvl="7">
+      <w:startOverride w:val="1"/>
+    </w:lvlOverride>
+    <w:lvlOverride w:ilvl="8">
+      <w:startOverride w:val="1"/>
+    </w:lvlOverride>
   </w:num>
   <w:num w:numId="1044">
     <w:abstractNumId w:val="991"/>
@@ -8293,6 +10486,9 @@
     <w:abstractNumId w:val="991"/>
   </w:num>
   <w:num w:numId="1054">
+    <w:abstractNumId w:val="991"/>
+  </w:num>
+  <w:num w:numId="1055">
     <w:abstractNumId w:val="99411"/>
     <w:lvlOverride w:ilvl="0">
       <w:startOverride w:val="1"/>
@@ -8322,10 +10518,10 @@
       <w:startOverride w:val="1"/>
     </w:lvlOverride>
   </w:num>
-  <w:num w:numId="1055">
+  <w:num w:numId="1056">
     <w:abstractNumId w:val="991"/>
   </w:num>
-  <w:num w:numId="1056">
+  <w:num w:numId="1057">
     <w:abstractNumId w:val="991"/>
   </w:num>
 </w:numbering>
@@ -8987,7 +11183,7 @@
       <w:color w:themeColor="accent1" w:themeShade="BF" w:val="365F91"/>
     </w:rPr>
   </w:style>
-  <w:style w:type="paragraph" w:customStyle="1" w:styleId="SourceCode">
+  <w:style w:customStyle="1" w:styleId="SourceCode" w:type="paragraph">
     <w:name w:val="Source Code"/>
     <w:basedOn w:val="Normal"/>
     <w:link w:val="VerbatimChar"/>
@@ -8995,7 +11191,7 @@
       <w:wordWrap w:val="off"/>
     </w:pPr>
   </w:style>
-  <w:style w:type="character" w:customStyle="1" w:styleId="KeywordTok">
+  <w:style w:customStyle="1" w:styleId="KeywordTok" w:type="character">
     <w:name w:val="KeywordTok"/>
     <w:basedOn w:val="VerbatimChar"/>
     <w:rPr>
@@ -9003,77 +11199,77 @@
       <w:color w:val="007020"/>
     </w:rPr>
   </w:style>
-  <w:style w:type="character" w:customStyle="1" w:styleId="DataTypeTok">
+  <w:style w:customStyle="1" w:styleId="DataTypeTok" w:type="character">
     <w:name w:val="DataTypeTok"/>
     <w:basedOn w:val="VerbatimChar"/>
     <w:rPr>
       <w:color w:val="902000"/>
     </w:rPr>
   </w:style>
-  <w:style w:type="character" w:customStyle="1" w:styleId="DecValTok">
+  <w:style w:customStyle="1" w:styleId="DecValTok" w:type="character">
     <w:name w:val="DecValTok"/>
     <w:basedOn w:val="VerbatimChar"/>
     <w:rPr>
       <w:color w:val="40a070"/>
     </w:rPr>
   </w:style>
-  <w:style w:type="character" w:customStyle="1" w:styleId="BaseNTok">
+  <w:style w:customStyle="1" w:styleId="BaseNTok" w:type="character">
     <w:name w:val="BaseNTok"/>
     <w:basedOn w:val="VerbatimChar"/>
     <w:rPr>
       <w:color w:val="40a070"/>
     </w:rPr>
   </w:style>
-  <w:style w:type="character" w:customStyle="1" w:styleId="FloatTok">
+  <w:style w:customStyle="1" w:styleId="FloatTok" w:type="character">
     <w:name w:val="FloatTok"/>
     <w:basedOn w:val="VerbatimChar"/>
     <w:rPr>
       <w:color w:val="40a070"/>
     </w:rPr>
   </w:style>
-  <w:style w:type="character" w:customStyle="1" w:styleId="ConstantTok">
+  <w:style w:customStyle="1" w:styleId="ConstantTok" w:type="character">
     <w:name w:val="ConstantTok"/>
     <w:basedOn w:val="VerbatimChar"/>
     <w:rPr>
       <w:color w:val="880000"/>
     </w:rPr>
   </w:style>
-  <w:style w:type="character" w:customStyle="1" w:styleId="CharTok">
+  <w:style w:customStyle="1" w:styleId="CharTok" w:type="character">
     <w:name w:val="CharTok"/>
     <w:basedOn w:val="VerbatimChar"/>
     <w:rPr>
       <w:color w:val="4070a0"/>
     </w:rPr>
   </w:style>
-  <w:style w:type="character" w:customStyle="1" w:styleId="SpecialCharTok">
+  <w:style w:customStyle="1" w:styleId="SpecialCharTok" w:type="character">
     <w:name w:val="SpecialCharTok"/>
     <w:basedOn w:val="VerbatimChar"/>
     <w:rPr>
       <w:color w:val="4070a0"/>
     </w:rPr>
   </w:style>
-  <w:style w:type="character" w:customStyle="1" w:styleId="StringTok">
+  <w:style w:customStyle="1" w:styleId="StringTok" w:type="character">
     <w:name w:val="StringTok"/>
     <w:basedOn w:val="VerbatimChar"/>
     <w:rPr>
       <w:color w:val="4070a0"/>
     </w:rPr>
   </w:style>
-  <w:style w:type="character" w:customStyle="1" w:styleId="VerbatimStringTok">
+  <w:style w:customStyle="1" w:styleId="VerbatimStringTok" w:type="character">
     <w:name w:val="VerbatimStringTok"/>
     <w:basedOn w:val="VerbatimChar"/>
     <w:rPr>
       <w:color w:val="4070a0"/>
     </w:rPr>
   </w:style>
-  <w:style w:type="character" w:customStyle="1" w:styleId="SpecialStringTok">
+  <w:style w:customStyle="1" w:styleId="SpecialStringTok" w:type="character">
     <w:name w:val="SpecialStringTok"/>
     <w:basedOn w:val="VerbatimChar"/>
     <w:rPr>
       <w:color w:val="bb6688"/>
     </w:rPr>
   </w:style>
-  <w:style w:type="character" w:customStyle="1" w:styleId="ImportTok">
+  <w:style w:customStyle="1" w:styleId="ImportTok" w:type="character">
     <w:name w:val="ImportTok"/>
     <w:basedOn w:val="VerbatimChar"/>
     <w:rPr>
@@ -9081,7 +11277,7 @@
       <w:color w:val="008000"/>
     </w:rPr>
   </w:style>
-  <w:style w:type="character" w:customStyle="1" w:styleId="CommentTok">
+  <w:style w:customStyle="1" w:styleId="CommentTok" w:type="character">
     <w:name w:val="CommentTok"/>
     <w:basedOn w:val="VerbatimChar"/>
     <w:rPr>
@@ -9089,7 +11285,7 @@
       <w:color w:val="60a0b0"/>
     </w:rPr>
   </w:style>
-  <w:style w:type="character" w:customStyle="1" w:styleId="DocumentationTok">
+  <w:style w:customStyle="1" w:styleId="DocumentationTok" w:type="character">
     <w:name w:val="DocumentationTok"/>
     <w:basedOn w:val="VerbatimChar"/>
     <w:rPr>
@@ -9097,7 +11293,7 @@
       <w:color w:val="ba2121"/>
     </w:rPr>
   </w:style>
-  <w:style w:type="character" w:customStyle="1" w:styleId="AnnotationTok">
+  <w:style w:customStyle="1" w:styleId="AnnotationTok" w:type="character">
     <w:name w:val="AnnotationTok"/>
     <w:basedOn w:val="VerbatimChar"/>
     <w:rPr>
@@ -9106,7 +11302,7 @@
       <w:color w:val="60a0b0"/>
     </w:rPr>
   </w:style>
-  <w:style w:type="character" w:customStyle="1" w:styleId="CommentVarTok">
+  <w:style w:customStyle="1" w:styleId="CommentVarTok" w:type="character">
     <w:name w:val="CommentVarTok"/>
     <w:basedOn w:val="VerbatimChar"/>
     <w:rPr>
@@ -9115,28 +11311,28 @@
       <w:color w:val="60a0b0"/>
     </w:rPr>
   </w:style>
-  <w:style w:type="character" w:customStyle="1" w:styleId="OtherTok">
+  <w:style w:customStyle="1" w:styleId="OtherTok" w:type="character">
     <w:name w:val="OtherTok"/>
     <w:basedOn w:val="VerbatimChar"/>
     <w:rPr>
       <w:color w:val="007020"/>
     </w:rPr>
   </w:style>
-  <w:style w:type="character" w:customStyle="1" w:styleId="FunctionTok">
+  <w:style w:customStyle="1" w:styleId="FunctionTok" w:type="character">
     <w:name w:val="FunctionTok"/>
     <w:basedOn w:val="VerbatimChar"/>
     <w:rPr>
       <w:color w:val="06287e"/>
     </w:rPr>
   </w:style>
-  <w:style w:type="character" w:customStyle="1" w:styleId="VariableTok">
+  <w:style w:customStyle="1" w:styleId="VariableTok" w:type="character">
     <w:name w:val="VariableTok"/>
     <w:basedOn w:val="VerbatimChar"/>
     <w:rPr>
       <w:color w:val="19177c"/>
     </w:rPr>
   </w:style>
-  <w:style w:type="character" w:customStyle="1" w:styleId="ControlFlowTok">
+  <w:style w:customStyle="1" w:styleId="ControlFlowTok" w:type="character">
     <w:name w:val="ControlFlowTok"/>
     <w:basedOn w:val="VerbatimChar"/>
     <w:rPr>
@@ -9144,45 +11340,45 @@
       <w:color w:val="007020"/>
     </w:rPr>
   </w:style>
-  <w:style w:type="character" w:customStyle="1" w:styleId="OperatorTok">
+  <w:style w:customStyle="1" w:styleId="OperatorTok" w:type="character">
     <w:name w:val="OperatorTok"/>
     <w:basedOn w:val="VerbatimChar"/>
     <w:rPr>
       <w:color w:val="666666"/>
     </w:rPr>
   </w:style>
-  <w:style w:type="character" w:customStyle="1" w:styleId="BuiltInTok">
+  <w:style w:customStyle="1" w:styleId="BuiltInTok" w:type="character">
     <w:name w:val="BuiltInTok"/>
     <w:basedOn w:val="VerbatimChar"/>
     <w:rPr>
       <w:color w:val="008000"/>
     </w:rPr>
   </w:style>
-  <w:style w:type="character" w:customStyle="1" w:styleId="ExtensionTok">
+  <w:style w:customStyle="1" w:styleId="ExtensionTok" w:type="character">
     <w:name w:val="ExtensionTok"/>
     <w:basedOn w:val="VerbatimChar"/>
     <w:rPr/>
   </w:style>
-  <w:style w:type="character" w:customStyle="1" w:styleId="PreprocessorTok">
+  <w:style w:customStyle="1" w:styleId="PreprocessorTok" w:type="character">
     <w:name w:val="PreprocessorTok"/>
     <w:basedOn w:val="VerbatimChar"/>
     <w:rPr>
       <w:color w:val="bc7a00"/>
     </w:rPr>
   </w:style>
-  <w:style w:type="character" w:customStyle="1" w:styleId="AttributeTok">
+  <w:style w:customStyle="1" w:styleId="AttributeTok" w:type="character">
     <w:name w:val="AttributeTok"/>
     <w:basedOn w:val="VerbatimChar"/>
     <w:rPr>
       <w:color w:val="7d9029"/>
     </w:rPr>
   </w:style>
-  <w:style w:type="character" w:customStyle="1" w:styleId="RegionMarkerTok">
+  <w:style w:customStyle="1" w:styleId="RegionMarkerTok" w:type="character">
     <w:name w:val="RegionMarkerTok"/>
     <w:basedOn w:val="VerbatimChar"/>
     <w:rPr/>
   </w:style>
-  <w:style w:type="character" w:customStyle="1" w:styleId="InformationTok">
+  <w:style w:customStyle="1" w:styleId="InformationTok" w:type="character">
     <w:name w:val="InformationTok"/>
     <w:basedOn w:val="VerbatimChar"/>
     <w:rPr>
@@ -9191,7 +11387,7 @@
       <w:color w:val="60a0b0"/>
     </w:rPr>
   </w:style>
-  <w:style w:type="character" w:customStyle="1" w:styleId="WarningTok">
+  <w:style w:customStyle="1" w:styleId="WarningTok" w:type="character">
     <w:name w:val="WarningTok"/>
     <w:basedOn w:val="VerbatimChar"/>
     <w:rPr>
@@ -9200,7 +11396,7 @@
       <w:color w:val="60a0b0"/>
     </w:rPr>
   </w:style>
-  <w:style w:type="character" w:customStyle="1" w:styleId="AlertTok">
+  <w:style w:customStyle="1" w:styleId="AlertTok" w:type="character">
     <w:name w:val="AlertTok"/>
     <w:basedOn w:val="VerbatimChar"/>
     <w:rPr>
@@ -9208,7 +11404,7 @@
       <w:color w:val="ff0000"/>
     </w:rPr>
   </w:style>
-  <w:style w:type="character" w:customStyle="1" w:styleId="ErrorTok">
+  <w:style w:customStyle="1" w:styleId="ErrorTok" w:type="character">
     <w:name w:val="ErrorTok"/>
     <w:basedOn w:val="VerbatimChar"/>
     <w:rPr>
@@ -9216,7 +11412,7 @@
       <w:color w:val="ff0000"/>
     </w:rPr>
   </w:style>
-  <w:style w:type="character" w:customStyle="1" w:styleId="NormalTok">
+  <w:style w:customStyle="1" w:styleId="NormalTok" w:type="character">
     <w:name w:val="NormalTok"/>
     <w:basedOn w:val="VerbatimChar"/>
     <w:rPr/>

</xml_diff>